<commit_message>
Requisiti: Word online su Google Drive, cartella CYF gaming (R-507)
Co-Authored-By: Claude Opus 5.5 <noreply@anthropic.com>
Claude-Session: https://claude.ai/code/session_01L12wL1MnrouDiAykWT6zM6
</commit_message>
<xml_diff>
--- a/docs/CYF-Gaming-requisiti.docx
+++ b/docs/CYF-Gaming-requisiti.docx
@@ -197,6 +197,36 @@
       <w:r>
         <w:t xml:space="preserve">fatto</w:t>
       </w:r>
+      <w:r>
+        <w:t xml:space="preserve"> </w:t>
+      </w:r>
+      <w:r>
+        <w:t xml:space="preserve">·</w:t>
+      </w:r>
+      <w:r>
+        <w:t xml:space="preserve"> </w:t>
+      </w:r>
+      <w:r>
+        <w:t xml:space="preserve">online</w:t>
+      </w:r>
+      <w:r>
+        <w:t xml:space="preserve"> </w:t>
+      </w:r>
+      <w:r>
+        <w:t xml:space="preserve">su</w:t>
+      </w:r>
+      <w:r>
+        <w:t xml:space="preserve"> </w:t>
+      </w:r>
+      <w:r>
+        <w:t xml:space="preserve">Google</w:t>
+      </w:r>
+      <w:r>
+        <w:t xml:space="preserve"> </w:t>
+      </w:r>
+      <w:r>
+        <w:t xml:space="preserve">Drive</w:t>
+      </w:r>
     </w:p>
     <w:bookmarkStart w:id="23" w:name="prossimi-passi"/>
     <w:p>
@@ -212,7 +242,22 @@
         <w:pStyle w:val="FirstParagraph"/>
       </w:pPr>
       <w:r>
-        <w:t xml:space="preserve">Aggiornati il 26/10/2026 alle 21 (versione online: 0.17.0). È la parte da leggere per prima: che cosa si può fare adesso. Tutto quello che è già fatto viene dopo, nelle sezioni 1-13 e nello storico delle versioni.</w:t>
+        <w:t xml:space="preserve">Aggiornati il 26/10/2026 alle 21 (versione online: 0.17.0). Questo Word è anche su Google Drive, cartella</w:t>
+      </w:r>
+      <w:r>
+        <w:t xml:space="preserve"> </w:t>
+      </w:r>
+      <w:r>
+        <w:t xml:space="preserve">“</w:t>
+      </w:r>
+      <w:r>
+        <w:t xml:space="preserve">CYF gaming</w:t>
+      </w:r>
+      <w:r>
+        <w:t xml:space="preserve">”</w:t>
+      </w:r>
+      <w:r>
+        <w:t xml:space="preserve">, e si aggiorna da solo. È la parte da leggere per prima: che cosa si può fare adesso. Tutto quello che è già fatto viene dopo, nelle sezioni 1-13 e nello storico delle versioni.</w:t>
       </w:r>
     </w:p>
     <w:bookmarkStart w:id="20" w:name="cosa-puoi-fare-tu-luigi"/>
@@ -778,20 +823,26 @@
               <w:rPr>
                 <w:sz w:val="19"/>
               </w:rPr>
-              <w:t xml:space="preserve">Dire dove vuoi trovare il Word aggiornato in automatico anche a PC spento (R-507): oggi è su GitHub (</w:t>
+              <w:t xml:space="preserve">Creare la chiave Cloudflare per il sito di prova</w:t>
+            </w:r>
+            <w:r>
+              <w:rPr>
+                <w:sz w:val="19"/>
+              </w:rPr>
+              <w:t xml:space="preserve"> </w:t>
             </w:r>
             <w:r>
               <w:rPr>
                 <w:rStyle w:val="VerbatimChar"/>
                 <w:sz w:val="19"/>
               </w:rPr>
-              <w:t xml:space="preserve">docs/</w:t>
-            </w:r>
-            <w:r>
-              <w:rPr>
-                <w:sz w:val="19"/>
-              </w:rPr>
-              <w:t xml:space="preserve">) e in chat; sul Desktop arriva solo con il PC collegato</w:t>
+              <w:t xml:space="preserve">cyf-gaming-prova</w:t>
+            </w:r>
+            <w:r>
+              <w:rPr>
+                <w:sz w:val="19"/>
+              </w:rPr>
+              <w:t xml:space="preserve">, per provare le novità dal telefono prima che le vedano tutti</w:t>
             </w:r>
           </w:p>
         </w:tc>
@@ -809,7 +860,7 @@
               <w:rPr>
                 <w:sz w:val="19"/>
               </w:rPr>
-              <w:t xml:space="preserve">1 min</w:t>
+              <w:t xml:space="preserve">10 min</w:t>
             </w:r>
           </w:p>
         </w:tc>
@@ -827,7 +878,7 @@
               <w:rPr>
                 <w:sz w:val="19"/>
               </w:rPr>
-              <w:t xml:space="preserve">R-507</w:t>
+              <w:t xml:space="preserve">A-09</w:t>
             </w:r>
           </w:p>
         </w:tc>
@@ -865,26 +916,7 @@
               <w:rPr>
                 <w:sz w:val="19"/>
               </w:rPr>
-              <w:t xml:space="preserve">Creare la chiave Cloudflare per il sito di prova</w:t>
-            </w:r>
-            <w:r>
-              <w:rPr>
-                <w:sz w:val="19"/>
-              </w:rPr>
-              <w:t xml:space="preserve"> </w:t>
-            </w:r>
-            <w:r>
-              <w:rPr>
-                <w:rStyle w:val="VerbatimChar"/>
-                <w:sz w:val="19"/>
-              </w:rPr>
-              <w:t xml:space="preserve">cyf-gaming-prova</w:t>
-            </w:r>
-            <w:r>
-              <w:rPr>
-                <w:sz w:val="19"/>
-              </w:rPr>
-              <w:t xml:space="preserve">, per provare le novità dal telefono prima che le vedano tutti</w:t>
+              <w:t xml:space="preserve">Comprare e collegare il dominio (es. cyfgaming.it, ~10-15 €/anno)</w:t>
             </w:r>
           </w:p>
         </w:tc>
@@ -920,7 +952,7 @@
               <w:rPr>
                 <w:sz w:val="19"/>
               </w:rPr>
-              <w:t xml:space="preserve">A-09</w:t>
+              <w:t xml:space="preserve">D-03</w:t>
             </w:r>
           </w:p>
         </w:tc>
@@ -941,80 +973,6 @@
                 <w:sz w:val="19"/>
               </w:rPr>
               <w:t xml:space="preserve">6</w:t>
-            </w:r>
-          </w:p>
-        </w:tc>
-        <w:tc>
-          <w:tcPr>
-            <w:tcW w:type="dxa" w:w="6576"/>
-          </w:tcPr>
-          <w:p>
-            <w:pPr>
-              <w:pStyle w:val="Compact"/>
-              <w:spacing w:after="40"/>
-              <w:jc w:val="left"/>
-            </w:pPr>
-            <w:r>
-              <w:rPr>
-                <w:sz w:val="19"/>
-              </w:rPr>
-              <w:t xml:space="preserve">Comprare e collegare il dominio (es. cyfgaming.it, ~10-15 €/anno)</w:t>
-            </w:r>
-          </w:p>
-        </w:tc>
-        <w:tc>
-          <w:tcPr>
-            <w:tcW w:type="dxa" w:w="1247"/>
-          </w:tcPr>
-          <w:p>
-            <w:pPr>
-              <w:pStyle w:val="Compact"/>
-              <w:spacing w:after="40"/>
-              <w:jc w:val="left"/>
-            </w:pPr>
-            <w:r>
-              <w:rPr>
-                <w:sz w:val="19"/>
-              </w:rPr>
-              <w:t xml:space="preserve">10 min</w:t>
-            </w:r>
-          </w:p>
-        </w:tc>
-        <w:tc>
-          <w:tcPr>
-            <w:tcW w:type="dxa" w:w="1531"/>
-          </w:tcPr>
-          <w:p>
-            <w:pPr>
-              <w:pStyle w:val="Compact"/>
-              <w:spacing w:after="40"/>
-              <w:jc w:val="left"/>
-            </w:pPr>
-            <w:r>
-              <w:rPr>
-                <w:sz w:val="19"/>
-              </w:rPr>
-              <w:t xml:space="preserve">D-03</w:t>
-            </w:r>
-          </w:p>
-        </w:tc>
-      </w:tr>
-      <w:tr>
-        <w:tc>
-          <w:tcPr>
-            <w:tcW w:type="dxa" w:w="510"/>
-          </w:tcPr>
-          <w:p>
-            <w:pPr>
-              <w:pStyle w:val="Compact"/>
-              <w:spacing w:after="40"/>
-              <w:jc w:val="left"/>
-            </w:pPr>
-            <w:r>
-              <w:rPr>
-                <w:sz w:val="19"/>
-              </w:rPr>
-              <w:t xml:space="preserve">7</w:t>
             </w:r>
           </w:p>
         </w:tc>
@@ -12210,7 +12168,7 @@
               <w:rPr>
                 <w:sz w:val="19"/>
               </w:rPr>
-              <w:t xml:space="preserve">Nel Word, all’inizio i prossimi passi e dopo tutto quello che è stato fatto; il Word si aggiorna da solo quando qualcosa viene fatto</w:t>
+              <w:t xml:space="preserve">Nel Word, all’inizio i prossimi passi e dopo tutto quello che è stato fatto; il Word si aggiorna da solo quando qualcosa viene fatto, ed è online nella cartella Google Drive scelta da Luigi</w:t>
             </w:r>
           </w:p>
         </w:tc>
@@ -12362,7 +12320,7 @@
               <w:rPr>
                 <w:sz w:val="19"/>
               </w:rPr>
-              <w:t xml:space="preserve">e lo mette in</w:t>
+              <w:t xml:space="preserve">in</w:t>
             </w:r>
             <w:r>
               <w:rPr>
@@ -12387,7 +12345,168 @@
               <w:rPr>
                 <w:sz w:val="19"/>
               </w:rPr>
-              <w:t xml:space="preserve">su GitHub; Claude lo manda anche in chat. Sul Desktop arriva solo con il PC collegato e il permesso sulla cartella: da decidere con Luigi se usare Google Drive, che si sincronizza da solo sul PC</w:t>
+              <w:t xml:space="preserve">su GitHub.</w:t>
+            </w:r>
+            <w:r>
+              <w:rPr>
+                <w:sz w:val="19"/>
+              </w:rPr>
+              <w:t xml:space="preserve"> </w:t>
+            </w:r>
+            <w:r>
+              <w:rPr>
+                <w:bCs/>
+                <w:b/>
+                <w:sz w:val="19"/>
+              </w:rPr>
+              <w:t xml:space="preserve">Online su Google Drive</w:t>
+            </w:r>
+            <w:r>
+              <w:rPr>
+                <w:sz w:val="19"/>
+              </w:rPr>
+              <w:t xml:space="preserve"> </w:t>
+            </w:r>
+            <w:r>
+              <w:rPr>
+                <w:sz w:val="19"/>
+              </w:rPr>
+              <w:t xml:space="preserve">dal 26/10 alle 20:44, nella cartella</w:t>
+            </w:r>
+            <w:r>
+              <w:rPr>
+                <w:sz w:val="19"/>
+              </w:rPr>
+              <w:t xml:space="preserve"> </w:t>
+            </w:r>
+            <w:r>
+              <w:rPr>
+                <w:sz w:val="19"/>
+              </w:rPr>
+              <w:t xml:space="preserve">“</w:t>
+            </w:r>
+            <w:r>
+              <w:rPr>
+                <w:sz w:val="19"/>
+              </w:rPr>
+              <w:t xml:space="preserve">CYF gaming</w:t>
+            </w:r>
+            <w:r>
+              <w:rPr>
+                <w:sz w:val="19"/>
+              </w:rPr>
+              <w:t xml:space="preserve">”</w:t>
+            </w:r>
+            <w:r>
+              <w:rPr>
+                <w:sz w:val="19"/>
+              </w:rPr>
+              <w:t xml:space="preserve"> </w:t>
+            </w:r>
+            <w:r>
+              <w:rPr>
+                <w:sz w:val="19"/>
+              </w:rPr>
+              <w:t xml:space="preserve">indicata da Luigi (account luigi.imperatore.eng): il file</w:t>
+            </w:r>
+            <w:r>
+              <w:rPr>
+                <w:sz w:val="19"/>
+              </w:rPr>
+              <w:t xml:space="preserve"> </w:t>
+            </w:r>
+            <w:r>
+              <w:rPr>
+                <w:rStyle w:val="VerbatimChar"/>
+                <w:sz w:val="19"/>
+              </w:rPr>
+              <w:t xml:space="preserve">CYF-Gaming-requisiti.docx</w:t>
+            </w:r>
+            <w:r>
+              <w:rPr>
+                <w:sz w:val="19"/>
+              </w:rPr>
+              <w:t xml:space="preserve"> </w:t>
+            </w:r>
+            <w:r>
+              <w:rPr>
+                <w:sz w:val="19"/>
+              </w:rPr>
+              <w:t xml:space="preserve">lo scrive il PC di casa nella cartella sincronizzata</w:t>
+            </w:r>
+            <w:r>
+              <w:rPr>
+                <w:sz w:val="19"/>
+              </w:rPr>
+              <w:t xml:space="preserve"> </w:t>
+            </w:r>
+            <w:r>
+              <w:rPr>
+                <w:rStyle w:val="VerbatimChar"/>
+                <w:sz w:val="19"/>
+              </w:rPr>
+              <w:t xml:space="preserve">G:\Il mio Drive\CYF gaming</w:t>
+            </w:r>
+            <w:r>
+              <w:rPr>
+                <w:sz w:val="19"/>
+              </w:rPr>
+              <w:t xml:space="preserve">, con l’attività pianificata</w:t>
+            </w:r>
+            <w:r>
+              <w:rPr>
+                <w:sz w:val="19"/>
+              </w:rPr>
+              <w:t xml:space="preserve"> </w:t>
+            </w:r>
+            <w:r>
+              <w:rPr>
+                <w:sz w:val="19"/>
+              </w:rPr>
+              <w:t xml:space="preserve">“</w:t>
+            </w:r>
+            <w:r>
+              <w:rPr>
+                <w:sz w:val="19"/>
+              </w:rPr>
+              <w:t xml:space="preserve">Word requisiti CYF su Drive</w:t>
+            </w:r>
+            <w:r>
+              <w:rPr>
+                <w:sz w:val="19"/>
+              </w:rPr>
+              <w:t xml:space="preserve">”</w:t>
+            </w:r>
+            <w:r>
+              <w:rPr>
+                <w:sz w:val="19"/>
+              </w:rPr>
+              <w:t xml:space="preserve"> </w:t>
+            </w:r>
+            <w:r>
+              <w:rPr>
+                <w:sz w:val="19"/>
+              </w:rPr>
+              <w:t xml:space="preserve">alle 7:13, 13:13 e 19:13 (copia solo se il Word su GitHub è più nuovo). Il turno di notte gira nel cloud e non può scrivere su Drive: con il PC spento la copia aspetta il primo giro a PC acceso; intanto l’ultima versione è sempre su GitHub in</w:t>
+            </w:r>
+            <w:r>
+              <w:rPr>
+                <w:sz w:val="19"/>
+              </w:rPr>
+              <w:t xml:space="preserve"> </w:t>
+            </w:r>
+            <w:r>
+              <w:rPr>
+                <w:rStyle w:val="VerbatimChar"/>
+                <w:sz w:val="19"/>
+              </w:rPr>
+              <w:t xml:space="preserve">docs/</w:t>
+            </w:r>
+            <w:r>
+              <w:rPr>
+                <w:sz w:val="19"/>
+              </w:rPr>
+              <w:t xml:space="preserve">. Quando il PC è collegato a una chat, Claude copia il Word anche subito</w:t>
             </w:r>
           </w:p>
         </w:tc>

</xml_diff>

<commit_message>
0.19.1: turno di notte 26-27/10 — giro completo verde, correzioni piccole, prossimi passi aggiornati
- tools/verifica/nomi.mjs: conosce Worker, OffscreenCanvas, createImageBitmap
  (fermava per sbaglio il cancello del ramo sfondi-citta, R-405)
- package.json: versione riallineata a config.js (era rimasta a 0.17.0)
- REQUISITI.md: prossimi passi in testa aggiornati (tolti R-234/R-235, A-20,
  A-16 fatti), storico 0.19.1, Word rigenerato in docs/

Co-Authored-By: Claude Fable 5 <noreply@anthropic.com>
Claude-Session: https://claude.ai/code/session_01KYs4CQrWCPeQJMJmDVyrvN
</commit_message>
<xml_diff>
--- a/docs/CYF-Gaming-requisiti.docx
+++ b/docs/CYF-Gaming-requisiti.docx
@@ -69,7 +69,7 @@
         <w:t xml:space="preserve"> </w:t>
       </w:r>
       <w:r>
-        <w:t xml:space="preserve">0.17.0</w:t>
+        <w:t xml:space="preserve">0.19.1</w:t>
       </w:r>
       <w:r>
         <w:t xml:space="preserve"> </w:t>
@@ -87,115 +87,181 @@
         <w:t xml:space="preserve"> </w:t>
       </w:r>
       <w:r>
-        <w:t xml:space="preserve">al</w:t>
+        <w:t xml:space="preserve">dal</w:t>
       </w:r>
       <w:r>
         <w:t xml:space="preserve"> </w:t>
       </w:r>
       <w:r>
-        <w:t xml:space="preserve">26</w:t>
+        <w:t xml:space="preserve">turno</w:t>
       </w:r>
       <w:r>
         <w:t xml:space="preserve"> </w:t>
       </w:r>
       <w:r>
+        <w:t xml:space="preserve">di</w:t>
+      </w:r>
+      <w:r>
+        <w:t xml:space="preserve"> </w:t>
+      </w:r>
+      <w:r>
+        <w:t xml:space="preserve">notte</w:t>
+      </w:r>
+      <w:r>
+        <w:t xml:space="preserve"> </w:t>
+      </w:r>
+      <w:r>
+        <w:t xml:space="preserve">del</w:t>
+      </w:r>
+      <w:r>
+        <w:t xml:space="preserve"> </w:t>
+      </w:r>
+      <w:r>
+        <w:t xml:space="preserve">26-27</w:t>
+      </w:r>
+      <w:r>
+        <w:t xml:space="preserve"> </w:t>
+      </w:r>
+      <w:r>
         <w:t xml:space="preserve">ottobre</w:t>
       </w:r>
       <w:r>
         <w:t xml:space="preserve"> </w:t>
       </w:r>
       <w:r>
-        <w:t xml:space="preserve">2026,</w:t>
+        <w:t xml:space="preserve">2026</w:t>
       </w:r>
       <w:r>
         <w:t xml:space="preserve"> </w:t>
       </w:r>
       <w:r>
-        <w:t xml:space="preserve">ore</w:t>
+        <w:t xml:space="preserve">·</w:t>
       </w:r>
       <w:r>
         <w:t xml:space="preserve"> </w:t>
       </w:r>
       <w:r>
-        <w:t xml:space="preserve">21</w:t>
+        <w:t xml:space="preserve">in</w:t>
       </w:r>
       <w:r>
         <w:t xml:space="preserve"> </w:t>
       </w:r>
       <w:r>
+        <w:t xml:space="preserve">testa</w:t>
+      </w:r>
+      <w:r>
+        <w:t xml:space="preserve"> </w:t>
+      </w:r>
+      <w:r>
+        <w:t xml:space="preserve">i</w:t>
+      </w:r>
+      <w:r>
+        <w:t xml:space="preserve"> </w:t>
+      </w:r>
+      <w:r>
+        <w:t xml:space="preserve">prossimi</w:t>
+      </w:r>
+      <w:r>
+        <w:t xml:space="preserve"> </w:t>
+      </w:r>
+      <w:r>
+        <w:t xml:space="preserve">passi</w:t>
+      </w:r>
+      <w:r>
+        <w:t xml:space="preserve"> </w:t>
+      </w:r>
+      <w:r>
         <w:t xml:space="preserve">·</w:t>
       </w:r>
       <w:r>
         <w:t xml:space="preserve"> </w:t>
       </w:r>
       <w:r>
+        <w:t xml:space="preserve">velocità</w:t>
+      </w:r>
+      <w:r>
+        <w:t xml:space="preserve"> </w:t>
+      </w:r>
+      <w:r>
+        <w:t xml:space="preserve">reali</w:t>
+      </w:r>
+      <w:r>
+        <w:t xml:space="preserve"> </w:t>
+      </w:r>
+      <w:r>
+        <w:t xml:space="preserve">(max</w:t>
+      </w:r>
+      <w:r>
+        <w:t xml:space="preserve"> </w:t>
+      </w:r>
+      <w:r>
+        <w:t xml:space="preserve">80</w:t>
+      </w:r>
+      <w:r>
+        <w:t xml:space="preserve"> </w:t>
+      </w:r>
+      <w:r>
+        <w:t xml:space="preserve">km/h),</w:t>
+      </w:r>
+      <w:r>
+        <w:t xml:space="preserve"> </w:t>
+      </w:r>
+      <w:r>
+        <w:t xml:space="preserve">CYF</w:t>
+      </w:r>
+      <w:r>
+        <w:t xml:space="preserve"> </w:t>
+      </w:r>
+      <w:r>
+        <w:t xml:space="preserve">sul</w:t>
+      </w:r>
+      <w:r>
+        <w:t xml:space="preserve"> </w:t>
+      </w:r>
+      <w:r>
+        <w:t xml:space="preserve">trampolino</w:t>
+      </w:r>
+      <w:r>
+        <w:t xml:space="preserve"> </w:t>
+      </w:r>
+      <w:r>
+        <w:t xml:space="preserve">gigante,</w:t>
+      </w:r>
+      <w:r>
+        <w:t xml:space="preserve"> </w:t>
+      </w:r>
+      <w:r>
         <w:t xml:space="preserve">in</w:t>
       </w:r>
       <w:r>
         <w:t xml:space="preserve"> </w:t>
       </w:r>
       <w:r>
-        <w:t xml:space="preserve">testa</w:t>
+        <w:t xml:space="preserve">aria</w:t>
       </w:r>
       <w:r>
         <w:t xml:space="preserve"> </w:t>
       </w:r>
       <w:r>
-        <w:t xml:space="preserve">i</w:t>
+        <w:t xml:space="preserve">non</w:t>
       </w:r>
       <w:r>
         <w:t xml:space="preserve"> </w:t>
       </w:r>
       <w:r>
-        <w:t xml:space="preserve">prossimi</w:t>
+        <w:t xml:space="preserve">si</w:t>
       </w:r>
       <w:r>
         <w:t xml:space="preserve"> </w:t>
       </w:r>
       <w:r>
-        <w:t xml:space="preserve">passi,</w:t>
+        <w:t xml:space="preserve">viene</w:t>
       </w:r>
       <w:r>
         <w:t xml:space="preserve"> </w:t>
       </w:r>
       <w:r>
-        <w:t xml:space="preserve">dopo</w:t>
-      </w:r>
-      <w:r>
-        <w:t xml:space="preserve"> </w:t>
-      </w:r>
-      <w:r>
-        <w:t xml:space="preserve">tutto</w:t>
-      </w:r>
-      <w:r>
-        <w:t xml:space="preserve"> </w:t>
-      </w:r>
-      <w:r>
-        <w:t xml:space="preserve">quello</w:t>
-      </w:r>
-      <w:r>
-        <w:t xml:space="preserve"> </w:t>
-      </w:r>
-      <w:r>
-        <w:t xml:space="preserve">che</w:t>
-      </w:r>
-      <w:r>
-        <w:t xml:space="preserve"> </w:t>
-      </w:r>
-      <w:r>
-        <w:t xml:space="preserve">è</w:t>
-      </w:r>
-      <w:r>
-        <w:t xml:space="preserve"> </w:t>
-      </w:r>
-      <w:r>
-        <w:t xml:space="preserve">stato</w:t>
-      </w:r>
-      <w:r>
-        <w:t xml:space="preserve"> </w:t>
-      </w:r>
-      <w:r>
-        <w:t xml:space="preserve">fatto</w:t>
+        <w:t xml:space="preserve">colpiti</w:t>
       </w:r>
       <w:r>
         <w:t xml:space="preserve"> </w:t>
@@ -242,7 +308,7 @@
         <w:pStyle w:val="FirstParagraph"/>
       </w:pPr>
       <w:r>
-        <w:t xml:space="preserve">Aggiornati il 26/10/2026 alle 21 (versione online: 0.17.0). Questo Word è anche su Google Drive, cartella</w:t>
+        <w:t xml:space="preserve">Aggiornati dal turno di notte del 26-27/10/2026 (versione online: 0.19.1). Questo Word è anche su Google Drive, cartella</w:t>
       </w:r>
       <w:r>
         <w:t xml:space="preserve"> </w:t>
@@ -615,7 +681,59 @@
               <w:rPr>
                 <w:sz w:val="19"/>
               </w:rPr>
-              <w:t xml:space="preserve">(pulsante azzurro nel menu) e le novità dalla 0.10 alla 0.17, meglio con qualche amico; poi scrivere i requisiti che vanno bene (</w:t>
+              <w:t xml:space="preserve">(pulsante azzurro nel menu), gli</w:t>
+            </w:r>
+            <w:r>
+              <w:rPr>
+                <w:sz w:val="19"/>
+              </w:rPr>
+              <w:t xml:space="preserve"> </w:t>
+            </w:r>
+            <w:r>
+              <w:rPr>
+                <w:bCs/>
+                <w:b/>
+                <w:sz w:val="19"/>
+              </w:rPr>
+              <w:t xml:space="preserve">avversari del computer</w:t>
+            </w:r>
+            <w:r>
+              <w:rPr>
+                <w:sz w:val="19"/>
+              </w:rPr>
+              <w:t xml:space="preserve"> </w:t>
+            </w:r>
+            <w:r>
+              <w:rPr>
+                <w:sz w:val="19"/>
+              </w:rPr>
+              <w:t xml:space="preserve">e le</w:t>
+            </w:r>
+            <w:r>
+              <w:rPr>
+                <w:sz w:val="19"/>
+              </w:rPr>
+              <w:t xml:space="preserve"> </w:t>
+            </w:r>
+            <w:r>
+              <w:rPr>
+                <w:bCs/>
+                <w:b/>
+                <w:sz w:val="19"/>
+              </w:rPr>
+              <w:t xml:space="preserve">velocità nuove</w:t>
+            </w:r>
+            <w:r>
+              <w:rPr>
+                <w:sz w:val="19"/>
+              </w:rPr>
+              <w:t xml:space="preserve"> </w:t>
+            </w:r>
+            <w:r>
+              <w:rPr>
+                <w:sz w:val="19"/>
+              </w:rPr>
+              <w:t xml:space="preserve">(novità dalla 0.10 alla 0.19), meglio con qualche amico; poi scrivere i requisiti che vanno bene (</w:t>
             </w:r>
             <w:r>
               <w:rPr>
@@ -713,7 +831,7 @@
               <w:rPr>
                 <w:sz w:val="19"/>
               </w:rPr>
-              <w:t xml:space="preserve">Decidere le scelte aperte di Claude (sezione 7). Le più urgenti: S-39 (fantasmi, serve per la 0.18), S-41 (regole del giorno e della notte) e S-42 (struttura del software). Basta</w:t>
+              <w:t xml:space="preserve">Decidere le scelte aperte di Claude (sezione 7). Le più urgenti: S-39 (avversari del computer), S-41 (velocità reali), S-42 (struttura del software) e S-43 (regole del giorno e della notte). Basta</w:t>
             </w:r>
             <w:r>
               <w:rPr>
@@ -1321,7 +1439,90 @@
               <w:rPr>
                 <w:sz w:val="19"/>
               </w:rPr>
-              <w:t xml:space="preserve">Fantasmi: le discese migliori corrono in pista come avversari trasparenti</w:t>
+              <w:t xml:space="preserve">Finire gli</w:t>
+            </w:r>
+            <w:r>
+              <w:rPr>
+                <w:sz w:val="19"/>
+              </w:rPr>
+              <w:t xml:space="preserve"> </w:t>
+            </w:r>
+            <w:r>
+              <w:rPr>
+                <w:bCs/>
+                <w:b/>
+                <w:sz w:val="19"/>
+              </w:rPr>
+              <w:t xml:space="preserve">sfondi dipinti delle 12 città</w:t>
+            </w:r>
+            <w:r>
+              <w:rPr>
+                <w:sz w:val="19"/>
+              </w:rPr>
+              <w:t xml:space="preserve"> </w:t>
+            </w:r>
+            <w:r>
+              <w:rPr>
+                <w:sz w:val="19"/>
+              </w:rPr>
+              <w:t xml:space="preserve">(ramo</w:t>
+            </w:r>
+            <w:r>
+              <w:rPr>
+                <w:sz w:val="19"/>
+              </w:rPr>
+              <w:t xml:space="preserve"> </w:t>
+            </w:r>
+            <w:r>
+              <w:rPr>
+                <w:rStyle w:val="VerbatimChar"/>
+                <w:sz w:val="19"/>
+              </w:rPr>
+              <w:t xml:space="preserve">sfondi-citta</w:t>
+            </w:r>
+            <w:r>
+              <w:rPr>
+                <w:sz w:val="19"/>
+              </w:rPr>
+              <w:t xml:space="preserve">, lavoro del giorno): il cancello è rosso perché sulla macchina lenta delle prove a Zagabria l’allenamento non parte (0 m percorsi); il falso allarme del controllo dei nomi su</w:t>
+            </w:r>
+            <w:r>
+              <w:rPr>
+                <w:sz w:val="19"/>
+              </w:rPr>
+              <w:t xml:space="preserve"> </w:t>
+            </w:r>
+            <w:r>
+              <w:rPr>
+                <w:rStyle w:val="VerbatimChar"/>
+                <w:sz w:val="19"/>
+              </w:rPr>
+              <w:t xml:space="preserve">Worker</w:t>
+            </w:r>
+            <w:r>
+              <w:rPr>
+                <w:sz w:val="19"/>
+              </w:rPr>
+              <w:t xml:space="preserve">/</w:t>
+            </w:r>
+            <w:r>
+              <w:rPr>
+                <w:rStyle w:val="VerbatimChar"/>
+                <w:sz w:val="19"/>
+              </w:rPr>
+              <w:t xml:space="preserve">OffscreenCanvas</w:t>
+            </w:r>
+            <w:r>
+              <w:rPr>
+                <w:sz w:val="19"/>
+              </w:rPr>
+              <w:t xml:space="preserve"> </w:t>
+            </w:r>
+            <w:r>
+              <w:rPr>
+                <w:sz w:val="19"/>
+              </w:rPr>
+              <w:t xml:space="preserve">è stato corretto nella 0.19.1</w:t>
             </w:r>
           </w:p>
         </w:tc>
@@ -1339,7 +1540,7 @@
               <w:rPr>
                 <w:sz w:val="19"/>
               </w:rPr>
-              <w:t xml:space="preserve">Si gioca in gara anche quando non c’è nessuno collegato</w:t>
+              <w:t xml:space="preserve">Sfondi come cartoline chiesti da Luigi</w:t>
             </w:r>
           </w:p>
         </w:tc>
@@ -1357,7 +1558,7 @@
               <w:rPr>
                 <w:sz w:val="19"/>
               </w:rPr>
-              <w:t xml:space="preserve">R-234</w:t>
+              <w:t xml:space="preserve">R-405</w:t>
             </w:r>
           </w:p>
         </w:tc>
@@ -1375,7 +1576,7 @@
               <w:rPr>
                 <w:sz w:val="19"/>
               </w:rPr>
-              <w:t xml:space="preserve">0.18</w:t>
+              <w:t xml:space="preserve">0.20</w:t>
             </w:r>
           </w:p>
         </w:tc>
@@ -1393,7 +1594,7 @@
               <w:rPr>
                 <w:sz w:val="19"/>
               </w:rPr>
-              <w:t xml:space="preserve">No (serve S-39)</w:t>
+              <w:t xml:space="preserve">No (lavoro del giorno)</w:t>
             </w:r>
           </w:p>
         </w:tc>
@@ -1431,7 +1632,43 @@
               <w:rPr>
                 <w:sz w:val="19"/>
               </w:rPr>
-              <w:t xml:space="preserve">Nella sala online, dopo 30 s da soli si corre contro i fantasmi</w:t>
+              <w:t xml:space="preserve">Link</w:t>
+            </w:r>
+            <w:r>
+              <w:rPr>
+                <w:sz w:val="19"/>
+              </w:rPr>
+              <w:t xml:space="preserve"> </w:t>
+            </w:r>
+            <w:r>
+              <w:rPr>
+                <w:sz w:val="19"/>
+              </w:rPr>
+              <w:t xml:space="preserve">“</w:t>
+            </w:r>
+            <w:r>
+              <w:rPr>
+                <w:sz w:val="19"/>
+              </w:rPr>
+              <w:t xml:space="preserve">batti il mio tempo</w:t>
+            </w:r>
+            <w:r>
+              <w:rPr>
+                <w:sz w:val="19"/>
+              </w:rPr>
+              <w:t xml:space="preserve">”</w:t>
+            </w:r>
+            <w:r>
+              <w:rPr>
+                <w:sz w:val="19"/>
+              </w:rPr>
+              <w:t xml:space="preserve"> </w:t>
+            </w:r>
+            <w:r>
+              <w:rPr>
+                <w:sz w:val="19"/>
+              </w:rPr>
+              <w:t xml:space="preserve">con il fantasma della discesa e immagine del risultato</w:t>
             </w:r>
           </w:p>
         </w:tc>
@@ -1449,7 +1686,7 @@
               <w:rPr>
                 <w:sz w:val="19"/>
               </w:rPr>
-              <w:t xml:space="preserve">Niente più attese a vuoto</w:t>
+              <w:t xml:space="preserve">Chi gioca porta altri giocatori</w:t>
             </w:r>
           </w:p>
         </w:tc>
@@ -1467,7 +1704,7 @@
               <w:rPr>
                 <w:sz w:val="19"/>
               </w:rPr>
-              <w:t xml:space="preserve">R-235</w:t>
+              <w:t xml:space="preserve">R-236, D-05</w:t>
             </w:r>
           </w:p>
         </w:tc>
@@ -1485,7 +1722,7 @@
               <w:rPr>
                 <w:sz w:val="19"/>
               </w:rPr>
-              <w:t xml:space="preserve">0.18</w:t>
+              <w:t xml:space="preserve">0.21</w:t>
             </w:r>
           </w:p>
         </w:tc>
@@ -1541,32 +1778,7 @@
               <w:rPr>
                 <w:sz w:val="19"/>
               </w:rPr>
-              <w:t xml:space="preserve">Server diviso per argomento, prima che</w:t>
-            </w:r>
-            <w:r>
-              <w:rPr>
-                <w:sz w:val="19"/>
-              </w:rPr>
-              <w:t xml:space="preserve"> </w:t>
-            </w:r>
-            <w:r>
-              <w:rPr>
-                <w:rStyle w:val="VerbatimChar"/>
-                <w:sz w:val="19"/>
-              </w:rPr>
-              <w:t xml:space="preserve">src/worker.js</w:t>
-            </w:r>
-            <w:r>
-              <w:rPr>
-                <w:sz w:val="19"/>
-              </w:rPr>
-              <w:t xml:space="preserve"> </w:t>
-            </w:r>
-            <w:r>
-              <w:rPr>
-                <w:sz w:val="19"/>
-              </w:rPr>
-              <w:t xml:space="preserve">superi le 1.000 righe</w:t>
+              <w:t xml:space="preserve">Prestazioni misurate ogni notte, con soglie (fps, peso della pagina, caricamento)</w:t>
             </w:r>
           </w:p>
         </w:tc>
@@ -1584,7 +1796,7 @@
               <w:rPr>
                 <w:sz w:val="19"/>
               </w:rPr>
-              <w:t xml:space="preserve">Ogni novità del server tocca un file piccolo</w:t>
+              <w:t xml:space="preserve">Si vede subito se una novità rallenta il gioco</w:t>
             </w:r>
           </w:p>
         </w:tc>
@@ -1602,7 +1814,7 @@
               <w:rPr>
                 <w:sz w:val="19"/>
               </w:rPr>
-              <w:t xml:space="preserve">A-20</w:t>
+              <w:t xml:space="preserve">A-14</w:t>
             </w:r>
           </w:p>
         </w:tc>
@@ -1620,7 +1832,7 @@
               <w:rPr>
                 <w:sz w:val="19"/>
               </w:rPr>
-              <w:t xml:space="preserve">0.18.x</w:t>
+              <w:t xml:space="preserve">—</w:t>
             </w:r>
           </w:p>
         </w:tc>
@@ -1677,43 +1889,7 @@
               <w:rPr>
                 <w:sz w:val="19"/>
               </w:rPr>
-              <w:t xml:space="preserve">Link</w:t>
-            </w:r>
-            <w:r>
-              <w:rPr>
-                <w:sz w:val="19"/>
-              </w:rPr>
-              <w:t xml:space="preserve"> </w:t>
-            </w:r>
-            <w:r>
-              <w:rPr>
-                <w:sz w:val="19"/>
-              </w:rPr>
-              <w:t xml:space="preserve">“</w:t>
-            </w:r>
-            <w:r>
-              <w:rPr>
-                <w:sz w:val="19"/>
-              </w:rPr>
-              <w:t xml:space="preserve">batti il mio tempo</w:t>
-            </w:r>
-            <w:r>
-              <w:rPr>
-                <w:sz w:val="19"/>
-              </w:rPr>
-              <w:t xml:space="preserve">”</w:t>
-            </w:r>
-            <w:r>
-              <w:rPr>
-                <w:sz w:val="19"/>
-              </w:rPr>
-              <w:t xml:space="preserve"> </w:t>
-            </w:r>
-            <w:r>
-              <w:rPr>
-                <w:sz w:val="19"/>
-              </w:rPr>
-              <w:t xml:space="preserve">con il fantasma e immagine del risultato</w:t>
+              <w:t xml:space="preserve">Pagina più leggera: file del gioco uniti e compressi, città scaricate solo quando servono</w:t>
             </w:r>
           </w:p>
         </w:tc>
@@ -1731,7 +1907,7 @@
               <w:rPr>
                 <w:sz w:val="19"/>
               </w:rPr>
-              <w:t xml:space="preserve">Chi gioca porta altri giocatori</w:t>
+              <w:t xml:space="preserve">Il caricamento non cresce con le città nuove</w:t>
             </w:r>
           </w:p>
         </w:tc>
@@ -1749,7 +1925,7 @@
               <w:rPr>
                 <w:sz w:val="19"/>
               </w:rPr>
-              <w:t xml:space="preserve">R-236, D-05</w:t>
+              <w:t xml:space="preserve">A-19</w:t>
             </w:r>
           </w:p>
         </w:tc>
@@ -1767,25 +1943,26 @@
               <w:rPr>
                 <w:sz w:val="19"/>
               </w:rPr>
-              <w:t xml:space="preserve">0.19</w:t>
+              <w:t xml:space="preserve">0.22</w:t>
             </w:r>
           </w:p>
         </w:tc>
         <w:tc>
           <w:tcPr>
             <w:tcW w:type="dxa" w:w="1304"/>
-          </w:tcPr>
-          <w:p>
-            <w:pPr>
-              <w:pStyle w:val="Compact"/>
-              <w:spacing w:after="40"/>
-              <w:jc w:val="left"/>
-            </w:pPr>
-            <w:r>
-              <w:rPr>
-                <w:sz w:val="19"/>
-              </w:rPr>
-              <w:t xml:space="preserve">No</w:t>
+            <w:shd w:val="clear" w:color="auto" w:fill="FFF1C7"/>
+          </w:tcPr>
+          <w:p>
+            <w:pPr>
+              <w:pStyle w:val="Compact"/>
+              <w:spacing w:after="40"/>
+              <w:jc w:val="left"/>
+            </w:pPr>
+            <w:r>
+              <w:rPr>
+                <w:sz w:val="19"/>
+              </w:rPr>
+              <w:t xml:space="preserve">Da approvare</w:t>
             </w:r>
           </w:p>
         </w:tc>
@@ -1823,7 +2000,7 @@
               <w:rPr>
                 <w:sz w:val="19"/>
               </w:rPr>
-              <w:t xml:space="preserve">Prestazioni misurate ogni notte, con soglie (fps, peso della pagina, caricamento)</w:t>
+              <w:t xml:space="preserve">Prove divise per modulo: il cancello prova solo i moduli toccati, la notte tutto</w:t>
             </w:r>
           </w:p>
         </w:tc>
@@ -1841,7 +2018,7 @@
               <w:rPr>
                 <w:sz w:val="19"/>
               </w:rPr>
-              <w:t xml:space="preserve">Si vede subito se una novità rallenta il gioco</w:t>
+              <w:t xml:space="preserve">Il cancello resta veloce anche con molti moduli</w:t>
             </w:r>
           </w:p>
         </w:tc>
@@ -1859,7 +2036,7 @@
               <w:rPr>
                 <w:sz w:val="19"/>
               </w:rPr>
-              <w:t xml:space="preserve">A-14</w:t>
+              <w:t xml:space="preserve">A-22</w:t>
             </w:r>
           </w:p>
         </w:tc>
@@ -1934,7 +2111,7 @@
               <w:rPr>
                 <w:sz w:val="19"/>
               </w:rPr>
-              <w:t xml:space="preserve">Pagina più leggera: file del gioco uniti e compressi, città scaricate solo quando servono, Three.js dal sito stesso</w:t>
+              <w:t xml:space="preserve">Fisica sul server: controllo contro chi bara (la fisica è già in un modulo solo, A-23)</w:t>
             </w:r>
           </w:p>
         </w:tc>
@@ -1952,7 +2129,7 @@
               <w:rPr>
                 <w:sz w:val="19"/>
               </w:rPr>
-              <w:t xml:space="preserve">Il caricamento non cresce con le città nuove</w:t>
+              <w:t xml:space="preserve">Serve ai fantasmi e alle classifiche</w:t>
             </w:r>
           </w:p>
         </w:tc>
@@ -1970,7 +2147,7 @@
               <w:rPr>
                 <w:sz w:val="19"/>
               </w:rPr>
-              <w:t xml:space="preserve">A-19, A-16</w:t>
+              <w:t xml:space="preserve">A-11, F-04</w:t>
             </w:r>
           </w:p>
         </w:tc>
@@ -1988,26 +2165,25 @@
               <w:rPr>
                 <w:sz w:val="19"/>
               </w:rPr>
-              <w:t xml:space="preserve">0.20</w:t>
+              <w:t xml:space="preserve">0.23</w:t>
             </w:r>
           </w:p>
         </w:tc>
         <w:tc>
           <w:tcPr>
             <w:tcW w:type="dxa" w:w="1304"/>
-            <w:shd w:val="clear" w:color="auto" w:fill="FFF1C7"/>
-          </w:tcPr>
-          <w:p>
-            <w:pPr>
-              <w:pStyle w:val="Compact"/>
-              <w:spacing w:after="40"/>
-              <w:jc w:val="left"/>
-            </w:pPr>
-            <w:r>
-              <w:rPr>
-                <w:sz w:val="19"/>
-              </w:rPr>
-              <w:t xml:space="preserve">Da approvare</w:t>
+          </w:tcPr>
+          <w:p>
+            <w:pPr>
+              <w:pStyle w:val="Compact"/>
+              <w:spacing w:after="40"/>
+              <w:jc w:val="left"/>
+            </w:pPr>
+            <w:r>
+              <w:rPr>
+                <w:sz w:val="19"/>
+              </w:rPr>
+              <w:t xml:space="preserve">No</w:t>
             </w:r>
           </w:p>
         </w:tc>
@@ -2045,7 +2221,7 @@
               <w:rPr>
                 <w:sz w:val="19"/>
               </w:rPr>
-              <w:t xml:space="preserve">Prove divise per modulo: il cancello prova solo i moduli toccati, la notte tutto</w:t>
+              <w:t xml:space="preserve">Dati del server divisi per argomento</w:t>
             </w:r>
           </w:p>
         </w:tc>
@@ -2063,7 +2239,7 @@
               <w:rPr>
                 <w:sz w:val="19"/>
               </w:rPr>
-              <w:t xml:space="preserve">Il cancello resta veloce anche con molti moduli</w:t>
+              <w:t xml:space="preserve">Un solo punto di passaggio rallenterebbe con molti giocatori</w:t>
             </w:r>
           </w:p>
         </w:tc>
@@ -2081,7 +2257,7 @@
               <w:rPr>
                 <w:sz w:val="19"/>
               </w:rPr>
-              <w:t xml:space="preserve">A-22</w:t>
+              <w:t xml:space="preserve">A-21</w:t>
             </w:r>
           </w:p>
         </w:tc>
@@ -2099,26 +2275,25 @@
               <w:rPr>
                 <w:sz w:val="19"/>
               </w:rPr>
-              <w:t xml:space="preserve">—</w:t>
+              <w:t xml:space="preserve">quando le misure lo chiedono</w:t>
             </w:r>
           </w:p>
         </w:tc>
         <w:tc>
           <w:tcPr>
             <w:tcW w:type="dxa" w:w="1304"/>
-            <w:shd w:val="clear" w:color="auto" w:fill="FFF1C7"/>
-          </w:tcPr>
-          <w:p>
-            <w:pPr>
-              <w:pStyle w:val="Compact"/>
-              <w:spacing w:after="40"/>
-              <w:jc w:val="left"/>
-            </w:pPr>
-            <w:r>
-              <w:rPr>
-                <w:sz w:val="19"/>
-              </w:rPr>
-              <w:t xml:space="preserve">Da approvare</w:t>
+          </w:tcPr>
+          <w:p>
+            <w:pPr>
+              <w:pStyle w:val="Compact"/>
+              <w:spacing w:after="40"/>
+              <w:jc w:val="left"/>
+            </w:pPr>
+            <w:r>
+              <w:rPr>
+                <w:sz w:val="19"/>
+              </w:rPr>
+              <w:t xml:space="preserve">No</w:t>
             </w:r>
           </w:p>
         </w:tc>
@@ -2156,226 +2331,6 @@
               <w:rPr>
                 <w:sz w:val="19"/>
               </w:rPr>
-              <w:t xml:space="preserve">Fisica separata dalla grafica, poi controllo contro chi bara sul server</w:t>
-            </w:r>
-          </w:p>
-        </w:tc>
-        <w:tc>
-          <w:tcPr>
-            <w:tcW w:type="dxa" w:w="2494"/>
-          </w:tcPr>
-          <w:p>
-            <w:pPr>
-              <w:pStyle w:val="Compact"/>
-              <w:spacing w:after="40"/>
-              <w:jc w:val="left"/>
-            </w:pPr>
-            <w:r>
-              <w:rPr>
-                <w:sz w:val="19"/>
-              </w:rPr>
-              <w:t xml:space="preserve">Serve anche ai fantasmi e alle classifiche</w:t>
-            </w:r>
-          </w:p>
-        </w:tc>
-        <w:tc>
-          <w:tcPr>
-            <w:tcW w:type="dxa" w:w="1247"/>
-          </w:tcPr>
-          <w:p>
-            <w:pPr>
-              <w:pStyle w:val="Compact"/>
-              <w:spacing w:after="40"/>
-              <w:jc w:val="left"/>
-            </w:pPr>
-            <w:r>
-              <w:rPr>
-                <w:sz w:val="19"/>
-              </w:rPr>
-              <w:t xml:space="preserve">A-11</w:t>
-            </w:r>
-          </w:p>
-        </w:tc>
-        <w:tc>
-          <w:tcPr>
-            <w:tcW w:type="dxa" w:w="1134"/>
-          </w:tcPr>
-          <w:p>
-            <w:pPr>
-              <w:pStyle w:val="Compact"/>
-              <w:spacing w:after="40"/>
-              <w:jc w:val="left"/>
-            </w:pPr>
-            <w:r>
-              <w:rPr>
-                <w:sz w:val="19"/>
-              </w:rPr>
-              <w:t xml:space="preserve">0.21</w:t>
-            </w:r>
-          </w:p>
-        </w:tc>
-        <w:tc>
-          <w:tcPr>
-            <w:tcW w:type="dxa" w:w="1304"/>
-          </w:tcPr>
-          <w:p>
-            <w:pPr>
-              <w:pStyle w:val="Compact"/>
-              <w:spacing w:after="40"/>
-              <w:jc w:val="left"/>
-            </w:pPr>
-            <w:r>
-              <w:rPr>
-                <w:sz w:val="19"/>
-              </w:rPr>
-              <w:t xml:space="preserve">No</w:t>
-            </w:r>
-          </w:p>
-        </w:tc>
-      </w:tr>
-      <w:tr>
-        <w:tc>
-          <w:tcPr>
-            <w:tcW w:type="dxa" w:w="510"/>
-          </w:tcPr>
-          <w:p>
-            <w:pPr>
-              <w:pStyle w:val="Compact"/>
-              <w:spacing w:after="40"/>
-              <w:jc w:val="left"/>
-            </w:pPr>
-            <w:r>
-              <w:rPr>
-                <w:sz w:val="19"/>
-              </w:rPr>
-              <w:t xml:space="preserve">9</w:t>
-            </w:r>
-          </w:p>
-        </w:tc>
-        <w:tc>
-          <w:tcPr>
-            <w:tcW w:type="dxa" w:w="3175"/>
-          </w:tcPr>
-          <w:p>
-            <w:pPr>
-              <w:pStyle w:val="Compact"/>
-              <w:spacing w:after="40"/>
-              <w:jc w:val="left"/>
-            </w:pPr>
-            <w:r>
-              <w:rPr>
-                <w:sz w:val="19"/>
-              </w:rPr>
-              <w:t xml:space="preserve">Dati del server divisi per argomento</w:t>
-            </w:r>
-          </w:p>
-        </w:tc>
-        <w:tc>
-          <w:tcPr>
-            <w:tcW w:type="dxa" w:w="2494"/>
-          </w:tcPr>
-          <w:p>
-            <w:pPr>
-              <w:pStyle w:val="Compact"/>
-              <w:spacing w:after="40"/>
-              <w:jc w:val="left"/>
-            </w:pPr>
-            <w:r>
-              <w:rPr>
-                <w:sz w:val="19"/>
-              </w:rPr>
-              <w:t xml:space="preserve">Un solo punto di passaggio rallenterebbe con molti giocatori</w:t>
-            </w:r>
-          </w:p>
-        </w:tc>
-        <w:tc>
-          <w:tcPr>
-            <w:tcW w:type="dxa" w:w="1247"/>
-          </w:tcPr>
-          <w:p>
-            <w:pPr>
-              <w:pStyle w:val="Compact"/>
-              <w:spacing w:after="40"/>
-              <w:jc w:val="left"/>
-            </w:pPr>
-            <w:r>
-              <w:rPr>
-                <w:sz w:val="19"/>
-              </w:rPr>
-              <w:t xml:space="preserve">A-21</w:t>
-            </w:r>
-          </w:p>
-        </w:tc>
-        <w:tc>
-          <w:tcPr>
-            <w:tcW w:type="dxa" w:w="1134"/>
-          </w:tcPr>
-          <w:p>
-            <w:pPr>
-              <w:pStyle w:val="Compact"/>
-              <w:spacing w:after="40"/>
-              <w:jc w:val="left"/>
-            </w:pPr>
-            <w:r>
-              <w:rPr>
-                <w:sz w:val="19"/>
-              </w:rPr>
-              <w:t xml:space="preserve">quando le misure lo chiedono</w:t>
-            </w:r>
-          </w:p>
-        </w:tc>
-        <w:tc>
-          <w:tcPr>
-            <w:tcW w:type="dxa" w:w="1304"/>
-          </w:tcPr>
-          <w:p>
-            <w:pPr>
-              <w:pStyle w:val="Compact"/>
-              <w:spacing w:after="40"/>
-              <w:jc w:val="left"/>
-            </w:pPr>
-            <w:r>
-              <w:rPr>
-                <w:sz w:val="19"/>
-              </w:rPr>
-              <w:t xml:space="preserve">No</w:t>
-            </w:r>
-          </w:p>
-        </w:tc>
-      </w:tr>
-      <w:tr>
-        <w:tc>
-          <w:tcPr>
-            <w:tcW w:type="dxa" w:w="510"/>
-          </w:tcPr>
-          <w:p>
-            <w:pPr>
-              <w:pStyle w:val="Compact"/>
-              <w:spacing w:after="40"/>
-              <w:jc w:val="left"/>
-            </w:pPr>
-            <w:r>
-              <w:rPr>
-                <w:sz w:val="19"/>
-              </w:rPr>
-              <w:t xml:space="preserve">10</w:t>
-            </w:r>
-          </w:p>
-        </w:tc>
-        <w:tc>
-          <w:tcPr>
-            <w:tcW w:type="dxa" w:w="3175"/>
-          </w:tcPr>
-          <w:p>
-            <w:pPr>
-              <w:pStyle w:val="Compact"/>
-              <w:spacing w:after="40"/>
-              <w:jc w:val="left"/>
-            </w:pPr>
-            <w:r>
-              <w:rPr>
-                <w:sz w:val="19"/>
-              </w:rPr>
               <w:t xml:space="preserve">Parte comune C-Y-F per il secondo gioco, controllo dei tipi, interruttori per le novità</w:t>
             </w:r>
           </w:p>
@@ -2454,6 +2409,14 @@
         </w:tc>
       </w:tr>
     </w:tbl>
+    <w:p>
+      <w:pPr>
+        <w:pStyle w:val="BodyText"/>
+      </w:pPr>
+      <w:r>
+        <w:t xml:space="preserve">Fatti e tolti da questa tabella il 26-27/10: avversari del computer al posto dei fantasmi (R-234, R-235, 0.18.0), server diviso per argomento (A-20, 0.18.1), Three.js dal sito stesso (A-16, 0.18.1), velocità reali e ostacoli −30% (R-242, R-313, 0.19.0).</w:t>
+      </w:r>
+    </w:p>
     <w:bookmarkEnd w:id="21"/>
     <w:bookmarkStart w:id="22" w:name="regole-di-lavoro-decise-da-luigi"/>
     <w:p>
@@ -9855,6 +9818,341 @@
           </w:p>
         </w:tc>
       </w:tr>
+      <w:tr>
+        <w:tc>
+          <w:tcPr>
+            <w:tcW w:type="dxa" w:w="907"/>
+          </w:tcPr>
+          <w:p>
+            <w:pPr>
+              <w:pStyle w:val="Compact"/>
+              <w:spacing w:after="40"/>
+              <w:jc w:val="left"/>
+            </w:pPr>
+            <w:r>
+              <w:rPr>
+                <w:sz w:val="19"/>
+              </w:rPr>
+              <w:t xml:space="preserve">R-240</w:t>
+            </w:r>
+          </w:p>
+        </w:tc>
+        <w:tc>
+          <w:tcPr>
+            <w:tcW w:type="dxa" w:w="4195"/>
+          </w:tcPr>
+          <w:p>
+            <w:pPr>
+              <w:pStyle w:val="Compact"/>
+              <w:spacing w:after="40"/>
+              <w:jc w:val="left"/>
+            </w:pPr>
+            <w:r>
+              <w:rPr>
+                <w:sz w:val="19"/>
+              </w:rPr>
+              <w:t xml:space="preserve">Sul trampolino più grande compare la scritta CYF</w:t>
+            </w:r>
+          </w:p>
+        </w:tc>
+        <w:tc>
+          <w:tcPr>
+            <w:tcW w:type="dxa" w:w="1134"/>
+          </w:tcPr>
+          <w:p>
+            <w:pPr>
+              <w:pStyle w:val="Compact"/>
+              <w:spacing w:after="40"/>
+              <w:jc w:val="left"/>
+            </w:pPr>
+            <w:r>
+              <w:rPr>
+                <w:sz w:val="19"/>
+              </w:rPr>
+              <w:t xml:space="preserve">26/10/2026</w:t>
+            </w:r>
+          </w:p>
+        </w:tc>
+        <w:tc>
+          <w:tcPr>
+            <w:tcW w:type="dxa" w:w="1134"/>
+            <w:shd w:val="clear" w:color="auto" w:fill="D7F0DF"/>
+          </w:tcPr>
+          <w:p>
+            <w:pPr>
+              <w:pStyle w:val="Compact"/>
+              <w:spacing w:after="40"/>
+              <w:jc w:val="left"/>
+            </w:pPr>
+            <w:r>
+              <w:rPr>
+                <w:sz w:val="19"/>
+              </w:rPr>
+              <w:t xml:space="preserve">Fatto</w:t>
+            </w:r>
+          </w:p>
+        </w:tc>
+        <w:tc>
+          <w:tcPr>
+            <w:tcW w:type="dxa" w:w="2494"/>
+          </w:tcPr>
+          <w:p>
+            <w:pPr>
+              <w:pStyle w:val="Compact"/>
+              <w:spacing w:after="40"/>
+              <w:jc w:val="left"/>
+            </w:pPr>
+            <w:r>
+              <w:rPr>
+                <w:sz w:val="19"/>
+              </w:rPr>
+              <w:t xml:space="preserve">Dalla 0.19.0. Sul trampolino gigante (R-214) la scritta</w:t>
+            </w:r>
+            <w:r>
+              <w:rPr>
+                <w:sz w:val="19"/>
+              </w:rPr>
+              <w:t xml:space="preserve"> </w:t>
+            </w:r>
+            <w:r>
+              <w:rPr>
+                <w:bCs/>
+                <w:b/>
+                <w:sz w:val="19"/>
+              </w:rPr>
+              <w:t xml:space="preserve">CYF</w:t>
+            </w:r>
+            <w:r>
+              <w:rPr>
+                <w:sz w:val="19"/>
+              </w:rPr>
+              <w:t xml:space="preserve"> </w:t>
+            </w:r>
+            <w:r>
+              <w:rPr>
+                <w:sz w:val="19"/>
+              </w:rPr>
+              <w:t xml:space="preserve">in grande sulla superficie in salita, con i colori dello stemma (arancione con il bordo bianco su fondo blu notte): segue la curva della rampa, si legge arrivando, sulla neve e in tutte le città. Le rampe normali restano senza scritta</w:t>
+            </w:r>
+          </w:p>
+        </w:tc>
+      </w:tr>
+      <w:tr>
+        <w:tc>
+          <w:tcPr>
+            <w:tcW w:type="dxa" w:w="907"/>
+          </w:tcPr>
+          <w:p>
+            <w:pPr>
+              <w:pStyle w:val="Compact"/>
+              <w:spacing w:after="40"/>
+              <w:jc w:val="left"/>
+            </w:pPr>
+            <w:r>
+              <w:rPr>
+                <w:sz w:val="19"/>
+              </w:rPr>
+              <w:t xml:space="preserve">R-241</w:t>
+            </w:r>
+          </w:p>
+        </w:tc>
+        <w:tc>
+          <w:tcPr>
+            <w:tcW w:type="dxa" w:w="4195"/>
+          </w:tcPr>
+          <w:p>
+            <w:pPr>
+              <w:pStyle w:val="Compact"/>
+              <w:spacing w:after="40"/>
+              <w:jc w:val="left"/>
+            </w:pPr>
+            <w:r>
+              <w:rPr>
+                <w:sz w:val="19"/>
+              </w:rPr>
+              <w:t xml:space="preserve">Nuova regola: se mi lanciano una banana o un bananone mentre sono in aria, non mi colpisce</w:t>
+            </w:r>
+          </w:p>
+        </w:tc>
+        <w:tc>
+          <w:tcPr>
+            <w:tcW w:type="dxa" w:w="1134"/>
+          </w:tcPr>
+          <w:p>
+            <w:pPr>
+              <w:pStyle w:val="Compact"/>
+              <w:spacing w:after="40"/>
+              <w:jc w:val="left"/>
+            </w:pPr>
+            <w:r>
+              <w:rPr>
+                <w:sz w:val="19"/>
+              </w:rPr>
+              <w:t xml:space="preserve">26/10/2026</w:t>
+            </w:r>
+          </w:p>
+        </w:tc>
+        <w:tc>
+          <w:tcPr>
+            <w:tcW w:type="dxa" w:w="1134"/>
+            <w:shd w:val="clear" w:color="auto" w:fill="D7F0DF"/>
+          </w:tcPr>
+          <w:p>
+            <w:pPr>
+              <w:pStyle w:val="Compact"/>
+              <w:spacing w:after="40"/>
+              <w:jc w:val="left"/>
+            </w:pPr>
+            <w:r>
+              <w:rPr>
+                <w:sz w:val="19"/>
+              </w:rPr>
+              <w:t xml:space="preserve">Fatto</w:t>
+            </w:r>
+          </w:p>
+        </w:tc>
+        <w:tc>
+          <w:tcPr>
+            <w:tcW w:type="dxa" w:w="2494"/>
+          </w:tcPr>
+          <w:p>
+            <w:pPr>
+              <w:pStyle w:val="Compact"/>
+              <w:spacing w:after="40"/>
+              <w:jc w:val="left"/>
+            </w:pPr>
+            <w:r>
+              <w:rPr>
+                <w:sz w:val="19"/>
+              </w:rPr>
+              <w:t xml:space="preserve">Dalla 0.19.0. Quando la banana o il bananone lanciati arrivano, chi è in aria (salto, rampa, trampolino) non cade e non si ferma; compare</w:t>
+            </w:r>
+            <w:r>
+              <w:rPr>
+                <w:sz w:val="19"/>
+              </w:rPr>
+              <w:t xml:space="preserve"> </w:t>
+            </w:r>
+            <w:r>
+              <w:rPr>
+                <w:sz w:val="19"/>
+              </w:rPr>
+              <w:t xml:space="preserve">“</w:t>
+            </w:r>
+            <w:r>
+              <w:rPr>
+                <w:sz w:val="19"/>
+              </w:rPr>
+              <w:t xml:space="preserve">Schivata in aria!</w:t>
+            </w:r>
+            <w:r>
+              <w:rPr>
+                <w:sz w:val="19"/>
+              </w:rPr>
+              <w:t xml:space="preserve">”</w:t>
+            </w:r>
+            <w:r>
+              <w:rPr>
+                <w:sz w:val="19"/>
+              </w:rPr>
+              <w:t xml:space="preserve">. La regola vale per tutti, anche per gli avversari del computer. Come prima, banane, bombe e bananoni appoggiati sulla pista si saltano: in aria non si toccano</w:t>
+            </w:r>
+          </w:p>
+        </w:tc>
+      </w:tr>
+      <w:tr>
+        <w:tc>
+          <w:tcPr>
+            <w:tcW w:type="dxa" w:w="907"/>
+          </w:tcPr>
+          <w:p>
+            <w:pPr>
+              <w:pStyle w:val="Compact"/>
+              <w:spacing w:after="40"/>
+              <w:jc w:val="left"/>
+            </w:pPr>
+            <w:r>
+              <w:rPr>
+                <w:sz w:val="19"/>
+              </w:rPr>
+              <w:t xml:space="preserve">R-242</w:t>
+            </w:r>
+          </w:p>
+        </w:tc>
+        <w:tc>
+          <w:tcPr>
+            <w:tcW w:type="dxa" w:w="4195"/>
+          </w:tcPr>
+          <w:p>
+            <w:pPr>
+              <w:pStyle w:val="Compact"/>
+              <w:spacing w:after="40"/>
+              <w:jc w:val="left"/>
+            </w:pPr>
+            <w:r>
+              <w:rPr>
+                <w:sz w:val="19"/>
+              </w:rPr>
+              <w:t xml:space="preserve">Velocità come nella realtà: massimo 80 km/h, difficile da raggiungere; media intorno ai 50 km/h</w:t>
+            </w:r>
+          </w:p>
+        </w:tc>
+        <w:tc>
+          <w:tcPr>
+            <w:tcW w:type="dxa" w:w="1134"/>
+          </w:tcPr>
+          <w:p>
+            <w:pPr>
+              <w:pStyle w:val="Compact"/>
+              <w:spacing w:after="40"/>
+              <w:jc w:val="left"/>
+            </w:pPr>
+            <w:r>
+              <w:rPr>
+                <w:sz w:val="19"/>
+              </w:rPr>
+              <w:t xml:space="preserve">26/10/2026</w:t>
+            </w:r>
+          </w:p>
+        </w:tc>
+        <w:tc>
+          <w:tcPr>
+            <w:tcW w:type="dxa" w:w="1134"/>
+            <w:shd w:val="clear" w:color="auto" w:fill="D7F0DF"/>
+          </w:tcPr>
+          <w:p>
+            <w:pPr>
+              <w:pStyle w:val="Compact"/>
+              <w:spacing w:after="40"/>
+              <w:jc w:val="left"/>
+            </w:pPr>
+            <w:r>
+              <w:rPr>
+                <w:sz w:val="19"/>
+              </w:rPr>
+              <w:t xml:space="preserve">Fatto</w:t>
+            </w:r>
+          </w:p>
+        </w:tc>
+        <w:tc>
+          <w:tcPr>
+            <w:tcW w:type="dxa" w:w="2494"/>
+          </w:tcPr>
+          <w:p>
+            <w:pPr>
+              <w:pStyle w:val="Compact"/>
+              <w:spacing w:after="40"/>
+              <w:jc w:val="left"/>
+            </w:pPr>
+            <w:r>
+              <w:rPr>
+                <w:sz w:val="19"/>
+              </w:rPr>
+              <w:t xml:space="preserve">Dalla 0.19.0. Dati: in uno studio con radar su 1.023 sciatori e snowboarder su piste blu dei Pirenei (2021-22) la media è 52 km/h (snowboarder 44, sciatori 53) e la massima 81,7 km/h. Nel gioco: 80 km/h solo in posizione raccolta, sul tratto più ripido e dopo tanta pista; senza raccolta ~71 km/h; le rampe non fanno superare gli 80. La gara di 5 minuti diventa di ~4,2 km (10 min ~8,4 km, 15 min ~12,6 km): le durate restano quelle, cambia la lunghezza. La classifica generale riparte (i tempi sui 12 km non sono confrontabili). Avversari del computer ricalibrati: su 6 piste simulate da 4,2 km il forte fa 4:31 (56 km/h di media, punta 77), il medio 5:24 (47 km/h), il lento 6:01 (42 km/h). Nota: in città nella realtà lo skate va molto più piano (8-19 km/h girando per strada); 80 km/h si raggiungono solo nel downhill con il longboard. Nel gioco la velocità resta uguale su neve e città (S-41)</w:t>
+            </w:r>
+          </w:p>
+        </w:tc>
+      </w:tr>
     </w:tbl>
     <w:bookmarkEnd w:id="27"/>
     <w:bookmarkStart w:id="28" w:name="scenari-e-città"/>
@@ -11168,6 +11466,99 @@
           </w:p>
         </w:tc>
       </w:tr>
+      <w:tr>
+        <w:tc>
+          <w:tcPr>
+            <w:tcW w:type="dxa" w:w="907"/>
+          </w:tcPr>
+          <w:p>
+            <w:pPr>
+              <w:pStyle w:val="Compact"/>
+              <w:spacing w:after="40"/>
+              <w:jc w:val="left"/>
+            </w:pPr>
+            <w:r>
+              <w:rPr>
+                <w:sz w:val="19"/>
+              </w:rPr>
+              <w:t xml:space="preserve">R-405</w:t>
+            </w:r>
+          </w:p>
+        </w:tc>
+        <w:tc>
+          <w:tcPr>
+            <w:tcW w:type="dxa" w:w="4195"/>
+          </w:tcPr>
+          <w:p>
+            <w:pPr>
+              <w:pStyle w:val="Compact"/>
+              <w:spacing w:after="40"/>
+              <w:jc w:val="left"/>
+            </w:pPr>
+            <w:r>
+              <w:rPr>
+                <w:sz w:val="19"/>
+              </w:rPr>
+              <w:t xml:space="preserve">Sfondi delle città più belli e con risoluzione migliore, come la classica veduta di ogni città</w:t>
+            </w:r>
+          </w:p>
+        </w:tc>
+        <w:tc>
+          <w:tcPr>
+            <w:tcW w:type="dxa" w:w="1134"/>
+          </w:tcPr>
+          <w:p>
+            <w:pPr>
+              <w:pStyle w:val="Compact"/>
+              <w:spacing w:after="40"/>
+              <w:jc w:val="left"/>
+            </w:pPr>
+            <w:r>
+              <w:rPr>
+                <w:sz w:val="19"/>
+              </w:rPr>
+              <w:t xml:space="preserve">26/10/2026</w:t>
+            </w:r>
+          </w:p>
+        </w:tc>
+        <w:tc>
+          <w:tcPr>
+            <w:tcW w:type="dxa" w:w="1134"/>
+            <w:shd w:val="clear" w:color="auto" w:fill="FDE2D6"/>
+          </w:tcPr>
+          <w:p>
+            <w:pPr>
+              <w:pStyle w:val="Compact"/>
+              <w:spacing w:after="40"/>
+              <w:jc w:val="left"/>
+            </w:pPr>
+            <w:r>
+              <w:rPr>
+                <w:sz w:val="19"/>
+              </w:rPr>
+              <w:t xml:space="preserve">Da fare</w:t>
+            </w:r>
+          </w:p>
+        </w:tc>
+        <w:tc>
+          <w:tcPr>
+            <w:tcW w:type="dxa" w:w="2494"/>
+          </w:tcPr>
+          <w:p>
+            <w:pPr>
+              <w:pStyle w:val="Compact"/>
+              <w:spacing w:after="40"/>
+              <w:jc w:val="left"/>
+            </w:pPr>
+            <w:r>
+              <w:rPr>
+                <w:sz w:val="19"/>
+              </w:rPr>
+              <w:t xml:space="preserve">Per ogni città un panorama dipinto in alta risoluzione (sul telefono metà), ispirato alla veduta più classica (cartolina) della città, con il monumento in fondo alla strada come chiesto in R-308: cielo e foschia, colline o mare, palazzi su più piani con finestre e luce, monumenti disegnati bene. Le foto trovate su Google si guardano solo come riferimento: non si possono usare per i diritti d’autore</w:t>
+            </w:r>
+          </w:p>
+        </w:tc>
+      </w:tr>
     </w:tbl>
     <w:bookmarkEnd w:id="29"/>
     <w:bookmarkStart w:id="30" w:name="documentazione"/>
@@ -12130,7 +12521,7 @@
               <w:rPr>
                 <w:sz w:val="19"/>
               </w:rPr>
-              <w:t xml:space="preserve">, si fa il cancello e si pubblica subito (S-41). Fino al 26/10 di giorno girava il cancello rapido</w:t>
+              <w:t xml:space="preserve">, si fa il cancello e si pubblica subito (S-43). Fino al 26/10 di giorno girava il cancello rapido</w:t>
             </w:r>
           </w:p>
         </w:tc>
@@ -17020,7 +17411,183 @@
               <w:rPr>
                 <w:sz w:val="19"/>
               </w:rPr>
-              <w:t xml:space="preserve">Fantasmi (R-234), scelte di Claude: non si possono colpire con banane, bombe e bananoni e non possono colpire (non c’è nessuno da fermare); sono trasparenti, con nome e tempo, e non entrano nella classifica dal vivo dei giocatori veri</w:t>
+              <w:t xml:space="preserve">Avversari (R-234…R-239), scelte di Claude:</w:t>
+            </w:r>
+            <w:r>
+              <w:rPr>
+                <w:sz w:val="19"/>
+              </w:rPr>
+              <w:t xml:space="preserve"> </w:t>
+            </w:r>
+            <w:r>
+              <w:rPr>
+                <w:bCs/>
+                <w:b/>
+                <w:sz w:val="19"/>
+              </w:rPr>
+              <w:t xml:space="preserve">chi li guida</w:t>
+            </w:r>
+            <w:r>
+              <w:rPr>
+                <w:sz w:val="19"/>
+              </w:rPr>
+              <w:t xml:space="preserve"> </w:t>
+            </w:r>
+            <w:r>
+              <w:rPr>
+                <w:sz w:val="19"/>
+              </w:rPr>
+              <w:t xml:space="preserve">è il telefono o PC di una persona in gara (chi organizza; nella sala online e nella pista del giorno la persona che c’è): il server non sa ancora calcolare il movimento (A-11). Se quella persona esce o il suo telefono si ferma per più di 3 s (per esempio l’app passa in secondo piano), gli avversari li prende un’altra persona in gara.</w:t>
+            </w:r>
+            <w:r>
+              <w:rPr>
+                <w:sz w:val="19"/>
+              </w:rPr>
+              <w:t xml:space="preserve"> </w:t>
+            </w:r>
+            <w:r>
+              <w:rPr>
+                <w:bCs/>
+                <w:b/>
+                <w:sz w:val="19"/>
+              </w:rPr>
+              <w:t xml:space="preserve">Fine della gara</w:t>
+            </w:r>
+            <w:r>
+              <w:rPr>
+                <w:sz w:val="19"/>
+              </w:rPr>
+              <w:t xml:space="preserve">: come oggi, quando tutte le persone sono arrivate; per gli avversari ancora in pista il tempo si calcola dalla loro velocità media fino a quel momento, così nessuno aspetta.</w:t>
+            </w:r>
+            <w:r>
+              <w:rPr>
+                <w:sz w:val="19"/>
+              </w:rPr>
+              <w:t xml:space="preserve"> </w:t>
+            </w:r>
+            <w:r>
+              <w:rPr>
+                <w:bCs/>
+                <w:b/>
+                <w:sz w:val="19"/>
+              </w:rPr>
+              <w:t xml:space="preserve">Nomi</w:t>
+            </w:r>
+            <w:r>
+              <w:rPr>
+                <w:sz w:val="19"/>
+              </w:rPr>
+              <w:t xml:space="preserve"> </w:t>
+            </w:r>
+            <w:r>
+              <w:rPr>
+                <w:sz w:val="19"/>
+              </w:rPr>
+              <w:t xml:space="preserve">presi da una lista di nomi comuni in più lingue, aspetto a caso dal loro codice, colori diversi da quelli delle persone.</w:t>
+            </w:r>
+            <w:r>
+              <w:rPr>
+                <w:sz w:val="19"/>
+              </w:rPr>
+              <w:t xml:space="preserve"> </w:t>
+            </w:r>
+            <w:r>
+              <w:rPr>
+                <w:bCs/>
+                <w:b/>
+                <w:sz w:val="19"/>
+              </w:rPr>
+              <w:t xml:space="preserve">Punti</w:t>
+            </w:r>
+            <w:r>
+              <w:rPr>
+                <w:sz w:val="19"/>
+              </w:rPr>
+              <w:t xml:space="preserve">: il piazzamento delle persone conta anche gli avversari (se un avversario arriva primo, chi è secondo prende i punti del 2°); gli avversari non prendono punti.</w:t>
+            </w:r>
+            <w:r>
+              <w:rPr>
+                <w:sz w:val="19"/>
+              </w:rPr>
+              <w:t xml:space="preserve"> </w:t>
+            </w:r>
+            <w:r>
+              <w:rPr>
+                <w:bCs/>
+                <w:b/>
+                <w:sz w:val="19"/>
+              </w:rPr>
+              <w:t xml:space="preserve">Sala online</w:t>
+            </w:r>
+            <w:r>
+              <w:rPr>
+                <w:sz w:val="19"/>
+              </w:rPr>
+              <w:t xml:space="preserve">: 15 s da soli, poi 3 avversari; con 2 o più persone niente avversari. Niente avversari nel menu (sullo sfondo resta il rider da solo). Nelle misure (R-232) gli avversari non contano.</w:t>
+            </w:r>
+            <w:r>
+              <w:rPr>
+                <w:sz w:val="19"/>
+              </w:rPr>
+              <w:t xml:space="preserve"> </w:t>
+            </w:r>
+            <w:r>
+              <w:rPr>
+                <w:bCs/>
+                <w:b/>
+                <w:sz w:val="19"/>
+              </w:rPr>
+              <w:t xml:space="preserve">Livelli tarati sui tempi veri</w:t>
+            </w:r>
+            <w:r>
+              <w:rPr>
+                <w:sz w:val="19"/>
+              </w:rPr>
+              <w:t xml:space="preserve">: in classifica (5 minuti, 12 km) c’erano due tempi, 7:28 e 8:04; su 6 piste simulate il forte fa in media 6:12, il medio 7:07, il lento 7:55, così chi gioca oggi batte almeno il lento e il forte resta una sfida. Da rivedere quando ci saranno più tempi (si cambiano in</w:t>
+            </w:r>
+            <w:r>
+              <w:rPr>
+                <w:sz w:val="19"/>
+              </w:rPr>
+              <w:t xml:space="preserve"> </w:t>
+            </w:r>
+            <w:r>
+              <w:rPr>
+                <w:rStyle w:val="VerbatimChar"/>
+                <w:sz w:val="19"/>
+              </w:rPr>
+              <w:t xml:space="preserve">LIV</w:t>
+            </w:r>
+            <w:r>
+              <w:rPr>
+                <w:sz w:val="19"/>
+              </w:rPr>
+              <w:t xml:space="preserve"> </w:t>
+            </w:r>
+            <w:r>
+              <w:rPr>
+                <w:sz w:val="19"/>
+              </w:rPr>
+              <w:t xml:space="preserve">dentro</w:t>
+            </w:r>
+            <w:r>
+              <w:rPr>
+                <w:sz w:val="19"/>
+              </w:rPr>
+              <w:t xml:space="preserve"> </w:t>
+            </w:r>
+            <w:r>
+              <w:rPr>
+                <w:rStyle w:val="VerbatimChar"/>
+                <w:sz w:val="19"/>
+              </w:rPr>
+              <w:t xml:space="preserve">moduli/bot.js</w:t>
+            </w:r>
+            <w:r>
+              <w:rPr>
+                <w:sz w:val="19"/>
+              </w:rPr>
+              <w:t xml:space="preserve">). Cadute per gara: forte 7-11, medio 10-16, lento 14-25 (di più nelle prime prove, prima di insegnare loro a frenare) Al posto di questa scelta c’erano i fantasmi (trasparenti, senza colpi), tolti su richiesta di Luigi</w:t>
             </w:r>
           </w:p>
         </w:tc>
@@ -17152,7 +17719,7 @@
               <w:rPr>
                 <w:sz w:val="19"/>
               </w:rPr>
-              <w:t xml:space="preserve">S-41</w:t>
+              <w:t xml:space="preserve">S-43</w:t>
             </w:r>
           </w:p>
         </w:tc>
@@ -17420,6 +17987,117 @@
                 <w:sz w:val="19"/>
               </w:rPr>
               <w:t xml:space="preserve">25/10/2026</w:t>
+            </w:r>
+          </w:p>
+        </w:tc>
+        <w:tc>
+          <w:tcPr>
+            <w:tcW w:type="dxa" w:w="1814"/>
+            <w:shd w:val="clear" w:color="auto" w:fill="E6EDF5"/>
+          </w:tcPr>
+          <w:p>
+            <w:pPr>
+              <w:pStyle w:val="Compact"/>
+              <w:spacing w:after="40"/>
+              <w:jc w:val="left"/>
+            </w:pPr>
+            <w:r>
+              <w:rPr>
+                <w:sz w:val="19"/>
+              </w:rPr>
+              <w:t xml:space="preserve">Da confermare</w:t>
+            </w:r>
+          </w:p>
+        </w:tc>
+      </w:tr>
+      <w:tr>
+        <w:tc>
+          <w:tcPr>
+            <w:tcW w:type="dxa" w:w="794"/>
+          </w:tcPr>
+          <w:p>
+            <w:pPr>
+              <w:pStyle w:val="Compact"/>
+              <w:spacing w:after="40"/>
+              <w:jc w:val="left"/>
+            </w:pPr>
+            <w:r>
+              <w:rPr>
+                <w:sz w:val="19"/>
+              </w:rPr>
+              <w:t xml:space="preserve">S-41</w:t>
+            </w:r>
+          </w:p>
+        </w:tc>
+        <w:tc>
+          <w:tcPr>
+            <w:tcW w:type="dxa" w:w="6009"/>
+          </w:tcPr>
+          <w:p>
+            <w:pPr>
+              <w:pStyle w:val="Compact"/>
+              <w:spacing w:after="40"/>
+              <w:jc w:val="left"/>
+            </w:pPr>
+            <w:r>
+              <w:rPr>
+                <w:sz w:val="19"/>
+              </w:rPr>
+              <w:t xml:space="preserve">Velocità e ostacoli (R-242, R-313), scelte di Claude: le durate delle gare restano 5, 10 e 15 minuti e si accorciano i chilometri (velocità media di riferimento 14 m/s, cioè ~50 km/h); il limite per un arrivo valido scende da 52 a 24 m/s; stessa velocità su neve e in città;</w:t>
+            </w:r>
+            <w:r>
+              <w:rPr>
+                <w:sz w:val="19"/>
+              </w:rPr>
+              <w:t xml:space="preserve"> </w:t>
+            </w:r>
+            <w:r>
+              <w:rPr>
+                <w:sz w:val="19"/>
+              </w:rPr>
+              <w:t xml:space="preserve">“</w:t>
+            </w:r>
+            <w:r>
+              <w:rPr>
+                <w:sz w:val="19"/>
+              </w:rPr>
+              <w:t xml:space="preserve">bandierine</w:t>
+            </w:r>
+            <w:r>
+              <w:rPr>
+                <w:sz w:val="19"/>
+              </w:rPr>
+              <w:t xml:space="preserve">”</w:t>
+            </w:r>
+            <w:r>
+              <w:rPr>
+                <w:sz w:val="19"/>
+              </w:rPr>
+              <w:t xml:space="preserve"> </w:t>
+            </w:r>
+            <w:r>
+              <w:rPr>
+                <w:sz w:val="19"/>
+              </w:rPr>
+              <w:t xml:space="preserve">lette come le porte con le bandierine (le paline ai bordi restano); la classifica generale riparte da zero con le lunghezze nuove. Telecamera, vignettatura e suoni riproporzionati alle velocità nuove, così la sensazione di velocità resta. Se per bandierine intendevi altro, dimmelo</w:t>
+            </w:r>
+          </w:p>
+        </w:tc>
+        <w:tc>
+          <w:tcPr>
+            <w:tcW w:type="dxa" w:w="1247"/>
+          </w:tcPr>
+          <w:p>
+            <w:pPr>
+              <w:pStyle w:val="Compact"/>
+              <w:spacing w:after="40"/>
+              <w:jc w:val="left"/>
+            </w:pPr>
+            <w:r>
+              <w:rPr>
+                <w:sz w:val="19"/>
+              </w:rPr>
+              <w:t xml:space="preserve">26/10/2026</w:t>
             </w:r>
           </w:p>
         </w:tc>
@@ -21849,6 +22527,588 @@
                 <w:sz w:val="19"/>
               </w:rPr>
               <w:t xml:space="preserve">Server con gara valida (T1-T10), 13 scenari e diagnosi, guida e acrobazie, trampolini, lingue, risultati, comandi touch, vocali, capelli e codice personale</w:t>
+            </w:r>
+          </w:p>
+        </w:tc>
+      </w:tr>
+    </w:tbl>
+    <w:p>
+      <w:pPr>
+        <w:pStyle w:val="BodyText"/>
+      </w:pPr>
+      <w:r>
+        <w:rPr>
+          <w:bCs/>
+          <w:b/>
+        </w:rPr>
+        <w:t xml:space="preserve">Controllo della 0.18.0 (26/10, ore 21)</w:t>
+      </w:r>
+      <w:r>
+        <w:t xml:space="preserve">: cancello rapido superato (con la nuova T13 del server e i 3 avversari della pista del giorno in</w:t>
+      </w:r>
+      <w:r>
+        <w:t xml:space="preserve"> </w:t>
+      </w:r>
+      <w:r>
+        <w:rPr>
+          <w:rStyle w:val="VerbatimChar"/>
+        </w:rPr>
+        <w:t xml:space="preserve">test_rapido.py</w:t>
+      </w:r>
+      <w:r>
+        <w:t xml:space="preserve">) e prova mirata</w:t>
+      </w:r>
+      <w:r>
+        <w:t xml:space="preserve"> </w:t>
+      </w:r>
+      <w:r>
+        <w:rPr>
+          <w:rStyle w:val="VerbatimChar"/>
+        </w:rPr>
+        <w:t xml:space="preserve">test_avversari.py</w:t>
+      </w:r>
+      <w:r>
+        <w:t xml:space="preserve"> </w:t>
+      </w:r>
+      <w:r>
+        <w:t xml:space="preserve">nel browser con due giocatori. La pista è rimasta identica dopo lo spostamento delle file di ostacoli in</w:t>
+      </w:r>
+      <w:r>
+        <w:t xml:space="preserve"> </w:t>
+      </w:r>
+      <w:r>
+        <w:rPr>
+          <w:rStyle w:val="VerbatimChar"/>
+        </w:rPr>
+        <w:t xml:space="preserve">tracciato.js</w:t>
+      </w:r>
+      <w:r>
+        <w:t xml:space="preserve">: confrontati 48.356 oggetti (4 città, 3 semi, allenamento e gara), posizione, rotazione e scala uguali. Il giro completo va nel controllo notturno (R-506):</w:t>
+      </w:r>
+    </w:p>
+    <w:tbl>
+      <w:tblPr>
+        <w:tblStyle w:val="Table"/>
+        <w:tblLook w:firstRow="1" w:lastRow="0" w:firstColumn="0" w:lastColumn="0" w:noHBand="0" w:noVBand="0" w:val="0020"/>
+        <w:jc w:val="start"/>
+        <w:tblBorders>
+          <w:top w:val="single" w:sz="4" w:color="B8C4D2"/>
+          <w:left w:val="single" w:sz="4" w:color="B8C4D2"/>
+          <w:bottom w:val="single" w:sz="4" w:color="B8C4D2"/>
+          <w:right w:val="single" w:sz="4" w:color="B8C4D2"/>
+          <w:insideH w:val="single" w:sz="4" w:color="B8C4D2"/>
+          <w:insideV w:val="single" w:sz="4" w:color="B8C4D2"/>
+        </w:tblBorders>
+        <w:tblW w:w="9865" w:type="dxa"/>
+        <w:tblLayout w:type="fixed"/>
+      </w:tblPr>
+      <w:tblGrid>
+        <w:gridCol w:w="1927"/>
+        <w:gridCol w:w="1474"/>
+        <w:gridCol w:w="6463"/>
+      </w:tblGrid>
+      <w:tr>
+        <w:trPr>
+          <w:tblHeader w:val="true"/>
+        </w:trPr>
+        <w:tc>
+          <w:tcPr>
+            <w:tcW w:type="dxa" w:w="1928"/>
+            <w:shd w:val="clear" w:color="auto" w:fill="13233A"/>
+          </w:tcPr>
+          <w:p>
+            <w:pPr>
+              <w:pStyle w:val="Compact"/>
+              <w:spacing w:after="40"/>
+              <w:jc w:val="left"/>
+            </w:pPr>
+            <w:r>
+              <w:rPr>
+                <w:b/>
+                <w:color w:val="FFFFFF"/>
+                <w:sz w:val="19"/>
+              </w:rPr>
+              <w:t xml:space="preserve">ID</w:t>
+            </w:r>
+          </w:p>
+        </w:tc>
+        <w:tc>
+          <w:tcPr>
+            <w:tcW w:type="dxa" w:w="1474"/>
+            <w:shd w:val="clear" w:color="auto" w:fill="13233A"/>
+          </w:tcPr>
+          <w:p>
+            <w:pPr>
+              <w:pStyle w:val="Compact"/>
+              <w:spacing w:after="40"/>
+              <w:jc w:val="left"/>
+            </w:pPr>
+            <w:r>
+              <w:rPr>
+                <w:b/>
+                <w:color w:val="FFFFFF"/>
+                <w:sz w:val="19"/>
+              </w:rPr>
+              <w:t xml:space="preserve">Esito</w:t>
+            </w:r>
+          </w:p>
+        </w:tc>
+        <w:tc>
+          <w:tcPr>
+            <w:tcW w:type="dxa" w:w="6463"/>
+            <w:shd w:val="clear" w:color="auto" w:fill="13233A"/>
+          </w:tcPr>
+          <w:p>
+            <w:pPr>
+              <w:pStyle w:val="Compact"/>
+              <w:spacing w:after="40"/>
+              <w:jc w:val="left"/>
+            </w:pPr>
+            <w:r>
+              <w:rPr>
+                <w:b/>
+                <w:color w:val="FFFFFF"/>
+                <w:sz w:val="19"/>
+              </w:rPr>
+              <w:t xml:space="preserve">Come è stato verificato</w:t>
+            </w:r>
+          </w:p>
+        </w:tc>
+      </w:tr>
+      <w:tr>
+        <w:tc>
+          <w:tcPr>
+            <w:tcW w:type="dxa" w:w="1928"/>
+          </w:tcPr>
+          <w:p>
+            <w:pPr>
+              <w:pStyle w:val="Compact"/>
+              <w:spacing w:after="40"/>
+              <w:jc w:val="left"/>
+            </w:pPr>
+            <w:r>
+              <w:rPr>
+                <w:sz w:val="19"/>
+              </w:rPr>
+              <w:t xml:space="preserve">R-234</w:t>
+            </w:r>
+          </w:p>
+        </w:tc>
+        <w:tc>
+          <w:tcPr>
+            <w:tcW w:type="dxa" w:w="1474"/>
+            <w:shd w:val="clear" w:color="auto" w:fill="D7F0DF"/>
+          </w:tcPr>
+          <w:p>
+            <w:pPr>
+              <w:pStyle w:val="Compact"/>
+              <w:spacing w:after="40"/>
+              <w:jc w:val="left"/>
+            </w:pPr>
+            <w:r>
+              <w:rPr>
+                <w:sz w:val="19"/>
+              </w:rPr>
+              <w:t xml:space="preserve">✓</w:t>
+            </w:r>
+          </w:p>
+        </w:tc>
+        <w:tc>
+          <w:tcPr>
+            <w:tcW w:type="dxa" w:w="6463"/>
+          </w:tcPr>
+          <w:p>
+            <w:pPr>
+              <w:pStyle w:val="Compact"/>
+              <w:spacing w:after="40"/>
+              <w:jc w:val="left"/>
+            </w:pPr>
+            <w:r>
+              <w:rPr>
+                <w:sz w:val="19"/>
+              </w:rPr>
+              <w:t xml:space="preserve">Il tracciato degli avversari coincide con la pista che si vede (4 città, 0 differenze su oltre 3.000 oggetti). Gare simulate di 12 km su 6 piste: evitano gli ostacoli, saltano, fanno acrobazie, cadono ogni tanto; tempi medi 6:12, 7:07, 7:55. In pista aspetti diversi, 🤖 solo in classifica (foto). Server: niente classifica generale né punti per loro</w:t>
+            </w:r>
+          </w:p>
+        </w:tc>
+      </w:tr>
+      <w:tr>
+        <w:tc>
+          <w:tcPr>
+            <w:tcW w:type="dxa" w:w="1928"/>
+          </w:tcPr>
+          <w:p>
+            <w:pPr>
+              <w:pStyle w:val="Compact"/>
+              <w:spacing w:after="40"/>
+              <w:jc w:val="left"/>
+            </w:pPr>
+            <w:r>
+              <w:rPr>
+                <w:sz w:val="19"/>
+              </w:rPr>
+              <w:t xml:space="preserve">R-237</w:t>
+            </w:r>
+          </w:p>
+        </w:tc>
+        <w:tc>
+          <w:tcPr>
+            <w:tcW w:type="dxa" w:w="1474"/>
+            <w:shd w:val="clear" w:color="auto" w:fill="D7F0DF"/>
+          </w:tcPr>
+          <w:p>
+            <w:pPr>
+              <w:pStyle w:val="Compact"/>
+              <w:spacing w:after="40"/>
+              <w:jc w:val="left"/>
+            </w:pPr>
+            <w:r>
+              <w:rPr>
+                <w:sz w:val="19"/>
+              </w:rPr>
+              <w:t xml:space="preserve">✓</w:t>
+            </w:r>
+          </w:p>
+        </w:tc>
+        <w:tc>
+          <w:tcPr>
+            <w:tcW w:type="dxa" w:w="6463"/>
+          </w:tcPr>
+          <w:p>
+            <w:pPr>
+              <w:pStyle w:val="Compact"/>
+              <w:spacing w:after="40"/>
+              <w:jc w:val="left"/>
+            </w:pPr>
+            <w:r>
+              <w:rPr>
+                <w:sz w:val="19"/>
+              </w:rPr>
+              <w:t xml:space="preserve">Nella stanza</w:t>
+            </w:r>
+            <w:r>
+              <w:rPr>
+                <w:sz w:val="19"/>
+              </w:rPr>
+              <w:t xml:space="preserve"> </w:t>
+            </w:r>
+            <w:r>
+              <w:rPr>
+                <w:sz w:val="19"/>
+              </w:rPr>
+              <w:t xml:space="preserve">“</w:t>
+            </w:r>
+            <w:r>
+              <w:rPr>
+                <w:sz w:val="19"/>
+              </w:rPr>
+              <w:t xml:space="preserve">🤖 + 2 avversari del computer</w:t>
+            </w:r>
+            <w:r>
+              <w:rPr>
+                <w:sz w:val="19"/>
+              </w:rPr>
+              <w:t xml:space="preserve">”</w:t>
+            </w:r>
+            <w:r>
+              <w:rPr>
+                <w:sz w:val="19"/>
+              </w:rPr>
+              <w:t xml:space="preserve">; solo chi organizza sceglie (0-4, non di più); in gara 2 persone e 2 avversari con la mano già alzata</w:t>
+            </w:r>
+          </w:p>
+        </w:tc>
+      </w:tr>
+      <w:tr>
+        <w:tc>
+          <w:tcPr>
+            <w:tcW w:type="dxa" w:w="1928"/>
+          </w:tcPr>
+          <w:p>
+            <w:pPr>
+              <w:pStyle w:val="Compact"/>
+              <w:spacing w:after="40"/>
+              <w:jc w:val="left"/>
+            </w:pPr>
+            <w:r>
+              <w:rPr>
+                <w:sz w:val="19"/>
+              </w:rPr>
+              <w:t xml:space="preserve">S-39</w:t>
+            </w:r>
+          </w:p>
+        </w:tc>
+        <w:tc>
+          <w:tcPr>
+            <w:tcW w:type="dxa" w:w="1474"/>
+            <w:shd w:val="clear" w:color="auto" w:fill="D7F0DF"/>
+          </w:tcPr>
+          <w:p>
+            <w:pPr>
+              <w:pStyle w:val="Compact"/>
+              <w:spacing w:after="40"/>
+              <w:jc w:val="left"/>
+            </w:pPr>
+            <w:r>
+              <w:rPr>
+                <w:sz w:val="19"/>
+              </w:rPr>
+              <w:t xml:space="preserve">✓</w:t>
+            </w:r>
+          </w:p>
+        </w:tc>
+        <w:tc>
+          <w:tcPr>
+            <w:tcW w:type="dxa" w:w="6463"/>
+          </w:tcPr>
+          <w:p>
+            <w:pPr>
+              <w:pStyle w:val="Compact"/>
+              <w:spacing w:after="40"/>
+              <w:jc w:val="left"/>
+            </w:pPr>
+            <w:r>
+              <w:rPr>
+                <w:sz w:val="19"/>
+              </w:rPr>
+              <w:t xml:space="preserve">Li guida chi organizza; l’altro li vede scendere; banana all’avversario davanti: si ferma; chi organizza esce e l’ospite li riprende da dove erano; il server rifiuta posizioni e azioni a nome degli avversari da chi non è il pilota</w:t>
+            </w:r>
+          </w:p>
+        </w:tc>
+      </w:tr>
+      <w:tr>
+        <w:tc>
+          <w:tcPr>
+            <w:tcW w:type="dxa" w:w="1928"/>
+          </w:tcPr>
+          <w:p>
+            <w:pPr>
+              <w:pStyle w:val="Compact"/>
+              <w:spacing w:after="40"/>
+              <w:jc w:val="left"/>
+            </w:pPr>
+            <w:r>
+              <w:rPr>
+                <w:sz w:val="19"/>
+              </w:rPr>
+              <w:t xml:space="preserve">R-235</w:t>
+            </w:r>
+          </w:p>
+        </w:tc>
+        <w:tc>
+          <w:tcPr>
+            <w:tcW w:type="dxa" w:w="1474"/>
+            <w:shd w:val="clear" w:color="auto" w:fill="D7F0DF"/>
+          </w:tcPr>
+          <w:p>
+            <w:pPr>
+              <w:pStyle w:val="Compact"/>
+              <w:spacing w:after="40"/>
+              <w:jc w:val="left"/>
+            </w:pPr>
+            <w:r>
+              <w:rPr>
+                <w:sz w:val="19"/>
+              </w:rPr>
+              <w:t xml:space="preserve">✓</w:t>
+            </w:r>
+          </w:p>
+        </w:tc>
+        <w:tc>
+          <w:tcPr>
+            <w:tcW w:type="dxa" w:w="6463"/>
+          </w:tcPr>
+          <w:p>
+            <w:pPr>
+              <w:pStyle w:val="Compact"/>
+              <w:spacing w:after="40"/>
+              <w:jc w:val="left"/>
+            </w:pPr>
+            <w:r>
+              <w:rPr>
+                <w:sz w:val="19"/>
+              </w:rPr>
+              <w:t xml:space="preserve">Sala online da soli:</w:t>
+            </w:r>
+            <w:r>
+              <w:rPr>
+                <w:sz w:val="19"/>
+              </w:rPr>
+              <w:t xml:space="preserve"> </w:t>
+            </w:r>
+            <w:r>
+              <w:rPr>
+                <w:sz w:val="19"/>
+              </w:rPr>
+              <w:t xml:space="preserve">“</w:t>
+            </w:r>
+            <w:r>
+              <w:rPr>
+                <w:sz w:val="19"/>
+              </w:rPr>
+              <w:t xml:space="preserve">tra 15 s si parte con gli avversari del computer</w:t>
+            </w:r>
+            <w:r>
+              <w:rPr>
+                <w:sz w:val="19"/>
+              </w:rPr>
+              <w:t xml:space="preserve">”</w:t>
+            </w:r>
+            <w:r>
+              <w:rPr>
+                <w:sz w:val="19"/>
+              </w:rPr>
+              <w:t xml:space="preserve">; con</w:t>
+            </w:r>
+            <w:r>
+              <w:rPr>
+                <w:sz w:val="19"/>
+              </w:rPr>
+              <w:t xml:space="preserve"> </w:t>
+            </w:r>
+            <w:r>
+              <w:rPr>
+                <w:sz w:val="19"/>
+              </w:rPr>
+              <w:t xml:space="preserve">“</w:t>
+            </w:r>
+            <w:r>
+              <w:rPr>
+                <w:sz w:val="19"/>
+              </w:rPr>
+              <w:t xml:space="preserve">Sono pronto</w:t>
+            </w:r>
+            <w:r>
+              <w:rPr>
+                <w:sz w:val="19"/>
+              </w:rPr>
+              <w:t xml:space="preserve">”</w:t>
+            </w:r>
+            <w:r>
+              <w:rPr>
+                <w:sz w:val="19"/>
+              </w:rPr>
+              <w:t xml:space="preserve"> </w:t>
+            </w:r>
+            <w:r>
+              <w:rPr>
+                <w:sz w:val="19"/>
+              </w:rPr>
+              <w:t xml:space="preserve">gara con 3 avversari</w:t>
+            </w:r>
+          </w:p>
+        </w:tc>
+      </w:tr>
+      <w:tr>
+        <w:tc>
+          <w:tcPr>
+            <w:tcW w:type="dxa" w:w="1928"/>
+          </w:tcPr>
+          <w:p>
+            <w:pPr>
+              <w:pStyle w:val="Compact"/>
+              <w:spacing w:after="40"/>
+              <w:jc w:val="left"/>
+            </w:pPr>
+            <w:r>
+              <w:rPr>
+                <w:sz w:val="19"/>
+              </w:rPr>
+              <w:t xml:space="preserve">R-238</w:t>
+            </w:r>
+          </w:p>
+        </w:tc>
+        <w:tc>
+          <w:tcPr>
+            <w:tcW w:type="dxa" w:w="1474"/>
+            <w:shd w:val="clear" w:color="auto" w:fill="D7F0DF"/>
+          </w:tcPr>
+          <w:p>
+            <w:pPr>
+              <w:pStyle w:val="Compact"/>
+              <w:spacing w:after="40"/>
+              <w:jc w:val="left"/>
+            </w:pPr>
+            <w:r>
+              <w:rPr>
+                <w:sz w:val="19"/>
+              </w:rPr>
+              <w:t xml:space="preserve">✓</w:t>
+            </w:r>
+          </w:p>
+        </w:tc>
+        <w:tc>
+          <w:tcPr>
+            <w:tcW w:type="dxa" w:w="6463"/>
+          </w:tcPr>
+          <w:p>
+            <w:pPr>
+              <w:pStyle w:val="Compact"/>
+              <w:spacing w:after="40"/>
+              <w:jc w:val="left"/>
+            </w:pPr>
+            <w:r>
+              <w:rPr>
+                <w:sz w:val="19"/>
+              </w:rPr>
+              <w:t xml:space="preserve">Pista del giorno: 3 avversari (forte, medio, lento), niente banane</w:t>
+            </w:r>
+          </w:p>
+        </w:tc>
+      </w:tr>
+      <w:tr>
+        <w:tc>
+          <w:tcPr>
+            <w:tcW w:type="dxa" w:w="1928"/>
+          </w:tcPr>
+          <w:p>
+            <w:pPr>
+              <w:pStyle w:val="Compact"/>
+              <w:spacing w:after="40"/>
+              <w:jc w:val="left"/>
+            </w:pPr>
+            <w:r>
+              <w:rPr>
+                <w:sz w:val="19"/>
+              </w:rPr>
+              <w:t xml:space="preserve">R-239</w:t>
+            </w:r>
+          </w:p>
+        </w:tc>
+        <w:tc>
+          <w:tcPr>
+            <w:tcW w:type="dxa" w:w="1474"/>
+            <w:shd w:val="clear" w:color="auto" w:fill="D7F0DF"/>
+          </w:tcPr>
+          <w:p>
+            <w:pPr>
+              <w:pStyle w:val="Compact"/>
+              <w:spacing w:after="40"/>
+              <w:jc w:val="left"/>
+            </w:pPr>
+            <w:r>
+              <w:rPr>
+                <w:sz w:val="19"/>
+              </w:rPr>
+              <w:t xml:space="preserve">✓</w:t>
+            </w:r>
+          </w:p>
+        </w:tc>
+        <w:tc>
+          <w:tcPr>
+            <w:tcW w:type="dxa" w:w="6463"/>
+          </w:tcPr>
+          <w:p>
+            <w:pPr>
+              <w:pStyle w:val="Compact"/>
+              <w:spacing w:after="40"/>
+              <w:jc w:val="left"/>
+            </w:pPr>
+            <w:r>
+              <w:rPr>
+                <w:sz w:val="19"/>
+              </w:rPr>
+              <w:t xml:space="preserve">Allenamento: 3 avversari con nomi, livelli e aspetti diversi che scendono vicino al rider; tornando al menu spariscono</w:t>
             </w:r>
           </w:p>
         </w:tc>
@@ -28976,19 +30236,19 @@
         <w:tc>
           <w:tcPr>
             <w:tcW w:type="dxa" w:w="1020"/>
-            <w:shd w:val="clear" w:color="auto" w:fill="FDE2D6"/>
-          </w:tcPr>
-          <w:p>
-            <w:pPr>
-              <w:pStyle w:val="Compact"/>
-              <w:spacing w:after="40"/>
-              <w:jc w:val="left"/>
-            </w:pPr>
-            <w:r>
-              <w:rPr>
-                <w:sz w:val="19"/>
-              </w:rPr>
-              <w:t xml:space="preserve">Da fare</w:t>
+            <w:shd w:val="clear" w:color="auto" w:fill="FFF1C7"/>
+          </w:tcPr>
+          <w:p>
+            <w:pPr>
+              <w:pStyle w:val="Compact"/>
+              <w:spacing w:after="40"/>
+              <w:jc w:val="left"/>
+            </w:pPr>
+            <w:r>
+              <w:rPr>
+                <w:sz w:val="19"/>
+              </w:rPr>
+              <w:t xml:space="preserve">In corso</w:t>
             </w:r>
           </w:p>
         </w:tc>
@@ -29006,7 +30266,20 @@
               <w:rPr>
                 <w:sz w:val="19"/>
               </w:rPr>
-              <w:t xml:space="preserve">Oggi si usa la r128 (2021) da un CDN esterno: se il CDN ha un problema, il gioco non parte. Va fatto dopo A-11, con le foto delle città per confrontare prima e dopo</w:t>
+              <w:t xml:space="preserve">Dal 26/10 (0.18.1): Three.js r128 servito dal sito stesso (</w:t>
+            </w:r>
+            <w:r>
+              <w:rPr>
+                <w:rStyle w:val="VerbatimChar"/>
+                <w:sz w:val="19"/>
+              </w:rPr>
+              <w:t xml:space="preserve">public/vendor/three.min.js</w:t>
+            </w:r>
+            <w:r>
+              <w:rPr>
+                <w:sz w:val="19"/>
+              </w:rPr>
+              <w:t xml:space="preserve">, licenza MIT), niente più CDN esterno; l’aggiornamento a una versione nuova resta da fare. Oggi si usa la r128 (2021) da un CDN esterno: se il CDN ha un problema, il gioco non parte. Va fatto dopo A-11, con le foto delle città per confrontare prima e dopo</w:t>
             </w:r>
           </w:p>
         </w:tc>
@@ -29518,7 +30791,7 @@
               <w:rPr>
                 <w:sz w:val="19"/>
               </w:rPr>
-              <w:t xml:space="preserve">Oggi la pagina del gioco carica 35 file separati (circa 430 KB di codice non compresso, più Three.js da un CDN esterno), comprese tutte le 12 città anche se se ne usa una. Un passo di costruzione con esbuild (uno strumento solo, molto veloce) unisce e comprime i file, e ogni città si scarica solo quando serve. Il codice sorgente resta diviso in moduli come oggi; aggiungere città e moduli non allunga più il caricamento. Con A-16</w:t>
+              <w:t xml:space="preserve">Oggi la pagina del gioco carica 35 file separati (circa 430 KB di codice non compresso), comprese tutte le 12 città anche se se ne usa una (Three.js dal 26/10 è servito dal sito stesso, A-16). Un passo di costruzione con esbuild (uno strumento solo, molto veloce) unisce e comprime i file, e ogni città si scarica solo quando serve. Il codice sorgente resta diviso in moduli come oggi; aggiungere città e moduli non allunga più il caricamento. Con A-16</w:t>
             </w:r>
           </w:p>
         </w:tc>
@@ -29581,19 +30854,19 @@
         <w:tc>
           <w:tcPr>
             <w:tcW w:type="dxa" w:w="1020"/>
-            <w:shd w:val="clear" w:color="auto" w:fill="FDE2D6"/>
-          </w:tcPr>
-          <w:p>
-            <w:pPr>
-              <w:pStyle w:val="Compact"/>
-              <w:spacing w:after="40"/>
-              <w:jc w:val="left"/>
-            </w:pPr>
-            <w:r>
-              <w:rPr>
-                <w:sz w:val="19"/>
-              </w:rPr>
-              <w:t xml:space="preserve">Da fare</w:t>
+            <w:shd w:val="clear" w:color="auto" w:fill="D7F0DF"/>
+          </w:tcPr>
+          <w:p>
+            <w:pPr>
+              <w:pStyle w:val="Compact"/>
+              <w:spacing w:after="40"/>
+              <w:jc w:val="left"/>
+            </w:pPr>
+            <w:r>
+              <w:rPr>
+                <w:sz w:val="19"/>
+              </w:rPr>
+              <w:t xml:space="preserve">Fatto</w:t>
             </w:r>
           </w:p>
         </w:tc>
@@ -29609,6 +30882,18 @@
             </w:pPr>
             <w:r>
               <w:rPr>
+                <w:sz w:val="19"/>
+              </w:rPr>
+              <w:t xml:space="preserve">Fatto il 26/10 nella 0.18.1, prima che</w:t>
+            </w:r>
+            <w:r>
+              <w:rPr>
+                <w:sz w:val="19"/>
+              </w:rPr>
+              <w:t xml:space="preserve"> </w:t>
+            </w:r>
+            <w:r>
+              <w:rPr>
                 <w:rStyle w:val="VerbatimChar"/>
                 <w:sz w:val="19"/>
               </w:rPr>
@@ -29624,7 +30909,7 @@
               <w:rPr>
                 <w:sz w:val="19"/>
               </w:rPr>
-              <w:t xml:space="preserve">(864 righe) contiene stanze, classifiche, pista del giorno, misure, profili ed errori. Va diviso in file per argomento (stanze, classifica, giorno, misure, profili, errori) con un piccolo smistatore degli indirizzi</w:t>
+              <w:t xml:space="preserve">(quasi 1.000 righe) crescesse ancora: indirizzi</w:t>
             </w:r>
             <w:r>
               <w:rPr>
@@ -29643,7 +30928,121 @@
               <w:rPr>
                 <w:sz w:val="19"/>
               </w:rPr>
-              <w:t xml:space="preserve">, come già fatto per il gioco, prima che i fantasmi (R-234) lo facciano crescere ancora</w:t>
+              <w:t xml:space="preserve"> </w:t>
+            </w:r>
+            <w:r>
+              <w:rPr>
+                <w:sz w:val="19"/>
+              </w:rPr>
+              <w:t xml:space="preserve">in</w:t>
+            </w:r>
+            <w:r>
+              <w:rPr>
+                <w:sz w:val="19"/>
+              </w:rPr>
+              <w:t xml:space="preserve"> </w:t>
+            </w:r>
+            <w:r>
+              <w:rPr>
+                <w:rStyle w:val="VerbatimChar"/>
+                <w:sz w:val="19"/>
+              </w:rPr>
+              <w:t xml:space="preserve">src/worker.js</w:t>
+            </w:r>
+            <w:r>
+              <w:rPr>
+                <w:sz w:val="19"/>
+              </w:rPr>
+              <w:t xml:space="preserve">, stanza delle gare in</w:t>
+            </w:r>
+            <w:r>
+              <w:rPr>
+                <w:sz w:val="19"/>
+              </w:rPr>
+              <w:t xml:space="preserve"> </w:t>
+            </w:r>
+            <w:r>
+              <w:rPr>
+                <w:rStyle w:val="VerbatimChar"/>
+                <w:sz w:val="19"/>
+              </w:rPr>
+              <w:t xml:space="preserve">src/stanza.mjs</w:t>
+            </w:r>
+            <w:r>
+              <w:rPr>
+                <w:sz w:val="19"/>
+              </w:rPr>
+              <w:t xml:space="preserve">, classifica e contatori in</w:t>
+            </w:r>
+            <w:r>
+              <w:rPr>
+                <w:sz w:val="19"/>
+              </w:rPr>
+              <w:t xml:space="preserve"> </w:t>
+            </w:r>
+            <w:r>
+              <w:rPr>
+                <w:rStyle w:val="VerbatimChar"/>
+                <w:sz w:val="19"/>
+              </w:rPr>
+              <w:t xml:space="preserve">src/classifica.mjs</w:t>
+            </w:r>
+            <w:r>
+              <w:rPr>
+                <w:sz w:val="19"/>
+              </w:rPr>
+              <w:t xml:space="preserve">, più i file già separati (</w:t>
+            </w:r>
+            <w:r>
+              <w:rPr>
+                <w:rStyle w:val="VerbatimChar"/>
+                <w:sz w:val="19"/>
+              </w:rPr>
+              <w:t xml:space="preserve">giorno.mjs</w:t>
+            </w:r>
+            <w:r>
+              <w:rPr>
+                <w:sz w:val="19"/>
+              </w:rPr>
+              <w:t xml:space="preserve">,</w:t>
+            </w:r>
+            <w:r>
+              <w:rPr>
+                <w:sz w:val="19"/>
+              </w:rPr>
+              <w:t xml:space="preserve"> </w:t>
+            </w:r>
+            <w:r>
+              <w:rPr>
+                <w:rStyle w:val="VerbatimChar"/>
+                <w:sz w:val="19"/>
+              </w:rPr>
+              <w:t xml:space="preserve">ritorni.mjs</w:t>
+            </w:r>
+            <w:r>
+              <w:rPr>
+                <w:sz w:val="19"/>
+              </w:rPr>
+              <w:t xml:space="preserve">,</w:t>
+            </w:r>
+            <w:r>
+              <w:rPr>
+                <w:sz w:val="19"/>
+              </w:rPr>
+              <w:t xml:space="preserve"> </w:t>
+            </w:r>
+            <w:r>
+              <w:rPr>
+                <w:rStyle w:val="VerbatimChar"/>
+                <w:sz w:val="19"/>
+              </w:rPr>
+              <w:t xml:space="preserve">avversari.mjs</w:t>
+            </w:r>
+            <w:r>
+              <w:rPr>
+                <w:sz w:val="19"/>
+              </w:rPr>
+              <w:t xml:space="preserve">)</w:t>
             </w:r>
           </w:p>
         </w:tc>
@@ -29885,6 +31284,267 @@
                 <w:sz w:val="19"/>
               </w:rPr>
               <w:t xml:space="preserve">, lancia solo quelle dei moduli toccati e di chi ne dipende, così resta sotto i 3 minuti anche con molti moduli. Il turno di notte lancia sempre tutto</w:t>
+            </w:r>
+          </w:p>
+        </w:tc>
+      </w:tr>
+      <w:tr>
+        <w:tc>
+          <w:tcPr>
+            <w:tcW w:type="dxa" w:w="794"/>
+          </w:tcPr>
+          <w:p>
+            <w:pPr>
+              <w:pStyle w:val="Compact"/>
+              <w:spacing w:after="40"/>
+              <w:jc w:val="left"/>
+            </w:pPr>
+            <w:r>
+              <w:rPr>
+                <w:sz w:val="19"/>
+              </w:rPr>
+              <w:t xml:space="preserve">A-23</w:t>
+            </w:r>
+          </w:p>
+        </w:tc>
+        <w:tc>
+          <w:tcPr>
+            <w:tcW w:type="dxa" w:w="2721"/>
+          </w:tcPr>
+          <w:p>
+            <w:pPr>
+              <w:pStyle w:val="Compact"/>
+              <w:spacing w:after="40"/>
+              <w:jc w:val="left"/>
+            </w:pPr>
+            <w:r>
+              <w:rPr>
+                <w:sz w:val="19"/>
+              </w:rPr>
+              <w:t xml:space="preserve">La fisica in un modulo solo, usato dal rider e dagli avversari del computer</w:t>
+            </w:r>
+          </w:p>
+        </w:tc>
+        <w:tc>
+          <w:tcPr>
+            <w:tcW w:type="dxa" w:w="1134"/>
+          </w:tcPr>
+          <w:p>
+            <w:pPr>
+              <w:pStyle w:val="Compact"/>
+              <w:spacing w:after="40"/>
+              <w:jc w:val="left"/>
+            </w:pPr>
+            <w:r>
+              <w:rPr>
+                <w:sz w:val="19"/>
+              </w:rPr>
+              <w:t xml:space="preserve">26/10/2026</w:t>
+            </w:r>
+          </w:p>
+        </w:tc>
+        <w:tc>
+          <w:tcPr>
+            <w:tcW w:type="dxa" w:w="1020"/>
+            <w:shd w:val="clear" w:color="auto" w:fill="D7F0DF"/>
+          </w:tcPr>
+          <w:p>
+            <w:pPr>
+              <w:pStyle w:val="Compact"/>
+              <w:spacing w:after="40"/>
+              <w:jc w:val="left"/>
+            </w:pPr>
+            <w:r>
+              <w:rPr>
+                <w:sz w:val="19"/>
+              </w:rPr>
+              <w:t xml:space="preserve">Fatto</w:t>
+            </w:r>
+          </w:p>
+        </w:tc>
+        <w:tc>
+          <w:tcPr>
+            <w:tcW w:type="dxa" w:w="4195"/>
+          </w:tcPr>
+          <w:p>
+            <w:pPr>
+              <w:pStyle w:val="Compact"/>
+              <w:spacing w:after="40"/>
+              <w:jc w:val="left"/>
+            </w:pPr>
+            <w:r>
+              <w:rPr>
+                <w:sz w:val="19"/>
+              </w:rPr>
+              <w:t xml:space="preserve">Dalla 0.18.1. Velocità massima, salti, rampe (</w:t>
+            </w:r>
+            <w:r>
+              <w:rPr>
+                <w:rStyle w:val="VerbatimChar"/>
+                <w:sz w:val="19"/>
+              </w:rPr>
+              <w:t xml:space="preserve">rampTop</w:t>
+            </w:r>
+            <w:r>
+              <w:rPr>
+                <w:sz w:val="19"/>
+              </w:rPr>
+              <w:t xml:space="preserve">), cadute e punti delle acrobazie stanno in</w:t>
+            </w:r>
+            <w:r>
+              <w:rPr>
+                <w:sz w:val="19"/>
+              </w:rPr>
+              <w:t xml:space="preserve"> </w:t>
+            </w:r>
+            <w:r>
+              <w:rPr>
+                <w:rStyle w:val="VerbatimChar"/>
+                <w:sz w:val="19"/>
+              </w:rPr>
+              <w:t xml:space="preserve">moduli/fisica.js</w:t>
+            </w:r>
+            <w:r>
+              <w:rPr>
+                <w:sz w:val="19"/>
+              </w:rPr>
+              <w:t xml:space="preserve">: il rider e gli avversari usano le stesse regole (prima gli avversari ne avevano una copia). Ogni cambio di fisica (come R-242) si fa in un posto solo. È anche il primo passo per far controllare la traiettoria al server (F-04). (Nei messaggi di modifica del 26/10 era indicato come</w:t>
+            </w:r>
+            <w:r>
+              <w:rPr>
+                <w:sz w:val="19"/>
+              </w:rPr>
+              <w:t xml:space="preserve"> </w:t>
+            </w:r>
+            <w:r>
+              <w:rPr>
+                <w:sz w:val="19"/>
+              </w:rPr>
+              <w:t xml:space="preserve">“</w:t>
+            </w:r>
+            <w:r>
+              <w:rPr>
+                <w:sz w:val="19"/>
+              </w:rPr>
+              <w:t xml:space="preserve">A-19</w:t>
+            </w:r>
+            <w:r>
+              <w:rPr>
+                <w:sz w:val="19"/>
+              </w:rPr>
+              <w:t xml:space="preserve">”</w:t>
+            </w:r>
+            <w:r>
+              <w:rPr>
+                <w:sz w:val="19"/>
+              </w:rPr>
+              <w:t xml:space="preserve">: la numerazione è stata sistemata quando i rami del 26/10 sono stati uniti)</w:t>
+            </w:r>
+          </w:p>
+        </w:tc>
+      </w:tr>
+      <w:tr>
+        <w:tc>
+          <w:tcPr>
+            <w:tcW w:type="dxa" w:w="794"/>
+          </w:tcPr>
+          <w:p>
+            <w:pPr>
+              <w:pStyle w:val="Compact"/>
+              <w:spacing w:after="40"/>
+              <w:jc w:val="left"/>
+            </w:pPr>
+            <w:r>
+              <w:rPr>
+                <w:sz w:val="19"/>
+              </w:rPr>
+              <w:t xml:space="preserve">A-24</w:t>
+            </w:r>
+          </w:p>
+        </w:tc>
+        <w:tc>
+          <w:tcPr>
+            <w:tcW w:type="dxa" w:w="2721"/>
+          </w:tcPr>
+          <w:p>
+            <w:pPr>
+              <w:pStyle w:val="Compact"/>
+              <w:spacing w:after="40"/>
+              <w:jc w:val="left"/>
+            </w:pPr>
+            <w:r>
+              <w:rPr>
+                <w:sz w:val="19"/>
+              </w:rPr>
+              <w:t xml:space="preserve">Piattaforma: restare su GitHub e Cloudflare</w:t>
+            </w:r>
+          </w:p>
+        </w:tc>
+        <w:tc>
+          <w:tcPr>
+            <w:tcW w:type="dxa" w:w="1134"/>
+          </w:tcPr>
+          <w:p>
+            <w:pPr>
+              <w:pStyle w:val="Compact"/>
+              <w:spacing w:after="40"/>
+              <w:jc w:val="left"/>
+            </w:pPr>
+            <w:r>
+              <w:rPr>
+                <w:sz w:val="19"/>
+              </w:rPr>
+              <w:t xml:space="preserve">26/10/2026</w:t>
+            </w:r>
+          </w:p>
+        </w:tc>
+        <w:tc>
+          <w:tcPr>
+            <w:tcW w:type="dxa" w:w="1020"/>
+            <w:shd w:val="clear" w:color="auto" w:fill="D7F0DF"/>
+          </w:tcPr>
+          <w:p>
+            <w:pPr>
+              <w:pStyle w:val="Compact"/>
+              <w:spacing w:after="40"/>
+              <w:jc w:val="left"/>
+            </w:pPr>
+            <w:r>
+              <w:rPr>
+                <w:sz w:val="19"/>
+              </w:rPr>
+              <w:t xml:space="preserve">Fatto</w:t>
+            </w:r>
+          </w:p>
+        </w:tc>
+        <w:tc>
+          <w:tcPr>
+            <w:tcW w:type="dxa" w:w="4195"/>
+          </w:tcPr>
+          <w:p>
+            <w:pPr>
+              <w:pStyle w:val="Compact"/>
+              <w:spacing w:after="40"/>
+              <w:jc w:val="left"/>
+            </w:pPr>
+            <w:r>
+              <w:rPr>
+                <w:sz w:val="19"/>
+              </w:rPr>
+              <w:t xml:space="preserve">Domanda di Luigi del 26/10: serve un’altra piattaforma visto che il software crescerà? No. Numeri: il repository pesa ~0,3 MB (GitHub consiglia di restare sotto 1 GB, file fino a 100 MB); le prove su GitHub sono gratuite per i repository pubblici; Cloudflare regge programmi fino a 64 MB, 20.000 file statici e 100.000 richieste al giorno nel piano gratuito (piano da 5 $/mese senza limite giornaliero). Quello che rende instabile un software che cresce è la struttura (A-11, A-13…A-22) e il fatto di andare online senza un sito di prova (A-09), non la piattaforma. Le etichette di versione su GitHub (tag) non si possono creare dalla sessione di Claude: la versione è nel messaggio di ogni modifica e in</w:t>
+            </w:r>
+            <w:r>
+              <w:rPr>
+                <w:sz w:val="19"/>
+              </w:rPr>
+              <w:t xml:space="preserve"> </w:t>
+            </w:r>
+            <w:r>
+              <w:rPr>
+                <w:rStyle w:val="VerbatimChar"/>
+                <w:sz w:val="19"/>
+              </w:rPr>
+              <w:t xml:space="preserve">config.js</w:t>
             </w:r>
           </w:p>
         </w:tc>
@@ -29920,7 +31580,7 @@
         <w:t xml:space="preserve">”</w:t>
       </w:r>
       <w:r>
-        <w:t xml:space="preserve">. I rallentamenti possibili sono di due tipi. Per chi gioca: pagina più pesante e meno fps a ogni città o funzione nuova; contro questi A-19, A-16 e A-14, che misura e blocca i peggioramenti. Per chi sviluppa: file sempre più grandi, prove sempre più lunghe, modifiche che rompono altro; contro questi A-20, A-22, A-11, A-13, A-15 e A-17. Ordine: un passo di struttura tra una funzione e l’altra (vedi Prossimi passi), mai tutti insieme e mai una riscrittura. Piattaforma: si resta su GitHub e Cloudflare (motivi in S-42).</w:t>
+        <w:t xml:space="preserve">. I rallentamenti possibili sono di due tipi. Per chi gioca: pagina più pesante e meno fps a ogni città o funzione nuova; contro questi A-19, A-16 e A-14, che misura e blocca i peggioramenti. Per chi sviluppa: file sempre più grandi, prove sempre più lunghe, modifiche che rompono altro; contro questi A-20 (fatto nella 0.18.1), A-22, A-11, A-13, A-15 e A-17. Ordine: un passo di struttura tra una funzione e l’altra (vedi Prossimi passi), mai tutti insieme e mai una riscrittura. Piattaforma: si resta su GitHub e Cloudflare (motivi in S-42 e A-24).</w:t>
       </w:r>
     </w:p>
     <w:p>
@@ -30888,6 +32548,99 @@
           </w:p>
         </w:tc>
       </w:tr>
+      <w:tr>
+        <w:tc>
+          <w:tcPr>
+            <w:tcW w:type="dxa" w:w="907"/>
+          </w:tcPr>
+          <w:p>
+            <w:pPr>
+              <w:pStyle w:val="Compact"/>
+              <w:spacing w:after="40"/>
+              <w:jc w:val="left"/>
+            </w:pPr>
+            <w:r>
+              <w:rPr>
+                <w:sz w:val="19"/>
+              </w:rPr>
+              <w:t xml:space="preserve">R-313</w:t>
+            </w:r>
+          </w:p>
+        </w:tc>
+        <w:tc>
+          <w:tcPr>
+            <w:tcW w:type="dxa" w:w="4195"/>
+          </w:tcPr>
+          <w:p>
+            <w:pPr>
+              <w:pStyle w:val="Compact"/>
+              <w:spacing w:after="40"/>
+              <w:jc w:val="left"/>
+            </w:pPr>
+            <w:r>
+              <w:rPr>
+                <w:sz w:val="19"/>
+              </w:rPr>
+              <w:t xml:space="preserve">Ridurre del 30% gli oggetti sulla pista: rocce, alberi e bandierine; più spazio</w:t>
+            </w:r>
+          </w:p>
+        </w:tc>
+        <w:tc>
+          <w:tcPr>
+            <w:tcW w:type="dxa" w:w="1134"/>
+          </w:tcPr>
+          <w:p>
+            <w:pPr>
+              <w:pStyle w:val="Compact"/>
+              <w:spacing w:after="40"/>
+              <w:jc w:val="left"/>
+            </w:pPr>
+            <w:r>
+              <w:rPr>
+                <w:sz w:val="19"/>
+              </w:rPr>
+              <w:t xml:space="preserve">26/10/2026</w:t>
+            </w:r>
+          </w:p>
+        </w:tc>
+        <w:tc>
+          <w:tcPr>
+            <w:tcW w:type="dxa" w:w="1134"/>
+            <w:shd w:val="clear" w:color="auto" w:fill="D7F0DF"/>
+          </w:tcPr>
+          <w:p>
+            <w:pPr>
+              <w:pStyle w:val="Compact"/>
+              <w:spacing w:after="40"/>
+              <w:jc w:val="left"/>
+            </w:pPr>
+            <w:r>
+              <w:rPr>
+                <w:sz w:val="19"/>
+              </w:rPr>
+              <w:t xml:space="preserve">Fatto</w:t>
+            </w:r>
+          </w:p>
+        </w:tc>
+        <w:tc>
+          <w:tcPr>
+            <w:tcW w:type="dxa" w:w="2494"/>
+          </w:tcPr>
+          <w:p>
+            <w:pPr>
+              <w:pStyle w:val="Compact"/>
+              <w:spacing w:after="40"/>
+              <w:jc w:val="left"/>
+            </w:pPr>
+            <w:r>
+              <w:rPr>
+                <w:sz w:val="19"/>
+              </w:rPr>
+              <w:t xml:space="preserve">Dalla 0.19.0. Alberi (o elementi alti), rocce (o elementi bassi) e porte con le bandierine −30% esatto rispetto a prima: tra gli elementi di una fila gli alberi passano dal 24,7% al 17,3%, le rocce dal 13% al 9,1%, le porte dal 17% all’11,9%; il resto resta vuoto. Bonus e rampe invariati. Le paline ai bordi restano (S-41). La pista cambia per tutti nello stesso modo, anche quella del giorno</w:t>
+            </w:r>
+          </w:p>
+        </w:tc>
+      </w:tr>
     </w:tbl>
     <w:p>
       <w:pPr>
@@ -32762,7 +34515,38 @@
         <w:t xml:space="preserve"> </w:t>
       </w:r>
       <w:r>
-        <w:t xml:space="preserve">Prima si misura (R-232), poi pista del giorno (R-233), fantasmi (R-234, R-235) e sfida con il link (R-236): ogni passo è una versione da provare dal telefono. Le idee F-11…F-15 si decidono dopo, guardando i dati.</w:t>
+        <w:t xml:space="preserve">Prima si misura (R-232), poi pista del giorno (R-233), avversari (R-234…R-239) e sfida con il link (R-236): ogni passo è una versione da provare dal telefono. Le idee F-11…F-15 si decidono dopo, guardando i dati.</w:t>
+      </w:r>
+    </w:p>
+    <w:p>
+      <w:pPr>
+        <w:pStyle w:val="BodyText"/>
+      </w:pPr>
+      <w:r>
+        <w:rPr>
+          <w:bCs/>
+          <w:b/>
+        </w:rPr>
+        <w:t xml:space="preserve">Cambio del 26/10 sera.</w:t>
+      </w:r>
+      <w:r>
+        <w:t xml:space="preserve"> </w:t>
+      </w:r>
+      <w:r>
+        <w:t xml:space="preserve">Al posto dei fantasmi (discese registrate, trasparenti) Luigi vuole</w:t>
+      </w:r>
+      <w:r>
+        <w:t xml:space="preserve"> </w:t>
+      </w:r>
+      <w:r>
+        <w:rPr>
+          <w:bCs/>
+          <w:b/>
+        </w:rPr>
+        <w:t xml:space="preserve">avversari guidati dal software</w:t>
+      </w:r>
+      <w:r>
+        <w:t xml:space="preserve">: giocatori come gli altri, che però guida il gioco. Le sue scelte: in pista non si distinguono dalle persone, solo un piccolo 🤖 nelle classifiche; ci sono in allenamento, pista del giorno, sfida con gli amici e sala online vuota; livelli misti.</w:t>
       </w:r>
     </w:p>
     <w:tbl>
@@ -33848,7 +35632,323 @@
               <w:rPr>
                 <w:sz w:val="19"/>
               </w:rPr>
-              <w:t xml:space="preserve">Fantasmi: le discese migliori corrono in pista come avversari trasparenti</w:t>
+              <w:t xml:space="preserve">Avversari guidati dal software, uguali ai giocatori veri (non fantasmi trasparenti): corrono in pista come le persone ma li guida il gioco</w:t>
+            </w:r>
+          </w:p>
+        </w:tc>
+        <w:tc>
+          <w:tcPr>
+            <w:tcW w:type="dxa" w:w="1134"/>
+          </w:tcPr>
+          <w:p>
+            <w:pPr>
+              <w:pStyle w:val="Compact"/>
+              <w:spacing w:after="40"/>
+              <w:jc w:val="left"/>
+            </w:pPr>
+            <w:r>
+              <w:rPr>
+                <w:sz w:val="19"/>
+              </w:rPr>
+              <w:t xml:space="preserve">26/10/2026</w:t>
+            </w:r>
+          </w:p>
+        </w:tc>
+        <w:tc>
+          <w:tcPr>
+            <w:tcW w:type="dxa" w:w="1134"/>
+            <w:shd w:val="clear" w:color="auto" w:fill="D7F0DF"/>
+          </w:tcPr>
+          <w:p>
+            <w:pPr>
+              <w:pStyle w:val="Compact"/>
+              <w:spacing w:after="40"/>
+              <w:jc w:val="left"/>
+            </w:pPr>
+            <w:r>
+              <w:rPr>
+                <w:sz w:val="19"/>
+              </w:rPr>
+              <w:t xml:space="preserve">Fatto</w:t>
+            </w:r>
+          </w:p>
+        </w:tc>
+        <w:tc>
+          <w:tcPr>
+            <w:tcW w:type="dxa" w:w="2494"/>
+          </w:tcPr>
+          <w:p>
+            <w:pPr>
+              <w:pStyle w:val="Compact"/>
+              <w:spacing w:after="40"/>
+              <w:jc w:val="left"/>
+            </w:pPr>
+            <w:r>
+              <w:rPr>
+                <w:sz w:val="19"/>
+              </w:rPr>
+              <w:t xml:space="preserve">Dalla 0.18.0. Personaggio completo come quello di una persona (maglia, capelli, pantaloni, casco, tavola, diversi per ognuno) con il nome sopra la testa; stessa pista, stessi ostacoli e stessa velocità massima delle persone. Curvano per evitare alberi, rocce e paletti, a volte saltano le rocce, salgono sulle rampe e sui trampolini giganti e fanno acrobazie (rotazioni, salti mortali, presa della tavola) con i punti come le persone, passano nelle porte e prendono i bonus. Sbagliano come le persone: a volte prendono un ostacolo o atterrano storti e cadono. In gara usano i punti per banane, bombe e bananoni e si possono colpire come tutti.</w:t>
+            </w:r>
+            <w:r>
+              <w:rPr>
+                <w:sz w:val="19"/>
+              </w:rPr>
+              <w:t xml:space="preserve"> </w:t>
+            </w:r>
+            <w:r>
+              <w:rPr>
+                <w:bCs/>
+                <w:b/>
+                <w:sz w:val="19"/>
+              </w:rPr>
+              <w:t xml:space="preserve">Livelli misti</w:t>
+            </w:r>
+            <w:r>
+              <w:rPr>
+                <w:sz w:val="19"/>
+              </w:rPr>
+              <w:t xml:space="preserve">: in ogni gara uno forte, uno medio e uno più lento, così si può vincere ma non sempre. In pista non si distinguono dalle persone; un piccolo</w:t>
+            </w:r>
+            <w:r>
+              <w:rPr>
+                <w:sz w:val="19"/>
+              </w:rPr>
+              <w:t xml:space="preserve"> </w:t>
+            </w:r>
+            <w:r>
+              <w:rPr>
+                <w:bCs/>
+                <w:b/>
+                <w:sz w:val="19"/>
+              </w:rPr>
+              <w:t xml:space="preserve">🤖</w:t>
+            </w:r>
+            <w:r>
+              <w:rPr>
+                <w:sz w:val="19"/>
+              </w:rPr>
+              <w:t xml:space="preserve"> </w:t>
+            </w:r>
+            <w:r>
+              <w:rPr>
+                <w:sz w:val="19"/>
+              </w:rPr>
+              <w:t xml:space="preserve">accanto al nome c’è solo nella classifica dal vivo, in quella finale e nei premi. I loro tempi non entrano nella classifica generale né in quella del giorno e non prendono punti collezionati. Scelte S-39</w:t>
+            </w:r>
+          </w:p>
+        </w:tc>
+      </w:tr>
+      <w:tr>
+        <w:tc>
+          <w:tcPr>
+            <w:tcW w:type="dxa" w:w="907"/>
+          </w:tcPr>
+          <w:p>
+            <w:pPr>
+              <w:pStyle w:val="Compact"/>
+              <w:spacing w:after="40"/>
+              <w:jc w:val="left"/>
+            </w:pPr>
+            <w:r>
+              <w:rPr>
+                <w:sz w:val="19"/>
+              </w:rPr>
+              <w:t xml:space="preserve">R-235</w:t>
+            </w:r>
+          </w:p>
+        </w:tc>
+        <w:tc>
+          <w:tcPr>
+            <w:tcW w:type="dxa" w:w="4195"/>
+          </w:tcPr>
+          <w:p>
+            <w:pPr>
+              <w:pStyle w:val="Compact"/>
+              <w:spacing w:after="40"/>
+              <w:jc w:val="left"/>
+            </w:pPr>
+            <w:r>
+              <w:rPr>
+                <w:sz w:val="19"/>
+              </w:rPr>
+              <w:t xml:space="preserve">Sala online vuota: se non arriva nessuno, si parte con gli avversari del software invece di aspettare da soli</w:t>
+            </w:r>
+          </w:p>
+        </w:tc>
+        <w:tc>
+          <w:tcPr>
+            <w:tcW w:type="dxa" w:w="1134"/>
+          </w:tcPr>
+          <w:p>
+            <w:pPr>
+              <w:pStyle w:val="Compact"/>
+              <w:spacing w:after="40"/>
+              <w:jc w:val="left"/>
+            </w:pPr>
+            <w:r>
+              <w:rPr>
+                <w:sz w:val="19"/>
+              </w:rPr>
+              <w:t xml:space="preserve">26/10/2026</w:t>
+            </w:r>
+          </w:p>
+        </w:tc>
+        <w:tc>
+          <w:tcPr>
+            <w:tcW w:type="dxa" w:w="1134"/>
+            <w:shd w:val="clear" w:color="auto" w:fill="D7F0DF"/>
+          </w:tcPr>
+          <w:p>
+            <w:pPr>
+              <w:pStyle w:val="Compact"/>
+              <w:spacing w:after="40"/>
+              <w:jc w:val="left"/>
+            </w:pPr>
+            <w:r>
+              <w:rPr>
+                <w:sz w:val="19"/>
+              </w:rPr>
+              <w:t xml:space="preserve">Fatto</w:t>
+            </w:r>
+          </w:p>
+        </w:tc>
+        <w:tc>
+          <w:tcPr>
+            <w:tcW w:type="dxa" w:w="2494"/>
+          </w:tcPr>
+          <w:p>
+            <w:pPr>
+              <w:pStyle w:val="Compact"/>
+              <w:spacing w:after="40"/>
+              <w:jc w:val="left"/>
+            </w:pPr>
+            <w:r>
+              <w:rPr>
+                <w:sz w:val="19"/>
+              </w:rPr>
+              <w:t xml:space="preserve">Dalla 0.18.0. Chi è da solo nella sala online aspetta 15 s (</w:t>
+            </w:r>
+            <w:r>
+              <w:rPr>
+                <w:sz w:val="19"/>
+              </w:rPr>
+              <w:t xml:space="preserve">“</w:t>
+            </w:r>
+            <w:r>
+              <w:rPr>
+                <w:sz w:val="19"/>
+              </w:rPr>
+              <w:t xml:space="preserve">Se non arriva nessuno, tra 15 s si parte con gli avversari del computer 🤖. Premi</w:t>
+            </w:r>
+            <w:r>
+              <w:rPr>
+                <w:sz w:val="19"/>
+              </w:rPr>
+              <w:t xml:space="preserve">”</w:t>
+            </w:r>
+            <w:r>
+              <w:rPr>
+                <w:sz w:val="19"/>
+              </w:rPr>
+              <w:t xml:space="preserve">Sono pronto” per partire subito”: con</w:t>
+            </w:r>
+            <w:r>
+              <w:rPr>
+                <w:sz w:val="19"/>
+              </w:rPr>
+              <w:t xml:space="preserve"> </w:t>
+            </w:r>
+            <w:r>
+              <w:rPr>
+                <w:sz w:val="19"/>
+              </w:rPr>
+              <w:t xml:space="preserve">“</w:t>
+            </w:r>
+            <w:r>
+              <w:rPr>
+                <w:sz w:val="19"/>
+              </w:rPr>
+              <w:t xml:space="preserve">Sono pronto</w:t>
+            </w:r>
+            <w:r>
+              <w:rPr>
+                <w:sz w:val="19"/>
+              </w:rPr>
+              <w:t xml:space="preserve">”</w:t>
+            </w:r>
+            <w:r>
+              <w:rPr>
+                <w:sz w:val="19"/>
+              </w:rPr>
+              <w:t xml:space="preserve"> </w:t>
+            </w:r>
+            <w:r>
+              <w:rPr>
+                <w:sz w:val="19"/>
+              </w:rPr>
+              <w:t xml:space="preserve">si parte dopo 3 s), poi la gara parte con 3 avversari guidati dal software. Chi arriva dopo entra in gara come oggi (persona vera, parte dal via). Con 2 o più persone nella sala la gara è solo tra persone, come prima</w:t>
+            </w:r>
+          </w:p>
+        </w:tc>
+      </w:tr>
+      <w:tr>
+        <w:tc>
+          <w:tcPr>
+            <w:tcW w:type="dxa" w:w="907"/>
+          </w:tcPr>
+          <w:p>
+            <w:pPr>
+              <w:pStyle w:val="Compact"/>
+              <w:spacing w:after="40"/>
+              <w:jc w:val="left"/>
+            </w:pPr>
+            <w:r>
+              <w:rPr>
+                <w:sz w:val="19"/>
+              </w:rPr>
+              <w:t xml:space="preserve">R-236</w:t>
+            </w:r>
+          </w:p>
+        </w:tc>
+        <w:tc>
+          <w:tcPr>
+            <w:tcW w:type="dxa" w:w="4195"/>
+          </w:tcPr>
+          <w:p>
+            <w:pPr>
+              <w:pStyle w:val="Compact"/>
+              <w:spacing w:after="40"/>
+              <w:jc w:val="left"/>
+            </w:pPr>
+            <w:r>
+              <w:rPr>
+                <w:sz w:val="19"/>
+              </w:rPr>
+              <w:t xml:space="preserve">Condividere il risultato e sfidare con un link</w:t>
+            </w:r>
+            <w:r>
+              <w:rPr>
+                <w:sz w:val="19"/>
+              </w:rPr>
+              <w:t xml:space="preserve"> </w:t>
+            </w:r>
+            <w:r>
+              <w:rPr>
+                <w:sz w:val="19"/>
+              </w:rPr>
+              <w:t xml:space="preserve">“</w:t>
+            </w:r>
+            <w:r>
+              <w:rPr>
+                <w:sz w:val="19"/>
+              </w:rPr>
+              <w:t xml:space="preserve">batti il mio tempo</w:t>
+            </w:r>
+            <w:r>
+              <w:rPr>
+                <w:sz w:val="19"/>
+              </w:rPr>
+              <w:t xml:space="preserve">”</w:t>
             </w:r>
           </w:p>
         </w:tc>
@@ -33903,7 +36003,37 @@
               <w:rPr>
                 <w:sz w:val="19"/>
               </w:rPr>
-              <w:t xml:space="preserve">Il server salva le posizioni delle discese migliori (quelle che il gioco già manda 10 volte al secondo, circa 25 KB per 5 minuti). In pista si vedono trasparenti, con nome e tempo; si superano ma non si colpiscono. I fantasmi mostrano il nome del giocatore, come la classifica. Scelte S-39</w:t>
+              <w:t xml:space="preserve">A fine gara un testo corto da incollare (per esempio</w:t>
+            </w:r>
+            <w:r>
+              <w:rPr>
+                <w:sz w:val="19"/>
+              </w:rPr>
+              <w:t xml:space="preserve"> </w:t>
+            </w:r>
+            <w:r>
+              <w:rPr>
+                <w:sz w:val="19"/>
+              </w:rPr>
+              <w:t xml:space="preserve">“</w:t>
+            </w:r>
+            <w:r>
+              <w:rPr>
+                <w:sz w:val="19"/>
+              </w:rPr>
+              <w:t xml:space="preserve">🏂 Pista del giorno #12 · Napoli · 4:58 · 3° su 41</w:t>
+            </w:r>
+            <w:r>
+              <w:rPr>
+                <w:sz w:val="19"/>
+              </w:rPr>
+              <w:t xml:space="preserve">”</w:t>
+            </w:r>
+            <w:r>
+              <w:rPr>
+                <w:sz w:val="19"/>
+              </w:rPr>
+              <w:t xml:space="preserve">) e l’immagine del risultato (D-05). Chi apre il link corre la stessa pista con il tempo da battere in alto (dal 26/10 sera niente fantasma: eventualmente un avversario del software che tiene quel ritmo)</w:t>
             </w:r>
           </w:p>
         </w:tc>
@@ -33923,7 +36053,7 @@
               <w:rPr>
                 <w:sz w:val="19"/>
               </w:rPr>
-              <w:t xml:space="preserve">R-235</w:t>
+              <w:t xml:space="preserve">R-237</w:t>
             </w:r>
           </w:p>
         </w:tc>
@@ -33941,7 +36071,7 @@
               <w:rPr>
                 <w:sz w:val="19"/>
               </w:rPr>
-              <w:t xml:space="preserve">Nella sala online, se non arriva nessuno, si corre contro i fantasmi invece di aspettare da soli</w:t>
+              <w:t xml:space="preserve">Sfida con gli amici: chi organizza sceglie quanti avversari del software aggiungere</w:t>
             </w:r>
           </w:p>
         </w:tc>
@@ -33966,19 +36096,19 @@
         <w:tc>
           <w:tcPr>
             <w:tcW w:type="dxa" w:w="1134"/>
-            <w:shd w:val="clear" w:color="auto" w:fill="FDE2D6"/>
-          </w:tcPr>
-          <w:p>
-            <w:pPr>
-              <w:pStyle w:val="Compact"/>
-              <w:spacing w:after="40"/>
-              <w:jc w:val="left"/>
-            </w:pPr>
-            <w:r>
-              <w:rPr>
-                <w:sz w:val="19"/>
-              </w:rPr>
-              <w:t xml:space="preserve">Da fare</w:t>
+            <w:shd w:val="clear" w:color="auto" w:fill="D7F0DF"/>
+          </w:tcPr>
+          <w:p>
+            <w:pPr>
+              <w:pStyle w:val="Compact"/>
+              <w:spacing w:after="40"/>
+              <w:jc w:val="left"/>
+            </w:pPr>
+            <w:r>
+              <w:rPr>
+                <w:sz w:val="19"/>
+              </w:rPr>
+              <w:t xml:space="preserve">Fatto</w:t>
             </w:r>
           </w:p>
         </w:tc>
@@ -33996,7 +36126,103 @@
               <w:rPr>
                 <w:sz w:val="19"/>
               </w:rPr>
-              <w:t xml:space="preserve">Dopo 30 s da soli nella sala online, la gara parte con i fantasmi della pista. Se nel frattempo arriva una persona vera, si corre con lei come oggi</w:t>
+              <w:t xml:space="preserve">Dalla 0.18.0. Nella stanza, sotto la durata, la riga</w:t>
+            </w:r>
+            <w:r>
+              <w:rPr>
+                <w:sz w:val="19"/>
+              </w:rPr>
+              <w:t xml:space="preserve"> </w:t>
+            </w:r>
+            <w:r>
+              <w:rPr>
+                <w:sz w:val="19"/>
+              </w:rPr>
+              <w:t xml:space="preserve">“</w:t>
+            </w:r>
+            <w:r>
+              <w:rPr>
+                <w:sz w:val="19"/>
+              </w:rPr>
+              <w:t xml:space="preserve">Avversari del computer 🤖</w:t>
+            </w:r>
+            <w:r>
+              <w:rPr>
+                <w:sz w:val="19"/>
+              </w:rPr>
+              <w:t xml:space="preserve">”</w:t>
+            </w:r>
+            <w:r>
+              <w:rPr>
+                <w:sz w:val="19"/>
+              </w:rPr>
+              <w:t xml:space="preserve"> </w:t>
+            </w:r>
+            <w:r>
+              <w:rPr>
+                <w:sz w:val="19"/>
+              </w:rPr>
+              <w:t xml:space="preserve">con i pulsanti 0, 1, 2, 3, 4; nell’elenco dei giocatori</w:t>
+            </w:r>
+            <w:r>
+              <w:rPr>
+                <w:sz w:val="19"/>
+              </w:rPr>
+              <w:t xml:space="preserve"> </w:t>
+            </w:r>
+            <w:r>
+              <w:rPr>
+                <w:sz w:val="19"/>
+              </w:rPr>
+              <w:t xml:space="preserve">“</w:t>
+            </w:r>
+            <w:r>
+              <w:rPr>
+                <w:sz w:val="19"/>
+              </w:rPr>
+              <w:t xml:space="preserve">🤖 + 2 avversari del computer</w:t>
+            </w:r>
+            <w:r>
+              <w:rPr>
+                <w:sz w:val="19"/>
+              </w:rPr>
+              <w:t xml:space="preserve">”</w:t>
+            </w:r>
+            <w:r>
+              <w:rPr>
+                <w:sz w:val="19"/>
+              </w:rPr>
+              <w:t xml:space="preserve"> </w:t>
+            </w:r>
+            <w:r>
+              <w:rPr>
+                <w:sz w:val="19"/>
+              </w:rPr>
+              <w:t xml:space="preserve">(li tocca solo chi organizza, gli altri vedono la scelta). Normale: 0, cioè come prima. In tutto al massimo 8 corridori, persone comprese. Gli avversari partono in fila con le persone e alzano subito la mano (</w:t>
+            </w:r>
+            <w:r>
+              <w:rPr>
+                <w:sz w:val="19"/>
+              </w:rPr>
+              <w:t xml:space="preserve">“</w:t>
+            </w:r>
+            <w:r>
+              <w:rPr>
+                <w:sz w:val="19"/>
+              </w:rPr>
+              <w:t xml:space="preserve">Sono pronto</w:t>
+            </w:r>
+            <w:r>
+              <w:rPr>
+                <w:sz w:val="19"/>
+              </w:rPr>
+              <w:t xml:space="preserve">”</w:t>
+            </w:r>
+            <w:r>
+              <w:rPr>
+                <w:sz w:val="19"/>
+              </w:rPr>
+              <w:t xml:space="preserve">)</w:t>
             </w:r>
           </w:p>
         </w:tc>
@@ -34016,7 +36242,7 @@
               <w:rPr>
                 <w:sz w:val="19"/>
               </w:rPr>
-              <w:t xml:space="preserve">R-236</w:t>
+              <w:t xml:space="preserve">R-238</w:t>
             </w:r>
           </w:p>
         </w:tc>
@@ -34034,31 +36260,7 @@
               <w:rPr>
                 <w:sz w:val="19"/>
               </w:rPr>
-              <w:t xml:space="preserve">Condividere il risultato e sfidare con un link</w:t>
-            </w:r>
-            <w:r>
-              <w:rPr>
-                <w:sz w:val="19"/>
-              </w:rPr>
-              <w:t xml:space="preserve"> </w:t>
-            </w:r>
-            <w:r>
-              <w:rPr>
-                <w:sz w:val="19"/>
-              </w:rPr>
-              <w:t xml:space="preserve">“</w:t>
-            </w:r>
-            <w:r>
-              <w:rPr>
-                <w:sz w:val="19"/>
-              </w:rPr>
-              <w:t xml:space="preserve">batti il mio tempo</w:t>
-            </w:r>
-            <w:r>
-              <w:rPr>
-                <w:sz w:val="19"/>
-              </w:rPr>
-              <w:t xml:space="preserve">”</w:t>
+              <w:t xml:space="preserve">Pista del giorno con avversari</w:t>
             </w:r>
           </w:p>
         </w:tc>
@@ -34083,19 +36285,19 @@
         <w:tc>
           <w:tcPr>
             <w:tcW w:type="dxa" w:w="1134"/>
-            <w:shd w:val="clear" w:color="auto" w:fill="FDE2D6"/>
-          </w:tcPr>
-          <w:p>
-            <w:pPr>
-              <w:pStyle w:val="Compact"/>
-              <w:spacing w:after="40"/>
-              <w:jc w:val="left"/>
-            </w:pPr>
-            <w:r>
-              <w:rPr>
-                <w:sz w:val="19"/>
-              </w:rPr>
-              <w:t xml:space="preserve">Da fare</w:t>
+            <w:shd w:val="clear" w:color="auto" w:fill="D7F0DF"/>
+          </w:tcPr>
+          <w:p>
+            <w:pPr>
+              <w:pStyle w:val="Compact"/>
+              <w:spacing w:after="40"/>
+              <w:jc w:val="left"/>
+            </w:pPr>
+            <w:r>
+              <w:rPr>
+                <w:sz w:val="19"/>
+              </w:rPr>
+              <w:t xml:space="preserve">Fatto</w:t>
             </w:r>
           </w:p>
         </w:tc>
@@ -34113,37 +36315,100 @@
               <w:rPr>
                 <w:sz w:val="19"/>
               </w:rPr>
-              <w:t xml:space="preserve">A fine gara un testo corto da incollare (per esempio</w:t>
-            </w:r>
-            <w:r>
-              <w:rPr>
-                <w:sz w:val="19"/>
-              </w:rPr>
-              <w:t xml:space="preserve"> </w:t>
-            </w:r>
-            <w:r>
-              <w:rPr>
-                <w:sz w:val="19"/>
-              </w:rPr>
-              <w:t xml:space="preserve">“</w:t>
-            </w:r>
-            <w:r>
-              <w:rPr>
-                <w:sz w:val="19"/>
-              </w:rPr>
-              <w:t xml:space="preserve">🏂 Pista del giorno #12 · Napoli · 4:58 · 3° su 41</w:t>
-            </w:r>
-            <w:r>
-              <w:rPr>
-                <w:sz w:val="19"/>
-              </w:rPr>
-              <w:t xml:space="preserve">”</w:t>
-            </w:r>
-            <w:r>
-              <w:rPr>
-                <w:sz w:val="19"/>
-              </w:rPr>
-              <w:t xml:space="preserve">) e l’immagine del risultato (D-05). Chi apre il link corre la stessa pista contro il fantasma di chi l’ha mandato</w:t>
+              <w:t xml:space="preserve">Dalla 0.18.0. Si corre la pista del giorno con 3 avversari guidati dal software (uno forte, uno medio, uno più lento) invece che da soli contro il tempo. Come per le persone, nella pista del giorno non ci sono banane, bombe e bananoni (S-40): il tempo del giorno resta confrontabile tra tutti. Gli avversari non entrano nella classifica del giorno</w:t>
+            </w:r>
+          </w:p>
+        </w:tc>
+      </w:tr>
+      <w:tr>
+        <w:tc>
+          <w:tcPr>
+            <w:tcW w:type="dxa" w:w="907"/>
+          </w:tcPr>
+          <w:p>
+            <w:pPr>
+              <w:pStyle w:val="Compact"/>
+              <w:spacing w:after="40"/>
+              <w:jc w:val="left"/>
+            </w:pPr>
+            <w:r>
+              <w:rPr>
+                <w:sz w:val="19"/>
+              </w:rPr>
+              <w:t xml:space="preserve">R-239</w:t>
+            </w:r>
+          </w:p>
+        </w:tc>
+        <w:tc>
+          <w:tcPr>
+            <w:tcW w:type="dxa" w:w="4195"/>
+          </w:tcPr>
+          <w:p>
+            <w:pPr>
+              <w:pStyle w:val="Compact"/>
+              <w:spacing w:after="40"/>
+              <w:jc w:val="left"/>
+            </w:pPr>
+            <w:r>
+              <w:rPr>
+                <w:sz w:val="19"/>
+              </w:rPr>
+              <w:t xml:space="preserve">Allenamento con avversari</w:t>
+            </w:r>
+          </w:p>
+        </w:tc>
+        <w:tc>
+          <w:tcPr>
+            <w:tcW w:type="dxa" w:w="1134"/>
+          </w:tcPr>
+          <w:p>
+            <w:pPr>
+              <w:pStyle w:val="Compact"/>
+              <w:spacing w:after="40"/>
+              <w:jc w:val="left"/>
+            </w:pPr>
+            <w:r>
+              <w:rPr>
+                <w:sz w:val="19"/>
+              </w:rPr>
+              <w:t xml:space="preserve">26/10/2026</w:t>
+            </w:r>
+          </w:p>
+        </w:tc>
+        <w:tc>
+          <w:tcPr>
+            <w:tcW w:type="dxa" w:w="1134"/>
+            <w:shd w:val="clear" w:color="auto" w:fill="D7F0DF"/>
+          </w:tcPr>
+          <w:p>
+            <w:pPr>
+              <w:pStyle w:val="Compact"/>
+              <w:spacing w:after="40"/>
+              <w:jc w:val="left"/>
+            </w:pPr>
+            <w:r>
+              <w:rPr>
+                <w:sz w:val="19"/>
+              </w:rPr>
+              <w:t xml:space="preserve">Fatto</w:t>
+            </w:r>
+          </w:p>
+        </w:tc>
+        <w:tc>
+          <w:tcPr>
+            <w:tcW w:type="dxa" w:w="2494"/>
+          </w:tcPr>
+          <w:p>
+            <w:pPr>
+              <w:pStyle w:val="Compact"/>
+              <w:spacing w:after="40"/>
+              <w:jc w:val="left"/>
+            </w:pPr>
+            <w:r>
+              <w:rPr>
+                <w:sz w:val="19"/>
+              </w:rPr>
+              <w:t xml:space="preserve">Dalla 0.18.0. In allenamento corrono con te 3 avversari guidati dal software, che guidano, saltano, fanno acrobazie e cadono come in gara. Banane e bombe restano solo in gara. Siccome l’allenamento non ha un traguardo, gli avversari restano nei paraggi: se restano molto indietro accelerano un po’, se vanno troppo avanti rallentano</w:t>
             </w:r>
           </w:p>
         </w:tc>
@@ -36165,6 +38430,555 @@
                 <w:sz w:val="19"/>
               </w:rPr>
               <w:t xml:space="preserve">Pista del giorno (R-233, S-40): pulsante nel menu con numero, città e migliore di oggi; gara da soli di 5 minuti con pista e città uguali per tutti, che cambiano a mezzanotte (ora italiana); tempo misurato dal server, classifica del giorno con il migliore di ognuno, Riprova, posizione e condivisione a fine gara; /api/giorno. Protocollo di rete versione 6</w:t>
+            </w:r>
+          </w:p>
+        </w:tc>
+      </w:tr>
+      <w:tr>
+        <w:tc>
+          <w:tcPr>
+            <w:tcW w:type="dxa" w:w="1247"/>
+          </w:tcPr>
+          <w:p>
+            <w:pPr>
+              <w:pStyle w:val="Compact"/>
+              <w:spacing w:after="40"/>
+              <w:jc w:val="left"/>
+            </w:pPr>
+            <w:r>
+              <w:rPr>
+                <w:sz w:val="19"/>
+              </w:rPr>
+              <w:t xml:space="preserve">0.18.0</w:t>
+            </w:r>
+          </w:p>
+        </w:tc>
+        <w:tc>
+          <w:tcPr>
+            <w:tcW w:type="dxa" w:w="1361"/>
+          </w:tcPr>
+          <w:p>
+            <w:pPr>
+              <w:pStyle w:val="Compact"/>
+              <w:spacing w:after="40"/>
+              <w:jc w:val="left"/>
+            </w:pPr>
+            <w:r>
+              <w:rPr>
+                <w:sz w:val="19"/>
+              </w:rPr>
+              <w:t xml:space="preserve">26/10/2026</w:t>
+            </w:r>
+          </w:p>
+        </w:tc>
+        <w:tc>
+          <w:tcPr>
+            <w:tcW w:type="dxa" w:w="7257"/>
+          </w:tcPr>
+          <w:p>
+            <w:pPr>
+              <w:pStyle w:val="Compact"/>
+              <w:spacing w:after="40"/>
+              <w:jc w:val="left"/>
+            </w:pPr>
+            <w:r>
+              <w:rPr>
+                <w:sz w:val="19"/>
+              </w:rPr>
+              <w:t xml:space="preserve">Avversari guidati dal software, uguali ai giocatori veri (R-234, S-39): guidano, evitano gli ostacoli, saltano, fanno acrobazie, cadono, usano banane, bombe e bananoni e si possono colpire; livelli misti; 🤖 solo nelle classifiche. Ci sono in allenamento (R-239), nella pista del giorno (R-238), nella sfida se chi organizza li aggiunge (R-237) e nella sala online quando si è da soli per 15 s (R-235). Ostacoli della pista calcolati da un modulo solo (</w:t>
+            </w:r>
+            <w:r>
+              <w:rPr>
+                <w:rStyle w:val="VerbatimChar"/>
+                <w:sz w:val="19"/>
+              </w:rPr>
+              <w:t xml:space="preserve">tracciato.js</w:t>
+            </w:r>
+            <w:r>
+              <w:rPr>
+                <w:sz w:val="19"/>
+              </w:rPr>
+              <w:t xml:space="preserve">), lo stesso per la pista che si vede e per gli avversari. Protocollo di rete versione 6</w:t>
+            </w:r>
+          </w:p>
+        </w:tc>
+      </w:tr>
+      <w:tr>
+        <w:tc>
+          <w:tcPr>
+            <w:tcW w:type="dxa" w:w="1247"/>
+          </w:tcPr>
+          <w:p>
+            <w:pPr>
+              <w:pStyle w:val="Compact"/>
+              <w:spacing w:after="40"/>
+              <w:jc w:val="left"/>
+            </w:pPr>
+            <w:r>
+              <w:rPr>
+                <w:sz w:val="19"/>
+              </w:rPr>
+              <w:t xml:space="preserve">0.18.1</w:t>
+            </w:r>
+          </w:p>
+        </w:tc>
+        <w:tc>
+          <w:tcPr>
+            <w:tcW w:type="dxa" w:w="1361"/>
+          </w:tcPr>
+          <w:p>
+            <w:pPr>
+              <w:pStyle w:val="Compact"/>
+              <w:spacing w:after="40"/>
+              <w:jc w:val="left"/>
+            </w:pPr>
+            <w:r>
+              <w:rPr>
+                <w:sz w:val="19"/>
+              </w:rPr>
+              <w:t xml:space="preserve">26/10/2026</w:t>
+            </w:r>
+          </w:p>
+        </w:tc>
+        <w:tc>
+          <w:tcPr>
+            <w:tcW w:type="dxa" w:w="7257"/>
+          </w:tcPr>
+          <w:p>
+            <w:pPr>
+              <w:pStyle w:val="Compact"/>
+              <w:spacing w:after="40"/>
+              <w:jc w:val="left"/>
+            </w:pPr>
+            <w:r>
+              <w:rPr>
+                <w:sz w:val="19"/>
+              </w:rPr>
+              <w:t xml:space="preserve">Struttura, niente cambia nel gioco (A-23, A-20, A-16, A-24): fisica in</w:t>
+            </w:r>
+            <w:r>
+              <w:rPr>
+                <w:sz w:val="19"/>
+              </w:rPr>
+              <w:t xml:space="preserve"> </w:t>
+            </w:r>
+            <w:r>
+              <w:rPr>
+                <w:rStyle w:val="VerbatimChar"/>
+                <w:sz w:val="19"/>
+              </w:rPr>
+              <w:t xml:space="preserve">moduli/fisica.js</w:t>
+            </w:r>
+            <w:r>
+              <w:rPr>
+                <w:sz w:val="19"/>
+              </w:rPr>
+              <w:t xml:space="preserve"> </w:t>
+            </w:r>
+            <w:r>
+              <w:rPr>
+                <w:sz w:val="19"/>
+              </w:rPr>
+              <w:t xml:space="preserve">usata dal rider e dagli avversari (traccia del rider identica prima e dopo: 160 controlli su 160); Three.js dal sito stesso (</w:t>
+            </w:r>
+            <w:r>
+              <w:rPr>
+                <w:rStyle w:val="VerbatimChar"/>
+                <w:sz w:val="19"/>
+              </w:rPr>
+              <w:t xml:space="preserve">public/vendor</w:t>
+            </w:r>
+            <w:r>
+              <w:rPr>
+                <w:sz w:val="19"/>
+              </w:rPr>
+              <w:t xml:space="preserve">); server diviso in</w:t>
+            </w:r>
+            <w:r>
+              <w:rPr>
+                <w:sz w:val="19"/>
+              </w:rPr>
+              <w:t xml:space="preserve"> </w:t>
+            </w:r>
+            <w:r>
+              <w:rPr>
+                <w:rStyle w:val="VerbatimChar"/>
+                <w:sz w:val="19"/>
+              </w:rPr>
+              <w:t xml:space="preserve">worker.js</w:t>
+            </w:r>
+            <w:r>
+              <w:rPr>
+                <w:sz w:val="19"/>
+              </w:rPr>
+              <w:t xml:space="preserve"> </w:t>
+            </w:r>
+            <w:r>
+              <w:rPr>
+                <w:sz w:val="19"/>
+              </w:rPr>
+              <w:t xml:space="preserve">(indirizzi),</w:t>
+            </w:r>
+            <w:r>
+              <w:rPr>
+                <w:sz w:val="19"/>
+              </w:rPr>
+              <w:t xml:space="preserve"> </w:t>
+            </w:r>
+            <w:r>
+              <w:rPr>
+                <w:rStyle w:val="VerbatimChar"/>
+                <w:sz w:val="19"/>
+              </w:rPr>
+              <w:t xml:space="preserve">stanza.mjs</w:t>
+            </w:r>
+            <w:r>
+              <w:rPr>
+                <w:sz w:val="19"/>
+              </w:rPr>
+              <w:t xml:space="preserve">,</w:t>
+            </w:r>
+            <w:r>
+              <w:rPr>
+                <w:sz w:val="19"/>
+              </w:rPr>
+              <w:t xml:space="preserve"> </w:t>
+            </w:r>
+            <w:r>
+              <w:rPr>
+                <w:rStyle w:val="VerbatimChar"/>
+                <w:sz w:val="19"/>
+              </w:rPr>
+              <w:t xml:space="preserve">classifica.mjs</w:t>
+            </w:r>
+            <w:r>
+              <w:rPr>
+                <w:sz w:val="19"/>
+              </w:rPr>
+              <w:t xml:space="preserve">,</w:t>
+            </w:r>
+            <w:r>
+              <w:rPr>
+                <w:sz w:val="19"/>
+              </w:rPr>
+              <w:t xml:space="preserve"> </w:t>
+            </w:r>
+            <w:r>
+              <w:rPr>
+                <w:rStyle w:val="VerbatimChar"/>
+                <w:sz w:val="19"/>
+              </w:rPr>
+              <w:t xml:space="preserve">comune.mjs</w:t>
+            </w:r>
+            <w:r>
+              <w:rPr>
+                <w:sz w:val="19"/>
+              </w:rPr>
+              <w:t xml:space="preserve">. Corretto un baco: atterrando</w:t>
+            </w:r>
+            <w:r>
+              <w:rPr>
+                <w:sz w:val="19"/>
+              </w:rPr>
+              <w:t xml:space="preserve"> </w:t>
+            </w:r>
+            <w:r>
+              <w:rPr>
+                <w:sz w:val="19"/>
+              </w:rPr>
+              <w:t xml:space="preserve">“</w:t>
+            </w:r>
+            <w:r>
+              <w:rPr>
+                <w:sz w:val="19"/>
+              </w:rPr>
+              <w:t xml:space="preserve">al contrario</w:t>
+            </w:r>
+            <w:r>
+              <w:rPr>
+                <w:sz w:val="19"/>
+              </w:rPr>
+              <w:t xml:space="preserve">”</w:t>
+            </w:r>
+            <w:r>
+              <w:rPr>
+                <w:sz w:val="19"/>
+              </w:rPr>
+              <w:t xml:space="preserve"> </w:t>
+            </w:r>
+            <w:r>
+              <w:rPr>
+                <w:sz w:val="19"/>
+              </w:rPr>
+              <w:t xml:space="preserve">senza ruotare si prendevano i punti di un 180°</w:t>
+            </w:r>
+          </w:p>
+        </w:tc>
+      </w:tr>
+      <w:tr>
+        <w:tc>
+          <w:tcPr>
+            <w:tcW w:type="dxa" w:w="1247"/>
+          </w:tcPr>
+          <w:p>
+            <w:pPr>
+              <w:pStyle w:val="Compact"/>
+              <w:spacing w:after="40"/>
+              <w:jc w:val="left"/>
+            </w:pPr>
+            <w:r>
+              <w:rPr>
+                <w:sz w:val="19"/>
+              </w:rPr>
+              <w:t xml:space="preserve">0.19.0</w:t>
+            </w:r>
+          </w:p>
+        </w:tc>
+        <w:tc>
+          <w:tcPr>
+            <w:tcW w:type="dxa" w:w="1361"/>
+          </w:tcPr>
+          <w:p>
+            <w:pPr>
+              <w:pStyle w:val="Compact"/>
+              <w:spacing w:after="40"/>
+              <w:jc w:val="left"/>
+            </w:pPr>
+            <w:r>
+              <w:rPr>
+                <w:sz w:val="19"/>
+              </w:rPr>
+              <w:t xml:space="preserve">26/10/2026</w:t>
+            </w:r>
+          </w:p>
+        </w:tc>
+        <w:tc>
+          <w:tcPr>
+            <w:tcW w:type="dxa" w:w="7257"/>
+          </w:tcPr>
+          <w:p>
+            <w:pPr>
+              <w:pStyle w:val="Compact"/>
+              <w:spacing w:after="40"/>
+              <w:jc w:val="left"/>
+            </w:pPr>
+            <w:r>
+              <w:rPr>
+                <w:sz w:val="19"/>
+              </w:rPr>
+              <w:t xml:space="preserve">Velocità come nella realtà: massimo 80 km/h solo in posizione raccolta e dopo ~2,4 km, media intorno ai 50 km/h; gare da 4,2 / 8,4 / 12,6 km (5 / 10 / 15 minuti); classifica generale da zero; telecamera e suoni riproporzionati; avversari ricalibrati (R-242, S-41). Alberi, rocce e porte −30% (R-313). Scritta CYF sul trampolino gigante (R-240). Nuova regola: in aria banana e bananone lanciati non colpiscono,</w:t>
+            </w:r>
+            <w:r>
+              <w:rPr>
+                <w:sz w:val="19"/>
+              </w:rPr>
+              <w:t xml:space="preserve"> </w:t>
+            </w:r>
+            <w:r>
+              <w:rPr>
+                <w:sz w:val="19"/>
+              </w:rPr>
+              <w:t xml:space="preserve">“</w:t>
+            </w:r>
+            <w:r>
+              <w:rPr>
+                <w:sz w:val="19"/>
+              </w:rPr>
+              <w:t xml:space="preserve">Schivata in aria!</w:t>
+            </w:r>
+            <w:r>
+              <w:rPr>
+                <w:sz w:val="19"/>
+              </w:rPr>
+              <w:t xml:space="preserve">”</w:t>
+            </w:r>
+            <w:r>
+              <w:rPr>
+                <w:sz w:val="19"/>
+              </w:rPr>
+              <w:t xml:space="preserve"> </w:t>
+            </w:r>
+            <w:r>
+              <w:rPr>
+                <w:sz w:val="19"/>
+              </w:rPr>
+              <w:t xml:space="preserve">(R-241)</w:t>
+            </w:r>
+          </w:p>
+        </w:tc>
+      </w:tr>
+      <w:tr>
+        <w:tc>
+          <w:tcPr>
+            <w:tcW w:type="dxa" w:w="1247"/>
+          </w:tcPr>
+          <w:p>
+            <w:pPr>
+              <w:pStyle w:val="Compact"/>
+              <w:spacing w:after="40"/>
+              <w:jc w:val="left"/>
+            </w:pPr>
+            <w:r>
+              <w:rPr>
+                <w:sz w:val="19"/>
+              </w:rPr>
+              <w:t xml:space="preserve">0.19.1</w:t>
+            </w:r>
+          </w:p>
+        </w:tc>
+        <w:tc>
+          <w:tcPr>
+            <w:tcW w:type="dxa" w:w="1361"/>
+          </w:tcPr>
+          <w:p>
+            <w:pPr>
+              <w:pStyle w:val="Compact"/>
+              <w:spacing w:after="40"/>
+              <w:jc w:val="left"/>
+            </w:pPr>
+            <w:r>
+              <w:rPr>
+                <w:sz w:val="19"/>
+              </w:rPr>
+              <w:t xml:space="preserve">27/10/2026</w:t>
+            </w:r>
+          </w:p>
+        </w:tc>
+        <w:tc>
+          <w:tcPr>
+            <w:tcW w:type="dxa" w:w="7257"/>
+          </w:tcPr>
+          <w:p>
+            <w:pPr>
+              <w:pStyle w:val="Compact"/>
+              <w:spacing w:after="40"/>
+              <w:jc w:val="left"/>
+            </w:pPr>
+            <w:r>
+              <w:rPr>
+                <w:sz w:val="19"/>
+              </w:rPr>
+              <w:t xml:space="preserve">Turno di notte: uniti i rami del 26/10 (prossimi passi in testa al Word, R-507…R-510; sistemata la numerazione doppia A-19…A-21 → A-23/A-24 e S-41 → S-43). Giro completo delle prove: 13 suite tutte verdi. Correzioni: il controllo dei nomi (</w:t>
+            </w:r>
+            <w:r>
+              <w:rPr>
+                <w:rStyle w:val="VerbatimChar"/>
+                <w:sz w:val="19"/>
+              </w:rPr>
+              <w:t xml:space="preserve">tools/verifica/nomi.mjs</w:t>
+            </w:r>
+            <w:r>
+              <w:rPr>
+                <w:sz w:val="19"/>
+              </w:rPr>
+              <w:t xml:space="preserve">) ora conosce i nomi del browser</w:t>
+            </w:r>
+            <w:r>
+              <w:rPr>
+                <w:sz w:val="19"/>
+              </w:rPr>
+              <w:t xml:space="preserve"> </w:t>
+            </w:r>
+            <w:r>
+              <w:rPr>
+                <w:rStyle w:val="VerbatimChar"/>
+                <w:sz w:val="19"/>
+              </w:rPr>
+              <w:t xml:space="preserve">Worker</w:t>
+            </w:r>
+            <w:r>
+              <w:rPr>
+                <w:sz w:val="19"/>
+              </w:rPr>
+              <w:t xml:space="preserve">,</w:t>
+            </w:r>
+            <w:r>
+              <w:rPr>
+                <w:sz w:val="19"/>
+              </w:rPr>
+              <w:t xml:space="preserve"> </w:t>
+            </w:r>
+            <w:r>
+              <w:rPr>
+                <w:rStyle w:val="VerbatimChar"/>
+                <w:sz w:val="19"/>
+              </w:rPr>
+              <w:t xml:space="preserve">OffscreenCanvas</w:t>
+            </w:r>
+            <w:r>
+              <w:rPr>
+                <w:sz w:val="19"/>
+              </w:rPr>
+              <w:t xml:space="preserve">,</w:t>
+            </w:r>
+            <w:r>
+              <w:rPr>
+                <w:sz w:val="19"/>
+              </w:rPr>
+              <w:t xml:space="preserve"> </w:t>
+            </w:r>
+            <w:r>
+              <w:rPr>
+                <w:rStyle w:val="VerbatimChar"/>
+                <w:sz w:val="19"/>
+              </w:rPr>
+              <w:t xml:space="preserve">createImageBitmap</w:t>
+            </w:r>
+            <w:r>
+              <w:rPr>
+                <w:sz w:val="19"/>
+              </w:rPr>
+              <w:t xml:space="preserve"> </w:t>
+            </w:r>
+            <w:r>
+              <w:rPr>
+                <w:sz w:val="19"/>
+              </w:rPr>
+              <w:t xml:space="preserve">(fermava per sbaglio il ramo degli sfondi dipinti, R-405); la versione in</w:t>
+            </w:r>
+            <w:r>
+              <w:rPr>
+                <w:sz w:val="19"/>
+              </w:rPr>
+              <w:t xml:space="preserve"> </w:t>
+            </w:r>
+            <w:r>
+              <w:rPr>
+                <w:rStyle w:val="VerbatimChar"/>
+                <w:sz w:val="19"/>
+              </w:rPr>
+              <w:t xml:space="preserve">package.json</w:t>
+            </w:r>
+            <w:r>
+              <w:rPr>
+                <w:sz w:val="19"/>
+              </w:rPr>
+              <w:t xml:space="preserve"> </w:t>
+            </w:r>
+            <w:r>
+              <w:rPr>
+                <w:sz w:val="19"/>
+              </w:rPr>
+              <w:t xml:space="preserve">era rimasta a 0.17.0 ed è di nuovo allineata a</w:t>
+            </w:r>
+            <w:r>
+              <w:rPr>
+                <w:sz w:val="19"/>
+              </w:rPr>
+              <w:t xml:space="preserve"> </w:t>
+            </w:r>
+            <w:r>
+              <w:rPr>
+                <w:rStyle w:val="VerbatimChar"/>
+                <w:sz w:val="19"/>
+              </w:rPr>
+              <w:t xml:space="preserve">config.js</w:t>
+            </w:r>
+            <w:r>
+              <w:rPr>
+                <w:sz w:val="19"/>
+              </w:rPr>
+              <w:t xml:space="preserve">. Nessuna modifica al gioco</w:t>
             </w:r>
           </w:p>
         </w:tc>

</xml_diff>

<commit_message>
0.19.1: il cancello riparte da stato locale pulito (come su GitHub): /api/points non si sporca tra un giro e l'altro
Co-Authored-By: Claude Fable 5 <noreply@anthropic.com>
Claude-Session: https://claude.ai/code/session_01KYs4CQrWCPeQJMJmDVyrvN
</commit_message>
<xml_diff>
--- a/docs/CYF-Gaming-requisiti.docx
+++ b/docs/CYF-Gaming-requisiti.docx
@@ -38978,7 +38978,20 @@
               <w:rPr>
                 <w:sz w:val="19"/>
               </w:rPr>
-              <w:t xml:space="preserve">; la prova della banana ricevuta (G6) ora legge la durata del fermo decisa al colpo, come già la prova del bananone, e non scatta più sulla macchina lenta; la prova dei piedi sulla rampa distingue i fotogrammi lenti (tetto largo di 25 cm, che basta a trovare il baco da 1 m della 0.11.0) da quelli normali (tetto di 5 cm). Nessuna modifica al gioco</w:t>
+              <w:t xml:space="preserve">; la prova della banana ricevuta (G6) ora legge la durata del fermo decisa al colpo, come già la prova del bananone, e non scatta più sulla macchina lenta; la prova dei piedi sulla rampa distingue i fotogrammi lenti (tetto largo di 25 cm, che basta a trovare il baco da 1 m della 0.11.0) da quelli normali (tetto di 5 cm); il cancello riparte sempre da uno stato locale pulito (</w:t>
+            </w:r>
+            <w:r>
+              <w:rPr>
+                <w:rStyle w:val="VerbatimChar"/>
+                <w:sz w:val="19"/>
+              </w:rPr>
+              <w:t xml:space="preserve">rm -rf .wrangler/state</w:t>
+            </w:r>
+            <w:r>
+              <w:rPr>
+                <w:sz w:val="19"/>
+              </w:rPr>
+              <w:t xml:space="preserve">), come su GitHub, così i giocatori di prova dei giri precedenti non si accumulano e /api/points resta controllabile. Nessuna modifica al gioco</w:t>
             </w:r>
           </w:p>
         </w:tc>

</xml_diff>

<commit_message>
0.20.1: la tavola poggia sulla rampa tra punta e coda (niente punta nel bordo con pochi fotogrammi al secondo, R-214)
Co-Authored-By: Claude Opus 5.5 <noreply@anthropic.com>
Claude-Session: https://claude.ai/code/session_017ipzp9sqryzfFBJaHpW6iC
</commit_message>
<xml_diff>
--- a/docs/CYF-Gaming-requisiti.docx
+++ b/docs/CYF-Gaming-requisiti.docx
@@ -39045,7 +39045,45 @@
               <w:rPr>
                 <w:sz w:val="19"/>
               </w:rPr>
-              <w:t xml:space="preserve">Controllo di stabilità della notte (chiesto da Luigi alle 4:49): giro completo delle prove sulla 0.20.0, errori dai telefoni, pubblicazione. Corretto l’unico errore arrivato dai telefoni: pagina vecchia con programma nuovo (R-011).</w:t>
+              <w:t xml:space="preserve">Controllo di stabilità della notte (chiesto da Luigi alle 4:49): giro completo delle prove sulla 0.20.0, errori dai telefoni, pubblicazione. Corretto l’unico errore arrivato dai telefoni: pagina vecchia con programma nuovo (R-011). Corretto un difetto trovato dal giro completo: con pochi fotogrammi al secondo, nel primo istante sulla rampa la punta della tavola entrava fino a 11 cm nel bordo; ora la tavola poggia tra punta e coda (</w:t>
+            </w:r>
+            <w:r>
+              <w:rPr>
+                <w:rStyle w:val="VerbatimChar"/>
+                <w:sz w:val="19"/>
+              </w:rPr>
+              <w:t xml:space="preserve">tavolaSuRampa</w:t>
+            </w:r>
+            <w:r>
+              <w:rPr>
+                <w:sz w:val="19"/>
+              </w:rPr>
+              <w:t xml:space="preserve"> </w:t>
+            </w:r>
+            <w:r>
+              <w:rPr>
+                <w:sz w:val="19"/>
+              </w:rPr>
+              <w:t xml:space="preserve">in</w:t>
+            </w:r>
+            <w:r>
+              <w:rPr>
+                <w:sz w:val="19"/>
+              </w:rPr>
+              <w:t xml:space="preserve"> </w:t>
+            </w:r>
+            <w:r>
+              <w:rPr>
+                <w:rStyle w:val="VerbatimChar"/>
+                <w:sz w:val="19"/>
+              </w:rPr>
+              <w:t xml:space="preserve">moduli/fisica.js</w:t>
+            </w:r>
+            <w:r>
+              <w:rPr>
+                <w:sz w:val="19"/>
+              </w:rPr>
+              <w:t xml:space="preserve">, anche per gli avversari, R-214); stacco e altezza dei salti invariati.</w:t>
             </w:r>
             <w:r>
               <w:rPr>

</xml_diff>

<commit_message>
0.21.0 (giorno): batti il mio tempo con immagine del risultato (R-236, D-05) e missioni (R-243); requisiti, S-44, S-45, moduli sfida.js e missioni.js
Scritto di giorno, senza prove (R-506): le fa il turno di notte prima di pubblicare.

Co-Authored-By: Claude Opus 5.5 <noreply@anthropic.com>
Claude-Session: https://claude.ai/code/session_01Xy4Xstu72gFJtZMpmwSjuP
</commit_message>
<xml_diff>
--- a/docs/CYF-Gaming-requisiti.docx
+++ b/docs/CYF-Gaming-requisiti.docx
@@ -69,12 +69,30 @@
         <w:t xml:space="preserve"> </w:t>
       </w:r>
       <w:r>
-        <w:t xml:space="preserve">0.20.2</w:t>
+        <w:t xml:space="preserve">0.21.0</w:t>
       </w:r>
       <w:r>
         <w:t xml:space="preserve"> </w:t>
       </w:r>
       <w:r>
+        <w:t xml:space="preserve">(in</w:t>
+      </w:r>
+      <w:r>
+        <w:t xml:space="preserve"> </w:t>
+      </w:r>
+      <w:r>
+        <w:t xml:space="preserve">prova</w:t>
+      </w:r>
+      <w:r>
+        <w:t xml:space="preserve"> </w:t>
+      </w:r>
+      <w:r>
+        <w:t xml:space="preserve">stanotte)</w:t>
+      </w:r>
+      <w:r>
+        <w:t xml:space="preserve"> </w:t>
+      </w:r>
+      <w:r>
         <w:t xml:space="preserve">·</w:t>
       </w:r>
       <w:r>
@@ -117,7 +135,7 @@
         <w:t xml:space="preserve"> </w:t>
       </w:r>
       <w:r>
-        <w:t xml:space="preserve">8:45</w:t>
+        <w:t xml:space="preserve">19:30</w:t>
       </w:r>
       <w:r>
         <w:t xml:space="preserve"> </w:t>
@@ -129,91 +147,91 @@
         <w:t xml:space="preserve"> </w:t>
       </w:r>
       <w:r>
-        <w:t xml:space="preserve">prossimi</w:t>
+        <w:t xml:space="preserve">sfida</w:t>
       </w:r>
       <w:r>
         <w:t xml:space="preserve"> </w:t>
       </w:r>
       <w:r>
-        <w:t xml:space="preserve">passi</w:t>
+        <w:t xml:space="preserve">“</w:t>
+      </w:r>
+      <w:r>
+        <w:t xml:space="preserve">batti</w:t>
       </w:r>
       <w:r>
         <w:t xml:space="preserve"> </w:t>
       </w:r>
       <w:r>
-        <w:t xml:space="preserve">in</w:t>
+        <w:t xml:space="preserve">il</w:t>
       </w:r>
       <w:r>
         <w:t xml:space="preserve"> </w:t>
       </w:r>
       <w:r>
-        <w:t xml:space="preserve">testa,</w:t>
+        <w:t xml:space="preserve">mio</w:t>
       </w:r>
       <w:r>
         <w:t xml:space="preserve"> </w:t>
       </w:r>
       <w:r>
+        <w:t xml:space="preserve">tempo</w:t>
+      </w:r>
+      <w:r>
+        <w:t xml:space="preserve">”</w:t>
+      </w:r>
+      <w:r>
+        <w:t xml:space="preserve"> </w:t>
+      </w:r>
+      <w:r>
         <w:t xml:space="preserve">con</w:t>
       </w:r>
       <w:r>
         <w:t xml:space="preserve"> </w:t>
       </w:r>
       <w:r>
-        <w:t xml:space="preserve">le</w:t>
+        <w:t xml:space="preserve">immagine</w:t>
       </w:r>
       <w:r>
         <w:t xml:space="preserve"> </w:t>
       </w:r>
       <w:r>
-        <w:t xml:space="preserve">approvazioni</w:t>
+        <w:t xml:space="preserve">e</w:t>
       </w:r>
       <w:r>
         <w:t xml:space="preserve"> </w:t>
       </w:r>
       <w:r>
-        <w:t xml:space="preserve">vere</w:t>
+        <w:t xml:space="preserve">missioni</w:t>
       </w:r>
       <w:r>
         <w:t xml:space="preserve"> </w:t>
       </w:r>
       <w:r>
-        <w:t xml:space="preserve">·</w:t>
+        <w:t xml:space="preserve">scritte</w:t>
       </w:r>
       <w:r>
         <w:t xml:space="preserve"> </w:t>
       </w:r>
       <w:r>
-        <w:t xml:space="preserve">i</w:t>
+        <w:t xml:space="preserve">sul</w:t>
       </w:r>
       <w:r>
         <w:t xml:space="preserve"> </w:t>
       </w:r>
       <w:r>
-        <w:t xml:space="preserve">due</w:t>
+        <w:t xml:space="preserve">ramo</w:t>
       </w:r>
       <w:r>
         <w:t xml:space="preserve"> </w:t>
       </w:r>
       <w:r>
-        <w:t xml:space="preserve">controlli</w:t>
+        <w:t xml:space="preserve">del</w:t>
       </w:r>
       <w:r>
         <w:t xml:space="preserve"> </w:t>
       </w:r>
       <w:r>
-        <w:t xml:space="preserve">della</w:t>
-      </w:r>
-      <w:r>
-        <w:t xml:space="preserve"> </w:t>
-      </w:r>
-      <w:r>
-        <w:t xml:space="preserve">notte</w:t>
-      </w:r>
-      <w:r>
-        <w:t xml:space="preserve"> </w:t>
-      </w:r>
-      <w:r>
-        <w:t xml:space="preserve">uniti</w:t>
+        <w:t xml:space="preserve">giorno</w:t>
       </w:r>
       <w:r>
         <w:t xml:space="preserve"> </w:t>
@@ -260,7 +278,40 @@
         <w:pStyle w:val="FirstParagraph"/>
       </w:pPr>
       <w:r>
-        <w:t xml:space="preserve">Aggiornati il 27/10/2026 alle 8:45 (versione online: 0.20.2). Questo Word è anche su Google Drive, cartella</w:t>
+        <w:t xml:space="preserve">Aggiornati il 27/10/2026 alle 19:30 (versione online: 0.20.2; la 0.21.0 con</w:t>
+      </w:r>
+      <w:r>
+        <w:t xml:space="preserve"> </w:t>
+      </w:r>
+      <w:r>
+        <w:t xml:space="preserve">“</w:t>
+      </w:r>
+      <w:r>
+        <w:t xml:space="preserve">batti il mio tempo</w:t>
+      </w:r>
+      <w:r>
+        <w:t xml:space="preserve">”</w:t>
+      </w:r>
+      <w:r>
+        <w:t xml:space="preserve"> </w:t>
+      </w:r>
+      <w:r>
+        <w:t xml:space="preserve">e le missioni è scritta sul ramo</w:t>
+      </w:r>
+      <w:r>
+        <w:t xml:space="preserve"> </w:t>
+      </w:r>
+      <w:r>
+        <w:rPr>
+          <w:rStyle w:val="VerbatimChar"/>
+        </w:rPr>
+        <w:t xml:space="preserve">giorno/batti-missioni</w:t>
+      </w:r>
+      <w:r>
+        <w:t xml:space="preserve"> </w:t>
+      </w:r>
+      <w:r>
+        <w:t xml:space="preserve">e va online domattina, dopo le prove del turno di notte). Questo Word è anche su Google Drive, cartella</w:t>
       </w:r>
       <w:r>
         <w:t xml:space="preserve"> </w:t>
@@ -607,7 +658,7 @@
               <w:rPr>
                 <w:sz w:val="19"/>
               </w:rPr>
-              <w:t xml:space="preserve">Dal telefono, provare le novità dalla 0.10 alla 0.20, meglio con qualche amico:</w:t>
+              <w:t xml:space="preserve">Da domattina, dal telefono: correre la pista del giorno, premere</w:t>
             </w:r>
             <w:r>
               <w:rPr>
@@ -621,19 +672,19 @@
                 <w:b/>
                 <w:sz w:val="19"/>
               </w:rPr>
-              <w:t xml:space="preserve">sfondi delle città</w:t>
-            </w:r>
-            <w:r>
-              <w:rPr>
-                <w:sz w:val="19"/>
-              </w:rPr>
-              <w:t xml:space="preserve"> </w:t>
-            </w:r>
-            <w:r>
-              <w:rPr>
-                <w:sz w:val="19"/>
-              </w:rPr>
-              <w:t xml:space="preserve">(R-405),</w:t>
+              <w:t xml:space="preserve">Condividi</w:t>
+            </w:r>
+            <w:r>
+              <w:rPr>
+                <w:sz w:val="19"/>
+              </w:rPr>
+              <w:t xml:space="preserve"> </w:t>
+            </w:r>
+            <w:r>
+              <w:rPr>
+                <w:sz w:val="19"/>
+              </w:rPr>
+              <w:t xml:space="preserve">e mandare il link a un amico (R-236); guardare le</w:t>
             </w:r>
             <w:r>
               <w:rPr>
@@ -647,19 +698,117 @@
                 <w:b/>
                 <w:sz w:val="19"/>
               </w:rPr>
-              <w:t xml:space="preserve">avversari del computer</w:t>
-            </w:r>
-            <w:r>
-              <w:rPr>
-                <w:sz w:val="19"/>
-              </w:rPr>
-              <w:t xml:space="preserve"> </w:t>
-            </w:r>
-            <w:r>
-              <w:rPr>
-                <w:sz w:val="19"/>
-              </w:rPr>
-              <w:t xml:space="preserve">(R-234),</w:t>
+              <w:t xml:space="preserve">missioni</w:t>
+            </w:r>
+            <w:r>
+              <w:rPr>
+                <w:sz w:val="19"/>
+              </w:rPr>
+              <w:t xml:space="preserve"> </w:t>
+            </w:r>
+            <w:r>
+              <w:rPr>
+                <w:sz w:val="19"/>
+              </w:rPr>
+              <w:t xml:space="preserve">nel menu (R-243). Poi dire se vanno bene (</w:t>
+            </w:r>
+            <w:r>
+              <w:rPr>
+                <w:sz w:val="19"/>
+              </w:rPr>
+              <w:t xml:space="preserve">“</w:t>
+            </w:r>
+            <w:r>
+              <w:rPr>
+                <w:sz w:val="19"/>
+              </w:rPr>
+              <w:t xml:space="preserve">R-236 controllato</w:t>
+            </w:r>
+            <w:r>
+              <w:rPr>
+                <w:sz w:val="19"/>
+              </w:rPr>
+              <w:t xml:space="preserve">”</w:t>
+            </w:r>
+            <w:r>
+              <w:rPr>
+                <w:sz w:val="19"/>
+              </w:rPr>
+              <w:t xml:space="preserve">)</w:t>
+            </w:r>
+          </w:p>
+        </w:tc>
+        <w:tc>
+          <w:tcPr>
+            <w:tcW w:type="dxa" w:w="1247"/>
+          </w:tcPr>
+          <w:p>
+            <w:pPr>
+              <w:pStyle w:val="Compact"/>
+              <w:spacing w:after="40"/>
+              <w:jc w:val="left"/>
+            </w:pPr>
+            <w:r>
+              <w:rPr>
+                <w:sz w:val="19"/>
+              </w:rPr>
+              <w:t xml:space="preserve">10 min</w:t>
+            </w:r>
+          </w:p>
+        </w:tc>
+        <w:tc>
+          <w:tcPr>
+            <w:tcW w:type="dxa" w:w="1531"/>
+          </w:tcPr>
+          <w:p>
+            <w:pPr>
+              <w:pStyle w:val="Compact"/>
+              <w:spacing w:after="40"/>
+              <w:jc w:val="left"/>
+            </w:pPr>
+            <w:r>
+              <w:rPr>
+                <w:sz w:val="19"/>
+              </w:rPr>
+              <w:t xml:space="preserve">R-236, R-243</w:t>
+            </w:r>
+          </w:p>
+        </w:tc>
+      </w:tr>
+      <w:tr>
+        <w:tc>
+          <w:tcPr>
+            <w:tcW w:type="dxa" w:w="510"/>
+          </w:tcPr>
+          <w:p>
+            <w:pPr>
+              <w:pStyle w:val="Compact"/>
+              <w:spacing w:after="40"/>
+              <w:jc w:val="left"/>
+            </w:pPr>
+            <w:r>
+              <w:rPr>
+                <w:sz w:val="19"/>
+              </w:rPr>
+              <w:t xml:space="preserve">3</w:t>
+            </w:r>
+          </w:p>
+        </w:tc>
+        <w:tc>
+          <w:tcPr>
+            <w:tcW w:type="dxa" w:w="6576"/>
+          </w:tcPr>
+          <w:p>
+            <w:pPr>
+              <w:pStyle w:val="Compact"/>
+              <w:spacing w:after="40"/>
+              <w:jc w:val="left"/>
+            </w:pPr>
+            <w:r>
+              <w:rPr>
+                <w:sz w:val="19"/>
+              </w:rPr>
+              <w:t xml:space="preserve">Dal telefono, provare le novità dalla 0.10 alla 0.20, meglio con qualche amico:</w:t>
             </w:r>
             <w:r>
               <w:rPr>
@@ -673,19 +822,19 @@
                 <w:b/>
                 <w:sz w:val="19"/>
               </w:rPr>
-              <w:t xml:space="preserve">velocità reali</w:t>
-            </w:r>
-            <w:r>
-              <w:rPr>
-                <w:sz w:val="19"/>
-              </w:rPr>
-              <w:t xml:space="preserve"> </w:t>
-            </w:r>
-            <w:r>
-              <w:rPr>
-                <w:sz w:val="19"/>
-              </w:rPr>
-              <w:t xml:space="preserve">(R-242),</w:t>
+              <w:t xml:space="preserve">sfondi delle città</w:t>
+            </w:r>
+            <w:r>
+              <w:rPr>
+                <w:sz w:val="19"/>
+              </w:rPr>
+              <w:t xml:space="preserve"> </w:t>
+            </w:r>
+            <w:r>
+              <w:rPr>
+                <w:sz w:val="19"/>
+              </w:rPr>
+              <w:t xml:space="preserve">(R-405),</w:t>
             </w:r>
             <w:r>
               <w:rPr>
@@ -699,6 +848,58 @@
                 <w:b/>
                 <w:sz w:val="19"/>
               </w:rPr>
+              <w:t xml:space="preserve">avversari del computer</w:t>
+            </w:r>
+            <w:r>
+              <w:rPr>
+                <w:sz w:val="19"/>
+              </w:rPr>
+              <w:t xml:space="preserve"> </w:t>
+            </w:r>
+            <w:r>
+              <w:rPr>
+                <w:sz w:val="19"/>
+              </w:rPr>
+              <w:t xml:space="preserve">(R-234),</w:t>
+            </w:r>
+            <w:r>
+              <w:rPr>
+                <w:sz w:val="19"/>
+              </w:rPr>
+              <w:t xml:space="preserve"> </w:t>
+            </w:r>
+            <w:r>
+              <w:rPr>
+                <w:bCs/>
+                <w:b/>
+                <w:sz w:val="19"/>
+              </w:rPr>
+              <w:t xml:space="preserve">velocità reali</w:t>
+            </w:r>
+            <w:r>
+              <w:rPr>
+                <w:sz w:val="19"/>
+              </w:rPr>
+              <w:t xml:space="preserve"> </w:t>
+            </w:r>
+            <w:r>
+              <w:rPr>
+                <w:sz w:val="19"/>
+              </w:rPr>
+              <w:t xml:space="preserve">(R-242),</w:t>
+            </w:r>
+            <w:r>
+              <w:rPr>
+                <w:sz w:val="19"/>
+              </w:rPr>
+              <w:t xml:space="preserve"> </w:t>
+            </w:r>
+            <w:r>
+              <w:rPr>
+                <w:bCs/>
+                <w:b/>
+                <w:sz w:val="19"/>
+              </w:rPr>
               <w:t xml:space="preserve">pista del giorno</w:t>
             </w:r>
             <w:r>
@@ -791,7 +992,7 @@
               <w:rPr>
                 <w:sz w:val="19"/>
               </w:rPr>
-              <w:t xml:space="preserve">3</w:t>
+              <w:t xml:space="preserve">4</w:t>
             </w:r>
           </w:p>
         </w:tc>
@@ -901,7 +1102,7 @@
               <w:rPr>
                 <w:sz w:val="19"/>
               </w:rPr>
-              <w:t xml:space="preserve">4</w:t>
+              <w:t xml:space="preserve">5</w:t>
             </w:r>
           </w:p>
         </w:tc>
@@ -919,7 +1120,31 @@
               <w:rPr>
                 <w:sz w:val="19"/>
               </w:rPr>
-              <w:t xml:space="preserve">Decidere le scelte aperte di Claude (sezione 7). Le più urgenti: S-39 (avversari del computer), S-41 (velocità reali), S-42 (regole del giorno e della notte) e S-43 (struttura del software). Basta</w:t>
+              <w:t xml:space="preserve">Decidere le scelte aperte di Claude (sezione 7). Le più urgenti: S-39 (avversari del computer), S-41 (velocità reali), S-42 (regole del giorno e della notte), S-43 (struttura del software), S-44 (</w:t>
+            </w:r>
+            <w:r>
+              <w:rPr>
+                <w:sz w:val="19"/>
+              </w:rPr>
+              <w:t xml:space="preserve">“</w:t>
+            </w:r>
+            <w:r>
+              <w:rPr>
+                <w:sz w:val="19"/>
+              </w:rPr>
+              <w:t xml:space="preserve">batti il mio tempo</w:t>
+            </w:r>
+            <w:r>
+              <w:rPr>
+                <w:sz w:val="19"/>
+              </w:rPr>
+              <w:t xml:space="preserve">”</w:t>
+            </w:r>
+            <w:r>
+              <w:rPr>
+                <w:sz w:val="19"/>
+              </w:rPr>
+              <w:t xml:space="preserve">) e S-45 (missioni). Basta</w:t>
             </w:r>
             <w:r>
               <w:rPr>
@@ -1011,7 +1236,7 @@
               <w:rPr>
                 <w:sz w:val="19"/>
               </w:rPr>
-              <w:t xml:space="preserve">5</w:t>
+              <w:t xml:space="preserve">6</w:t>
             </w:r>
           </w:p>
         </w:tc>
@@ -1104,7 +1329,7 @@
               <w:rPr>
                 <w:sz w:val="19"/>
               </w:rPr>
-              <w:t xml:space="preserve">6</w:t>
+              <w:t xml:space="preserve">7</w:t>
             </w:r>
           </w:p>
         </w:tc>
@@ -1178,7 +1403,7 @@
               <w:rPr>
                 <w:sz w:val="19"/>
               </w:rPr>
-              <w:t xml:space="preserve">7</w:t>
+              <w:t xml:space="preserve">8</w:t>
             </w:r>
           </w:p>
         </w:tc>
@@ -1545,7 +1770,7 @@
               <w:rPr>
                 <w:sz w:val="19"/>
               </w:rPr>
-              <w:t xml:space="preserve">Link</w:t>
+              <w:t xml:space="preserve">Provare e pubblicare la 0.21.0:</w:t>
             </w:r>
             <w:r>
               <w:rPr>
@@ -1581,7 +1806,144 @@
               <w:rPr>
                 <w:sz w:val="19"/>
               </w:rPr>
-              <w:t xml:space="preserve">con la discesa dell’amico come avversario e immagine del risultato</w:t>
+              <w:t xml:space="preserve">con immagine del risultato (R-236) e missioni (R-243), già scritte sul ramo</w:t>
+            </w:r>
+            <w:r>
+              <w:rPr>
+                <w:sz w:val="19"/>
+              </w:rPr>
+              <w:t xml:space="preserve"> </w:t>
+            </w:r>
+            <w:r>
+              <w:rPr>
+                <w:rStyle w:val="VerbatimChar"/>
+                <w:sz w:val="19"/>
+              </w:rPr>
+              <w:t xml:space="preserve">giorno/batti-missioni</w:t>
+            </w:r>
+            <w:r>
+              <w:rPr>
+                <w:sz w:val="19"/>
+              </w:rPr>
+              <w:t xml:space="preserve">. Prove da aggiungere:</w:t>
+            </w:r>
+            <w:r>
+              <w:rPr>
+                <w:sz w:val="19"/>
+              </w:rPr>
+              <w:t xml:space="preserve"> </w:t>
+            </w:r>
+            <w:r>
+              <w:rPr>
+                <w:rStyle w:val="VerbatimChar"/>
+                <w:sz w:val="19"/>
+              </w:rPr>
+              <w:t xml:space="preserve">pistaNumero</w:t>
+            </w:r>
+            <w:r>
+              <w:rPr>
+                <w:sz w:val="19"/>
+              </w:rPr>
+              <w:t xml:space="preserve"> </w:t>
+            </w:r>
+            <w:r>
+              <w:rPr>
+                <w:sz w:val="19"/>
+              </w:rPr>
+              <w:t xml:space="preserve">e la pista passata senza classifica in</w:t>
+            </w:r>
+            <w:r>
+              <w:rPr>
+                <w:sz w:val="19"/>
+              </w:rPr>
+              <w:t xml:space="preserve"> </w:t>
+            </w:r>
+            <w:r>
+              <w:rPr>
+                <w:rStyle w:val="VerbatimChar"/>
+                <w:sz w:val="19"/>
+              </w:rPr>
+              <w:t xml:space="preserve">test_server.mjs</w:t>
+            </w:r>
+            <w:r>
+              <w:rPr>
+                <w:sz w:val="19"/>
+              </w:rPr>
+              <w:t xml:space="preserve">; riquadro</w:t>
+            </w:r>
+            <w:r>
+              <w:rPr>
+                <w:sz w:val="19"/>
+              </w:rPr>
+              <w:t xml:space="preserve"> </w:t>
+            </w:r>
+            <w:r>
+              <w:rPr>
+                <w:sz w:val="19"/>
+              </w:rPr>
+              <w:t xml:space="preserve">“</w:t>
+            </w:r>
+            <w:r>
+              <w:rPr>
+                <w:sz w:val="19"/>
+              </w:rPr>
+              <w:t xml:space="preserve">ti sfida</w:t>
+            </w:r>
+            <w:r>
+              <w:rPr>
+                <w:sz w:val="19"/>
+              </w:rPr>
+              <w:t xml:space="preserve">”</w:t>
+            </w:r>
+            <w:r>
+              <w:rPr>
+                <w:sz w:val="19"/>
+              </w:rPr>
+              <w:t xml:space="preserve"> </w:t>
+            </w:r>
+            <w:r>
+              <w:rPr>
+                <w:sz w:val="19"/>
+              </w:rPr>
+              <w:t xml:space="preserve">con</w:t>
+            </w:r>
+            <w:r>
+              <w:rPr>
+                <w:sz w:val="19"/>
+              </w:rPr>
+              <w:t xml:space="preserve"> </w:t>
+            </w:r>
+            <w:r>
+              <w:rPr>
+                <w:rStyle w:val="VerbatimChar"/>
+                <w:sz w:val="19"/>
+              </w:rPr>
+              <w:t xml:space="preserve">?batti=</w:t>
+            </w:r>
+            <w:r>
+              <w:rPr>
+                <w:sz w:val="19"/>
+              </w:rPr>
+              <w:t xml:space="preserve">, riga del distacco, esito e Immagine in una prova del browser; missioni (avanzamento, stella, profilo</w:t>
+            </w:r>
+            <w:r>
+              <w:rPr>
+                <w:sz w:val="19"/>
+              </w:rPr>
+              <w:t xml:space="preserve"> </w:t>
+            </w:r>
+            <w:r>
+              <w:rPr>
+                <w:rStyle w:val="VerbatimChar"/>
+                <w:sz w:val="19"/>
+              </w:rPr>
+              <w:t xml:space="preserve">mi</w:t>
+            </w:r>
+            <w:r>
+              <w:rPr>
+                <w:sz w:val="19"/>
+              </w:rPr>
+              <w:t xml:space="preserve">)</w:t>
             </w:r>
           </w:p>
         </w:tc>
@@ -1599,7 +1961,7 @@
               <w:rPr>
                 <w:sz w:val="19"/>
               </w:rPr>
-              <w:t xml:space="preserve">Chi gioca porta altri giocatori</w:t>
+              <w:t xml:space="preserve">Chi gioca porta altri giocatori; da soli c’è un motivo per tornare</w:t>
             </w:r>
           </w:p>
         </w:tc>
@@ -1617,7 +1979,7 @@
               <w:rPr>
                 <w:sz w:val="19"/>
               </w:rPr>
-              <w:t xml:space="preserve">R-236, D-05</w:t>
+              <w:t xml:space="preserve">R-236, R-243</w:t>
             </w:r>
           </w:p>
         </w:tc>
@@ -1653,7 +2015,118 @@
               <w:rPr>
                 <w:sz w:val="19"/>
               </w:rPr>
-              <w:t xml:space="preserve">No (lavoro del giorno)</w:t>
+              <w:t xml:space="preserve">Sì (stanotte)</w:t>
+            </w:r>
+          </w:p>
+        </w:tc>
+      </w:tr>
+      <w:tr>
+        <w:tc>
+          <w:tcPr>
+            <w:tcW w:type="dxa" w:w="510"/>
+          </w:tcPr>
+          <w:p>
+            <w:pPr>
+              <w:pStyle w:val="Compact"/>
+              <w:spacing w:after="40"/>
+              <w:jc w:val="left"/>
+            </w:pPr>
+            <w:r>
+              <w:rPr>
+                <w:sz w:val="19"/>
+              </w:rPr>
+              <w:t xml:space="preserve">1b</w:t>
+            </w:r>
+          </w:p>
+        </w:tc>
+        <w:tc>
+          <w:tcPr>
+            <w:tcW w:type="dxa" w:w="3175"/>
+          </w:tcPr>
+          <w:p>
+            <w:pPr>
+              <w:pStyle w:val="Compact"/>
+              <w:spacing w:after="40"/>
+              <w:jc w:val="left"/>
+            </w:pPr>
+            <w:r>
+              <w:rPr>
+                <w:sz w:val="19"/>
+              </w:rPr>
+              <w:t xml:space="preserve">Misurare da dove arrivano i giocatori (link di sfida, pista del giorno condivisa, diretto): proposta del confronto del 27/10, da confermare</w:t>
+            </w:r>
+          </w:p>
+        </w:tc>
+        <w:tc>
+          <w:tcPr>
+            <w:tcW w:type="dxa" w:w="2494"/>
+          </w:tcPr>
+          <w:p>
+            <w:pPr>
+              <w:pStyle w:val="Compact"/>
+              <w:spacing w:after="40"/>
+              <w:jc w:val="left"/>
+            </w:pPr>
+            <w:r>
+              <w:rPr>
+                <w:sz w:val="19"/>
+              </w:rPr>
+              <w:t xml:space="preserve">Dice se il link porta giocatori nuovi</w:t>
+            </w:r>
+          </w:p>
+        </w:tc>
+        <w:tc>
+          <w:tcPr>
+            <w:tcW w:type="dxa" w:w="1247"/>
+          </w:tcPr>
+          <w:p>
+            <w:pPr>
+              <w:pStyle w:val="Compact"/>
+              <w:spacing w:after="40"/>
+              <w:jc w:val="left"/>
+            </w:pPr>
+            <w:r>
+              <w:rPr>
+                <w:sz w:val="19"/>
+              </w:rPr>
+              <w:t xml:space="preserve">nuova</w:t>
+            </w:r>
+          </w:p>
+        </w:tc>
+        <w:tc>
+          <w:tcPr>
+            <w:tcW w:type="dxa" w:w="1134"/>
+          </w:tcPr>
+          <w:p>
+            <w:pPr>
+              <w:pStyle w:val="Compact"/>
+              <w:spacing w:after="40"/>
+              <w:jc w:val="left"/>
+            </w:pPr>
+            <w:r>
+              <w:rPr>
+                <w:sz w:val="19"/>
+              </w:rPr>
+              <w:t xml:space="preserve">—</w:t>
+            </w:r>
+          </w:p>
+        </w:tc>
+        <w:tc>
+          <w:tcPr>
+            <w:tcW w:type="dxa" w:w="1304"/>
+            <w:shd w:val="clear" w:color="auto" w:fill="FFF1C7"/>
+          </w:tcPr>
+          <w:p>
+            <w:pPr>
+              <w:pStyle w:val="Compact"/>
+              <w:spacing w:after="40"/>
+              <w:jc w:val="left"/>
+            </w:pPr>
+            <w:r>
+              <w:rPr>
+                <w:sz w:val="19"/>
+              </w:rPr>
+              <w:t xml:space="preserve">Da approvare</w:t>
             </w:r>
           </w:p>
         </w:tc>
@@ -2591,7 +3064,22 @@
         <w:pStyle w:val="BodyText"/>
       </w:pPr>
       <w:r>
-        <w:t xml:space="preserve">Fatti e tolti da questa tabella il 26-27/10: avversari del computer al posto dei fantasmi (R-234, R-235, 0.18.0), fisica in un modulo e server diviso (A-19, A-20, 0.18.1), Three.js dal sito stesso (A-16, 0.18.1), velocità reali e ostacoli −30% (R-242, R-313, 0.19.0), sfondi delle città come cartoline dipinte in un worker (R-405, A-22, 0.20.0), pagina e programma della stessa versione (R-011, 0.20.1).</w:t>
+        <w:t xml:space="preserve">Scritti il 27/10 pomeriggio su richiesta di Luigi (</w:t>
+      </w:r>
+      <w:r>
+        <w:t xml:space="preserve">“</w:t>
+      </w:r>
+      <w:r>
+        <w:t xml:space="preserve">procedi con la 2 e la 3</w:t>
+      </w:r>
+      <w:r>
+        <w:t xml:space="preserve">”</w:t>
+      </w:r>
+      <w:r>
+        <w:t xml:space="preserve"> </w:t>
+      </w:r>
+      <w:r>
+        <w:t xml:space="preserve">del confronto delle 18): R-236 e R-243 (riga 1). Fatti e tolti da questa tabella il 26-27/10: avversari del computer al posto dei fantasmi (R-234, R-235, 0.18.0), fisica in un modulo e server diviso (A-19, A-20, 0.18.1), Three.js dal sito stesso (A-16, 0.18.1), velocità reali e ostacoli −30% (R-242, R-313, 0.19.0), sfondi delle città come cartoline dipinte in un worker (R-405, A-22, 0.20.0), pagina e programma della stessa versione (R-011, 0.20.1).</w:t>
       </w:r>
     </w:p>
     <w:bookmarkEnd w:id="21"/>
@@ -18408,6 +18896,265 @@
           </w:p>
         </w:tc>
       </w:tr>
+      <w:tr>
+        <w:tc>
+          <w:tcPr>
+            <w:tcW w:type="dxa" w:w="794"/>
+          </w:tcPr>
+          <w:p>
+            <w:pPr>
+              <w:pStyle w:val="Compact"/>
+              <w:spacing w:after="40"/>
+              <w:jc w:val="left"/>
+            </w:pPr>
+            <w:r>
+              <w:rPr>
+                <w:sz w:val="19"/>
+              </w:rPr>
+              <w:t xml:space="preserve">S-44</w:t>
+            </w:r>
+          </w:p>
+        </w:tc>
+        <w:tc>
+          <w:tcPr>
+            <w:tcW w:type="dxa" w:w="6009"/>
+          </w:tcPr>
+          <w:p>
+            <w:pPr>
+              <w:pStyle w:val="Compact"/>
+              <w:spacing w:after="40"/>
+              <w:jc w:val="left"/>
+            </w:pPr>
+            <w:r>
+              <w:rPr>
+                <w:sz w:val="19"/>
+              </w:rPr>
+              <w:t xml:space="preserve">“</w:t>
+            </w:r>
+            <w:r>
+              <w:rPr>
+                <w:sz w:val="19"/>
+              </w:rPr>
+              <w:t xml:space="preserve">Batti il mio tempo</w:t>
+            </w:r>
+            <w:r>
+              <w:rPr>
+                <w:sz w:val="19"/>
+              </w:rPr>
+              <w:t xml:space="preserve">”</w:t>
+            </w:r>
+            <w:r>
+              <w:rPr>
+                <w:sz w:val="19"/>
+              </w:rPr>
+              <w:t xml:space="preserve"> </w:t>
+            </w:r>
+            <w:r>
+              <w:rPr>
+                <w:sz w:val="19"/>
+              </w:rPr>
+              <w:t xml:space="preserve">(R-236), scelte di Claude: il link c’è solo per la</w:t>
+            </w:r>
+            <w:r>
+              <w:rPr>
+                <w:sz w:val="19"/>
+              </w:rPr>
+              <w:t xml:space="preserve"> </w:t>
+            </w:r>
+            <w:r>
+              <w:rPr>
+                <w:bCs/>
+                <w:b/>
+                <w:sz w:val="19"/>
+              </w:rPr>
+              <w:t xml:space="preserve">pista del giorno</w:t>
+            </w:r>
+            <w:r>
+              <w:rPr>
+                <w:sz w:val="19"/>
+              </w:rPr>
+              <w:t xml:space="preserve">, perché è l’unica gara con pista e regole uguali per tutti (nelle sfide ci sono banane, bombe e avversari, quindi i tempi non si confrontano); dalle altre gare si condividono testo e immagine come prima. Il tempo dell’amico viaggia</w:t>
+            </w:r>
+            <w:r>
+              <w:rPr>
+                <w:sz w:val="19"/>
+              </w:rPr>
+              <w:t xml:space="preserve"> </w:t>
+            </w:r>
+            <w:r>
+              <w:rPr>
+                <w:bCs/>
+                <w:b/>
+                <w:sz w:val="19"/>
+              </w:rPr>
+              <w:t xml:space="preserve">nel link</w:t>
+            </w:r>
+            <w:r>
+              <w:rPr>
+                <w:sz w:val="19"/>
+              </w:rPr>
+              <w:t xml:space="preserve"> </w:t>
+            </w:r>
+            <w:r>
+              <w:rPr>
+                <w:sz w:val="19"/>
+              </w:rPr>
+              <w:t xml:space="preserve">e non viene controllato dal server: chi modifica il link a mano vede un tempo falso, ma non cambia nessuna classifica. Nel link non c’è il codice del giocatore (servirebbe a farsi passare per lui). Al posto di un avversario 🤖 che corre al ritmo dell’amico c’è la riga con il distacco stimato: costa molto meno e non cambia la pista del giorno (gli avversari ci sono già). Le piste dei giorni passati si possono rifare dal link, ma il tempo non entra in classifica. L’immagine si fa sul telefono (niente server), 1080×1080 come i post quadrati</w:t>
+            </w:r>
+          </w:p>
+        </w:tc>
+        <w:tc>
+          <w:tcPr>
+            <w:tcW w:type="dxa" w:w="1247"/>
+          </w:tcPr>
+          <w:p>
+            <w:pPr>
+              <w:pStyle w:val="Compact"/>
+              <w:spacing w:after="40"/>
+              <w:jc w:val="left"/>
+            </w:pPr>
+            <w:r>
+              <w:rPr>
+                <w:sz w:val="19"/>
+              </w:rPr>
+              <w:t xml:space="preserve">27/10/2026</w:t>
+            </w:r>
+          </w:p>
+        </w:tc>
+        <w:tc>
+          <w:tcPr>
+            <w:tcW w:type="dxa" w:w="1814"/>
+            <w:shd w:val="clear" w:color="auto" w:fill="E6EDF5"/>
+          </w:tcPr>
+          <w:p>
+            <w:pPr>
+              <w:pStyle w:val="Compact"/>
+              <w:spacing w:after="40"/>
+              <w:jc w:val="left"/>
+            </w:pPr>
+            <w:r>
+              <w:rPr>
+                <w:sz w:val="19"/>
+              </w:rPr>
+              <w:t xml:space="preserve">Da confermare</w:t>
+            </w:r>
+          </w:p>
+        </w:tc>
+      </w:tr>
+      <w:tr>
+        <w:tc>
+          <w:tcPr>
+            <w:tcW w:type="dxa" w:w="794"/>
+          </w:tcPr>
+          <w:p>
+            <w:pPr>
+              <w:pStyle w:val="Compact"/>
+              <w:spacing w:after="40"/>
+              <w:jc w:val="left"/>
+            </w:pPr>
+            <w:r>
+              <w:rPr>
+                <w:sz w:val="19"/>
+              </w:rPr>
+              <w:t xml:space="preserve">S-45</w:t>
+            </w:r>
+          </w:p>
+        </w:tc>
+        <w:tc>
+          <w:tcPr>
+            <w:tcW w:type="dxa" w:w="6009"/>
+          </w:tcPr>
+          <w:p>
+            <w:pPr>
+              <w:pStyle w:val="Compact"/>
+              <w:spacing w:after="40"/>
+              <w:jc w:val="left"/>
+            </w:pPr>
+            <w:r>
+              <w:rPr>
+                <w:sz w:val="19"/>
+              </w:rPr>
+              <w:t xml:space="preserve">Missioni (R-243), scelte di Claude: le controlla il telefono, non il server, quindi chi sa farlo potrebbe imbrogliare; per questo le stelle</w:t>
+            </w:r>
+            <w:r>
+              <w:rPr>
+                <w:sz w:val="19"/>
+              </w:rPr>
+              <w:t xml:space="preserve"> </w:t>
+            </w:r>
+            <w:r>
+              <w:rPr>
+                <w:bCs/>
+                <w:b/>
+                <w:sz w:val="19"/>
+              </w:rPr>
+              <w:t xml:space="preserve">non danno punti collezionati</w:t>
+            </w:r>
+            <w:r>
+              <w:rPr>
+                <w:sz w:val="19"/>
+              </w:rPr>
+              <w:t xml:space="preserve"> </w:t>
+            </w:r>
+            <w:r>
+              <w:rPr>
+                <w:sz w:val="19"/>
+              </w:rPr>
+              <w:t xml:space="preserve">né parti del personaggio (si potrà decidere con F-14, dopo il controllo sul server F-04). 3 obiettivi alla volta, mai due dello stesso tipo; gli atterraggi storti non contano per le acrobazie; quello nuovo si sceglie a caso tra i tipi che non ci sono già; i progressi contano anche in allenamento. Nel profilo le missioni occupano un campo corto (</w:t>
+            </w:r>
+            <w:r>
+              <w:rPr>
+                <w:rStyle w:val="VerbatimChar"/>
+                <w:sz w:val="19"/>
+              </w:rPr>
+              <w:t xml:space="preserve">mi</w:t>
+            </w:r>
+            <w:r>
+              <w:rPr>
+                <w:sz w:val="19"/>
+              </w:rPr>
+              <w:t xml:space="preserve">)</w:t>
+            </w:r>
+          </w:p>
+        </w:tc>
+        <w:tc>
+          <w:tcPr>
+            <w:tcW w:type="dxa" w:w="1247"/>
+          </w:tcPr>
+          <w:p>
+            <w:pPr>
+              <w:pStyle w:val="Compact"/>
+              <w:spacing w:after="40"/>
+              <w:jc w:val="left"/>
+            </w:pPr>
+            <w:r>
+              <w:rPr>
+                <w:sz w:val="19"/>
+              </w:rPr>
+              <w:t xml:space="preserve">27/10/2026</w:t>
+            </w:r>
+          </w:p>
+        </w:tc>
+        <w:tc>
+          <w:tcPr>
+            <w:tcW w:type="dxa" w:w="1814"/>
+            <w:shd w:val="clear" w:color="auto" w:fill="E6EDF5"/>
+          </w:tcPr>
+          <w:p>
+            <w:pPr>
+              <w:pStyle w:val="Compact"/>
+              <w:spacing w:after="40"/>
+              <w:jc w:val="left"/>
+            </w:pPr>
+            <w:r>
+              <w:rPr>
+                <w:sz w:val="19"/>
+              </w:rPr>
+              <w:t xml:space="preserve">Da confermare</w:t>
+            </w:r>
+          </w:p>
+        </w:tc>
+      </w:tr>
     </w:tbl>
     <w:bookmarkEnd w:id="31"/>
     <w:bookmarkStart w:id="32" w:name="idee-per-il-futuro-da-confermare"/>
@@ -19845,7 +20592,7 @@
               <w:rPr>
                 <w:sz w:val="19"/>
               </w:rPr>
-              <w:t xml:space="preserve">) da allegare alla condivisione: dal 26/10 fa parte di R-236</w:t>
+              <w:t xml:space="preserve">) da allegare alla condivisione: scritta il 27/10 con R-236 (0.21.0)</w:t>
             </w:r>
           </w:p>
         </w:tc>
@@ -19863,7 +20610,7 @@
               <w:rPr>
                 <w:sz w:val="19"/>
               </w:rPr>
-              <w:t xml:space="preserve">Claude</w:t>
+              <w:t xml:space="preserve">Claude ✓</w:t>
             </w:r>
           </w:p>
         </w:tc>
@@ -23963,6 +24710,62 @@
                 <w:sz w:val="19"/>
               </w:rPr>
               <w:t xml:space="preserve">Allenamento: 3 avversari con nomi, livelli e aspetti diversi che scendono vicino al rider; tornando al menu spariscono</w:t>
+            </w:r>
+          </w:p>
+        </w:tc>
+      </w:tr>
+      <w:tr>
+        <w:tc>
+          <w:tcPr>
+            <w:tcW w:type="dxa" w:w="1928"/>
+          </w:tcPr>
+          <w:p>
+            <w:pPr>
+              <w:pStyle w:val="Compact"/>
+              <w:spacing w:after="40"/>
+              <w:jc w:val="left"/>
+            </w:pPr>
+            <w:r>
+              <w:rPr>
+                <w:sz w:val="19"/>
+              </w:rPr>
+              <w:t xml:space="preserve">R-243</w:t>
+            </w:r>
+          </w:p>
+        </w:tc>
+        <w:tc>
+          <w:tcPr>
+            <w:tcW w:type="dxa" w:w="1474"/>
+          </w:tcPr>
+          <w:p>
+            <w:pPr>
+              <w:pStyle w:val="Compact"/>
+              <w:spacing w:after="40"/>
+              <w:jc w:val="left"/>
+            </w:pPr>
+            <w:r>
+              <w:rPr>
+                <w:sz w:val="19"/>
+              </w:rPr>
+              <w:t xml:space="preserve">Missioni: 3 obiettivi alla volta, come le missioni di Subway Surfers e gli obiettivi di Alto’s Odyssey, per avere un motivo per giocare anche da soli</w:t>
+            </w:r>
+          </w:p>
+        </w:tc>
+        <w:tc>
+          <w:tcPr>
+            <w:tcW w:type="dxa" w:w="6463"/>
+          </w:tcPr>
+          <w:p>
+            <w:pPr>
+              <w:pStyle w:val="Compact"/>
+              <w:spacing w:after="40"/>
+              <w:jc w:val="left"/>
+            </w:pPr>
+            <w:r>
+              <w:rPr>
+                <w:sz w:val="19"/>
+              </w:rPr>
+              <w:t xml:space="preserve">27/10/2026</w:t>
             </w:r>
           </w:p>
         </w:tc>
@@ -36829,19 +37632,19 @@
         <w:tc>
           <w:tcPr>
             <w:tcW w:type="dxa" w:w="1134"/>
-            <w:shd w:val="clear" w:color="auto" w:fill="FDE2D6"/>
-          </w:tcPr>
-          <w:p>
-            <w:pPr>
-              <w:pStyle w:val="Compact"/>
-              <w:spacing w:after="40"/>
-              <w:jc w:val="left"/>
-            </w:pPr>
-            <w:r>
-              <w:rPr>
-                <w:sz w:val="19"/>
-              </w:rPr>
-              <w:t xml:space="preserve">Da fare</w:t>
+            <w:shd w:val="clear" w:color="auto" w:fill="FFF1C7"/>
+          </w:tcPr>
+          <w:p>
+            <w:pPr>
+              <w:pStyle w:val="Compact"/>
+              <w:spacing w:after="40"/>
+              <w:jc w:val="left"/>
+            </w:pPr>
+            <w:r>
+              <w:rPr>
+                <w:sz w:val="19"/>
+              </w:rPr>
+              <w:t xml:space="preserve">In corso</w:t>
             </w:r>
           </w:p>
         </w:tc>
@@ -36859,13 +37662,78 @@
               <w:rPr>
                 <w:sz w:val="19"/>
               </w:rPr>
-              <w:t xml:space="preserve">A fine gara un testo corto da incollare (per esempio</w:t>
-            </w:r>
-            <w:r>
-              <w:rPr>
-                <w:sz w:val="19"/>
-              </w:rPr>
-              <w:t xml:space="preserve"> </w:t>
+              <w:t xml:space="preserve">Scritto il 27/10 per la 0.21.0 (ramo</w:t>
+            </w:r>
+            <w:r>
+              <w:rPr>
+                <w:sz w:val="19"/>
+              </w:rPr>
+              <w:t xml:space="preserve"> </w:t>
+            </w:r>
+            <w:r>
+              <w:rPr>
+                <w:rStyle w:val="VerbatimChar"/>
+                <w:sz w:val="19"/>
+              </w:rPr>
+              <w:t xml:space="preserve">giorno/batti-missioni</w:t>
+            </w:r>
+            <w:r>
+              <w:rPr>
+                <w:sz w:val="19"/>
+              </w:rPr>
+              <w:t xml:space="preserve">, online dopo le prove della notte).</w:t>
+            </w:r>
+            <w:r>
+              <w:rPr>
+                <w:sz w:val="19"/>
+              </w:rPr>
+              <w:t xml:space="preserve"> </w:t>
+            </w:r>
+            <w:r>
+              <w:rPr>
+                <w:bCs/>
+                <w:b/>
+                <w:sz w:val="19"/>
+              </w:rPr>
+              <w:t xml:space="preserve">Il link.</w:t>
+            </w:r>
+            <w:r>
+              <w:rPr>
+                <w:sz w:val="19"/>
+              </w:rPr>
+              <w:t xml:space="preserve"> </w:t>
+            </w:r>
+            <w:r>
+              <w:rPr>
+                <w:sz w:val="19"/>
+              </w:rPr>
+              <w:t xml:space="preserve">A fine pista del giorno</w:t>
+            </w:r>
+            <w:r>
+              <w:rPr>
+                <w:sz w:val="19"/>
+              </w:rPr>
+              <w:t xml:space="preserve"> </w:t>
+            </w:r>
+            <w:r>
+              <w:rPr>
+                <w:bCs/>
+                <w:b/>
+                <w:sz w:val="19"/>
+              </w:rPr>
+              <w:t xml:space="preserve">Condividi</w:t>
+            </w:r>
+            <w:r>
+              <w:rPr>
+                <w:sz w:val="19"/>
+              </w:rPr>
+              <w:t xml:space="preserve"> </w:t>
+            </w:r>
+            <w:r>
+              <w:rPr>
+                <w:sz w:val="19"/>
+              </w:rPr>
+              <w:t xml:space="preserve">manda il testo (</w:t>
             </w:r>
             <w:r>
               <w:rPr>
@@ -36877,7 +37745,7 @@
               <w:rPr>
                 <w:sz w:val="19"/>
               </w:rPr>
-              <w:t xml:space="preserve">🏂 Pista del giorno #12 · Napoli · 4:58 · 3° su 41</w:t>
+              <w:t xml:space="preserve">🏂 Pista del giorno #12 · Napoli · 4:58.45 · 3° su 41. Batti il mio tempo: …</w:t>
             </w:r>
             <w:r>
               <w:rPr>
@@ -36889,7 +37757,539 @@
               <w:rPr>
                 <w:sz w:val="19"/>
               </w:rPr>
-              <w:t xml:space="preserve">) e l’immagine del risultato (D-05). Chi apre il link corre la stessa pista con il tempo da battere in alto (dal 26/10 sera niente fantasma: eventualmente un avversario del software che tiene quel ritmo)</w:t>
+              <w:t xml:space="preserve">) con il link</w:t>
+            </w:r>
+            <w:r>
+              <w:rPr>
+                <w:sz w:val="19"/>
+              </w:rPr>
+              <w:t xml:space="preserve"> </w:t>
+            </w:r>
+            <w:r>
+              <w:rPr>
+                <w:rStyle w:val="VerbatimChar"/>
+                <w:sz w:val="19"/>
+              </w:rPr>
+              <w:t xml:space="preserve">…/pista-nera/?batti=12&amp;t=298450&amp;da=Marco</w:t>
+            </w:r>
+            <w:r>
+              <w:rPr>
+                <w:sz w:val="19"/>
+              </w:rPr>
+              <w:t xml:space="preserve"> </w:t>
+            </w:r>
+            <w:r>
+              <w:rPr>
+                <w:sz w:val="19"/>
+              </w:rPr>
+              <w:t xml:space="preserve">(numero della pista, tempo in millesimi, nome). Sui telefoni che lo permettono (Android con Chrome, iPhone con Safari) insieme al testo parte anche l’</w:t>
+            </w:r>
+            <w:r>
+              <w:rPr>
+                <w:bCs/>
+                <w:b/>
+                <w:sz w:val="19"/>
+              </w:rPr>
+              <w:t xml:space="preserve">immagine del risultato</w:t>
+            </w:r>
+            <w:r>
+              <w:rPr>
+                <w:sz w:val="19"/>
+              </w:rPr>
+              <w:t xml:space="preserve"> </w:t>
+            </w:r>
+            <w:r>
+              <w:rPr>
+                <w:sz w:val="19"/>
+              </w:rPr>
+              <w:t xml:space="preserve">(D-05); altrove il testo va su WhatsApp come prima. Il pulsante nuovo</w:t>
+            </w:r>
+            <w:r>
+              <w:rPr>
+                <w:sz w:val="19"/>
+              </w:rPr>
+              <w:t xml:space="preserve"> </w:t>
+            </w:r>
+            <w:r>
+              <w:rPr>
+                <w:bCs/>
+                <w:b/>
+                <w:sz w:val="19"/>
+              </w:rPr>
+              <w:t xml:space="preserve">🖼️ Immagine</w:t>
+            </w:r>
+            <w:r>
+              <w:rPr>
+                <w:sz w:val="19"/>
+              </w:rPr>
+              <w:t xml:space="preserve"> </w:t>
+            </w:r>
+            <w:r>
+              <w:rPr>
+                <w:sz w:val="19"/>
+              </w:rPr>
+              <w:t xml:space="preserve">salva l’immagine in ogni gara (anche sfida e sala online, con posizione, città e tempo).</w:t>
+            </w:r>
+            <w:r>
+              <w:rPr>
+                <w:sz w:val="19"/>
+              </w:rPr>
+              <w:t xml:space="preserve"> </w:t>
+            </w:r>
+            <w:r>
+              <w:rPr>
+                <w:bCs/>
+                <w:b/>
+                <w:sz w:val="19"/>
+              </w:rPr>
+              <w:t xml:space="preserve">L’immagine</w:t>
+            </w:r>
+            <w:r>
+              <w:rPr>
+                <w:sz w:val="19"/>
+              </w:rPr>
+              <w:t xml:space="preserve"> </w:t>
+            </w:r>
+            <w:r>
+              <w:rPr>
+                <w:sz w:val="19"/>
+              </w:rPr>
+              <w:t xml:space="preserve">(1080×1080): la scena della gara presa in quel momento, scurita, con</w:t>
+            </w:r>
+            <w:r>
+              <w:rPr>
+                <w:sz w:val="19"/>
+              </w:rPr>
+              <w:t xml:space="preserve"> </w:t>
+            </w:r>
+            <w:r>
+              <w:rPr>
+                <w:sz w:val="19"/>
+              </w:rPr>
+              <w:t xml:space="preserve">“</w:t>
+            </w:r>
+            <w:r>
+              <w:rPr>
+                <w:sz w:val="19"/>
+              </w:rPr>
+              <w:t xml:space="preserve">Pista Nera</w:t>
+            </w:r>
+            <w:r>
+              <w:rPr>
+                <w:sz w:val="19"/>
+              </w:rPr>
+              <w:t xml:space="preserve">”</w:t>
+            </w:r>
+            <w:r>
+              <w:rPr>
+                <w:sz w:val="19"/>
+              </w:rPr>
+              <w:t xml:space="preserve">, la pista e la città, il tempo grande, la posizione, la riga della sfida vinta o persa e</w:t>
+            </w:r>
+            <w:r>
+              <w:rPr>
+                <w:sz w:val="19"/>
+              </w:rPr>
+              <w:t xml:space="preserve"> </w:t>
+            </w:r>
+            <w:r>
+              <w:rPr>
+                <w:sz w:val="19"/>
+              </w:rPr>
+              <w:t xml:space="preserve">“</w:t>
+            </w:r>
+            <w:r>
+              <w:rPr>
+                <w:sz w:val="19"/>
+              </w:rPr>
+              <w:t xml:space="preserve">Batti il mio tempo</w:t>
+            </w:r>
+            <w:r>
+              <w:rPr>
+                <w:sz w:val="19"/>
+              </w:rPr>
+              <w:t xml:space="preserve">”</w:t>
+            </w:r>
+            <w:r>
+              <w:rPr>
+                <w:sz w:val="19"/>
+              </w:rPr>
+              <w:t xml:space="preserve"> </w:t>
+            </w:r>
+            <w:r>
+              <w:rPr>
+                <w:sz w:val="19"/>
+              </w:rPr>
+              <w:t xml:space="preserve">con l’indirizzo del sito.</w:t>
+            </w:r>
+            <w:r>
+              <w:rPr>
+                <w:sz w:val="19"/>
+              </w:rPr>
+              <w:t xml:space="preserve"> </w:t>
+            </w:r>
+            <w:r>
+              <w:rPr>
+                <w:bCs/>
+                <w:b/>
+                <w:sz w:val="19"/>
+              </w:rPr>
+              <w:t xml:space="preserve">Chi apre il link</w:t>
+            </w:r>
+            <w:r>
+              <w:rPr>
+                <w:sz w:val="19"/>
+              </w:rPr>
+              <w:t xml:space="preserve"> </w:t>
+            </w:r>
+            <w:r>
+              <w:rPr>
+                <w:sz w:val="19"/>
+              </w:rPr>
+              <w:t xml:space="preserve">trova nel menu, sopra la pista del giorno, il riquadro arancione</w:t>
+            </w:r>
+            <w:r>
+              <w:rPr>
+                <w:sz w:val="19"/>
+              </w:rPr>
+              <w:t xml:space="preserve"> </w:t>
+            </w:r>
+            <w:r>
+              <w:rPr>
+                <w:sz w:val="19"/>
+              </w:rPr>
+              <w:t xml:space="preserve">“</w:t>
+            </w:r>
+            <w:r>
+              <w:rPr>
+                <w:sz w:val="19"/>
+              </w:rPr>
+              <w:t xml:space="preserve">🎯 Marco ti sfida · Pista del giorno #12 · Napoli · 4:58.45</w:t>
+            </w:r>
+            <w:r>
+              <w:rPr>
+                <w:sz w:val="19"/>
+              </w:rPr>
+              <w:t xml:space="preserve">”</w:t>
+            </w:r>
+            <w:r>
+              <w:rPr>
+                <w:sz w:val="19"/>
+              </w:rPr>
+              <w:t xml:space="preserve"> </w:t>
+            </w:r>
+            <w:r>
+              <w:rPr>
+                <w:sz w:val="19"/>
+              </w:rPr>
+              <w:t xml:space="preserve">con</w:t>
+            </w:r>
+            <w:r>
+              <w:rPr>
+                <w:sz w:val="19"/>
+              </w:rPr>
+              <w:t xml:space="preserve"> </w:t>
+            </w:r>
+            <w:r>
+              <w:rPr>
+                <w:bCs/>
+                <w:b/>
+                <w:sz w:val="19"/>
+              </w:rPr>
+              <w:t xml:space="preserve">Accetta la sfida</w:t>
+            </w:r>
+            <w:r>
+              <w:rPr>
+                <w:sz w:val="19"/>
+              </w:rPr>
+              <w:t xml:space="preserve"> </w:t>
+            </w:r>
+            <w:r>
+              <w:rPr>
+                <w:sz w:val="19"/>
+              </w:rPr>
+              <w:t xml:space="preserve">(e ✕ per chiuderlo). Se la #12 è la pista di oggi si corre la pista del giorno come sempre e il tempo vale per la classifica di oggi. Se è di un giorno passato si corre</w:t>
+            </w:r>
+            <w:r>
+              <w:rPr>
+                <w:sz w:val="19"/>
+              </w:rPr>
+              <w:t xml:space="preserve"> </w:t>
+            </w:r>
+            <w:r>
+              <w:rPr>
+                <w:bCs/>
+                <w:b/>
+                <w:sz w:val="19"/>
+              </w:rPr>
+              <w:t xml:space="preserve">la stessa pista di quel giorno</w:t>
+            </w:r>
+            <w:r>
+              <w:rPr>
+                <w:sz w:val="19"/>
+              </w:rPr>
+              <w:t xml:space="preserve"> </w:t>
+            </w:r>
+            <w:r>
+              <w:rPr>
+                <w:sz w:val="19"/>
+              </w:rPr>
+              <w:t xml:space="preserve">(stessa città, stesso tracciato, 5 minuti, tempo misurato dal server), ma il tempo non entra in nessuna classifica: la classifica di quel giorno è chiusa.</w:t>
+            </w:r>
+            <w:r>
+              <w:rPr>
+                <w:sz w:val="19"/>
+              </w:rPr>
+              <w:t xml:space="preserve"> </w:t>
+            </w:r>
+            <w:r>
+              <w:rPr>
+                <w:bCs/>
+                <w:b/>
+                <w:sz w:val="19"/>
+              </w:rPr>
+              <w:t xml:space="preserve">In gara</w:t>
+            </w:r>
+            <w:r>
+              <w:rPr>
+                <w:sz w:val="19"/>
+              </w:rPr>
+              <w:t xml:space="preserve"> </w:t>
+            </w:r>
+            <w:r>
+              <w:rPr>
+                <w:sz w:val="19"/>
+              </w:rPr>
+              <w:t xml:space="preserve">sotto i numeri in alto c’è la riga</w:t>
+            </w:r>
+            <w:r>
+              <w:rPr>
+                <w:sz w:val="19"/>
+              </w:rPr>
+              <w:t xml:space="preserve"> </w:t>
+            </w:r>
+            <w:r>
+              <w:rPr>
+                <w:sz w:val="19"/>
+              </w:rPr>
+              <w:t xml:space="preserve">“</w:t>
+            </w:r>
+            <w:r>
+              <w:rPr>
+                <w:sz w:val="19"/>
+              </w:rPr>
+              <w:t xml:space="preserve">🎯 Marco 4:58.45 · tu −2,3 s</w:t>
+            </w:r>
+            <w:r>
+              <w:rPr>
+                <w:sz w:val="19"/>
+              </w:rPr>
+              <w:t xml:space="preserve">”</w:t>
+            </w:r>
+            <w:r>
+              <w:rPr>
+                <w:sz w:val="19"/>
+              </w:rPr>
+              <w:t xml:space="preserve"> </w:t>
+            </w:r>
+            <w:r>
+              <w:rPr>
+                <w:sz w:val="19"/>
+              </w:rPr>
+              <w:t xml:space="preserve">(verde se sei avanti, rossa se sei indietro): è una</w:t>
+            </w:r>
+            <w:r>
+              <w:rPr>
+                <w:sz w:val="19"/>
+              </w:rPr>
+              <w:t xml:space="preserve"> </w:t>
+            </w:r>
+            <w:r>
+              <w:rPr>
+                <w:bCs/>
+                <w:b/>
+                <w:sz w:val="19"/>
+              </w:rPr>
+              <w:t xml:space="preserve">stima</w:t>
+            </w:r>
+            <w:r>
+              <w:rPr>
+                <w:sz w:val="19"/>
+              </w:rPr>
+              <w:t xml:space="preserve">, perché del tempo dell’amico si conosce solo il totale e si suppone che sia andato sempre alla stessa media.</w:t>
+            </w:r>
+            <w:r>
+              <w:rPr>
+                <w:sz w:val="19"/>
+              </w:rPr>
+              <w:t xml:space="preserve"> </w:t>
+            </w:r>
+            <w:r>
+              <w:rPr>
+                <w:bCs/>
+                <w:b/>
+                <w:sz w:val="19"/>
+              </w:rPr>
+              <w:t xml:space="preserve">A fine gara</w:t>
+            </w:r>
+            <w:r>
+              <w:rPr>
+                <w:sz w:val="19"/>
+              </w:rPr>
+              <w:t xml:space="preserve">:</w:t>
+            </w:r>
+            <w:r>
+              <w:rPr>
+                <w:sz w:val="19"/>
+              </w:rPr>
+              <w:t xml:space="preserve"> </w:t>
+            </w:r>
+            <w:r>
+              <w:rPr>
+                <w:sz w:val="19"/>
+              </w:rPr>
+              <w:t xml:space="preserve">“</w:t>
+            </w:r>
+            <w:r>
+              <w:rPr>
+                <w:sz w:val="19"/>
+              </w:rPr>
+              <w:t xml:space="preserve">🎉 Hai battuto Marco di 3,21 s!</w:t>
+            </w:r>
+            <w:r>
+              <w:rPr>
+                <w:sz w:val="19"/>
+              </w:rPr>
+              <w:t xml:space="preserve">”</w:t>
+            </w:r>
+            <w:r>
+              <w:rPr>
+                <w:sz w:val="19"/>
+              </w:rPr>
+              <w:t xml:space="preserve"> </w:t>
+            </w:r>
+            <w:r>
+              <w:rPr>
+                <w:sz w:val="19"/>
+              </w:rPr>
+              <w:t xml:space="preserve">oppure</w:t>
+            </w:r>
+            <w:r>
+              <w:rPr>
+                <w:sz w:val="19"/>
+              </w:rPr>
+              <w:t xml:space="preserve"> </w:t>
+            </w:r>
+            <w:r>
+              <w:rPr>
+                <w:sz w:val="19"/>
+              </w:rPr>
+              <w:t xml:space="preserve">“</w:t>
+            </w:r>
+            <w:r>
+              <w:rPr>
+                <w:sz w:val="19"/>
+              </w:rPr>
+              <w:t xml:space="preserve">Marco è ancora davanti di 1,40 s: riprova!</w:t>
+            </w:r>
+            <w:r>
+              <w:rPr>
+                <w:sz w:val="19"/>
+              </w:rPr>
+              <w:t xml:space="preserve">”</w:t>
+            </w:r>
+            <w:r>
+              <w:rPr>
+                <w:sz w:val="19"/>
+              </w:rPr>
+              <w:t xml:space="preserve">; con Riprova la sfida resta. Se si vince, Condividi manda</w:t>
+            </w:r>
+            <w:r>
+              <w:rPr>
+                <w:sz w:val="19"/>
+              </w:rPr>
+              <w:t xml:space="preserve"> </w:t>
+            </w:r>
+            <w:r>
+              <w:rPr>
+                <w:sz w:val="19"/>
+              </w:rPr>
+              <w:t xml:space="preserve">“</w:t>
+            </w:r>
+            <w:r>
+              <w:rPr>
+                <w:sz w:val="19"/>
+              </w:rPr>
+              <w:t xml:space="preserve">Ho battuto Marco…</w:t>
+            </w:r>
+            <w:r>
+              <w:rPr>
+                <w:sz w:val="19"/>
+              </w:rPr>
+              <w:t xml:space="preserve">”</w:t>
+            </w:r>
+            <w:r>
+              <w:rPr>
+                <w:sz w:val="19"/>
+              </w:rPr>
+              <w:t xml:space="preserve"> </w:t>
+            </w:r>
+            <w:r>
+              <w:rPr>
+                <w:sz w:val="19"/>
+              </w:rPr>
+              <w:t xml:space="preserve">con il proprio tempo e un link nuovo.</w:t>
+            </w:r>
+            <w:r>
+              <w:rPr>
+                <w:sz w:val="19"/>
+              </w:rPr>
+              <w:t xml:space="preserve"> </w:t>
+            </w:r>
+            <w:r>
+              <w:rPr>
+                <w:bCs/>
+                <w:b/>
+                <w:sz w:val="19"/>
+              </w:rPr>
+              <w:t xml:space="preserve">Misure</w:t>
+            </w:r>
+            <w:r>
+              <w:rPr>
+                <w:sz w:val="19"/>
+              </w:rPr>
+              <w:t xml:space="preserve"> </w:t>
+            </w:r>
+            <w:r>
+              <w:rPr>
+                <w:sz w:val="19"/>
+              </w:rPr>
+              <w:t xml:space="preserve">(R-232): su /api/stats</w:t>
+            </w:r>
+            <w:r>
+              <w:rPr>
+                <w:sz w:val="19"/>
+              </w:rPr>
+              <w:t xml:space="preserve"> </w:t>
+            </w:r>
+            <w:r>
+              <w:rPr>
+                <w:rStyle w:val="VerbatimChar"/>
+                <w:sz w:val="19"/>
+              </w:rPr>
+              <w:t xml:space="preserve">batti_gare</w:t>
+            </w:r>
+            <w:r>
+              <w:rPr>
+                <w:sz w:val="19"/>
+              </w:rPr>
+              <w:t xml:space="preserve"> </w:t>
+            </w:r>
+            <w:r>
+              <w:rPr>
+                <w:sz w:val="19"/>
+              </w:rPr>
+              <w:t xml:space="preserve">conta le gare partite da un link di sfida. Scelte S-44</w:t>
             </w:r>
           </w:p>
         </w:tc>
@@ -40066,6 +41466,210 @@
                 <w:sz w:val="19"/>
               </w:rPr>
               <w:t xml:space="preserve">che chiede l’ok per la notte</w:t>
+            </w:r>
+          </w:p>
+        </w:tc>
+      </w:tr>
+      <w:tr>
+        <w:tc>
+          <w:tcPr>
+            <w:tcW w:type="dxa" w:w="1247"/>
+          </w:tcPr>
+          <w:p>
+            <w:pPr>
+              <w:pStyle w:val="Compact"/>
+              <w:spacing w:after="40"/>
+              <w:jc w:val="left"/>
+            </w:pPr>
+            <w:r>
+              <w:rPr>
+                <w:sz w:val="19"/>
+              </w:rPr>
+              <w:t xml:space="preserve">0.21.0</w:t>
+            </w:r>
+          </w:p>
+        </w:tc>
+        <w:tc>
+          <w:tcPr>
+            <w:tcW w:type="dxa" w:w="1361"/>
+          </w:tcPr>
+          <w:p>
+            <w:pPr>
+              <w:pStyle w:val="Compact"/>
+              <w:spacing w:after="40"/>
+              <w:jc w:val="left"/>
+            </w:pPr>
+            <w:r>
+              <w:rPr>
+                <w:sz w:val="19"/>
+              </w:rPr>
+              <w:t xml:space="preserve">27/10/2026</w:t>
+            </w:r>
+          </w:p>
+        </w:tc>
+        <w:tc>
+          <w:tcPr>
+            <w:tcW w:type="dxa" w:w="7257"/>
+          </w:tcPr>
+          <w:p>
+            <w:pPr>
+              <w:pStyle w:val="Compact"/>
+              <w:spacing w:after="40"/>
+              <w:jc w:val="left"/>
+            </w:pPr>
+            <w:r>
+              <w:rPr>
+                <w:sz w:val="19"/>
+              </w:rPr>
+              <w:t xml:space="preserve">(Scritta di giorno sul ramo</w:t>
+            </w:r>
+            <w:r>
+              <w:rPr>
+                <w:sz w:val="19"/>
+              </w:rPr>
+              <w:t xml:space="preserve"> </w:t>
+            </w:r>
+            <w:r>
+              <w:rPr>
+                <w:rStyle w:val="VerbatimChar"/>
+                <w:sz w:val="19"/>
+              </w:rPr>
+              <w:t xml:space="preserve">giorno/batti-missioni</w:t>
+            </w:r>
+            <w:r>
+              <w:rPr>
+                <w:sz w:val="19"/>
+              </w:rPr>
+              <w:t xml:space="preserve">; online dopo le prove del turno di notte.)</w:t>
+            </w:r>
+            <w:r>
+              <w:rPr>
+                <w:sz w:val="19"/>
+              </w:rPr>
+              <w:t xml:space="preserve"> </w:t>
+            </w:r>
+            <w:r>
+              <w:rPr>
+                <w:sz w:val="19"/>
+              </w:rPr>
+              <w:t xml:space="preserve">“</w:t>
+            </w:r>
+            <w:r>
+              <w:rPr>
+                <w:sz w:val="19"/>
+              </w:rPr>
+              <w:t xml:space="preserve">Batti il mio tempo</w:t>
+            </w:r>
+            <w:r>
+              <w:rPr>
+                <w:sz w:val="19"/>
+              </w:rPr>
+              <w:t xml:space="preserve">”</w:t>
+            </w:r>
+            <w:r>
+              <w:rPr>
+                <w:sz w:val="19"/>
+              </w:rPr>
+              <w:t xml:space="preserve"> </w:t>
+            </w:r>
+            <w:r>
+              <w:rPr>
+                <w:sz w:val="19"/>
+              </w:rPr>
+              <w:t xml:space="preserve">(R-236, S-44): link della pista del giorno con il tempo da battere, riquadro</w:t>
+            </w:r>
+            <w:r>
+              <w:rPr>
+                <w:sz w:val="19"/>
+              </w:rPr>
+              <w:t xml:space="preserve"> </w:t>
+            </w:r>
+            <w:r>
+              <w:rPr>
+                <w:sz w:val="19"/>
+              </w:rPr>
+              <w:t xml:space="preserve">“</w:t>
+            </w:r>
+            <w:r>
+              <w:rPr>
+                <w:sz w:val="19"/>
+              </w:rPr>
+              <w:t xml:space="preserve">ti sfida</w:t>
+            </w:r>
+            <w:r>
+              <w:rPr>
+                <w:sz w:val="19"/>
+              </w:rPr>
+              <w:t xml:space="preserve">”</w:t>
+            </w:r>
+            <w:r>
+              <w:rPr>
+                <w:sz w:val="19"/>
+              </w:rPr>
+              <w:t xml:space="preserve"> </w:t>
+            </w:r>
+            <w:r>
+              <w:rPr>
+                <w:sz w:val="19"/>
+              </w:rPr>
+              <w:t xml:space="preserve">nel menu, distacco stimato in gara, esito a fine gara, piste dei giorni passati rifatte dal link senza classifica, immagine del risultato 1080×1080 da condividere o salvare (D-05), misura</w:t>
+            </w:r>
+            <w:r>
+              <w:rPr>
+                <w:sz w:val="19"/>
+              </w:rPr>
+              <w:t xml:space="preserve"> </w:t>
+            </w:r>
+            <w:r>
+              <w:rPr>
+                <w:rStyle w:val="VerbatimChar"/>
+                <w:sz w:val="19"/>
+              </w:rPr>
+              <w:t xml:space="preserve">batti_gare</w:t>
+            </w:r>
+            <w:r>
+              <w:rPr>
+                <w:sz w:val="19"/>
+              </w:rPr>
+              <w:t xml:space="preserve">. Missioni (R-243, S-45): 3 obiettivi alla volta nel menu, stelle, avanzamento nel profilo. Moduli nuovi</w:t>
+            </w:r>
+            <w:r>
+              <w:rPr>
+                <w:sz w:val="19"/>
+              </w:rPr>
+              <w:t xml:space="preserve"> </w:t>
+            </w:r>
+            <w:r>
+              <w:rPr>
+                <w:rStyle w:val="VerbatimChar"/>
+                <w:sz w:val="19"/>
+              </w:rPr>
+              <w:t xml:space="preserve">moduli/sfida.js</w:t>
+            </w:r>
+            <w:r>
+              <w:rPr>
+                <w:sz w:val="19"/>
+              </w:rPr>
+              <w:t xml:space="preserve"> </w:t>
+            </w:r>
+            <w:r>
+              <w:rPr>
+                <w:sz w:val="19"/>
+              </w:rPr>
+              <w:t xml:space="preserve">e</w:t>
+            </w:r>
+            <w:r>
+              <w:rPr>
+                <w:sz w:val="19"/>
+              </w:rPr>
+              <w:t xml:space="preserve"> </w:t>
+            </w:r>
+            <w:r>
+              <w:rPr>
+                <w:rStyle w:val="VerbatimChar"/>
+                <w:sz w:val="19"/>
+              </w:rPr>
+              <w:t xml:space="preserve">moduli/missioni.js</w:t>
             </w:r>
           </w:p>
         </w:tc>

</xml_diff>

<commit_message>
Requisiti 0.22.0-0.24.0: Word rigenerato (docs/), R-232 rimanda a R-246
Co-Authored-By: Claude Fable 5.1 <noreply@anthropic.com>
Claude-Session: https://claude.ai/code/session_01Xy4XssGhkQ1wHUoccwzoLC
</commit_message>
<xml_diff>
--- a/docs/CYF-Gaming-requisiti.docx
+++ b/docs/CYF-Gaming-requisiti.docx
@@ -63,13 +63,13 @@
         <w:pStyle w:val="Subtitle"/>
       </w:pPr>
       <w:r>
-        <w:t xml:space="preserve">Versione</w:t>
+        <w:t xml:space="preserve">Versioni</w:t>
       </w:r>
       <w:r>
         <w:t xml:space="preserve"> </w:t>
       </w:r>
       <w:r>
-        <w:t xml:space="preserve">0.21.0</w:t>
+        <w:t xml:space="preserve">0.21.0-0.24.0</w:t>
       </w:r>
       <w:r>
         <w:t xml:space="preserve"> </w:t>
@@ -135,7 +135,7 @@
         <w:t xml:space="preserve"> </w:t>
       </w:r>
       <w:r>
-        <w:t xml:space="preserve">19:30</w:t>
+        <w:t xml:space="preserve">22:30</w:t>
       </w:r>
       <w:r>
         <w:t xml:space="preserve"> </w:t>
@@ -147,13 +147,22 @@
         <w:t xml:space="preserve"> </w:t>
       </w:r>
       <w:r>
-        <w:t xml:space="preserve">sfida</w:t>
+        <w:t xml:space="preserve">scritte</w:t>
       </w:r>
       <w:r>
         <w:t xml:space="preserve"> </w:t>
       </w:r>
       <w:r>
-        <w:t xml:space="preserve">“</w:t>
+        <w:t xml:space="preserve">di</w:t>
+      </w:r>
+      <w:r>
+        <w:t xml:space="preserve"> </w:t>
+      </w:r>
+      <w:r>
+        <w:t xml:space="preserve">giorno:</w:t>
+      </w:r>
+      <w:r>
+        <w:t xml:space="preserve"> </w:t>
       </w:r>
       <w:r>
         <w:t xml:space="preserve">batti</w:t>
@@ -177,61 +186,88 @@
         <w:t xml:space="preserve">tempo</w:t>
       </w:r>
       <w:r>
-        <w:t xml:space="preserve">”</w:t>
-      </w:r>
-      <w:r>
         <w:t xml:space="preserve"> </w:t>
       </w:r>
       <w:r>
+        <w:t xml:space="preserve">e</w:t>
+      </w:r>
+      <w:r>
+        <w:t xml:space="preserve"> </w:t>
+      </w:r>
+      <w:r>
+        <w:t xml:space="preserve">missioni,</w:t>
+      </w:r>
+      <w:r>
+        <w:t xml:space="preserve"> </w:t>
+      </w:r>
+      <w:r>
+        <w:t xml:space="preserve">modalità</w:t>
+      </w:r>
+      <w:r>
+        <w:t xml:space="preserve"> </w:t>
+      </w:r>
+      <w:r>
+        <w:t xml:space="preserve">portale</w:t>
+      </w:r>
+      <w:r>
+        <w:t xml:space="preserve"> </w:t>
+      </w:r>
+      <w:r>
+        <w:t xml:space="preserve">(CrazyGames),</w:t>
+      </w:r>
+      <w:r>
+        <w:t xml:space="preserve"> </w:t>
+      </w:r>
+      <w:r>
+        <w:t xml:space="preserve">città</w:t>
+      </w:r>
+      <w:r>
+        <w:t xml:space="preserve"> </w:t>
+      </w:r>
+      <w:r>
+        <w:t xml:space="preserve">della</w:t>
+      </w:r>
+      <w:r>
+        <w:t xml:space="preserve"> </w:t>
+      </w:r>
+      <w:r>
+        <w:t xml:space="preserve">settimana</w:t>
+      </w:r>
+      <w:r>
+        <w:t xml:space="preserve"> </w:t>
+      </w:r>
+      <w:r>
         <w:t xml:space="preserve">con</w:t>
       </w:r>
       <w:r>
         <w:t xml:space="preserve"> </w:t>
       </w:r>
       <w:r>
-        <w:t xml:space="preserve">immagine</w:t>
+        <w:t xml:space="preserve">la</w:t>
       </w:r>
       <w:r>
         <w:t xml:space="preserve"> </w:t>
       </w:r>
       <w:r>
-        <w:t xml:space="preserve">e</w:t>
+        <w:t xml:space="preserve">maglia,</w:t>
       </w:r>
       <w:r>
         <w:t xml:space="preserve"> </w:t>
       </w:r>
       <w:r>
-        <w:t xml:space="preserve">missioni</w:t>
+        <w:t xml:space="preserve">fonte</w:t>
       </w:r>
       <w:r>
         <w:t xml:space="preserve"> </w:t>
       </w:r>
       <w:r>
-        <w:t xml:space="preserve">scritte</w:t>
+        <w:t xml:space="preserve">delle</w:t>
       </w:r>
       <w:r>
         <w:t xml:space="preserve"> </w:t>
       </w:r>
       <w:r>
-        <w:t xml:space="preserve">sul</w:t>
-      </w:r>
-      <w:r>
-        <w:t xml:space="preserve"> </w:t>
-      </w:r>
-      <w:r>
-        <w:t xml:space="preserve">ramo</w:t>
-      </w:r>
-      <w:r>
-        <w:t xml:space="preserve"> </w:t>
-      </w:r>
-      <w:r>
-        <w:t xml:space="preserve">del</w:t>
-      </w:r>
-      <w:r>
-        <w:t xml:space="preserve"> </w:t>
-      </w:r>
-      <w:r>
-        <w:t xml:space="preserve">giorno</w:t>
+        <w:t xml:space="preserve">visite</w:t>
       </w:r>
       <w:r>
         <w:t xml:space="preserve"> </w:t>
@@ -278,7 +314,7 @@
         <w:pStyle w:val="FirstParagraph"/>
       </w:pPr>
       <w:r>
-        <w:t xml:space="preserve">Aggiornati il 27/10/2026 alle 19:30 (versione online: 0.20.2; la 0.21.0 con</w:t>
+        <w:t xml:space="preserve">Aggiornati il 27/10/2026 alle 22:30 (versione online: 0.20.2; la 0.21.0 con</w:t>
       </w:r>
       <w:r>
         <w:t xml:space="preserve"> </w:t>
@@ -296,7 +332,7 @@
         <w:t xml:space="preserve"> </w:t>
       </w:r>
       <w:r>
-        <w:t xml:space="preserve">e le missioni è scritta sul ramo</w:t>
+        <w:t xml:space="preserve">e le missioni è sul ramo</w:t>
       </w:r>
       <w:r>
         <w:t xml:space="preserve"> </w:t>
@@ -308,10 +344,19 @@
         <w:t xml:space="preserve">giorno/batti-missioni</w:t>
       </w:r>
       <w:r>
+        <w:t xml:space="preserve">; la 0.22.0 modalità portale, la 0.23.0 città della settimana e la 0.24.0 fonte delle visite sono sul ramo</w:t>
+      </w:r>
+      <w:r>
         <w:t xml:space="preserve"> </w:t>
       </w:r>
       <w:r>
-        <w:t xml:space="preserve">e va online domattina, dopo le prove del turno di notte). Questo Word è anche su Google Drive, cartella</w:t>
+        <w:rPr>
+          <w:rStyle w:val="VerbatimChar"/>
+        </w:rPr>
+        <w:t xml:space="preserve">giorno/portale-settimana</w:t>
+      </w:r>
+      <w:r>
+        <w:t xml:space="preserve">, che contiene anche la 0.21.0: vanno online domattina, dopo le prove del turno di notte). Questo Word è anche su Google Drive, cartella</w:t>
       </w:r>
       <w:r>
         <w:t xml:space="preserve"> </w:t>
@@ -771,6 +816,254 @@
                 <w:sz w:val="19"/>
               </w:rPr>
               <w:t xml:space="preserve">R-236, R-243</w:t>
+            </w:r>
+          </w:p>
+        </w:tc>
+      </w:tr>
+      <w:tr>
+        <w:tc>
+          <w:tcPr>
+            <w:tcW w:type="dxa" w:w="510"/>
+          </w:tcPr>
+          <w:p>
+            <w:pPr>
+              <w:pStyle w:val="Compact"/>
+              <w:spacing w:after="40"/>
+              <w:jc w:val="left"/>
+            </w:pPr>
+            <w:r>
+              <w:rPr>
+                <w:sz w:val="19"/>
+              </w:rPr>
+              <w:t xml:space="preserve">2b</w:t>
+            </w:r>
+          </w:p>
+        </w:tc>
+        <w:tc>
+          <w:tcPr>
+            <w:tcW w:type="dxa" w:w="6576"/>
+          </w:tcPr>
+          <w:p>
+            <w:pPr>
+              <w:pStyle w:val="Compact"/>
+              <w:spacing w:after="40"/>
+              <w:jc w:val="left"/>
+            </w:pPr>
+            <w:r>
+              <w:rPr>
+                <w:sz w:val="19"/>
+              </w:rPr>
+              <w:t xml:space="preserve">Da domattina, dal telefono: nel menu il riquadro</w:t>
+            </w:r>
+            <w:r>
+              <w:rPr>
+                <w:sz w:val="19"/>
+              </w:rPr>
+              <w:t xml:space="preserve"> </w:t>
+            </w:r>
+            <w:r>
+              <w:rPr>
+                <w:bCs/>
+                <w:b/>
+                <w:sz w:val="19"/>
+              </w:rPr>
+              <w:t xml:space="preserve">Città della settimana</w:t>
+            </w:r>
+            <w:r>
+              <w:rPr>
+                <w:sz w:val="19"/>
+              </w:rPr>
+              <w:t xml:space="preserve"> </w:t>
+            </w:r>
+            <w:r>
+              <w:rPr>
+                <w:sz w:val="19"/>
+              </w:rPr>
+              <w:t xml:space="preserve">(R-245), finire una gara a Roma (sala online o sfida) e controllare che arrivi la maglia #1 in</w:t>
+            </w:r>
+            <w:r>
+              <w:rPr>
+                <w:sz w:val="19"/>
+              </w:rPr>
+              <w:t xml:space="preserve"> </w:t>
+            </w:r>
+            <w:r>
+              <w:rPr>
+                <w:sz w:val="19"/>
+              </w:rPr>
+              <w:t xml:space="preserve">“</w:t>
+            </w:r>
+            <w:r>
+              <w:rPr>
+                <w:sz w:val="19"/>
+              </w:rPr>
+              <w:t xml:space="preserve">Modifica il personaggio</w:t>
+            </w:r>
+            <w:r>
+              <w:rPr>
+                <w:sz w:val="19"/>
+              </w:rPr>
+              <w:t xml:space="preserve">”</w:t>
+            </w:r>
+            <w:r>
+              <w:rPr>
+                <w:sz w:val="19"/>
+              </w:rPr>
+              <w:t xml:space="preserve">; provare il gioco con</w:t>
+            </w:r>
+            <w:r>
+              <w:rPr>
+                <w:sz w:val="19"/>
+              </w:rPr>
+              <w:t xml:space="preserve"> </w:t>
+            </w:r>
+            <w:r>
+              <w:rPr>
+                <w:rStyle w:val="VerbatimChar"/>
+                <w:sz w:val="19"/>
+              </w:rPr>
+              <w:t xml:space="preserve">?portale=crazygames</w:t>
+            </w:r>
+            <w:r>
+              <w:rPr>
+                <w:sz w:val="19"/>
+              </w:rPr>
+              <w:t xml:space="preserve"> </w:t>
+            </w:r>
+            <w:r>
+              <w:rPr>
+                <w:sz w:val="19"/>
+              </w:rPr>
+              <w:t xml:space="preserve">in fondo all’indirizzo (R-244)</w:t>
+            </w:r>
+          </w:p>
+        </w:tc>
+        <w:tc>
+          <w:tcPr>
+            <w:tcW w:type="dxa" w:w="1247"/>
+          </w:tcPr>
+          <w:p>
+            <w:pPr>
+              <w:pStyle w:val="Compact"/>
+              <w:spacing w:after="40"/>
+              <w:jc w:val="left"/>
+            </w:pPr>
+            <w:r>
+              <w:rPr>
+                <w:sz w:val="19"/>
+              </w:rPr>
+              <w:t xml:space="preserve">15 min</w:t>
+            </w:r>
+          </w:p>
+        </w:tc>
+        <w:tc>
+          <w:tcPr>
+            <w:tcW w:type="dxa" w:w="1531"/>
+          </w:tcPr>
+          <w:p>
+            <w:pPr>
+              <w:pStyle w:val="Compact"/>
+              <w:spacing w:after="40"/>
+              <w:jc w:val="left"/>
+            </w:pPr>
+            <w:r>
+              <w:rPr>
+                <w:sz w:val="19"/>
+              </w:rPr>
+              <w:t xml:space="preserve">R-244, R-245</w:t>
+            </w:r>
+          </w:p>
+        </w:tc>
+      </w:tr>
+      <w:tr>
+        <w:tc>
+          <w:tcPr>
+            <w:tcW w:type="dxa" w:w="510"/>
+          </w:tcPr>
+          <w:p>
+            <w:pPr>
+              <w:pStyle w:val="Compact"/>
+              <w:spacing w:after="40"/>
+              <w:jc w:val="left"/>
+            </w:pPr>
+            <w:r>
+              <w:rPr>
+                <w:sz w:val="19"/>
+              </w:rPr>
+              <w:t xml:space="preserve">2c</w:t>
+            </w:r>
+          </w:p>
+        </w:tc>
+        <w:tc>
+          <w:tcPr>
+            <w:tcW w:type="dxa" w:w="6576"/>
+          </w:tcPr>
+          <w:p>
+            <w:pPr>
+              <w:pStyle w:val="Compact"/>
+              <w:spacing w:after="40"/>
+              <w:jc w:val="left"/>
+            </w:pPr>
+            <w:r>
+              <w:rPr>
+                <w:sz w:val="19"/>
+              </w:rPr>
+              <w:t xml:space="preserve">Proporre Pista Nera su CrazyGames (Basic Launch) con l’indirizzo</w:t>
+            </w:r>
+            <w:r>
+              <w:rPr>
+                <w:sz w:val="19"/>
+              </w:rPr>
+              <w:t xml:space="preserve"> </w:t>
+            </w:r>
+            <w:r>
+              <w:rPr>
+                <w:rStyle w:val="VerbatimChar"/>
+                <w:sz w:val="19"/>
+              </w:rPr>
+              <w:t xml:space="preserve">…/pista-nera/?portale=crazygames</w:t>
+            </w:r>
+            <w:r>
+              <w:rPr>
+                <w:sz w:val="19"/>
+              </w:rPr>
+              <w:t xml:space="preserve">, quando la 0.22.0 è online</w:t>
+            </w:r>
+          </w:p>
+        </w:tc>
+        <w:tc>
+          <w:tcPr>
+            <w:tcW w:type="dxa" w:w="1247"/>
+          </w:tcPr>
+          <w:p>
+            <w:pPr>
+              <w:pStyle w:val="Compact"/>
+              <w:spacing w:after="40"/>
+              <w:jc w:val="left"/>
+            </w:pPr>
+            <w:r>
+              <w:rPr>
+                <w:sz w:val="19"/>
+              </w:rPr>
+              <w:t xml:space="preserve">20 min</w:t>
+            </w:r>
+          </w:p>
+        </w:tc>
+        <w:tc>
+          <w:tcPr>
+            <w:tcW w:type="dxa" w:w="1531"/>
+          </w:tcPr>
+          <w:p>
+            <w:pPr>
+              <w:pStyle w:val="Compact"/>
+              <w:spacing w:after="40"/>
+              <w:jc w:val="left"/>
+            </w:pPr>
+            <w:r>
+              <w:rPr>
+                <w:sz w:val="19"/>
+              </w:rPr>
+              <w:t xml:space="preserve">D-12</w:t>
             </w:r>
           </w:p>
         </w:tc>
@@ -2053,7 +2346,145 @@
               <w:rPr>
                 <w:sz w:val="19"/>
               </w:rPr>
-              <w:t xml:space="preserve">Misurare da dove arrivano i giocatori (link di sfida, pista del giorno condivisa, diretto): proposta del confronto del 27/10, da confermare</w:t>
+              <w:t xml:space="preserve">Provare e pubblicare la 0.22.0, 0.23.0 e 0.24.0 sul ramo</w:t>
+            </w:r>
+            <w:r>
+              <w:rPr>
+                <w:sz w:val="19"/>
+              </w:rPr>
+              <w:t xml:space="preserve"> </w:t>
+            </w:r>
+            <w:r>
+              <w:rPr>
+                <w:rStyle w:val="VerbatimChar"/>
+                <w:sz w:val="19"/>
+              </w:rPr>
+              <w:t xml:space="preserve">giorno/portale-settimana</w:t>
+            </w:r>
+            <w:r>
+              <w:rPr>
+                <w:sz w:val="19"/>
+              </w:rPr>
+              <w:t xml:space="preserve"> </w:t>
+            </w:r>
+            <w:r>
+              <w:rPr>
+                <w:sz w:val="19"/>
+              </w:rPr>
+              <w:t xml:space="preserve">(contiene anche la 0.21.0): modalità portale (R-244), città della settimana con la maglia (R-245), fonte delle visite (R-246). Prove da aggiungere:</w:t>
+            </w:r>
+            <w:r>
+              <w:rPr>
+                <w:sz w:val="19"/>
+              </w:rPr>
+              <w:t xml:space="preserve"> </w:t>
+            </w:r>
+            <w:r>
+              <w:rPr>
+                <w:rStyle w:val="VerbatimChar"/>
+                <w:sz w:val="19"/>
+              </w:rPr>
+              <w:t xml:space="preserve">?portale=</w:t>
+            </w:r>
+            <w:r>
+              <w:rPr>
+                <w:sz w:val="19"/>
+              </w:rPr>
+              <w:t xml:space="preserve"> </w:t>
+            </w:r>
+            <w:r>
+              <w:rPr>
+                <w:sz w:val="19"/>
+              </w:rPr>
+              <w:t xml:space="preserve">nasconde donazioni e link e spegne i vocali (browser);</w:t>
+            </w:r>
+            <w:r>
+              <w:rPr>
+                <w:sz w:val="19"/>
+              </w:rPr>
+              <w:t xml:space="preserve"> </w:t>
+            </w:r>
+            <w:r>
+              <w:rPr>
+                <w:rStyle w:val="VerbatimChar"/>
+                <w:sz w:val="19"/>
+              </w:rPr>
+              <w:t xml:space="preserve">calendario.js</w:t>
+            </w:r>
+            <w:r>
+              <w:rPr>
+                <w:sz w:val="19"/>
+              </w:rPr>
+              <w:t xml:space="preserve"> </w:t>
+            </w:r>
+            <w:r>
+              <w:rPr>
+                <w:sz w:val="19"/>
+              </w:rPr>
+              <w:t xml:space="preserve">settimana → città,</w:t>
+            </w:r>
+            <w:r>
+              <w:rPr>
+                <w:sz w:val="19"/>
+              </w:rPr>
+              <w:t xml:space="preserve"> </w:t>
+            </w:r>
+            <w:r>
+              <w:rPr>
+                <w:rStyle w:val="VerbatimChar"/>
+                <w:sz w:val="19"/>
+              </w:rPr>
+              <w:t xml:space="preserve">premia</w:t>
+            </w:r>
+            <w:r>
+              <w:rPr>
+                <w:sz w:val="19"/>
+              </w:rPr>
+              <w:t xml:space="preserve"> </w:t>
+            </w:r>
+            <w:r>
+              <w:rPr>
+                <w:sz w:val="19"/>
+              </w:rPr>
+              <w:t xml:space="preserve">del server e maglia nei risultati (</w:t>
+            </w:r>
+            <w:r>
+              <w:rPr>
+                <w:rStyle w:val="VerbatimChar"/>
+                <w:sz w:val="19"/>
+              </w:rPr>
+              <w:t xml:space="preserve">test_server.mjs</w:t>
+            </w:r>
+            <w:r>
+              <w:rPr>
+                <w:sz w:val="19"/>
+              </w:rPr>
+              <w:t xml:space="preserve">);</w:t>
+            </w:r>
+            <w:r>
+              <w:rPr>
+                <w:sz w:val="19"/>
+              </w:rPr>
+              <w:t xml:space="preserve"> </w:t>
+            </w:r>
+            <w:r>
+              <w:rPr>
+                <w:rStyle w:val="VerbatimChar"/>
+                <w:sz w:val="19"/>
+              </w:rPr>
+              <w:t xml:space="preserve">/api/visita</w:t>
+            </w:r>
+            <w:r>
+              <w:rPr>
+                <w:sz w:val="19"/>
+              </w:rPr>
+              <w:t xml:space="preserve"> </w:t>
+            </w:r>
+            <w:r>
+              <w:rPr>
+                <w:sz w:val="19"/>
+              </w:rPr>
+              <w:t xml:space="preserve">con la fonte e ritorni per fonte (T11)</w:t>
             </w:r>
           </w:p>
         </w:tc>
@@ -2071,7 +2502,31 @@
               <w:rPr>
                 <w:sz w:val="19"/>
               </w:rPr>
-              <w:t xml:space="preserve">Dice se il link porta giocatori nuovi</w:t>
+              <w:t xml:space="preserve">Richiesta di Luigi del 27/10 (</w:t>
+            </w:r>
+            <w:r>
+              <w:rPr>
+                <w:sz w:val="19"/>
+              </w:rPr>
+              <w:t xml:space="preserve">“</w:t>
+            </w:r>
+            <w:r>
+              <w:rPr>
+                <w:sz w:val="19"/>
+              </w:rPr>
+              <w:t xml:space="preserve">implementa quello che hanno i competitor, dalla modifica più massiccia</w:t>
+            </w:r>
+            <w:r>
+              <w:rPr>
+                <w:sz w:val="19"/>
+              </w:rPr>
+              <w:t xml:space="preserve">”</w:t>
+            </w:r>
+            <w:r>
+              <w:rPr>
+                <w:sz w:val="19"/>
+              </w:rPr>
+              <w:t xml:space="preserve">)</w:t>
             </w:r>
           </w:p>
         </w:tc>
@@ -2089,7 +2544,7 @@
               <w:rPr>
                 <w:sz w:val="19"/>
               </w:rPr>
-              <w:t xml:space="preserve">nuova</w:t>
+              <w:t xml:space="preserve">R-244, R-245, R-246</w:t>
             </w:r>
           </w:p>
         </w:tc>
@@ -2107,26 +2562,25 @@
               <w:rPr>
                 <w:sz w:val="19"/>
               </w:rPr>
-              <w:t xml:space="preserve">—</w:t>
+              <w:t xml:space="preserve">0.22-0.24</w:t>
             </w:r>
           </w:p>
         </w:tc>
         <w:tc>
           <w:tcPr>
             <w:tcW w:type="dxa" w:w="1304"/>
-            <w:shd w:val="clear" w:color="auto" w:fill="FFF1C7"/>
-          </w:tcPr>
-          <w:p>
-            <w:pPr>
-              <w:pStyle w:val="Compact"/>
-              <w:spacing w:after="40"/>
-              <w:jc w:val="left"/>
-            </w:pPr>
-            <w:r>
-              <w:rPr>
-                <w:sz w:val="19"/>
-              </w:rPr>
-              <w:t xml:space="preserve">Da approvare</w:t>
+          </w:tcPr>
+          <w:p>
+            <w:pPr>
+              <w:pStyle w:val="Compact"/>
+              <w:spacing w:after="40"/>
+              <w:jc w:val="left"/>
+            </w:pPr>
+            <w:r>
+              <w:rPr>
+                <w:sz w:val="19"/>
+              </w:rPr>
+              <w:t xml:space="preserve">Sì (stanotte)</w:t>
             </w:r>
           </w:p>
         </w:tc>
@@ -3064,7 +3518,7 @@
         <w:pStyle w:val="BodyText"/>
       </w:pPr>
       <w:r>
-        <w:t xml:space="preserve">Scritti il 27/10 pomeriggio su richiesta di Luigi (</w:t>
+        <w:t xml:space="preserve">Scritti il 27/10 pomeriggio e sera su richiesta di Luigi (</w:t>
       </w:r>
       <w:r>
         <w:t xml:space="preserve">“</w:t>
@@ -3079,7 +3533,22 @@
         <w:t xml:space="preserve"> </w:t>
       </w:r>
       <w:r>
-        <w:t xml:space="preserve">del confronto delle 18): R-236 e R-243 (riga 1). Fatti e tolti da questa tabella il 26-27/10: avversari del computer al posto dei fantasmi (R-234, R-235, 0.18.0), fisica in un modulo e server diviso (A-19, A-20, 0.18.1), Three.js dal sito stesso (A-16, 0.18.1), velocità reali e ostacoli −30% (R-242, R-313, 0.19.0), sfondi delle città come cartoline dipinte in un worker (R-405, A-22, 0.20.0), pagina e programma della stessa versione (R-011, 0.20.1).</w:t>
+        <w:t xml:space="preserve">del confronto delle 18, poi</w:t>
+      </w:r>
+      <w:r>
+        <w:t xml:space="preserve"> </w:t>
+      </w:r>
+      <w:r>
+        <w:t xml:space="preserve">“</w:t>
+      </w:r>
+      <w:r>
+        <w:t xml:space="preserve">implementa quello che hanno i competitor e noi no, dalla modifica più massiccia</w:t>
+      </w:r>
+      <w:r>
+        <w:t xml:space="preserve">”</w:t>
+      </w:r>
+      <w:r>
+        <w:t xml:space="preserve">): R-236 e R-243 (riga 1), R-244, R-245 e R-246 (riga 1b). Delle 5 proposte del confronto del 27/10 restano fuori solo la pubblicazione vera su CrazyGames, che fa Luigi (D-12). Fatti e tolti da questa tabella il 26-27/10: avversari del computer al posto dei fantasmi (R-234, R-235, 0.18.0), fisica in un modulo e server diviso (A-19, A-20, 0.18.1), Three.js dal sito stesso (A-16, 0.18.1), velocità reali e ostacoli −30% (R-242, R-313, 0.19.0), sfondi delle città come cartoline dipinte in un worker (R-405, A-22, 0.20.0), pagina e programma della stessa versione (R-011, 0.20.1).</w:t>
       </w:r>
     </w:p>
     <w:bookmarkEnd w:id="21"/>
@@ -19155,6 +19624,474 @@
           </w:p>
         </w:tc>
       </w:tr>
+      <w:tr>
+        <w:tc>
+          <w:tcPr>
+            <w:tcW w:type="dxa" w:w="794"/>
+          </w:tcPr>
+          <w:p>
+            <w:pPr>
+              <w:pStyle w:val="Compact"/>
+              <w:spacing w:after="40"/>
+              <w:jc w:val="left"/>
+            </w:pPr>
+            <w:r>
+              <w:rPr>
+                <w:sz w:val="19"/>
+              </w:rPr>
+              <w:t xml:space="preserve">S-46</w:t>
+            </w:r>
+          </w:p>
+        </w:tc>
+        <w:tc>
+          <w:tcPr>
+            <w:tcW w:type="dxa" w:w="6009"/>
+          </w:tcPr>
+          <w:p>
+            <w:pPr>
+              <w:pStyle w:val="Compact"/>
+              <w:spacing w:after="40"/>
+              <w:jc w:val="left"/>
+            </w:pPr>
+            <w:r>
+              <w:rPr>
+                <w:sz w:val="19"/>
+              </w:rPr>
+              <w:t xml:space="preserve">Portali (R-244), scelte di Claude: la modalità portale si accende con</w:t>
+            </w:r>
+            <w:r>
+              <w:rPr>
+                <w:sz w:val="19"/>
+              </w:rPr>
+              <w:t xml:space="preserve"> </w:t>
+            </w:r>
+            <w:r>
+              <w:rPr>
+                <w:rStyle w:val="VerbatimChar"/>
+                <w:sz w:val="19"/>
+              </w:rPr>
+              <w:t xml:space="preserve">?portale=&lt;nome&gt;</w:t>
+            </w:r>
+            <w:r>
+              <w:rPr>
+                <w:sz w:val="19"/>
+              </w:rPr>
+              <w:t xml:space="preserve"> </w:t>
+            </w:r>
+            <w:r>
+              <w:rPr>
+                <w:sz w:val="19"/>
+              </w:rPr>
+              <w:t xml:space="preserve">nell’indirizzo che si dà al portale e, come rete di sicurezza, quando il gioco è aperto nel riquadro di un portale conosciuto; resta accesa per la visita. Nella stanza della sfida sul portale resta il codice (gli amici lo scrivono in</w:t>
+            </w:r>
+            <w:r>
+              <w:rPr>
+                <w:sz w:val="19"/>
+              </w:rPr>
+              <w:t xml:space="preserve"> </w:t>
+            </w:r>
+            <w:r>
+              <w:rPr>
+                <w:sz w:val="19"/>
+              </w:rPr>
+              <w:t xml:space="preserve">“</w:t>
+            </w:r>
+            <w:r>
+              <w:rPr>
+                <w:sz w:val="19"/>
+              </w:rPr>
+              <w:t xml:space="preserve">Hai un codice?</w:t>
+            </w:r>
+            <w:r>
+              <w:rPr>
+                <w:sz w:val="19"/>
+              </w:rPr>
+              <w:t xml:space="preserve">”</w:t>
+            </w:r>
+            <w:r>
+              <w:rPr>
+                <w:sz w:val="19"/>
+              </w:rPr>
+              <w:t xml:space="preserve">), niente link: un link al nostro sito porterebbe i giocatori fuori dal portale, che lo vieta. I vocali sul portale partono spenti e chiunque può accenderli; fuori dal portale restano accesi come oggi, e la casella vale per tutti. Niente SDK di CrazyGames finché non serve la pubblicità (Basic Launch): quando Luigi deciderà la versione con pubblicità, si aggiunge l’SDK con un interruttore (A-17). I percorsi dei file restano assoluti (</w:t>
+            </w:r>
+            <w:r>
+              <w:rPr>
+                <w:rStyle w:val="VerbatimChar"/>
+                <w:sz w:val="19"/>
+              </w:rPr>
+              <w:t xml:space="preserve">/vendor/…</w:t>
+            </w:r>
+            <w:r>
+              <w:rPr>
+                <w:sz w:val="19"/>
+              </w:rPr>
+              <w:t xml:space="preserve">) perché il gioco resta sul nostro sito: se un giorno si caricasse come pacchetto sul portale, servirebbero percorsi relativi e l’indirizzo del nostro server per le gare</w:t>
+            </w:r>
+          </w:p>
+        </w:tc>
+        <w:tc>
+          <w:tcPr>
+            <w:tcW w:type="dxa" w:w="1247"/>
+          </w:tcPr>
+          <w:p>
+            <w:pPr>
+              <w:pStyle w:val="Compact"/>
+              <w:spacing w:after="40"/>
+              <w:jc w:val="left"/>
+            </w:pPr>
+            <w:r>
+              <w:rPr>
+                <w:sz w:val="19"/>
+              </w:rPr>
+              <w:t xml:space="preserve">27/10/2026</w:t>
+            </w:r>
+          </w:p>
+        </w:tc>
+        <w:tc>
+          <w:tcPr>
+            <w:tcW w:type="dxa" w:w="1814"/>
+            <w:shd w:val="clear" w:color="auto" w:fill="E6EDF5"/>
+          </w:tcPr>
+          <w:p>
+            <w:pPr>
+              <w:pStyle w:val="Compact"/>
+              <w:spacing w:after="40"/>
+              <w:jc w:val="left"/>
+            </w:pPr>
+            <w:r>
+              <w:rPr>
+                <w:sz w:val="19"/>
+              </w:rPr>
+              <w:t xml:space="preserve">Da confermare</w:t>
+            </w:r>
+          </w:p>
+        </w:tc>
+      </w:tr>
+      <w:tr>
+        <w:tc>
+          <w:tcPr>
+            <w:tcW w:type="dxa" w:w="794"/>
+          </w:tcPr>
+          <w:p>
+            <w:pPr>
+              <w:pStyle w:val="Compact"/>
+              <w:spacing w:after="40"/>
+              <w:jc w:val="left"/>
+            </w:pPr>
+            <w:r>
+              <w:rPr>
+                <w:sz w:val="19"/>
+              </w:rPr>
+              <w:t xml:space="preserve">S-47</w:t>
+            </w:r>
+          </w:p>
+        </w:tc>
+        <w:tc>
+          <w:tcPr>
+            <w:tcW w:type="dxa" w:w="6009"/>
+          </w:tcPr>
+          <w:p>
+            <w:pPr>
+              <w:pStyle w:val="Compact"/>
+              <w:spacing w:after="40"/>
+              <w:jc w:val="left"/>
+            </w:pPr>
+            <w:r>
+              <w:rPr>
+                <w:sz w:val="19"/>
+              </w:rPr>
+              <w:t xml:space="preserve">Città della settimana (R-245), scelte di Claude: il premio è una</w:t>
+            </w:r>
+            <w:r>
+              <w:rPr>
+                <w:sz w:val="19"/>
+              </w:rPr>
+              <w:t xml:space="preserve"> </w:t>
+            </w:r>
+            <w:r>
+              <w:rPr>
+                <w:bCs/>
+                <w:b/>
+                <w:sz w:val="19"/>
+              </w:rPr>
+              <w:t xml:space="preserve">maglia</w:t>
+            </w:r>
+            <w:r>
+              <w:rPr>
+                <w:sz w:val="19"/>
+              </w:rPr>
+              <w:t xml:space="preserve"> </w:t>
+            </w:r>
+            <w:r>
+              <w:rPr>
+                <w:sz w:val="19"/>
+              </w:rPr>
+              <w:t xml:space="preserve">(la cosa più visibile agli altri), una diversa per ogni settimana, numerata; vale solo una gara</w:t>
+            </w:r>
+            <w:r>
+              <w:rPr>
+                <w:sz w:val="19"/>
+              </w:rPr>
+              <w:t xml:space="preserve"> </w:t>
+            </w:r>
+            <w:r>
+              <w:rPr>
+                <w:bCs/>
+                <w:b/>
+                <w:sz w:val="19"/>
+              </w:rPr>
+              <w:t xml:space="preserve">finita</w:t>
+            </w:r>
+            <w:r>
+              <w:rPr>
+                <w:sz w:val="19"/>
+              </w:rPr>
+              <w:t xml:space="preserve"> </w:t>
+            </w:r>
+            <w:r>
+              <w:rPr>
+                <w:sz w:val="19"/>
+              </w:rPr>
+              <w:t xml:space="preserve">con arrivo valido, perché la decide il server e non si può imbrogliare dal telefono; conta anche la pista del giorno quando capita nella città giusta; la settimana è lunedì-domenica ora italiana come la pista del giorno; l’ordine delle città è fisso ma diverso da quello della pista del giorno, così nella stessa settimana la pista del giorno tocca la città in evidenza al massimo una volta. Il pulsante</w:t>
+            </w:r>
+            <w:r>
+              <w:rPr>
+                <w:sz w:val="19"/>
+              </w:rPr>
+              <w:t xml:space="preserve"> </w:t>
+            </w:r>
+            <w:r>
+              <w:rPr>
+                <w:sz w:val="19"/>
+              </w:rPr>
+              <w:t xml:space="preserve">“</w:t>
+            </w:r>
+            <w:r>
+              <w:rPr>
+                <w:sz w:val="19"/>
+              </w:rPr>
+              <w:t xml:space="preserve">Corri a Roma</w:t>
+            </w:r>
+            <w:r>
+              <w:rPr>
+                <w:sz w:val="19"/>
+              </w:rPr>
+              <w:t xml:space="preserve">”</w:t>
+            </w:r>
+            <w:r>
+              <w:rPr>
+                <w:sz w:val="19"/>
+              </w:rPr>
+              <w:t xml:space="preserve"> </w:t>
+            </w:r>
+            <w:r>
+              <w:rPr>
+                <w:sz w:val="19"/>
+              </w:rPr>
+              <w:t xml:space="preserve">cambia solo la città del menu: la gara la si fa con gli amici, online o nella pista del giorno. Il server non controlla la maglia che un giocatore dice di avere (come oggi per capelli e casco): un giocatore esperto potrebbe mostrarne una non vinta, senza vantaggi in gara. Prima maglia: settimana #1 (26/10-1/11/2026), Roma</w:t>
+            </w:r>
+          </w:p>
+        </w:tc>
+        <w:tc>
+          <w:tcPr>
+            <w:tcW w:type="dxa" w:w="1247"/>
+          </w:tcPr>
+          <w:p>
+            <w:pPr>
+              <w:pStyle w:val="Compact"/>
+              <w:spacing w:after="40"/>
+              <w:jc w:val="left"/>
+            </w:pPr>
+            <w:r>
+              <w:rPr>
+                <w:sz w:val="19"/>
+              </w:rPr>
+              <w:t xml:space="preserve">27/10/2026</w:t>
+            </w:r>
+          </w:p>
+        </w:tc>
+        <w:tc>
+          <w:tcPr>
+            <w:tcW w:type="dxa" w:w="1814"/>
+            <w:shd w:val="clear" w:color="auto" w:fill="E6EDF5"/>
+          </w:tcPr>
+          <w:p>
+            <w:pPr>
+              <w:pStyle w:val="Compact"/>
+              <w:spacing w:after="40"/>
+              <w:jc w:val="left"/>
+            </w:pPr>
+            <w:r>
+              <w:rPr>
+                <w:sz w:val="19"/>
+              </w:rPr>
+              <w:t xml:space="preserve">Da confermare</w:t>
+            </w:r>
+          </w:p>
+        </w:tc>
+      </w:tr>
+      <w:tr>
+        <w:tc>
+          <w:tcPr>
+            <w:tcW w:type="dxa" w:w="794"/>
+          </w:tcPr>
+          <w:p>
+            <w:pPr>
+              <w:pStyle w:val="Compact"/>
+              <w:spacing w:after="40"/>
+              <w:jc w:val="left"/>
+            </w:pPr>
+            <w:r>
+              <w:rPr>
+                <w:sz w:val="19"/>
+              </w:rPr>
+              <w:t xml:space="preserve">S-48</w:t>
+            </w:r>
+          </w:p>
+        </w:tc>
+        <w:tc>
+          <w:tcPr>
+            <w:tcW w:type="dxa" w:w="6009"/>
+          </w:tcPr>
+          <w:p>
+            <w:pPr>
+              <w:pStyle w:val="Compact"/>
+              <w:spacing w:after="40"/>
+              <w:jc w:val="left"/>
+            </w:pPr>
+            <w:r>
+              <w:rPr>
+                <w:sz w:val="19"/>
+              </w:rPr>
+              <w:t xml:space="preserve">Fonte delle visite (R-246), scelte di Claude: la fonte si legge dall’indirizzo di arrivo (</w:t>
+            </w:r>
+            <w:r>
+              <w:rPr>
+                <w:rStyle w:val="VerbatimChar"/>
+                <w:sz w:val="19"/>
+              </w:rPr>
+              <w:t xml:space="preserve">?sfida=</w:t>
+            </w:r>
+            <w:r>
+              <w:rPr>
+                <w:sz w:val="19"/>
+              </w:rPr>
+              <w:t xml:space="preserve">,</w:t>
+            </w:r>
+            <w:r>
+              <w:rPr>
+                <w:sz w:val="19"/>
+              </w:rPr>
+              <w:t xml:space="preserve"> </w:t>
+            </w:r>
+            <w:r>
+              <w:rPr>
+                <w:rStyle w:val="VerbatimChar"/>
+                <w:sz w:val="19"/>
+              </w:rPr>
+              <w:t xml:space="preserve">?batti=</w:t>
+            </w:r>
+            <w:r>
+              <w:rPr>
+                <w:sz w:val="19"/>
+              </w:rPr>
+              <w:t xml:space="preserve">,</w:t>
+            </w:r>
+            <w:r>
+              <w:rPr>
+                <w:sz w:val="19"/>
+              </w:rPr>
+              <w:t xml:space="preserve"> </w:t>
+            </w:r>
+            <w:r>
+              <w:rPr>
+                <w:rStyle w:val="VerbatimChar"/>
+                <w:sz w:val="19"/>
+              </w:rPr>
+              <w:t xml:space="preserve">?portale=</w:t>
+            </w:r>
+            <w:r>
+              <w:rPr>
+                <w:sz w:val="19"/>
+              </w:rPr>
+              <w:t xml:space="preserve">) e dal riferimento del browser (home del sito);</w:t>
+            </w:r>
+            <w:r>
+              <w:rPr>
+                <w:sz w:val="19"/>
+              </w:rPr>
+              <w:t xml:space="preserve"> </w:t>
+            </w:r>
+            <w:r>
+              <w:rPr>
+                <w:sz w:val="19"/>
+              </w:rPr>
+              <w:t xml:space="preserve">“</w:t>
+            </w:r>
+            <w:r>
+              <w:rPr>
+                <w:sz w:val="19"/>
+              </w:rPr>
+              <w:t xml:space="preserve">diretto</w:t>
+            </w:r>
+            <w:r>
+              <w:rPr>
+                <w:sz w:val="19"/>
+              </w:rPr>
+              <w:t xml:space="preserve">”</w:t>
+            </w:r>
+            <w:r>
+              <w:rPr>
+                <w:sz w:val="19"/>
+              </w:rPr>
+              <w:t xml:space="preserve"> </w:t>
+            </w:r>
+            <w:r>
+              <w:rPr>
+                <w:sz w:val="19"/>
+              </w:rPr>
+              <w:t xml:space="preserve">è tutto il resto. Vale la prima visita del giorno di ogni giocatore; per i ritorni vale la fonte della sua prima visita in assoluto (dal giorno in cui va online la 0.24.0). Le fonti sono poche e fisse (5): si aggiungono solo quando servono</w:t>
+            </w:r>
+          </w:p>
+        </w:tc>
+        <w:tc>
+          <w:tcPr>
+            <w:tcW w:type="dxa" w:w="1247"/>
+          </w:tcPr>
+          <w:p>
+            <w:pPr>
+              <w:pStyle w:val="Compact"/>
+              <w:spacing w:after="40"/>
+              <w:jc w:val="left"/>
+            </w:pPr>
+            <w:r>
+              <w:rPr>
+                <w:sz w:val="19"/>
+              </w:rPr>
+              <w:t xml:space="preserve">27/10/2026</w:t>
+            </w:r>
+          </w:p>
+        </w:tc>
+        <w:tc>
+          <w:tcPr>
+            <w:tcW w:type="dxa" w:w="1814"/>
+            <w:shd w:val="clear" w:color="auto" w:fill="E6EDF5"/>
+          </w:tcPr>
+          <w:p>
+            <w:pPr>
+              <w:pStyle w:val="Compact"/>
+              <w:spacing w:after="40"/>
+              <w:jc w:val="left"/>
+            </w:pPr>
+            <w:r>
+              <w:rPr>
+                <w:sz w:val="19"/>
+              </w:rPr>
+              <w:t xml:space="preserve">Da confermare</w:t>
+            </w:r>
+          </w:p>
+        </w:tc>
+      </w:tr>
     </w:tbl>
     <w:bookmarkEnd w:id="31"/>
     <w:bookmarkStart w:id="32" w:name="idee-per-il-futuro-da-confermare"/>
@@ -20041,19 +20978,18 @@
         <w:tc>
           <w:tcPr>
             <w:tcW w:type="dxa" w:w="2154"/>
-            <w:shd w:val="clear" w:color="auto" w:fill="E6EDF5"/>
-          </w:tcPr>
-          <w:p>
-            <w:pPr>
-              <w:pStyle w:val="Compact"/>
-              <w:spacing w:after="40"/>
-              <w:jc w:val="left"/>
-            </w:pPr>
-            <w:r>
-              <w:rPr>
-                <w:sz w:val="19"/>
-              </w:rPr>
-              <w:t xml:space="preserve">Da confermare</w:t>
+          </w:tcPr>
+          <w:p>
+            <w:pPr>
+              <w:pStyle w:val="Compact"/>
+              <w:spacing w:after="40"/>
+              <w:jc w:val="left"/>
+            </w:pPr>
+            <w:r>
+              <w:rPr>
+                <w:sz w:val="19"/>
+              </w:rPr>
+              <w:t xml:space="preserve">Da confermare (primo pezzo fatto il 27/10 con la maglia della settimana, R-245, assegnata dal server)</w:t>
             </w:r>
           </w:p>
         </w:tc>
@@ -20098,19 +21034,42 @@
         <w:tc>
           <w:tcPr>
             <w:tcW w:type="dxa" w:w="2154"/>
-            <w:shd w:val="clear" w:color="auto" w:fill="E6EDF5"/>
-          </w:tcPr>
-          <w:p>
-            <w:pPr>
-              <w:pStyle w:val="Compact"/>
-              <w:spacing w:after="40"/>
-              <w:jc w:val="left"/>
-            </w:pPr>
-            <w:r>
-              <w:rPr>
-                <w:sz w:val="19"/>
-              </w:rPr>
-              <w:t xml:space="preserve">Da confermare</w:t>
+          </w:tcPr>
+          <w:p>
+            <w:pPr>
+              <w:pStyle w:val="Compact"/>
+              <w:spacing w:after="40"/>
+              <w:jc w:val="left"/>
+            </w:pPr>
+            <w:r>
+              <w:rPr>
+                <w:sz w:val="19"/>
+              </w:rPr>
+              <w:t xml:space="preserve">Approvata 27/10 (</w:t>
+            </w:r>
+            <w:r>
+              <w:rPr>
+                <w:sz w:val="19"/>
+              </w:rPr>
+              <w:t xml:space="preserve">“</w:t>
+            </w:r>
+            <w:r>
+              <w:rPr>
+                <w:sz w:val="19"/>
+              </w:rPr>
+              <w:t xml:space="preserve">implementa quello che hanno i competitor</w:t>
+            </w:r>
+            <w:r>
+              <w:rPr>
+                <w:sz w:val="19"/>
+              </w:rPr>
+              <w:t xml:space="preserve">”</w:t>
+            </w:r>
+            <w:r>
+              <w:rPr>
+                <w:sz w:val="19"/>
+              </w:rPr>
+              <w:t xml:space="preserve">): ora è R-244 (modalità portale); la proposta su CrazyGames la fa Luigi (D-12)</w:t>
             </w:r>
           </w:p>
         </w:tc>
@@ -20988,6 +21947,117 @@
               <w:rPr>
                 <w:sz w:val="19"/>
               </w:rPr>
+              <w:t xml:space="preserve">D-12</w:t>
+            </w:r>
+          </w:p>
+        </w:tc>
+        <w:tc>
+          <w:tcPr>
+            <w:tcW w:type="dxa" w:w="6803"/>
+          </w:tcPr>
+          <w:p>
+            <w:pPr>
+              <w:pStyle w:val="Compact"/>
+              <w:spacing w:after="40"/>
+              <w:jc w:val="left"/>
+            </w:pPr>
+            <w:r>
+              <w:rPr>
+                <w:sz w:val="19"/>
+              </w:rPr>
+              <w:t xml:space="preserve">Proporre Pista Nera su CrazyGames (Basic Launch): account sviluppatore su developer.crazygames.com, gioco</w:t>
+            </w:r>
+            <w:r>
+              <w:rPr>
+                <w:sz w:val="19"/>
+              </w:rPr>
+              <w:t xml:space="preserve"> </w:t>
+            </w:r>
+            <w:r>
+              <w:rPr>
+                <w:sz w:val="19"/>
+              </w:rPr>
+              <w:t xml:space="preserve">“</w:t>
+            </w:r>
+            <w:r>
+              <w:rPr>
+                <w:sz w:val="19"/>
+              </w:rPr>
+              <w:t xml:space="preserve">hosted externally</w:t>
+            </w:r>
+            <w:r>
+              <w:rPr>
+                <w:sz w:val="19"/>
+              </w:rPr>
+              <w:t xml:space="preserve">”</w:t>
+            </w:r>
+            <w:r>
+              <w:rPr>
+                <w:sz w:val="19"/>
+              </w:rPr>
+              <w:t xml:space="preserve"> </w:t>
+            </w:r>
+            <w:r>
+              <w:rPr>
+                <w:sz w:val="19"/>
+              </w:rPr>
+              <w:t xml:space="preserve">con l’indirizzo</w:t>
+            </w:r>
+            <w:r>
+              <w:rPr>
+                <w:sz w:val="19"/>
+              </w:rPr>
+              <w:t xml:space="preserve"> </w:t>
+            </w:r>
+            <w:r>
+              <w:rPr>
+                <w:rStyle w:val="VerbatimChar"/>
+                <w:sz w:val="19"/>
+              </w:rPr>
+              <w:t xml:space="preserve">https://cyf-gaming.benedetta-davinci-mellum.workers.dev/pista-nera/?portale=crazygames</w:t>
+            </w:r>
+            <w:r>
+              <w:rPr>
+                <w:sz w:val="19"/>
+              </w:rPr>
+              <w:t xml:space="preserve">, orientamento orizzontale, PEGI 12, senza pubblicità. Serve la 0.22.0 online (R-244)</w:t>
+            </w:r>
+          </w:p>
+        </w:tc>
+        <w:tc>
+          <w:tcPr>
+            <w:tcW w:type="dxa" w:w="2154"/>
+          </w:tcPr>
+          <w:p>
+            <w:pPr>
+              <w:pStyle w:val="Compact"/>
+              <w:spacing w:after="40"/>
+              <w:jc w:val="left"/>
+            </w:pPr>
+            <w:r>
+              <w:rPr>
+                <w:sz w:val="19"/>
+              </w:rPr>
+              <w:t xml:space="preserve">Luigi, ~20 min</w:t>
+            </w:r>
+          </w:p>
+        </w:tc>
+      </w:tr>
+      <w:tr>
+        <w:tc>
+          <w:tcPr>
+            <w:tcW w:type="dxa" w:w="907"/>
+          </w:tcPr>
+          <w:p>
+            <w:pPr>
+              <w:pStyle w:val="Compact"/>
+              <w:spacing w:after="40"/>
+              <w:jc w:val="left"/>
+            </w:pPr>
+            <w:r>
+              <w:rPr>
+                <w:sz w:val="19"/>
+              </w:rPr>
               <w:t xml:space="preserve">D-07</w:t>
             </w:r>
           </w:p>
@@ -24710,62 +25780,6 @@
                 <w:sz w:val="19"/>
               </w:rPr>
               <w:t xml:space="preserve">Allenamento: 3 avversari con nomi, livelli e aspetti diversi che scendono vicino al rider; tornando al menu spariscono</w:t>
-            </w:r>
-          </w:p>
-        </w:tc>
-      </w:tr>
-      <w:tr>
-        <w:tc>
-          <w:tcPr>
-            <w:tcW w:type="dxa" w:w="1928"/>
-          </w:tcPr>
-          <w:p>
-            <w:pPr>
-              <w:pStyle w:val="Compact"/>
-              <w:spacing w:after="40"/>
-              <w:jc w:val="left"/>
-            </w:pPr>
-            <w:r>
-              <w:rPr>
-                <w:sz w:val="19"/>
-              </w:rPr>
-              <w:t xml:space="preserve">R-243</w:t>
-            </w:r>
-          </w:p>
-        </w:tc>
-        <w:tc>
-          <w:tcPr>
-            <w:tcW w:type="dxa" w:w="1474"/>
-          </w:tcPr>
-          <w:p>
-            <w:pPr>
-              <w:pStyle w:val="Compact"/>
-              <w:spacing w:after="40"/>
-              <w:jc w:val="left"/>
-            </w:pPr>
-            <w:r>
-              <w:rPr>
-                <w:sz w:val="19"/>
-              </w:rPr>
-              <w:t xml:space="preserve">Missioni: 3 obiettivi alla volta, come le missioni di Subway Surfers e gli obiettivi di Alto’s Odyssey, per avere un motivo per giocare anche da soli</w:t>
-            </w:r>
-          </w:p>
-        </w:tc>
-        <w:tc>
-          <w:tcPr>
-            <w:tcW w:type="dxa" w:w="6463"/>
-          </w:tcPr>
-          <w:p>
-            <w:pPr>
-              <w:pStyle w:val="Compact"/>
-              <w:spacing w:after="40"/>
-              <w:jc w:val="left"/>
-            </w:pPr>
-            <w:r>
-              <w:rPr>
-                <w:sz w:val="19"/>
-              </w:rPr>
-              <w:t xml:space="preserve">27/10/2026</w:t>
             </w:r>
           </w:p>
         </w:tc>
@@ -36429,7 +37443,7 @@
               <w:rPr>
                 <w:sz w:val="19"/>
               </w:rPr>
-              <w:t xml:space="preserve">Dalla 0.16.1. Il gioco, appena compare la prima immagine, manda al server una volta per pagina il codice anonimo del giocatore e il tempo di caricamento (niente nomi né dati personali; le prove locali non inviano). Su</w:t>
+              <w:t xml:space="preserve">Dalla 0.16.1 (dalla 0.24.0 anche da dove arrivano i giocatori: R-246). Il gioco, appena compare la prima immagine, manda al server una volta per pagina il codice anonimo del giocatore e il tempo di caricamento (niente nomi né dati personali; le prove locali non inviano). Su</w:t>
             </w:r>
             <w:r>
               <w:rPr>
@@ -38665,6 +39679,1809 @@
                 <w:sz w:val="19"/>
               </w:rPr>
               <w:t xml:space="preserve">Dalla 0.18.0. In allenamento corrono con te 3 avversari guidati dal software, che guidano, saltano, fanno acrobazie e cadono come in gara. Banane e bombe restano solo in gara. Siccome l’allenamento non ha un traguardo, gli avversari restano nei paraggi: se restano molto indietro accelerano un po’, se vanno troppo avanti rallentano</w:t>
+            </w:r>
+          </w:p>
+        </w:tc>
+      </w:tr>
+      <w:tr>
+        <w:tc>
+          <w:tcPr>
+            <w:tcW w:type="dxa" w:w="907"/>
+          </w:tcPr>
+          <w:p>
+            <w:pPr>
+              <w:pStyle w:val="Compact"/>
+              <w:spacing w:after="40"/>
+              <w:jc w:val="left"/>
+            </w:pPr>
+            <w:r>
+              <w:rPr>
+                <w:sz w:val="19"/>
+              </w:rPr>
+              <w:t xml:space="preserve">R-243</w:t>
+            </w:r>
+          </w:p>
+        </w:tc>
+        <w:tc>
+          <w:tcPr>
+            <w:tcW w:type="dxa" w:w="4195"/>
+          </w:tcPr>
+          <w:p>
+            <w:pPr>
+              <w:pStyle w:val="Compact"/>
+              <w:spacing w:after="40"/>
+              <w:jc w:val="left"/>
+            </w:pPr>
+            <w:r>
+              <w:rPr>
+                <w:sz w:val="19"/>
+              </w:rPr>
+              <w:t xml:space="preserve">Missioni: 3 obiettivi alla volta, come le missioni di Subway Surfers e gli obiettivi di Alto’s Odyssey, per avere un motivo per giocare anche da soli</w:t>
+            </w:r>
+          </w:p>
+        </w:tc>
+        <w:tc>
+          <w:tcPr>
+            <w:tcW w:type="dxa" w:w="1134"/>
+          </w:tcPr>
+          <w:p>
+            <w:pPr>
+              <w:pStyle w:val="Compact"/>
+              <w:spacing w:after="40"/>
+              <w:jc w:val="left"/>
+            </w:pPr>
+            <w:r>
+              <w:rPr>
+                <w:sz w:val="19"/>
+              </w:rPr>
+              <w:t xml:space="preserve">27/10/2026</w:t>
+            </w:r>
+          </w:p>
+        </w:tc>
+        <w:tc>
+          <w:tcPr>
+            <w:tcW w:type="dxa" w:w="1134"/>
+            <w:shd w:val="clear" w:color="auto" w:fill="FFF1C7"/>
+          </w:tcPr>
+          <w:p>
+            <w:pPr>
+              <w:pStyle w:val="Compact"/>
+              <w:spacing w:after="40"/>
+              <w:jc w:val="left"/>
+            </w:pPr>
+            <w:r>
+              <w:rPr>
+                <w:sz w:val="19"/>
+              </w:rPr>
+              <w:t xml:space="preserve">In corso</w:t>
+            </w:r>
+          </w:p>
+        </w:tc>
+        <w:tc>
+          <w:tcPr>
+            <w:tcW w:type="dxa" w:w="2494"/>
+          </w:tcPr>
+          <w:p>
+            <w:pPr>
+              <w:pStyle w:val="Compact"/>
+              <w:spacing w:after="40"/>
+              <w:jc w:val="left"/>
+            </w:pPr>
+            <w:r>
+              <w:rPr>
+                <w:sz w:val="19"/>
+              </w:rPr>
+              <w:t xml:space="preserve">Scritto il 27/10 per la 0.21.0 (ramo</w:t>
+            </w:r>
+            <w:r>
+              <w:rPr>
+                <w:sz w:val="19"/>
+              </w:rPr>
+              <w:t xml:space="preserve"> </w:t>
+            </w:r>
+            <w:r>
+              <w:rPr>
+                <w:rStyle w:val="VerbatimChar"/>
+                <w:sz w:val="19"/>
+              </w:rPr>
+              <w:t xml:space="preserve">giorno/batti-missioni</w:t>
+            </w:r>
+            <w:r>
+              <w:rPr>
+                <w:sz w:val="19"/>
+              </w:rPr>
+              <w:t xml:space="preserve">, online dopo le prove della notte). Nel menu, sotto la pista del giorno, il riquadro</w:t>
+            </w:r>
+            <w:r>
+              <w:rPr>
+                <w:sz w:val="19"/>
+              </w:rPr>
+              <w:t xml:space="preserve"> </w:t>
+            </w:r>
+            <w:r>
+              <w:rPr>
+                <w:bCs/>
+                <w:b/>
+                <w:sz w:val="19"/>
+              </w:rPr>
+              <w:t xml:space="preserve">🎯 Missioni · ⭐ 7</w:t>
+            </w:r>
+            <w:r>
+              <w:rPr>
+                <w:sz w:val="19"/>
+              </w:rPr>
+              <w:t xml:space="preserve"> </w:t>
+            </w:r>
+            <w:r>
+              <w:rPr>
+                <w:sz w:val="19"/>
+              </w:rPr>
+              <w:t xml:space="preserve">con 3 obiettivi e una barra di avanzamento per ognuno, per esempio</w:t>
+            </w:r>
+            <w:r>
+              <w:rPr>
+                <w:sz w:val="19"/>
+              </w:rPr>
+              <w:t xml:space="preserve"> </w:t>
+            </w:r>
+            <w:r>
+              <w:rPr>
+                <w:sz w:val="19"/>
+              </w:rPr>
+              <w:t xml:space="preserve">“</w:t>
+            </w:r>
+            <w:r>
+              <w:rPr>
+                <w:sz w:val="19"/>
+              </w:rPr>
+              <w:t xml:space="preserve">Fai 3 salti mortali (1/3)</w:t>
+            </w:r>
+            <w:r>
+              <w:rPr>
+                <w:sz w:val="19"/>
+              </w:rPr>
+              <w:t xml:space="preserve">”</w:t>
+            </w:r>
+            <w:r>
+              <w:rPr>
+                <w:sz w:val="19"/>
+              </w:rPr>
+              <w:t xml:space="preserve">,</w:t>
+            </w:r>
+            <w:r>
+              <w:rPr>
+                <w:sz w:val="19"/>
+              </w:rPr>
+              <w:t xml:space="preserve"> </w:t>
+            </w:r>
+            <w:r>
+              <w:rPr>
+                <w:sz w:val="19"/>
+              </w:rPr>
+              <w:t xml:space="preserve">“</w:t>
+            </w:r>
+            <w:r>
+              <w:rPr>
+                <w:sz w:val="19"/>
+              </w:rPr>
+              <w:t xml:space="preserve">Passa 10 porte (4/10)</w:t>
+            </w:r>
+            <w:r>
+              <w:rPr>
+                <w:sz w:val="19"/>
+              </w:rPr>
+              <w:t xml:space="preserve">”</w:t>
+            </w:r>
+            <w:r>
+              <w:rPr>
+                <w:sz w:val="19"/>
+              </w:rPr>
+              <w:t xml:space="preserve">,</w:t>
+            </w:r>
+            <w:r>
+              <w:rPr>
+                <w:sz w:val="19"/>
+              </w:rPr>
+              <w:t xml:space="preserve"> </w:t>
+            </w:r>
+            <w:r>
+              <w:rPr>
+                <w:sz w:val="19"/>
+              </w:rPr>
+              <w:t xml:space="preserve">“</w:t>
+            </w:r>
+            <w:r>
+              <w:rPr>
+                <w:sz w:val="19"/>
+              </w:rPr>
+              <w:t xml:space="preserve">Finisci la pista del giorno</w:t>
+            </w:r>
+            <w:r>
+              <w:rPr>
+                <w:sz w:val="19"/>
+              </w:rPr>
+              <w:t xml:space="preserve">”</w:t>
+            </w:r>
+            <w:r>
+              <w:rPr>
+                <w:sz w:val="19"/>
+              </w:rPr>
+              <w:t xml:space="preserve">. Valgono in allenamento, nella pista del giorno, nella sfida e nella sala online, in tutte le città. Quando un obiettivo è raggiunto compare</w:t>
+            </w:r>
+            <w:r>
+              <w:rPr>
+                <w:sz w:val="19"/>
+              </w:rPr>
+              <w:t xml:space="preserve"> </w:t>
+            </w:r>
+            <w:r>
+              <w:rPr>
+                <w:sz w:val="19"/>
+              </w:rPr>
+              <w:t xml:space="preserve">“</w:t>
+            </w:r>
+            <w:r>
+              <w:rPr>
+                <w:sz w:val="19"/>
+              </w:rPr>
+              <w:t xml:space="preserve">⭐ Missione compiuta: …</w:t>
+            </w:r>
+            <w:r>
+              <w:rPr>
+                <w:sz w:val="19"/>
+              </w:rPr>
+              <w:t xml:space="preserve">”</w:t>
+            </w:r>
+            <w:r>
+              <w:rPr>
+                <w:sz w:val="19"/>
+              </w:rPr>
+              <w:t xml:space="preserve">, si guadagna una</w:t>
+            </w:r>
+            <w:r>
+              <w:rPr>
+                <w:sz w:val="19"/>
+              </w:rPr>
+              <w:t xml:space="preserve"> </w:t>
+            </w:r>
+            <w:r>
+              <w:rPr>
+                <w:bCs/>
+                <w:b/>
+                <w:sz w:val="19"/>
+              </w:rPr>
+              <w:t xml:space="preserve">stella</w:t>
+            </w:r>
+            <w:r>
+              <w:rPr>
+                <w:sz w:val="19"/>
+              </w:rPr>
+              <w:t xml:space="preserve"> </w:t>
+            </w:r>
+            <w:r>
+              <w:rPr>
+                <w:sz w:val="19"/>
+              </w:rPr>
+              <w:t xml:space="preserve">e al suo posto arriva subito un obiettivo nuovo di un altro tipo. Tipi (27 obiettivi): salti mortali (1, 3, 5), rotazioni di 360°, 540° e 720° in un salto, prese della tavola (3, 8), due acrobazie in un salto (1, 3), porte (10, 25), serie di porte di fila (5, 8), bonus raccolti (20, 50), trampolini giganti (1, 3), chilometri (3, 8), velocità di 70 e 78 km/h, gare finite (1, 3), podio in gara con almeno un altro corridore, pista del giorno finita, gara finita senza cadere. Le stelle e gli obiettivi in corso restano sul dispositivo e nel profilo con il codice personale (R-226), quindi si ritrovano su un altro telefono. Le stelle per ora non danno punti né premi: vedi S-45</w:t>
+            </w:r>
+          </w:p>
+        </w:tc>
+      </w:tr>
+      <w:tr>
+        <w:tc>
+          <w:tcPr>
+            <w:tcW w:type="dxa" w:w="907"/>
+          </w:tcPr>
+          <w:p>
+            <w:pPr>
+              <w:pStyle w:val="Compact"/>
+              <w:spacing w:after="40"/>
+              <w:jc w:val="left"/>
+            </w:pPr>
+            <w:r>
+              <w:rPr>
+                <w:sz w:val="19"/>
+              </w:rPr>
+              <w:t xml:space="preserve">R-244</w:t>
+            </w:r>
+          </w:p>
+        </w:tc>
+        <w:tc>
+          <w:tcPr>
+            <w:tcW w:type="dxa" w:w="4195"/>
+          </w:tcPr>
+          <w:p>
+            <w:pPr>
+              <w:pStyle w:val="Compact"/>
+              <w:spacing w:after="40"/>
+              <w:jc w:val="left"/>
+            </w:pPr>
+            <w:r>
+              <w:rPr>
+                <w:sz w:val="19"/>
+              </w:rPr>
+              <w:t xml:space="preserve">Pronti per i portali di giochi nel browser (CrazyGames, Poki): il gioco deve funzionare dentro la pagina del portale, senza link verso l’esterno, senza donazioni, con i vocali spegnibili e adatto ai 12 anni (PEGI 12)</w:t>
+            </w:r>
+          </w:p>
+        </w:tc>
+        <w:tc>
+          <w:tcPr>
+            <w:tcW w:type="dxa" w:w="1134"/>
+          </w:tcPr>
+          <w:p>
+            <w:pPr>
+              <w:pStyle w:val="Compact"/>
+              <w:spacing w:after="40"/>
+              <w:jc w:val="left"/>
+            </w:pPr>
+            <w:r>
+              <w:rPr>
+                <w:sz w:val="19"/>
+              </w:rPr>
+              <w:t xml:space="preserve">27/10/2026</w:t>
+            </w:r>
+          </w:p>
+        </w:tc>
+        <w:tc>
+          <w:tcPr>
+            <w:tcW w:type="dxa" w:w="1134"/>
+            <w:shd w:val="clear" w:color="auto" w:fill="FFF1C7"/>
+          </w:tcPr>
+          <w:p>
+            <w:pPr>
+              <w:pStyle w:val="Compact"/>
+              <w:spacing w:after="40"/>
+              <w:jc w:val="left"/>
+            </w:pPr>
+            <w:r>
+              <w:rPr>
+                <w:sz w:val="19"/>
+              </w:rPr>
+              <w:t xml:space="preserve">In corso</w:t>
+            </w:r>
+          </w:p>
+        </w:tc>
+        <w:tc>
+          <w:tcPr>
+            <w:tcW w:type="dxa" w:w="2494"/>
+          </w:tcPr>
+          <w:p>
+            <w:pPr>
+              <w:pStyle w:val="Compact"/>
+              <w:spacing w:after="40"/>
+              <w:jc w:val="left"/>
+            </w:pPr>
+            <w:r>
+              <w:rPr>
+                <w:sz w:val="19"/>
+              </w:rPr>
+              <w:t xml:space="preserve">Scritto il 27/10 per la 0.22.0 (ramo</w:t>
+            </w:r>
+            <w:r>
+              <w:rPr>
+                <w:sz w:val="19"/>
+              </w:rPr>
+              <w:t xml:space="preserve"> </w:t>
+            </w:r>
+            <w:r>
+              <w:rPr>
+                <w:rStyle w:val="VerbatimChar"/>
+                <w:sz w:val="19"/>
+              </w:rPr>
+              <w:t xml:space="preserve">giorno/portale-settimana</w:t>
+            </w:r>
+            <w:r>
+              <w:rPr>
+                <w:sz w:val="19"/>
+              </w:rPr>
+              <w:t xml:space="preserve">, online dopo le prove della notte). Si approva così F-15, primo passo (</w:t>
+            </w:r>
+            <w:r>
+              <w:rPr>
+                <w:sz w:val="19"/>
+              </w:rPr>
+              <w:t xml:space="preserve">“</w:t>
+            </w:r>
+            <w:r>
+              <w:rPr>
+                <w:sz w:val="19"/>
+              </w:rPr>
+              <w:t xml:space="preserve">Basic Launch</w:t>
+            </w:r>
+            <w:r>
+              <w:rPr>
+                <w:sz w:val="19"/>
+              </w:rPr>
+              <w:t xml:space="preserve">”</w:t>
+            </w:r>
+            <w:r>
+              <w:rPr>
+                <w:sz w:val="19"/>
+              </w:rPr>
+              <w:t xml:space="preserve"> </w:t>
+            </w:r>
+            <w:r>
+              <w:rPr>
+                <w:sz w:val="19"/>
+              </w:rPr>
+              <w:t xml:space="preserve">di CrazyGames: senza il loro SDK e senza pubblicità, il gioco resta sul nostro sito e il portale lo apre in un riquadro).</w:t>
+            </w:r>
+            <w:r>
+              <w:rPr>
+                <w:sz w:val="19"/>
+              </w:rPr>
+              <w:t xml:space="preserve"> </w:t>
+            </w:r>
+            <w:r>
+              <w:rPr>
+                <w:bCs/>
+                <w:b/>
+                <w:sz w:val="19"/>
+              </w:rPr>
+              <w:t xml:space="preserve">Modalità portale</w:t>
+            </w:r>
+            <w:r>
+              <w:rPr>
+                <w:sz w:val="19"/>
+              </w:rPr>
+              <w:t xml:space="preserve">: si accende aprendo il gioco con</w:t>
+            </w:r>
+            <w:r>
+              <w:rPr>
+                <w:sz w:val="19"/>
+              </w:rPr>
+              <w:t xml:space="preserve"> </w:t>
+            </w:r>
+            <w:r>
+              <w:rPr>
+                <w:rStyle w:val="VerbatimChar"/>
+                <w:sz w:val="19"/>
+              </w:rPr>
+              <w:t xml:space="preserve">?portale=crazygames</w:t>
+            </w:r>
+            <w:r>
+              <w:rPr>
+                <w:sz w:val="19"/>
+              </w:rPr>
+              <w:t xml:space="preserve"> </w:t>
+            </w:r>
+            <w:r>
+              <w:rPr>
+                <w:sz w:val="19"/>
+              </w:rPr>
+              <w:t xml:space="preserve">(o</w:t>
+            </w:r>
+            <w:r>
+              <w:rPr>
+                <w:sz w:val="19"/>
+              </w:rPr>
+              <w:t xml:space="preserve"> </w:t>
+            </w:r>
+            <w:r>
+              <w:rPr>
+                <w:rStyle w:val="VerbatimChar"/>
+                <w:sz w:val="19"/>
+              </w:rPr>
+              <w:t xml:space="preserve">poki</w:t>
+            </w:r>
+            <w:r>
+              <w:rPr>
+                <w:sz w:val="19"/>
+              </w:rPr>
+              <w:t xml:space="preserve">), l’indirizzo che si dà al portale; resta accesa per tutta la visita anche se l’indirizzo cambia (sfida, pista del giorno), e il gioco la riconosce anche quando è aperto nel riquadro di CrazyGames senza il parametro. In modalità portale: niente pulsante delle donazioni, il titolo</w:t>
+            </w:r>
+            <w:r>
+              <w:rPr>
+                <w:sz w:val="19"/>
+              </w:rPr>
+              <w:t xml:space="preserve"> </w:t>
+            </w:r>
+            <w:r>
+              <w:rPr>
+                <w:sz w:val="19"/>
+              </w:rPr>
+              <w:t xml:space="preserve">“</w:t>
+            </w:r>
+            <w:r>
+              <w:rPr>
+                <w:sz w:val="19"/>
+              </w:rPr>
+              <w:t xml:space="preserve">C-Y-F Gaming</w:t>
+            </w:r>
+            <w:r>
+              <w:rPr>
+                <w:sz w:val="19"/>
+              </w:rPr>
+              <w:t xml:space="preserve">”</w:t>
+            </w:r>
+            <w:r>
+              <w:rPr>
+                <w:sz w:val="19"/>
+              </w:rPr>
+              <w:t xml:space="preserve"> </w:t>
+            </w:r>
+            <w:r>
+              <w:rPr>
+                <w:sz w:val="19"/>
+              </w:rPr>
+              <w:t xml:space="preserve">non è più un link alla home, nella stanza della sfida ci sono il codice e</w:t>
+            </w:r>
+            <w:r>
+              <w:rPr>
+                <w:sz w:val="19"/>
+              </w:rPr>
+              <w:t xml:space="preserve"> </w:t>
+            </w:r>
+            <w:r>
+              <w:rPr>
+                <w:bCs/>
+                <w:b/>
+                <w:sz w:val="19"/>
+              </w:rPr>
+              <w:t xml:space="preserve">Copia il codice</w:t>
+            </w:r>
+            <w:r>
+              <w:rPr>
+                <w:sz w:val="19"/>
+              </w:rPr>
+              <w:t xml:space="preserve"> </w:t>
+            </w:r>
+            <w:r>
+              <w:rPr>
+                <w:sz w:val="19"/>
+              </w:rPr>
+              <w:t xml:space="preserve">ma non il link né i pulsanti WhatsApp e Telegram (gli amici sul portale entrano con il codice), e i testi da condividere dicono</w:t>
+            </w:r>
+            <w:r>
+              <w:rPr>
+                <w:sz w:val="19"/>
+              </w:rPr>
+              <w:t xml:space="preserve"> </w:t>
+            </w:r>
+            <w:r>
+              <w:rPr>
+                <w:sz w:val="19"/>
+              </w:rPr>
+              <w:t xml:space="preserve">“</w:t>
+            </w:r>
+            <w:r>
+              <w:rPr>
+                <w:sz w:val="19"/>
+              </w:rPr>
+              <w:t xml:space="preserve">su CrazyGames</w:t>
+            </w:r>
+            <w:r>
+              <w:rPr>
+                <w:sz w:val="19"/>
+              </w:rPr>
+              <w:t xml:space="preserve">”</w:t>
+            </w:r>
+            <w:r>
+              <w:rPr>
+                <w:sz w:val="19"/>
+              </w:rPr>
+              <w:t xml:space="preserve"> </w:t>
+            </w:r>
+            <w:r>
+              <w:rPr>
+                <w:sz w:val="19"/>
+              </w:rPr>
+              <w:t xml:space="preserve">invece del link. I</w:t>
+            </w:r>
+            <w:r>
+              <w:rPr>
+                <w:sz w:val="19"/>
+              </w:rPr>
+              <w:t xml:space="preserve"> </w:t>
+            </w:r>
+            <w:r>
+              <w:rPr>
+                <w:bCs/>
+                <w:b/>
+                <w:sz w:val="19"/>
+              </w:rPr>
+              <w:t xml:space="preserve">messaggi vocali</w:t>
+            </w:r>
+            <w:r>
+              <w:rPr>
+                <w:sz w:val="19"/>
+              </w:rPr>
+              <w:t xml:space="preserve"> </w:t>
+            </w:r>
+            <w:r>
+              <w:rPr>
+                <w:sz w:val="19"/>
+              </w:rPr>
+              <w:t xml:space="preserve">si possono spegnere da chiunque, con la casella</w:t>
+            </w:r>
+            <w:r>
+              <w:rPr>
+                <w:sz w:val="19"/>
+              </w:rPr>
+              <w:t xml:space="preserve"> </w:t>
+            </w:r>
+            <w:r>
+              <w:rPr>
+                <w:sz w:val="19"/>
+              </w:rPr>
+              <w:t xml:space="preserve">“</w:t>
+            </w:r>
+            <w:r>
+              <w:rPr>
+                <w:sz w:val="19"/>
+              </w:rPr>
+              <w:t xml:space="preserve">Messaggi vocali</w:t>
+            </w:r>
+            <w:r>
+              <w:rPr>
+                <w:sz w:val="19"/>
+              </w:rPr>
+              <w:t xml:space="preserve">”</w:t>
+            </w:r>
+            <w:r>
+              <w:rPr>
+                <w:sz w:val="19"/>
+              </w:rPr>
+              <w:t xml:space="preserve"> </w:t>
+            </w:r>
+            <w:r>
+              <w:rPr>
+                <w:sz w:val="19"/>
+              </w:rPr>
+              <w:t xml:space="preserve">nel menu sotto i comandi: spenti, il microfono non c’è e i vocali degli altri non si sentono; sul portale partono spenti (chat con sconosciuti e pubblico dai 12 anni), altrove accesi come oggi. Requisiti tecnici di CrazyGames già rispettati o sistemati: peso iniziale sotto i 50 MB (siamo a ~1,2 MB più Three.js), pagina leggibile nel riquadro 907×510 e sul telefono, schermo intero gestito dal portale (nessun nostro pulsante), audio che riparte al tocco su iPhone, niente lente d’ingrandimento sul testo toccando la pista. Il nome del portale finisce nelle misure come fonte della visita (R-246). Scelte S-46.</w:t>
+            </w:r>
+            <w:r>
+              <w:rPr>
+                <w:sz w:val="19"/>
+              </w:rPr>
+              <w:t xml:space="preserve"> </w:t>
+            </w:r>
+            <w:r>
+              <w:rPr>
+                <w:bCs/>
+                <w:b/>
+                <w:sz w:val="19"/>
+              </w:rPr>
+              <w:t xml:space="preserve">Resta a Luigi</w:t>
+            </w:r>
+            <w:r>
+              <w:rPr>
+                <w:sz w:val="19"/>
+              </w:rPr>
+              <w:t xml:space="preserve"> </w:t>
+            </w:r>
+            <w:r>
+              <w:rPr>
+                <w:sz w:val="19"/>
+              </w:rPr>
+              <w:t xml:space="preserve">(D-12): aprire l’account sviluppatore su CrazyGames e proporre il gioco con l’indirizzo</w:t>
+            </w:r>
+            <w:r>
+              <w:rPr>
+                <w:sz w:val="19"/>
+              </w:rPr>
+              <w:t xml:space="preserve"> </w:t>
+            </w:r>
+            <w:r>
+              <w:rPr>
+                <w:rStyle w:val="VerbatimChar"/>
+                <w:sz w:val="19"/>
+              </w:rPr>
+              <w:t xml:space="preserve">https://cyf-gaming.benedetta-davinci-mellum.workers.dev/pista-nera/?portale=crazygames</w:t>
+            </w:r>
+            <w:r>
+              <w:rPr>
+                <w:sz w:val="19"/>
+              </w:rPr>
+              <w:t xml:space="preserve">, orientamento orizzontale, PEGI 12</w:t>
+            </w:r>
+          </w:p>
+        </w:tc>
+      </w:tr>
+      <w:tr>
+        <w:tc>
+          <w:tcPr>
+            <w:tcW w:type="dxa" w:w="907"/>
+          </w:tcPr>
+          <w:p>
+            <w:pPr>
+              <w:pStyle w:val="Compact"/>
+              <w:spacing w:after="40"/>
+              <w:jc w:val="left"/>
+            </w:pPr>
+            <w:r>
+              <w:rPr>
+                <w:sz w:val="19"/>
+              </w:rPr>
+              <w:t xml:space="preserve">R-245</w:t>
+            </w:r>
+          </w:p>
+        </w:tc>
+        <w:tc>
+          <w:tcPr>
+            <w:tcW w:type="dxa" w:w="4195"/>
+          </w:tcPr>
+          <w:p>
+            <w:pPr>
+              <w:pStyle w:val="Compact"/>
+              <w:spacing w:after="40"/>
+              <w:jc w:val="left"/>
+            </w:pPr>
+            <w:r>
+              <w:rPr>
+                <w:sz w:val="19"/>
+              </w:rPr>
+              <w:t xml:space="preserve">Città della settimana con un premio a tempo: ogni settimana una città in evidenza; chi finisce una gara in quella città vince una maglia esclusiva che si può ottenere solo in quella settimana (solo estetica, niente vantaggi in gara), come il</w:t>
+            </w:r>
+            <w:r>
+              <w:rPr>
+                <w:sz w:val="19"/>
+              </w:rPr>
+              <w:t xml:space="preserve"> </w:t>
+            </w:r>
+            <w:r>
+              <w:rPr>
+                <w:sz w:val="19"/>
+              </w:rPr>
+              <w:t xml:space="preserve">“</w:t>
+            </w:r>
+            <w:r>
+              <w:rPr>
+                <w:sz w:val="19"/>
+              </w:rPr>
+              <w:t xml:space="preserve">World Tour</w:t>
+            </w:r>
+            <w:r>
+              <w:rPr>
+                <w:sz w:val="19"/>
+              </w:rPr>
+              <w:t xml:space="preserve">”</w:t>
+            </w:r>
+            <w:r>
+              <w:rPr>
+                <w:sz w:val="19"/>
+              </w:rPr>
+              <w:t xml:space="preserve"> </w:t>
+            </w:r>
+            <w:r>
+              <w:rPr>
+                <w:sz w:val="19"/>
+              </w:rPr>
+              <w:t xml:space="preserve">di Subway Surfers</w:t>
+            </w:r>
+          </w:p>
+        </w:tc>
+        <w:tc>
+          <w:tcPr>
+            <w:tcW w:type="dxa" w:w="1134"/>
+          </w:tcPr>
+          <w:p>
+            <w:pPr>
+              <w:pStyle w:val="Compact"/>
+              <w:spacing w:after="40"/>
+              <w:jc w:val="left"/>
+            </w:pPr>
+            <w:r>
+              <w:rPr>
+                <w:sz w:val="19"/>
+              </w:rPr>
+              <w:t xml:space="preserve">27/10/2026</w:t>
+            </w:r>
+          </w:p>
+        </w:tc>
+        <w:tc>
+          <w:tcPr>
+            <w:tcW w:type="dxa" w:w="1134"/>
+            <w:shd w:val="clear" w:color="auto" w:fill="FFF1C7"/>
+          </w:tcPr>
+          <w:p>
+            <w:pPr>
+              <w:pStyle w:val="Compact"/>
+              <w:spacing w:after="40"/>
+              <w:jc w:val="left"/>
+            </w:pPr>
+            <w:r>
+              <w:rPr>
+                <w:sz w:val="19"/>
+              </w:rPr>
+              <w:t xml:space="preserve">In corso</w:t>
+            </w:r>
+          </w:p>
+        </w:tc>
+        <w:tc>
+          <w:tcPr>
+            <w:tcW w:type="dxa" w:w="2494"/>
+          </w:tcPr>
+          <w:p>
+            <w:pPr>
+              <w:pStyle w:val="Compact"/>
+              <w:spacing w:after="40"/>
+              <w:jc w:val="left"/>
+            </w:pPr>
+            <w:r>
+              <w:rPr>
+                <w:sz w:val="19"/>
+              </w:rPr>
+              <w:t xml:space="preserve">Scritto il 27/10 per la 0.23.0 (ramo</w:t>
+            </w:r>
+            <w:r>
+              <w:rPr>
+                <w:sz w:val="19"/>
+              </w:rPr>
+              <w:t xml:space="preserve"> </w:t>
+            </w:r>
+            <w:r>
+              <w:rPr>
+                <w:rStyle w:val="VerbatimChar"/>
+                <w:sz w:val="19"/>
+              </w:rPr>
+              <w:t xml:space="preserve">giorno/portale-settimana</w:t>
+            </w:r>
+            <w:r>
+              <w:rPr>
+                <w:sz w:val="19"/>
+              </w:rPr>
+              <w:t xml:space="preserve">). Nel menu, sotto la pista del giorno, il riquadro</w:t>
+            </w:r>
+            <w:r>
+              <w:rPr>
+                <w:sz w:val="19"/>
+              </w:rPr>
+              <w:t xml:space="preserve"> </w:t>
+            </w:r>
+            <w:r>
+              <w:rPr>
+                <w:bCs/>
+                <w:b/>
+                <w:sz w:val="19"/>
+              </w:rPr>
+              <w:t xml:space="preserve">🏙️ Città della settimana #N · Roma</w:t>
+            </w:r>
+            <w:r>
+              <w:rPr>
+                <w:sz w:val="19"/>
+              </w:rPr>
+              <w:t xml:space="preserve"> </w:t>
+            </w:r>
+            <w:r>
+              <w:rPr>
+                <w:sz w:val="19"/>
+              </w:rPr>
+              <w:t xml:space="preserve">con</w:t>
+            </w:r>
+            <w:r>
+              <w:rPr>
+                <w:sz w:val="19"/>
+              </w:rPr>
+              <w:t xml:space="preserve"> </w:t>
+            </w:r>
+            <w:r>
+              <w:rPr>
+                <w:sz w:val="19"/>
+              </w:rPr>
+              <w:t xml:space="preserve">“</w:t>
+            </w:r>
+            <w:r>
+              <w:rPr>
+                <w:sz w:val="19"/>
+              </w:rPr>
+              <w:t xml:space="preserve">fino a domenica 1/11</w:t>
+            </w:r>
+            <w:r>
+              <w:rPr>
+                <w:sz w:val="19"/>
+              </w:rPr>
+              <w:t xml:space="preserve">”</w:t>
+            </w:r>
+            <w:r>
+              <w:rPr>
+                <w:sz w:val="19"/>
+              </w:rPr>
+              <w:t xml:space="preserve">, il premio (</w:t>
+            </w:r>
+            <w:r>
+              <w:rPr>
+                <w:sz w:val="19"/>
+              </w:rPr>
+              <w:t xml:space="preserve">“</w:t>
+            </w:r>
+            <w:r>
+              <w:rPr>
+                <w:sz w:val="19"/>
+              </w:rPr>
+              <w:t xml:space="preserve">Finisci una gara a Roma entro domenica: maglia esclusiva #N</w:t>
+            </w:r>
+            <w:r>
+              <w:rPr>
+                <w:sz w:val="19"/>
+              </w:rPr>
+              <w:t xml:space="preserve">”</w:t>
+            </w:r>
+            <w:r>
+              <w:rPr>
+                <w:sz w:val="19"/>
+              </w:rPr>
+              <w:t xml:space="preserve">) e il pulsante</w:t>
+            </w:r>
+            <w:r>
+              <w:rPr>
+                <w:sz w:val="19"/>
+              </w:rPr>
+              <w:t xml:space="preserve"> </w:t>
+            </w:r>
+            <w:r>
+              <w:rPr>
+                <w:bCs/>
+                <w:b/>
+                <w:sz w:val="19"/>
+              </w:rPr>
+              <w:t xml:space="preserve">Corri a Roma</w:t>
+            </w:r>
+            <w:r>
+              <w:rPr>
+                <w:sz w:val="19"/>
+              </w:rPr>
+              <w:t xml:space="preserve">, che mette Roma come città del menu (sfida, sala online, allenamento). La settimana va da lunedì a domenica, ora italiana; la #1 è quella del 26/10/2026 e le città girano in 13 settimane in un ordine fisso diverso da quello della pista del giorno (S-47).</w:t>
+            </w:r>
+            <w:r>
+              <w:rPr>
+                <w:sz w:val="19"/>
+              </w:rPr>
+              <w:t xml:space="preserve"> </w:t>
+            </w:r>
+            <w:r>
+              <w:rPr>
+                <w:bCs/>
+                <w:b/>
+                <w:sz w:val="19"/>
+              </w:rPr>
+              <w:t xml:space="preserve">Vale una gara finita</w:t>
+            </w:r>
+            <w:r>
+              <w:rPr>
+                <w:sz w:val="19"/>
+              </w:rPr>
+              <w:t xml:space="preserve"> </w:t>
+            </w:r>
+            <w:r>
+              <w:rPr>
+                <w:sz w:val="19"/>
+              </w:rPr>
+              <w:t xml:space="preserve">(arrivo valido, tempo misurato dal server) in quella città in sfida, sala online o pista del giorno, nella settimana in cui si corre; l’allenamento non conta.</w:t>
+            </w:r>
+            <w:r>
+              <w:rPr>
+                <w:sz w:val="19"/>
+              </w:rPr>
+              <w:t xml:space="preserve"> </w:t>
+            </w:r>
+            <w:r>
+              <w:rPr>
+                <w:bCs/>
+                <w:b/>
+                <w:sz w:val="19"/>
+              </w:rPr>
+              <w:t xml:space="preserve">Il premio lo assegna il server</w:t>
+            </w:r>
+            <w:r>
+              <w:rPr>
+                <w:sz w:val="19"/>
+              </w:rPr>
+              <w:t xml:space="preserve">, che lo ricorda legato al giocatore (anche su un altro dispositivo con il codice personale, R-226): a fine gara compare</w:t>
+            </w:r>
+            <w:r>
+              <w:rPr>
+                <w:sz w:val="19"/>
+              </w:rPr>
+              <w:t xml:space="preserve"> </w:t>
+            </w:r>
+            <w:r>
+              <w:rPr>
+                <w:sz w:val="19"/>
+              </w:rPr>
+              <w:t xml:space="preserve">“</w:t>
+            </w:r>
+            <w:r>
+              <w:rPr>
+                <w:sz w:val="19"/>
+              </w:rPr>
+              <w:t xml:space="preserve">🎽 Maglia della settimana #N vinta: Roma!</w:t>
+            </w:r>
+            <w:r>
+              <w:rPr>
+                <w:sz w:val="19"/>
+              </w:rPr>
+              <w:t xml:space="preserve">”</w:t>
+            </w:r>
+            <w:r>
+              <w:rPr>
+                <w:sz w:val="19"/>
+              </w:rPr>
+              <w:t xml:space="preserve"> </w:t>
+            </w:r>
+            <w:r>
+              <w:rPr>
+                <w:sz w:val="19"/>
+              </w:rPr>
+              <w:t xml:space="preserve">e in</w:t>
+            </w:r>
+            <w:r>
+              <w:rPr>
+                <w:sz w:val="19"/>
+              </w:rPr>
+              <w:t xml:space="preserve"> </w:t>
+            </w:r>
+            <w:r>
+              <w:rPr>
+                <w:sz w:val="19"/>
+              </w:rPr>
+              <w:t xml:space="preserve">“</w:t>
+            </w:r>
+            <w:r>
+              <w:rPr>
+                <w:sz w:val="19"/>
+              </w:rPr>
+              <w:t xml:space="preserve">Modifica il personaggio</w:t>
+            </w:r>
+            <w:r>
+              <w:rPr>
+                <w:sz w:val="19"/>
+              </w:rPr>
+              <w:t xml:space="preserve">”</w:t>
+            </w:r>
+            <w:r>
+              <w:rPr>
+                <w:sz w:val="19"/>
+              </w:rPr>
+              <w:t xml:space="preserve"> </w:t>
+            </w:r>
+            <w:r>
+              <w:rPr>
+                <w:sz w:val="19"/>
+              </w:rPr>
+              <w:t xml:space="preserve">si trova il gruppo</w:t>
+            </w:r>
+            <w:r>
+              <w:rPr>
+                <w:sz w:val="19"/>
+              </w:rPr>
+              <w:t xml:space="preserve"> </w:t>
+            </w:r>
+            <w:r>
+              <w:rPr>
+                <w:bCs/>
+                <w:b/>
+                <w:sz w:val="19"/>
+              </w:rPr>
+              <w:t xml:space="preserve">Maglie della settimana</w:t>
+            </w:r>
+            <w:r>
+              <w:rPr>
+                <w:sz w:val="19"/>
+              </w:rPr>
+              <w:t xml:space="preserve">, con le maglie vinte. La maglia: colori della città, fascia con il nome della città e il numero della settimana sulla schiena e sul petto, stemma CYF come tutte; gli altri giocatori la vedono (anche in gara). Chi non l’ha vinta non può sceglierla. Passata la settimana non si vince più: una maglia nuova ogni settimana. Nel riquadro, dopo la vittoria:</w:t>
+            </w:r>
+            <w:r>
+              <w:rPr>
+                <w:sz w:val="19"/>
+              </w:rPr>
+              <w:t xml:space="preserve"> </w:t>
+            </w:r>
+            <w:r>
+              <w:rPr>
+                <w:sz w:val="19"/>
+              </w:rPr>
+              <w:t xml:space="preserve">“</w:t>
+            </w:r>
+            <w:r>
+              <w:rPr>
+                <w:sz w:val="19"/>
+              </w:rPr>
+              <w:t xml:space="preserve">Maglia #N vinta ✓</w:t>
+            </w:r>
+            <w:r>
+              <w:rPr>
+                <w:sz w:val="19"/>
+              </w:rPr>
+              <w:t xml:space="preserve">”</w:t>
+            </w:r>
+            <w:r>
+              <w:rPr>
+                <w:sz w:val="19"/>
+              </w:rPr>
+              <w:t xml:space="preserve">.</w:t>
+            </w:r>
+            <w:r>
+              <w:rPr>
+                <w:sz w:val="19"/>
+              </w:rPr>
+              <w:t xml:space="preserve"> </w:t>
+            </w:r>
+            <w:r>
+              <w:rPr>
+                <w:bCs/>
+                <w:b/>
+                <w:sz w:val="19"/>
+              </w:rPr>
+              <w:t xml:space="preserve">Misure</w:t>
+            </w:r>
+            <w:r>
+              <w:rPr>
+                <w:sz w:val="19"/>
+              </w:rPr>
+              <w:t xml:space="preserve"> </w:t>
+            </w:r>
+            <w:r>
+              <w:rPr>
+                <w:sz w:val="19"/>
+              </w:rPr>
+              <w:t xml:space="preserve">(R-232):</w:t>
+            </w:r>
+            <w:r>
+              <w:rPr>
+                <w:sz w:val="19"/>
+              </w:rPr>
+              <w:t xml:space="preserve"> </w:t>
+            </w:r>
+            <w:r>
+              <w:rPr>
+                <w:rStyle w:val="VerbatimChar"/>
+                <w:sz w:val="19"/>
+              </w:rPr>
+              <w:t xml:space="preserve">settimana_gare</w:t>
+            </w:r>
+            <w:r>
+              <w:rPr>
+                <w:sz w:val="19"/>
+              </w:rPr>
+              <w:t xml:space="preserve"> </w:t>
+            </w:r>
+            <w:r>
+              <w:rPr>
+                <w:sz w:val="19"/>
+              </w:rPr>
+              <w:t xml:space="preserve">(gare finite nella città della settimana) e</w:t>
+            </w:r>
+            <w:r>
+              <w:rPr>
+                <w:sz w:val="19"/>
+              </w:rPr>
+              <w:t xml:space="preserve"> </w:t>
+            </w:r>
+            <w:r>
+              <w:rPr>
+                <w:rStyle w:val="VerbatimChar"/>
+                <w:sz w:val="19"/>
+              </w:rPr>
+              <w:t xml:space="preserve">settimana_premi</w:t>
+            </w:r>
+            <w:r>
+              <w:rPr>
+                <w:sz w:val="19"/>
+              </w:rPr>
+              <w:t xml:space="preserve"> </w:t>
+            </w:r>
+            <w:r>
+              <w:rPr>
+                <w:sz w:val="19"/>
+              </w:rPr>
+              <w:t xml:space="preserve">(maglie assegnate) su /api/stats; la settimana corrente anche su /api/giorno (</w:t>
+            </w:r>
+            <w:r>
+              <w:rPr>
+                <w:rStyle w:val="VerbatimChar"/>
+                <w:sz w:val="19"/>
+              </w:rPr>
+              <w:t xml:space="preserve">settimana</w:t>
+            </w:r>
+            <w:r>
+              <w:rPr>
+                <w:sz w:val="19"/>
+              </w:rPr>
+              <w:t xml:space="preserve">). Idea F-14 (parti del personaggio da sbloccare): questo è il primo pezzo, deciso dal server quindi senza imbrogli</w:t>
+            </w:r>
+          </w:p>
+        </w:tc>
+      </w:tr>
+      <w:tr>
+        <w:tc>
+          <w:tcPr>
+            <w:tcW w:type="dxa" w:w="907"/>
+          </w:tcPr>
+          <w:p>
+            <w:pPr>
+              <w:pStyle w:val="Compact"/>
+              <w:spacing w:after="40"/>
+              <w:jc w:val="left"/>
+            </w:pPr>
+            <w:r>
+              <w:rPr>
+                <w:sz w:val="19"/>
+              </w:rPr>
+              <w:t xml:space="preserve">R-246</w:t>
+            </w:r>
+          </w:p>
+        </w:tc>
+        <w:tc>
+          <w:tcPr>
+            <w:tcW w:type="dxa" w:w="4195"/>
+          </w:tcPr>
+          <w:p>
+            <w:pPr>
+              <w:pStyle w:val="Compact"/>
+              <w:spacing w:after="40"/>
+              <w:jc w:val="left"/>
+            </w:pPr>
+            <w:r>
+              <w:rPr>
+                <w:sz w:val="19"/>
+              </w:rPr>
+              <w:t xml:space="preserve">Misurare da dove arrivano i giocatori: link di sfida, pista del giorno condivisa (</w:t>
+            </w:r>
+            <w:r>
+              <w:rPr>
+                <w:sz w:val="19"/>
+              </w:rPr>
+              <w:t xml:space="preserve">“</w:t>
+            </w:r>
+            <w:r>
+              <w:rPr>
+                <w:sz w:val="19"/>
+              </w:rPr>
+              <w:t xml:space="preserve">batti il mio tempo</w:t>
+            </w:r>
+            <w:r>
+              <w:rPr>
+                <w:sz w:val="19"/>
+              </w:rPr>
+              <w:t xml:space="preserve">”</w:t>
+            </w:r>
+            <w:r>
+              <w:rPr>
+                <w:sz w:val="19"/>
+              </w:rPr>
+              <w:t xml:space="preserve">), portale, home del sito o indirizzo diretto; per ogni fonte quanti tornano</w:t>
+            </w:r>
+          </w:p>
+        </w:tc>
+        <w:tc>
+          <w:tcPr>
+            <w:tcW w:type="dxa" w:w="1134"/>
+          </w:tcPr>
+          <w:p>
+            <w:pPr>
+              <w:pStyle w:val="Compact"/>
+              <w:spacing w:after="40"/>
+              <w:jc w:val="left"/>
+            </w:pPr>
+            <w:r>
+              <w:rPr>
+                <w:sz w:val="19"/>
+              </w:rPr>
+              <w:t xml:space="preserve">27/10/2026</w:t>
+            </w:r>
+          </w:p>
+        </w:tc>
+        <w:tc>
+          <w:tcPr>
+            <w:tcW w:type="dxa" w:w="1134"/>
+            <w:shd w:val="clear" w:color="auto" w:fill="FFF1C7"/>
+          </w:tcPr>
+          <w:p>
+            <w:pPr>
+              <w:pStyle w:val="Compact"/>
+              <w:spacing w:after="40"/>
+              <w:jc w:val="left"/>
+            </w:pPr>
+            <w:r>
+              <w:rPr>
+                <w:sz w:val="19"/>
+              </w:rPr>
+              <w:t xml:space="preserve">In corso</w:t>
+            </w:r>
+          </w:p>
+        </w:tc>
+        <w:tc>
+          <w:tcPr>
+            <w:tcW w:type="dxa" w:w="2494"/>
+          </w:tcPr>
+          <w:p>
+            <w:pPr>
+              <w:pStyle w:val="Compact"/>
+              <w:spacing w:after="40"/>
+              <w:jc w:val="left"/>
+            </w:pPr>
+            <w:r>
+              <w:rPr>
+                <w:sz w:val="19"/>
+              </w:rPr>
+              <w:t xml:space="preserve">Scritto il 27/10 per la 0.24.0 (ramo</w:t>
+            </w:r>
+            <w:r>
+              <w:rPr>
+                <w:sz w:val="19"/>
+              </w:rPr>
+              <w:t xml:space="preserve"> </w:t>
+            </w:r>
+            <w:r>
+              <w:rPr>
+                <w:rStyle w:val="VerbatimChar"/>
+                <w:sz w:val="19"/>
+              </w:rPr>
+              <w:t xml:space="preserve">giorno/portale-settimana</w:t>
+            </w:r>
+            <w:r>
+              <w:rPr>
+                <w:sz w:val="19"/>
+              </w:rPr>
+              <w:t xml:space="preserve">); completa R-232 (proposta 1 del confronto del 27/10). Il gioco manda con la visita anche la</w:t>
+            </w:r>
+            <w:r>
+              <w:rPr>
+                <w:sz w:val="19"/>
+              </w:rPr>
+              <w:t xml:space="preserve"> </w:t>
+            </w:r>
+            <w:r>
+              <w:rPr>
+                <w:bCs/>
+                <w:b/>
+                <w:sz w:val="19"/>
+              </w:rPr>
+              <w:t xml:space="preserve">fonte</w:t>
+            </w:r>
+            <w:r>
+              <w:rPr>
+                <w:sz w:val="19"/>
+              </w:rPr>
+              <w:t xml:space="preserve">:</w:t>
+            </w:r>
+            <w:r>
+              <w:rPr>
+                <w:sz w:val="19"/>
+              </w:rPr>
+              <w:t xml:space="preserve"> </w:t>
+            </w:r>
+            <w:r>
+              <w:rPr>
+                <w:rStyle w:val="VerbatimChar"/>
+                <w:sz w:val="19"/>
+              </w:rPr>
+              <w:t xml:space="preserve">sfida</w:t>
+            </w:r>
+            <w:r>
+              <w:rPr>
+                <w:sz w:val="19"/>
+              </w:rPr>
+              <w:t xml:space="preserve"> </w:t>
+            </w:r>
+            <w:r>
+              <w:rPr>
+                <w:sz w:val="19"/>
+              </w:rPr>
+              <w:t xml:space="preserve">(link</w:t>
+            </w:r>
+            <w:r>
+              <w:rPr>
+                <w:sz w:val="19"/>
+              </w:rPr>
+              <w:t xml:space="preserve"> </w:t>
+            </w:r>
+            <w:r>
+              <w:rPr>
+                <w:rStyle w:val="VerbatimChar"/>
+                <w:sz w:val="19"/>
+              </w:rPr>
+              <w:t xml:space="preserve">?sfida=</w:t>
+            </w:r>
+            <w:r>
+              <w:rPr>
+                <w:sz w:val="19"/>
+              </w:rPr>
+              <w:t xml:space="preserve">),</w:t>
+            </w:r>
+            <w:r>
+              <w:rPr>
+                <w:sz w:val="19"/>
+              </w:rPr>
+              <w:t xml:space="preserve"> </w:t>
+            </w:r>
+            <w:r>
+              <w:rPr>
+                <w:rStyle w:val="VerbatimChar"/>
+                <w:sz w:val="19"/>
+              </w:rPr>
+              <w:t xml:space="preserve">batti</w:t>
+            </w:r>
+            <w:r>
+              <w:rPr>
+                <w:sz w:val="19"/>
+              </w:rPr>
+              <w:t xml:space="preserve"> </w:t>
+            </w:r>
+            <w:r>
+              <w:rPr>
+                <w:sz w:val="19"/>
+              </w:rPr>
+              <w:t xml:space="preserve">(link</w:t>
+            </w:r>
+            <w:r>
+              <w:rPr>
+                <w:sz w:val="19"/>
+              </w:rPr>
+              <w:t xml:space="preserve"> </w:t>
+            </w:r>
+            <w:r>
+              <w:rPr>
+                <w:sz w:val="19"/>
+              </w:rPr>
+              <w:t xml:space="preserve">“</w:t>
+            </w:r>
+            <w:r>
+              <w:rPr>
+                <w:sz w:val="19"/>
+              </w:rPr>
+              <w:t xml:space="preserve">batti il mio tempo</w:t>
+            </w:r>
+            <w:r>
+              <w:rPr>
+                <w:sz w:val="19"/>
+              </w:rPr>
+              <w:t xml:space="preserve">”</w:t>
+            </w:r>
+            <w:r>
+              <w:rPr>
+                <w:sz w:val="19"/>
+              </w:rPr>
+              <w:t xml:space="preserve">),</w:t>
+            </w:r>
+            <w:r>
+              <w:rPr>
+                <w:sz w:val="19"/>
+              </w:rPr>
+              <w:t xml:space="preserve"> </w:t>
+            </w:r>
+            <w:r>
+              <w:rPr>
+                <w:rStyle w:val="VerbatimChar"/>
+                <w:sz w:val="19"/>
+              </w:rPr>
+              <w:t xml:space="preserve">portale</w:t>
+            </w:r>
+            <w:r>
+              <w:rPr>
+                <w:sz w:val="19"/>
+              </w:rPr>
+              <w:t xml:space="preserve"> </w:t>
+            </w:r>
+            <w:r>
+              <w:rPr>
+                <w:sz w:val="19"/>
+              </w:rPr>
+              <w:t xml:space="preserve">(CrazyGames, Poki…),</w:t>
+            </w:r>
+            <w:r>
+              <w:rPr>
+                <w:sz w:val="19"/>
+              </w:rPr>
+              <w:t xml:space="preserve"> </w:t>
+            </w:r>
+            <w:r>
+              <w:rPr>
+                <w:rStyle w:val="VerbatimChar"/>
+                <w:sz w:val="19"/>
+              </w:rPr>
+              <w:t xml:space="preserve">home</w:t>
+            </w:r>
+            <w:r>
+              <w:rPr>
+                <w:sz w:val="19"/>
+              </w:rPr>
+              <w:t xml:space="preserve"> </w:t>
+            </w:r>
+            <w:r>
+              <w:rPr>
+                <w:sz w:val="19"/>
+              </w:rPr>
+              <w:t xml:space="preserve">(dalla pagina iniziale del sito),</w:t>
+            </w:r>
+            <w:r>
+              <w:rPr>
+                <w:sz w:val="19"/>
+              </w:rPr>
+              <w:t xml:space="preserve"> </w:t>
+            </w:r>
+            <w:r>
+              <w:rPr>
+                <w:rStyle w:val="VerbatimChar"/>
+                <w:sz w:val="19"/>
+              </w:rPr>
+              <w:t xml:space="preserve">diretto</w:t>
+            </w:r>
+            <w:r>
+              <w:rPr>
+                <w:sz w:val="19"/>
+              </w:rPr>
+              <w:t xml:space="preserve"> </w:t>
+            </w:r>
+            <w:r>
+              <w:rPr>
+                <w:sz w:val="19"/>
+              </w:rPr>
+              <w:t xml:space="preserve">(tutto il resto: indirizzo scritto, segnalibro, link senza riferimento). Niente dati personali, come prima. Su</w:t>
+            </w:r>
+            <w:r>
+              <w:rPr>
+                <w:sz w:val="19"/>
+              </w:rPr>
+              <w:t xml:space="preserve"> </w:t>
+            </w:r>
+            <w:r>
+              <w:rPr>
+                <w:bCs/>
+                <w:b/>
+                <w:sz w:val="19"/>
+              </w:rPr>
+              <w:t xml:space="preserve">/api/stats</w:t>
+            </w:r>
+            <w:r>
+              <w:rPr>
+                <w:sz w:val="19"/>
+              </w:rPr>
+              <w:t xml:space="preserve">, per giorno,</w:t>
+            </w:r>
+            <w:r>
+              <w:rPr>
+                <w:sz w:val="19"/>
+              </w:rPr>
+              <w:t xml:space="preserve"> </w:t>
+            </w:r>
+            <w:r>
+              <w:rPr>
+                <w:rStyle w:val="VerbatimChar"/>
+                <w:sz w:val="19"/>
+              </w:rPr>
+              <w:t xml:space="preserve">visit_sfida</w:t>
+            </w:r>
+            <w:r>
+              <w:rPr>
+                <w:sz w:val="19"/>
+              </w:rPr>
+              <w:t xml:space="preserve">,</w:t>
+            </w:r>
+            <w:r>
+              <w:rPr>
+                <w:sz w:val="19"/>
+              </w:rPr>
+              <w:t xml:space="preserve"> </w:t>
+            </w:r>
+            <w:r>
+              <w:rPr>
+                <w:rStyle w:val="VerbatimChar"/>
+                <w:sz w:val="19"/>
+              </w:rPr>
+              <w:t xml:space="preserve">visit_batti</w:t>
+            </w:r>
+            <w:r>
+              <w:rPr>
+                <w:sz w:val="19"/>
+              </w:rPr>
+              <w:t xml:space="preserve">,</w:t>
+            </w:r>
+            <w:r>
+              <w:rPr>
+                <w:sz w:val="19"/>
+              </w:rPr>
+              <w:t xml:space="preserve"> </w:t>
+            </w:r>
+            <w:r>
+              <w:rPr>
+                <w:rStyle w:val="VerbatimChar"/>
+                <w:sz w:val="19"/>
+              </w:rPr>
+              <w:t xml:space="preserve">visit_portale</w:t>
+            </w:r>
+            <w:r>
+              <w:rPr>
+                <w:sz w:val="19"/>
+              </w:rPr>
+              <w:t xml:space="preserve">,</w:t>
+            </w:r>
+            <w:r>
+              <w:rPr>
+                <w:sz w:val="19"/>
+              </w:rPr>
+              <w:t xml:space="preserve"> </w:t>
+            </w:r>
+            <w:r>
+              <w:rPr>
+                <w:rStyle w:val="VerbatimChar"/>
+                <w:sz w:val="19"/>
+              </w:rPr>
+              <w:t xml:space="preserve">visit_home</w:t>
+            </w:r>
+            <w:r>
+              <w:rPr>
+                <w:sz w:val="19"/>
+              </w:rPr>
+              <w:t xml:space="preserve">,</w:t>
+            </w:r>
+            <w:r>
+              <w:rPr>
+                <w:sz w:val="19"/>
+              </w:rPr>
+              <w:t xml:space="preserve"> </w:t>
+            </w:r>
+            <w:r>
+              <w:rPr>
+                <w:rStyle w:val="VerbatimChar"/>
+                <w:sz w:val="19"/>
+              </w:rPr>
+              <w:t xml:space="preserve">visit_diretto</w:t>
+            </w:r>
+            <w:r>
+              <w:rPr>
+                <w:sz w:val="19"/>
+              </w:rPr>
+              <w:t xml:space="preserve"> </w:t>
+            </w:r>
+            <w:r>
+              <w:rPr>
+                <w:sz w:val="19"/>
+              </w:rPr>
+              <w:t xml:space="preserve">(la prima visita del giorno di ogni giocatore). Su</w:t>
+            </w:r>
+            <w:r>
+              <w:rPr>
+                <w:sz w:val="19"/>
+              </w:rPr>
+              <w:t xml:space="preserve"> </w:t>
+            </w:r>
+            <w:r>
+              <w:rPr>
+                <w:bCs/>
+                <w:b/>
+                <w:sz w:val="19"/>
+              </w:rPr>
+              <w:t xml:space="preserve">/api/ritorni</w:t>
+            </w:r>
+            <w:r>
+              <w:rPr>
+                <w:sz w:val="19"/>
+              </w:rPr>
+              <w:t xml:space="preserve">, oltre a</w:t>
+            </w:r>
+            <w:r>
+              <w:rPr>
+                <w:sz w:val="19"/>
+              </w:rPr>
+              <w:t xml:space="preserve"> </w:t>
+            </w:r>
+            <w:r>
+              <w:rPr>
+                <w:sz w:val="19"/>
+              </w:rPr>
+              <w:t xml:space="preserve">“</w:t>
+            </w:r>
+            <w:r>
+              <w:rPr>
+                <w:sz w:val="19"/>
+              </w:rPr>
+              <w:t xml:space="preserve">visite</w:t>
+            </w:r>
+            <w:r>
+              <w:rPr>
+                <w:sz w:val="19"/>
+              </w:rPr>
+              <w:t xml:space="preserve">”</w:t>
+            </w:r>
+            <w:r>
+              <w:rPr>
+                <w:sz w:val="19"/>
+              </w:rPr>
+              <w:t xml:space="preserve"> </w:t>
+            </w:r>
+            <w:r>
+              <w:rPr>
+                <w:sz w:val="19"/>
+              </w:rPr>
+              <w:t xml:space="preserve">e</w:t>
+            </w:r>
+            <w:r>
+              <w:rPr>
+                <w:sz w:val="19"/>
+              </w:rPr>
+              <w:t xml:space="preserve"> </w:t>
+            </w:r>
+            <w:r>
+              <w:rPr>
+                <w:sz w:val="19"/>
+              </w:rPr>
+              <w:t xml:space="preserve">“</w:t>
+            </w:r>
+            <w:r>
+              <w:rPr>
+                <w:sz w:val="19"/>
+              </w:rPr>
+              <w:t xml:space="preserve">corse</w:t>
+            </w:r>
+            <w:r>
+              <w:rPr>
+                <w:sz w:val="19"/>
+              </w:rPr>
+              <w:t xml:space="preserve">”</w:t>
+            </w:r>
+            <w:r>
+              <w:rPr>
+                <w:sz w:val="19"/>
+              </w:rPr>
+              <w:t xml:space="preserve">,</w:t>
+            </w:r>
+            <w:r>
+              <w:rPr>
+                <w:sz w:val="19"/>
+              </w:rPr>
+              <w:t xml:space="preserve"> </w:t>
+            </w:r>
+            <w:r>
+              <w:rPr>
+                <w:bCs/>
+                <w:b/>
+                <w:sz w:val="19"/>
+              </w:rPr>
+              <w:t xml:space="preserve">“</w:t>
+            </w:r>
+            <w:r>
+              <w:rPr>
+                <w:bCs/>
+                <w:b/>
+                <w:sz w:val="19"/>
+              </w:rPr>
+              <w:t xml:space="preserve">fonti</w:t>
+            </w:r>
+            <w:r>
+              <w:rPr>
+                <w:bCs/>
+                <w:b/>
+                <w:sz w:val="19"/>
+              </w:rPr>
+              <w:t xml:space="preserve">”</w:t>
+            </w:r>
+            <w:r>
+              <w:rPr>
+                <w:sz w:val="19"/>
+              </w:rPr>
+              <w:t xml:space="preserve">: i ritorni dopo 1, 7 e 30 giorni divisi per la fonte della prima visita di ogni giocatore, così si vede se chi arriva da un link di sfida torna più di chi arriva da solo. Limite: la fonte si conosce dal giorno in cui va online la 0.24.0; chi era già passato prima risulta</w:t>
+            </w:r>
+            <w:r>
+              <w:rPr>
+                <w:sz w:val="19"/>
+              </w:rPr>
+              <w:t xml:space="preserve"> </w:t>
+            </w:r>
+            <w:r>
+              <w:rPr>
+                <w:sz w:val="19"/>
+              </w:rPr>
+              <w:t xml:space="preserve">“</w:t>
+            </w:r>
+            <w:r>
+              <w:rPr>
+                <w:sz w:val="19"/>
+              </w:rPr>
+              <w:t xml:space="preserve">diretto</w:t>
+            </w:r>
+            <w:r>
+              <w:rPr>
+                <w:sz w:val="19"/>
+              </w:rPr>
+              <w:t xml:space="preserve">”</w:t>
+            </w:r>
+            <w:r>
+              <w:rPr>
+                <w:sz w:val="19"/>
+              </w:rPr>
+              <w:t xml:space="preserve">. Scelte S-48</w:t>
             </w:r>
           </w:p>
         </w:tc>
@@ -41670,6 +44487,484 @@
                 <w:sz w:val="19"/>
               </w:rPr>
               <w:t xml:space="preserve">moduli/missioni.js</w:t>
+            </w:r>
+          </w:p>
+        </w:tc>
+      </w:tr>
+      <w:tr>
+        <w:tc>
+          <w:tcPr>
+            <w:tcW w:type="dxa" w:w="1247"/>
+          </w:tcPr>
+          <w:p>
+            <w:pPr>
+              <w:pStyle w:val="Compact"/>
+              <w:spacing w:after="40"/>
+              <w:jc w:val="left"/>
+            </w:pPr>
+            <w:r>
+              <w:rPr>
+                <w:sz w:val="19"/>
+              </w:rPr>
+              <w:t xml:space="preserve">0.22.0</w:t>
+            </w:r>
+          </w:p>
+        </w:tc>
+        <w:tc>
+          <w:tcPr>
+            <w:tcW w:type="dxa" w:w="1361"/>
+          </w:tcPr>
+          <w:p>
+            <w:pPr>
+              <w:pStyle w:val="Compact"/>
+              <w:spacing w:after="40"/>
+              <w:jc w:val="left"/>
+            </w:pPr>
+            <w:r>
+              <w:rPr>
+                <w:sz w:val="19"/>
+              </w:rPr>
+              <w:t xml:space="preserve">27/10/2026</w:t>
+            </w:r>
+          </w:p>
+        </w:tc>
+        <w:tc>
+          <w:tcPr>
+            <w:tcW w:type="dxa" w:w="7257"/>
+          </w:tcPr>
+          <w:p>
+            <w:pPr>
+              <w:pStyle w:val="Compact"/>
+              <w:spacing w:after="40"/>
+              <w:jc w:val="left"/>
+            </w:pPr>
+            <w:r>
+              <w:rPr>
+                <w:sz w:val="19"/>
+              </w:rPr>
+              <w:t xml:space="preserve">(Scritta di giorno sul ramo</w:t>
+            </w:r>
+            <w:r>
+              <w:rPr>
+                <w:sz w:val="19"/>
+              </w:rPr>
+              <w:t xml:space="preserve"> </w:t>
+            </w:r>
+            <w:r>
+              <w:rPr>
+                <w:rStyle w:val="VerbatimChar"/>
+                <w:sz w:val="19"/>
+              </w:rPr>
+              <w:t xml:space="preserve">giorno/portale-settimana</w:t>
+            </w:r>
+            <w:r>
+              <w:rPr>
+                <w:sz w:val="19"/>
+              </w:rPr>
+              <w:t xml:space="preserve">; online dopo le prove del turno di notte.) Pronti per i portali di giochi (R-244, S-46, da F-15): modalità portale con</w:t>
+            </w:r>
+            <w:r>
+              <w:rPr>
+                <w:sz w:val="19"/>
+              </w:rPr>
+              <w:t xml:space="preserve"> </w:t>
+            </w:r>
+            <w:r>
+              <w:rPr>
+                <w:rStyle w:val="VerbatimChar"/>
+                <w:sz w:val="19"/>
+              </w:rPr>
+              <w:t xml:space="preserve">?portale=crazygames</w:t>
+            </w:r>
+            <w:r>
+              <w:rPr>
+                <w:sz w:val="19"/>
+              </w:rPr>
+              <w:t xml:space="preserve"> </w:t>
+            </w:r>
+            <w:r>
+              <w:rPr>
+                <w:sz w:val="19"/>
+              </w:rPr>
+              <w:t xml:space="preserve">(niente donazioni, niente link esterni, codice al posto del link nella stanza, testi senza link), casella</w:t>
+            </w:r>
+            <w:r>
+              <w:rPr>
+                <w:sz w:val="19"/>
+              </w:rPr>
+              <w:t xml:space="preserve"> </w:t>
+            </w:r>
+            <w:r>
+              <w:rPr>
+                <w:sz w:val="19"/>
+              </w:rPr>
+              <w:t xml:space="preserve">“</w:t>
+            </w:r>
+            <w:r>
+              <w:rPr>
+                <w:sz w:val="19"/>
+              </w:rPr>
+              <w:t xml:space="preserve">Messaggi vocali</w:t>
+            </w:r>
+            <w:r>
+              <w:rPr>
+                <w:sz w:val="19"/>
+              </w:rPr>
+              <w:t xml:space="preserve">”</w:t>
+            </w:r>
+            <w:r>
+              <w:rPr>
+                <w:sz w:val="19"/>
+              </w:rPr>
+              <w:t xml:space="preserve"> </w:t>
+            </w:r>
+            <w:r>
+              <w:rPr>
+                <w:sz w:val="19"/>
+              </w:rPr>
+              <w:t xml:space="preserve">nel menu per spegnere i vocali (spenti sul portale), audio che riparte al tocco su iPhone, niente lente sul testo toccando la pista. Nuovo modulo</w:t>
+            </w:r>
+            <w:r>
+              <w:rPr>
+                <w:sz w:val="19"/>
+              </w:rPr>
+              <w:t xml:space="preserve"> </w:t>
+            </w:r>
+            <w:r>
+              <w:rPr>
+                <w:rStyle w:val="VerbatimChar"/>
+                <w:sz w:val="19"/>
+              </w:rPr>
+              <w:t xml:space="preserve">moduli/portale.js</w:t>
+            </w:r>
+          </w:p>
+        </w:tc>
+      </w:tr>
+      <w:tr>
+        <w:tc>
+          <w:tcPr>
+            <w:tcW w:type="dxa" w:w="1247"/>
+          </w:tcPr>
+          <w:p>
+            <w:pPr>
+              <w:pStyle w:val="Compact"/>
+              <w:spacing w:after="40"/>
+              <w:jc w:val="left"/>
+            </w:pPr>
+            <w:r>
+              <w:rPr>
+                <w:sz w:val="19"/>
+              </w:rPr>
+              <w:t xml:space="preserve">0.23.0</w:t>
+            </w:r>
+          </w:p>
+        </w:tc>
+        <w:tc>
+          <w:tcPr>
+            <w:tcW w:type="dxa" w:w="1361"/>
+          </w:tcPr>
+          <w:p>
+            <w:pPr>
+              <w:pStyle w:val="Compact"/>
+              <w:spacing w:after="40"/>
+              <w:jc w:val="left"/>
+            </w:pPr>
+            <w:r>
+              <w:rPr>
+                <w:sz w:val="19"/>
+              </w:rPr>
+              <w:t xml:space="preserve">27/10/2026</w:t>
+            </w:r>
+          </w:p>
+        </w:tc>
+        <w:tc>
+          <w:tcPr>
+            <w:tcW w:type="dxa" w:w="7257"/>
+          </w:tcPr>
+          <w:p>
+            <w:pPr>
+              <w:pStyle w:val="Compact"/>
+              <w:spacing w:after="40"/>
+              <w:jc w:val="left"/>
+            </w:pPr>
+            <w:r>
+              <w:rPr>
+                <w:sz w:val="19"/>
+              </w:rPr>
+              <w:t xml:space="preserve">(Stesso ramo.) Città della settimana con la maglia esclusiva (R-245, S-47): riquadro nel menu con la città, la scadenza e</w:t>
+            </w:r>
+            <w:r>
+              <w:rPr>
+                <w:sz w:val="19"/>
+              </w:rPr>
+              <w:t xml:space="preserve"> </w:t>
+            </w:r>
+            <w:r>
+              <w:rPr>
+                <w:sz w:val="19"/>
+              </w:rPr>
+              <w:t xml:space="preserve">“</w:t>
+            </w:r>
+            <w:r>
+              <w:rPr>
+                <w:sz w:val="19"/>
+              </w:rPr>
+              <w:t xml:space="preserve">Corri a …</w:t>
+            </w:r>
+            <w:r>
+              <w:rPr>
+                <w:sz w:val="19"/>
+              </w:rPr>
+              <w:t xml:space="preserve">”</w:t>
+            </w:r>
+            <w:r>
+              <w:rPr>
+                <w:sz w:val="19"/>
+              </w:rPr>
+              <w:t xml:space="preserve">; il server assegna la maglia a chi finisce una gara in quella città e la ricorda; gruppo</w:t>
+            </w:r>
+            <w:r>
+              <w:rPr>
+                <w:sz w:val="19"/>
+              </w:rPr>
+              <w:t xml:space="preserve"> </w:t>
+            </w:r>
+            <w:r>
+              <w:rPr>
+                <w:sz w:val="19"/>
+              </w:rPr>
+              <w:t xml:space="preserve">“</w:t>
+            </w:r>
+            <w:r>
+              <w:rPr>
+                <w:sz w:val="19"/>
+              </w:rPr>
+              <w:t xml:space="preserve">Maglie della settimana</w:t>
+            </w:r>
+            <w:r>
+              <w:rPr>
+                <w:sz w:val="19"/>
+              </w:rPr>
+              <w:t xml:space="preserve">”</w:t>
+            </w:r>
+            <w:r>
+              <w:rPr>
+                <w:sz w:val="19"/>
+              </w:rPr>
+              <w:t xml:space="preserve"> </w:t>
+            </w:r>
+            <w:r>
+              <w:rPr>
+                <w:sz w:val="19"/>
+              </w:rPr>
+              <w:t xml:space="preserve">nel personaggio; misure</w:t>
+            </w:r>
+            <w:r>
+              <w:rPr>
+                <w:sz w:val="19"/>
+              </w:rPr>
+              <w:t xml:space="preserve"> </w:t>
+            </w:r>
+            <w:r>
+              <w:rPr>
+                <w:rStyle w:val="VerbatimChar"/>
+                <w:sz w:val="19"/>
+              </w:rPr>
+              <w:t xml:space="preserve">settimana_gare</w:t>
+            </w:r>
+            <w:r>
+              <w:rPr>
+                <w:sz w:val="19"/>
+              </w:rPr>
+              <w:t xml:space="preserve"> </w:t>
+            </w:r>
+            <w:r>
+              <w:rPr>
+                <w:sz w:val="19"/>
+              </w:rPr>
+              <w:t xml:space="preserve">e</w:t>
+            </w:r>
+            <w:r>
+              <w:rPr>
+                <w:sz w:val="19"/>
+              </w:rPr>
+              <w:t xml:space="preserve"> </w:t>
+            </w:r>
+            <w:r>
+              <w:rPr>
+                <w:rStyle w:val="VerbatimChar"/>
+                <w:sz w:val="19"/>
+              </w:rPr>
+              <w:t xml:space="preserve">settimana_premi</w:t>
+            </w:r>
+            <w:r>
+              <w:rPr>
+                <w:sz w:val="19"/>
+              </w:rPr>
+              <w:t xml:space="preserve">. Nuovi</w:t>
+            </w:r>
+            <w:r>
+              <w:rPr>
+                <w:sz w:val="19"/>
+              </w:rPr>
+              <w:t xml:space="preserve"> </w:t>
+            </w:r>
+            <w:r>
+              <w:rPr>
+                <w:rStyle w:val="VerbatimChar"/>
+                <w:sz w:val="19"/>
+              </w:rPr>
+              <w:t xml:space="preserve">shared/calendario.js</w:t>
+            </w:r>
+            <w:r>
+              <w:rPr>
+                <w:sz w:val="19"/>
+              </w:rPr>
+              <w:t xml:space="preserve"> </w:t>
+            </w:r>
+            <w:r>
+              <w:rPr>
+                <w:sz w:val="19"/>
+              </w:rPr>
+              <w:t xml:space="preserve">(settimana → città, usato da gioco e server),</w:t>
+            </w:r>
+            <w:r>
+              <w:rPr>
+                <w:sz w:val="19"/>
+              </w:rPr>
+              <w:t xml:space="preserve"> </w:t>
+            </w:r>
+            <w:r>
+              <w:rPr>
+                <w:rStyle w:val="VerbatimChar"/>
+                <w:sz w:val="19"/>
+              </w:rPr>
+              <w:t xml:space="preserve">moduli/settimana.js</w:t>
+            </w:r>
+            <w:r>
+              <w:rPr>
+                <w:sz w:val="19"/>
+              </w:rPr>
+              <w:t xml:space="preserve">,</w:t>
+            </w:r>
+            <w:r>
+              <w:rPr>
+                <w:sz w:val="19"/>
+              </w:rPr>
+              <w:t xml:space="preserve"> </w:t>
+            </w:r>
+            <w:r>
+              <w:rPr>
+                <w:rStyle w:val="VerbatimChar"/>
+                <w:sz w:val="19"/>
+              </w:rPr>
+              <w:t xml:space="preserve">src/settimana.mjs</w:t>
+            </w:r>
+            <w:r>
+              <w:rPr>
+                <w:sz w:val="19"/>
+              </w:rPr>
+              <w:t xml:space="preserve">; tabella</w:t>
+            </w:r>
+            <w:r>
+              <w:rPr>
+                <w:sz w:val="19"/>
+              </w:rPr>
+              <w:t xml:space="preserve"> </w:t>
+            </w:r>
+            <w:r>
+              <w:rPr>
+                <w:rStyle w:val="VerbatimChar"/>
+                <w:sz w:val="19"/>
+              </w:rPr>
+              <w:t xml:space="preserve">premi</w:t>
+            </w:r>
+            <w:r>
+              <w:rPr>
+                <w:sz w:val="19"/>
+              </w:rPr>
+              <w:t xml:space="preserve"> </w:t>
+            </w:r>
+            <w:r>
+              <w:rPr>
+                <w:sz w:val="19"/>
+              </w:rPr>
+              <w:t xml:space="preserve">nella classifica</w:t>
+            </w:r>
+          </w:p>
+        </w:tc>
+      </w:tr>
+      <w:tr>
+        <w:tc>
+          <w:tcPr>
+            <w:tcW w:type="dxa" w:w="1247"/>
+          </w:tcPr>
+          <w:p>
+            <w:pPr>
+              <w:pStyle w:val="Compact"/>
+              <w:spacing w:after="40"/>
+              <w:jc w:val="left"/>
+            </w:pPr>
+            <w:r>
+              <w:rPr>
+                <w:sz w:val="19"/>
+              </w:rPr>
+              <w:t xml:space="preserve">0.24.0</w:t>
+            </w:r>
+          </w:p>
+        </w:tc>
+        <w:tc>
+          <w:tcPr>
+            <w:tcW w:type="dxa" w:w="1361"/>
+          </w:tcPr>
+          <w:p>
+            <w:pPr>
+              <w:pStyle w:val="Compact"/>
+              <w:spacing w:after="40"/>
+              <w:jc w:val="left"/>
+            </w:pPr>
+            <w:r>
+              <w:rPr>
+                <w:sz w:val="19"/>
+              </w:rPr>
+              <w:t xml:space="preserve">27/10/2026</w:t>
+            </w:r>
+          </w:p>
+        </w:tc>
+        <w:tc>
+          <w:tcPr>
+            <w:tcW w:type="dxa" w:w="7257"/>
+          </w:tcPr>
+          <w:p>
+            <w:pPr>
+              <w:pStyle w:val="Compact"/>
+              <w:spacing w:after="40"/>
+              <w:jc w:val="left"/>
+            </w:pPr>
+            <w:r>
+              <w:rPr>
+                <w:sz w:val="19"/>
+              </w:rPr>
+              <w:t xml:space="preserve">(Stesso ramo.) Da dove arrivano i giocatori (R-246, S-48, completa R-232): la visita porta la fonte (sfida, batti, portale, home, diretto); su /api/stats</w:t>
+            </w:r>
+            <w:r>
+              <w:rPr>
+                <w:sz w:val="19"/>
+              </w:rPr>
+              <w:t xml:space="preserve"> </w:t>
+            </w:r>
+            <w:r>
+              <w:rPr>
+                <w:rStyle w:val="VerbatimChar"/>
+                <w:sz w:val="19"/>
+              </w:rPr>
+              <w:t xml:space="preserve">visit_&lt;fonte&gt;</w:t>
+            </w:r>
+            <w:r>
+              <w:rPr>
+                <w:sz w:val="19"/>
+              </w:rPr>
+              <w:t xml:space="preserve">, su /api/ritorni i ritorni per fonte</w:t>
             </w:r>
           </w:p>
         </w:tc>

</xml_diff>

<commit_message>
Requisiti: orario corretto (19:45)
Co-Authored-By: Claude Fable 5.1 <noreply@anthropic.com>
Claude-Session: https://claude.ai/code/session_01Xy4XssGhkQ1wHUoccwzoLC
</commit_message>
<xml_diff>
--- a/docs/CYF-Gaming-requisiti.docx
+++ b/docs/CYF-Gaming-requisiti.docx
@@ -135,7 +135,7 @@
         <w:t xml:space="preserve"> </w:t>
       </w:r>
       <w:r>
-        <w:t xml:space="preserve">22:30</w:t>
+        <w:t xml:space="preserve">19:45</w:t>
       </w:r>
       <w:r>
         <w:t xml:space="preserve"> </w:t>
@@ -314,7 +314,7 @@
         <w:pStyle w:val="FirstParagraph"/>
       </w:pPr>
       <w:r>
-        <w:t xml:space="preserve">Aggiornati il 27/10/2026 alle 22:30 (versione online: 0.20.2; la 0.21.0 con</w:t>
+        <w:t xml:space="preserve">Aggiornati il 27/10/2026 alle 19:45 (versione online: 0.20.2; la 0.21.0 con</w:t>
       </w:r>
       <w:r>
         <w:t xml:space="preserve"> </w:t>

</xml_diff>

<commit_message>
0.25.0 (giorno): Gran Premio delle 21 (R-247, S-49): sale GP01…GP08 che partono insieme all'ora fissa con la stessa pista nella città della settimana, riquadro con il conto alla rovescia, classifica della sera, /api/gp e /api/quick?gp=1, misure gp_sale e gp_persone; idee F-16…F-19
Co-Authored-By: Claude Fable 5.1 <noreply@anthropic.com>
Claude-Session: https://claude.ai/code/session_01Xy4XssGhkQ1wHUoccwzoLC
</commit_message>
<xml_diff>
--- a/docs/CYF-Gaming-requisiti.docx
+++ b/docs/CYF-Gaming-requisiti.docx
@@ -69,7 +69,7 @@
         <w:t xml:space="preserve"> </w:t>
       </w:r>
       <w:r>
-        <w:t xml:space="preserve">0.21.0-0.24.0</w:t>
+        <w:t xml:space="preserve">0.21.0-0.25.0</w:t>
       </w:r>
       <w:r>
         <w:t xml:space="preserve"> </w:t>
@@ -135,7 +135,7 @@
         <w:t xml:space="preserve"> </w:t>
       </w:r>
       <w:r>
-        <w:t xml:space="preserve">19:45</w:t>
+        <w:t xml:space="preserve">20:30</w:t>
       </w:r>
       <w:r>
         <w:t xml:space="preserve"> </w:t>
@@ -267,7 +267,31 @@
         <w:t xml:space="preserve"> </w:t>
       </w:r>
       <w:r>
-        <w:t xml:space="preserve">visite</w:t>
+        <w:t xml:space="preserve">visite,</w:t>
+      </w:r>
+      <w:r>
+        <w:t xml:space="preserve"> </w:t>
+      </w:r>
+      <w:r>
+        <w:t xml:space="preserve">Gran</w:t>
+      </w:r>
+      <w:r>
+        <w:t xml:space="preserve"> </w:t>
+      </w:r>
+      <w:r>
+        <w:t xml:space="preserve">Premio</w:t>
+      </w:r>
+      <w:r>
+        <w:t xml:space="preserve"> </w:t>
+      </w:r>
+      <w:r>
+        <w:t xml:space="preserve">delle</w:t>
+      </w:r>
+      <w:r>
+        <w:t xml:space="preserve"> </w:t>
+      </w:r>
+      <w:r>
+        <w:t xml:space="preserve">21</w:t>
       </w:r>
       <w:r>
         <w:t xml:space="preserve"> </w:t>
@@ -314,7 +338,7 @@
         <w:pStyle w:val="FirstParagraph"/>
       </w:pPr>
       <w:r>
-        <w:t xml:space="preserve">Aggiornati il 27/10/2026 alle 19:45 (versione online: 0.20.2; la 0.21.0 con</w:t>
+        <w:t xml:space="preserve">Aggiornati il 27/10/2026 alle 20:30 (versione online: 0.20.2; la 0.21.0 con</w:t>
       </w:r>
       <w:r>
         <w:t xml:space="preserve"> </w:t>
@@ -344,7 +368,7 @@
         <w:t xml:space="preserve">giorno/batti-missioni</w:t>
       </w:r>
       <w:r>
-        <w:t xml:space="preserve">; la 0.22.0 modalità portale, la 0.23.0 città della settimana e la 0.24.0 fonte delle visite sono sul ramo</w:t>
+        <w:t xml:space="preserve">; la 0.22.0 modalità portale, la 0.23.0 città della settimana, la 0.24.0 fonte delle visite e la 0.25.0 Gran Premio delle 21 sono sul ramo</w:t>
       </w:r>
       <w:r>
         <w:t xml:space="preserve"> </w:t>
@@ -1064,6 +1088,110 @@
                 <w:sz w:val="19"/>
               </w:rPr>
               <w:t xml:space="preserve">D-12</w:t>
+            </w:r>
+          </w:p>
+        </w:tc>
+      </w:tr>
+      <w:tr>
+        <w:tc>
+          <w:tcPr>
+            <w:tcW w:type="dxa" w:w="510"/>
+          </w:tcPr>
+          <w:p>
+            <w:pPr>
+              <w:pStyle w:val="Compact"/>
+              <w:spacing w:after="40"/>
+              <w:jc w:val="left"/>
+            </w:pPr>
+            <w:r>
+              <w:rPr>
+                <w:sz w:val="19"/>
+              </w:rPr>
+              <w:t xml:space="preserve">2d</w:t>
+            </w:r>
+          </w:p>
+        </w:tc>
+        <w:tc>
+          <w:tcPr>
+            <w:tcW w:type="dxa" w:w="6576"/>
+          </w:tcPr>
+          <w:p>
+            <w:pPr>
+              <w:pStyle w:val="Compact"/>
+              <w:spacing w:after="40"/>
+              <w:jc w:val="left"/>
+            </w:pPr>
+            <w:r>
+              <w:rPr>
+                <w:sz w:val="19"/>
+              </w:rPr>
+              <w:t xml:space="preserve">Decidere le idee nuove del 27/10 sera: F-16 serie di giorni e classifica tra amici, F-17 prima discesa guidata, F-18 tedesco, F-19 stagione (</w:t>
+            </w:r>
+            <w:r>
+              <w:rPr>
+                <w:sz w:val="19"/>
+              </w:rPr>
+              <w:t xml:space="preserve">“</w:t>
+            </w:r>
+            <w:r>
+              <w:rPr>
+                <w:sz w:val="19"/>
+              </w:rPr>
+              <w:t xml:space="preserve">F-17 ok</w:t>
+            </w:r>
+            <w:r>
+              <w:rPr>
+                <w:sz w:val="19"/>
+              </w:rPr>
+              <w:t xml:space="preserve">”</w:t>
+            </w:r>
+            <w:r>
+              <w:rPr>
+                <w:sz w:val="19"/>
+              </w:rPr>
+              <w:t xml:space="preserve"> </w:t>
+            </w:r>
+            <w:r>
+              <w:rPr>
+                <w:sz w:val="19"/>
+              </w:rPr>
+              <w:t xml:space="preserve">basta)</w:t>
+            </w:r>
+          </w:p>
+        </w:tc>
+        <w:tc>
+          <w:tcPr>
+            <w:tcW w:type="dxa" w:w="1247"/>
+          </w:tcPr>
+          <w:p>
+            <w:pPr>
+              <w:pStyle w:val="Compact"/>
+              <w:spacing w:after="40"/>
+              <w:jc w:val="left"/>
+            </w:pPr>
+            <w:r>
+              <w:rPr>
+                <w:sz w:val="19"/>
+              </w:rPr>
+              <w:t xml:space="preserve">2 min</w:t>
+            </w:r>
+          </w:p>
+        </w:tc>
+        <w:tc>
+          <w:tcPr>
+            <w:tcW w:type="dxa" w:w="1531"/>
+          </w:tcPr>
+          <w:p>
+            <w:pPr>
+              <w:pStyle w:val="Compact"/>
+              <w:spacing w:after="40"/>
+              <w:jc w:val="left"/>
+            </w:pPr>
+            <w:r>
+              <w:rPr>
+                <w:sz w:val="19"/>
+              </w:rPr>
+              <w:t xml:space="preserve">F-16…F-19</w:t>
             </w:r>
           </w:p>
         </w:tc>
@@ -2600,6 +2728,192 @@
               <w:rPr>
                 <w:sz w:val="19"/>
               </w:rPr>
+              <w:t xml:space="preserve">1c</w:t>
+            </w:r>
+          </w:p>
+        </w:tc>
+        <w:tc>
+          <w:tcPr>
+            <w:tcW w:type="dxa" w:w="3175"/>
+          </w:tcPr>
+          <w:p>
+            <w:pPr>
+              <w:pStyle w:val="Compact"/>
+              <w:spacing w:after="40"/>
+              <w:jc w:val="left"/>
+            </w:pPr>
+            <w:r>
+              <w:rPr>
+                <w:sz w:val="19"/>
+              </w:rPr>
+              <w:t xml:space="preserve">Provare e pubblicare la 0.25.0 (stesso ramo): Gran Premio delle 21 (R-247). Prove da aggiungere:</w:t>
+            </w:r>
+            <w:r>
+              <w:rPr>
+                <w:sz w:val="19"/>
+              </w:rPr>
+              <w:t xml:space="preserve"> </w:t>
+            </w:r>
+            <w:r>
+              <w:rPr>
+                <w:rStyle w:val="VerbatimChar"/>
+                <w:sz w:val="19"/>
+              </w:rPr>
+              <w:t xml:space="preserve">prossimoGP</w:t>
+            </w:r>
+            <w:r>
+              <w:rPr>
+                <w:sz w:val="19"/>
+              </w:rPr>
+              <w:t xml:space="preserve"> </w:t>
+            </w:r>
+            <w:r>
+              <w:rPr>
+                <w:sz w:val="19"/>
+              </w:rPr>
+              <w:t xml:space="preserve">e la finestra d’ingresso (</w:t>
+            </w:r>
+            <w:r>
+              <w:rPr>
+                <w:rStyle w:val="VerbatimChar"/>
+                <w:sz w:val="19"/>
+              </w:rPr>
+              <w:t xml:space="preserve">granpremio.mjs</w:t>
+            </w:r>
+            <w:r>
+              <w:rPr>
+                <w:sz w:val="19"/>
+              </w:rPr>
+              <w:t xml:space="preserve">), sala GP che parte all’ora fissa con lo stesso seme e classifica</w:t>
+            </w:r>
+            <w:r>
+              <w:rPr>
+                <w:sz w:val="19"/>
+              </w:rPr>
+              <w:t xml:space="preserve"> </w:t>
+            </w:r>
+            <w:r>
+              <w:rPr>
+                <w:rStyle w:val="VerbatimChar"/>
+                <w:sz w:val="19"/>
+              </w:rPr>
+              <w:t xml:space="preserve">gp:&lt;giorno&gt;</w:t>
+            </w:r>
+            <w:r>
+              <w:rPr>
+                <w:sz w:val="19"/>
+              </w:rPr>
+              <w:t xml:space="preserve"> </w:t>
+            </w:r>
+            <w:r>
+              <w:rPr>
+                <w:sz w:val="19"/>
+              </w:rPr>
+              <w:t xml:space="preserve">(</w:t>
+            </w:r>
+            <w:r>
+              <w:rPr>
+                <w:rStyle w:val="VerbatimChar"/>
+                <w:sz w:val="19"/>
+              </w:rPr>
+              <w:t xml:space="preserve">test_server.mjs</w:t>
+            </w:r>
+            <w:r>
+              <w:rPr>
+                <w:sz w:val="19"/>
+              </w:rPr>
+              <w:t xml:space="preserve">), riquadro con il conto alla rovescia (browser)</w:t>
+            </w:r>
+          </w:p>
+        </w:tc>
+        <w:tc>
+          <w:tcPr>
+            <w:tcW w:type="dxa" w:w="2494"/>
+          </w:tcPr>
+          <w:p>
+            <w:pPr>
+              <w:pStyle w:val="Compact"/>
+              <w:spacing w:after="40"/>
+              <w:jc w:val="left"/>
+            </w:pPr>
+            <w:r>
+              <w:rPr>
+                <w:sz w:val="19"/>
+              </w:rPr>
+              <w:t xml:space="preserve">Riempie le sale: tutti arrivano alla stessa ora</w:t>
+            </w:r>
+          </w:p>
+        </w:tc>
+        <w:tc>
+          <w:tcPr>
+            <w:tcW w:type="dxa" w:w="1247"/>
+          </w:tcPr>
+          <w:p>
+            <w:pPr>
+              <w:pStyle w:val="Compact"/>
+              <w:spacing w:after="40"/>
+              <w:jc w:val="left"/>
+            </w:pPr>
+            <w:r>
+              <w:rPr>
+                <w:sz w:val="19"/>
+              </w:rPr>
+              <w:t xml:space="preserve">R-247</w:t>
+            </w:r>
+          </w:p>
+        </w:tc>
+        <w:tc>
+          <w:tcPr>
+            <w:tcW w:type="dxa" w:w="1134"/>
+          </w:tcPr>
+          <w:p>
+            <w:pPr>
+              <w:pStyle w:val="Compact"/>
+              <w:spacing w:after="40"/>
+              <w:jc w:val="left"/>
+            </w:pPr>
+            <w:r>
+              <w:rPr>
+                <w:sz w:val="19"/>
+              </w:rPr>
+              <w:t xml:space="preserve">0.25</w:t>
+            </w:r>
+          </w:p>
+        </w:tc>
+        <w:tc>
+          <w:tcPr>
+            <w:tcW w:type="dxa" w:w="1304"/>
+          </w:tcPr>
+          <w:p>
+            <w:pPr>
+              <w:pStyle w:val="Compact"/>
+              <w:spacing w:after="40"/>
+              <w:jc w:val="left"/>
+            </w:pPr>
+            <w:r>
+              <w:rPr>
+                <w:sz w:val="19"/>
+              </w:rPr>
+              <w:t xml:space="preserve">Sì (stanotte)</w:t>
+            </w:r>
+          </w:p>
+        </w:tc>
+      </w:tr>
+      <w:tr>
+        <w:tc>
+          <w:tcPr>
+            <w:tcW w:type="dxa" w:w="510"/>
+          </w:tcPr>
+          <w:p>
+            <w:pPr>
+              <w:pStyle w:val="Compact"/>
+              <w:spacing w:after="40"/>
+              <w:jc w:val="left"/>
+            </w:pPr>
+            <w:r>
+              <w:rPr>
+                <w:sz w:val="19"/>
+              </w:rPr>
               <w:t xml:space="preserve">2</w:t>
             </w:r>
           </w:p>
@@ -3548,7 +3862,37 @@
         <w:t xml:space="preserve">”</w:t>
       </w:r>
       <w:r>
-        <w:t xml:space="preserve">): R-236 e R-243 (riga 1), R-244, R-245 e R-246 (riga 1b). Delle 5 proposte del confronto del 27/10 restano fuori solo la pubblicazione vera su CrazyGames, che fa Luigi (D-12). Fatti e tolti da questa tabella il 26-27/10: avversari del computer al posto dei fantasmi (R-234, R-235, 0.18.0), fisica in un modulo e server diviso (A-19, A-20, 0.18.1), Three.js dal sito stesso (A-16, 0.18.1), velocità reali e ostacoli −30% (R-242, R-313, 0.19.0), sfondi delle città come cartoline dipinte in un worker (R-405, A-22, 0.20.0), pagina e programma della stessa versione (R-011, 0.20.1).</w:t>
+        <w:t xml:space="preserve">): R-236 e R-243 (riga 1), R-244, R-245 e R-246 (riga 1b). Delle 5 proposte del confronto del 27/10 restano fuori solo la pubblicazione vera su CrazyGames, che fa Luigi (D-12). Alle 19:52 (</w:t>
+      </w:r>
+      <w:r>
+        <w:t xml:space="preserve">“</w:t>
+      </w:r>
+      <w:r>
+        <w:t xml:space="preserve">Non c’è niente che possiamo migliorare guardando i nostri competitor?</w:t>
+      </w:r>
+      <w:r>
+        <w:t xml:space="preserve">”</w:t>
+      </w:r>
+      <w:r>
+        <w:t xml:space="preserve"> </w:t>
+      </w:r>
+      <w:r>
+        <w:t xml:space="preserve">→</w:t>
+      </w:r>
+      <w:r>
+        <w:t xml:space="preserve"> </w:t>
+      </w:r>
+      <w:r>
+        <w:t xml:space="preserve">“</w:t>
+      </w:r>
+      <w:r>
+        <w:t xml:space="preserve">Procedi</w:t>
+      </w:r>
+      <w:r>
+        <w:t xml:space="preserve">”</w:t>
+      </w:r>
+      <w:r>
+        <w:t xml:space="preserve">): R-247 (riga 1c) e le idee F-16…F-19. Fatti e tolti da questa tabella il 26-27/10: avversari del computer al posto dei fantasmi (R-234, R-235, 0.18.0), fisica in un modulo e server diviso (A-19, A-20, 0.18.1), Three.js dal sito stesso (A-16, 0.18.1), velocità reali e ostacoli −30% (R-242, R-313, 0.19.0), sfondi delle città come cartoline dipinte in un worker (R-405, A-22, 0.20.0), pagina e programma della stessa versione (R-011, 0.20.1).</w:t>
       </w:r>
     </w:p>
     <w:bookmarkEnd w:id="21"/>
@@ -20092,6 +20436,126 @@
           </w:p>
         </w:tc>
       </w:tr>
+      <w:tr>
+        <w:tc>
+          <w:tcPr>
+            <w:tcW w:type="dxa" w:w="794"/>
+          </w:tcPr>
+          <w:p>
+            <w:pPr>
+              <w:pStyle w:val="Compact"/>
+              <w:spacing w:after="40"/>
+              <w:jc w:val="left"/>
+            </w:pPr>
+            <w:r>
+              <w:rPr>
+                <w:sz w:val="19"/>
+              </w:rPr>
+              <w:t xml:space="preserve">S-49</w:t>
+            </w:r>
+          </w:p>
+        </w:tc>
+        <w:tc>
+          <w:tcPr>
+            <w:tcW w:type="dxa" w:w="6009"/>
+          </w:tcPr>
+          <w:p>
+            <w:pPr>
+              <w:pStyle w:val="Compact"/>
+              <w:spacing w:after="40"/>
+              <w:jc w:val="left"/>
+            </w:pPr>
+            <w:r>
+              <w:rPr>
+                <w:sz w:val="19"/>
+              </w:rPr>
+              <w:t xml:space="preserve">Gran Premio (R-247), scelte di Claude: l’ora è le</w:t>
+            </w:r>
+            <w:r>
+              <w:rPr>
+                <w:sz w:val="19"/>
+              </w:rPr>
+              <w:t xml:space="preserve"> </w:t>
+            </w:r>
+            <w:r>
+              <w:rPr>
+                <w:bCs/>
+                <w:b/>
+                <w:sz w:val="19"/>
+              </w:rPr>
+              <w:t xml:space="preserve">21:00 italiane</w:t>
+            </w:r>
+            <w:r>
+              <w:rPr>
+                <w:sz w:val="19"/>
+              </w:rPr>
+              <w:t xml:space="preserve"> </w:t>
+            </w:r>
+            <w:r>
+              <w:rPr>
+                <w:sz w:val="19"/>
+              </w:rPr>
+              <w:t xml:space="preserve">tutti i giorni (dopo cena, prima della TV; gli eventi di Trackmania sono nel fine settimana ma noi dobbiamo riempire le sale ogni giorno); una gara sola di 5 minuti, così chi perde non aspetta; città = quella della settimana, così la maglia e il Gran Premio si rinforzano; stessa pista per tutte le sale, così la classifica della sera confronta tutti (fino a 64 persone in 8 sale); si entra da 10 minuti prima (il tempo di chiamare un amico) e fino a 6 minuti dopo; la classifica del Gran Premio usa la stessa tabella della pista del giorno con la chiave</w:t>
+            </w:r>
+            <w:r>
+              <w:rPr>
+                <w:sz w:val="19"/>
+              </w:rPr>
+              <w:t xml:space="preserve"> </w:t>
+            </w:r>
+            <w:r>
+              <w:rPr>
+                <w:rStyle w:val="VerbatimChar"/>
+                <w:sz w:val="19"/>
+              </w:rPr>
+              <w:t xml:space="preserve">gp:&lt;giorno&gt;</w:t>
+            </w:r>
+            <w:r>
+              <w:rPr>
+                <w:sz w:val="19"/>
+              </w:rPr>
+              <w:t xml:space="preserve">, un tempo valido entra anche nella classifica generale dei 5 minuti; nelle sale del Gran Premio chi è da solo alle 21 corre con gli avversari del software (così la sera c’è sempre una gara). Se un giorno i giocatori saranno tanti, si potrà aggiungere un secondo orario (per esempio le 18) senza cambiare il codice: è una costante</w:t>
+            </w:r>
+          </w:p>
+        </w:tc>
+        <w:tc>
+          <w:tcPr>
+            <w:tcW w:type="dxa" w:w="1247"/>
+          </w:tcPr>
+          <w:p>
+            <w:pPr>
+              <w:pStyle w:val="Compact"/>
+              <w:spacing w:after="40"/>
+              <w:jc w:val="left"/>
+            </w:pPr>
+            <w:r>
+              <w:rPr>
+                <w:sz w:val="19"/>
+              </w:rPr>
+              <w:t xml:space="preserve">27/10/2026</w:t>
+            </w:r>
+          </w:p>
+        </w:tc>
+        <w:tc>
+          <w:tcPr>
+            <w:tcW w:type="dxa" w:w="1814"/>
+            <w:shd w:val="clear" w:color="auto" w:fill="E6EDF5"/>
+          </w:tcPr>
+          <w:p>
+            <w:pPr>
+              <w:pStyle w:val="Compact"/>
+              <w:spacing w:after="40"/>
+              <w:jc w:val="left"/>
+            </w:pPr>
+            <w:r>
+              <w:rPr>
+                <w:sz w:val="19"/>
+              </w:rPr>
+              <w:t xml:space="preserve">Da confermare</w:t>
+            </w:r>
+          </w:p>
+        </w:tc>
+      </w:tr>
     </w:tbl>
     <w:bookmarkEnd w:id="31"/>
     <w:bookmarkStart w:id="32" w:name="idee-per-il-futuro-da-confermare"/>
@@ -21070,6 +21534,258 @@
                 <w:sz w:val="19"/>
               </w:rPr>
               <w:t xml:space="preserve">): ora è R-244 (modalità portale); la proposta su CrazyGames la fa Luigi (D-12)</w:t>
+            </w:r>
+          </w:p>
+        </w:tc>
+      </w:tr>
+      <w:tr>
+        <w:tc>
+          <w:tcPr>
+            <w:tcW w:type="dxa" w:w="907"/>
+          </w:tcPr>
+          <w:p>
+            <w:pPr>
+              <w:pStyle w:val="Compact"/>
+              <w:spacing w:after="40"/>
+              <w:jc w:val="left"/>
+            </w:pPr>
+            <w:r>
+              <w:rPr>
+                <w:sz w:val="19"/>
+              </w:rPr>
+              <w:t xml:space="preserve">F-16</w:t>
+            </w:r>
+          </w:p>
+        </w:tc>
+        <w:tc>
+          <w:tcPr>
+            <w:tcW w:type="dxa" w:w="6803"/>
+          </w:tcPr>
+          <w:p>
+            <w:pPr>
+              <w:pStyle w:val="Compact"/>
+              <w:spacing w:after="40"/>
+              <w:jc w:val="left"/>
+            </w:pPr>
+            <w:r>
+              <w:rPr>
+                <w:sz w:val="19"/>
+              </w:rPr>
+              <w:t xml:space="preserve">Serie di giorni della pista del giorno (</w:t>
+            </w:r>
+            <w:r>
+              <w:rPr>
+                <w:sz w:val="19"/>
+              </w:rPr>
+              <w:t xml:space="preserve">“</w:t>
+            </w:r>
+            <w:r>
+              <w:rPr>
+                <w:sz w:val="19"/>
+              </w:rPr>
+              <w:t xml:space="preserve">🔥 5 giorni di fila</w:t>
+            </w:r>
+            <w:r>
+              <w:rPr>
+                <w:sz w:val="19"/>
+              </w:rPr>
+              <w:t xml:space="preserve">”</w:t>
+            </w:r>
+            <w:r>
+              <w:rPr>
+                <w:sz w:val="19"/>
+              </w:rPr>
+              <w:t xml:space="preserve">, come Wordle) e classifica filtrata sui giocatori con cui si è già corso (come i risultati degli amici in Subway Surfers). Proposta del 27/10 sera</w:t>
+            </w:r>
+          </w:p>
+        </w:tc>
+        <w:tc>
+          <w:tcPr>
+            <w:tcW w:type="dxa" w:w="2154"/>
+            <w:shd w:val="clear" w:color="auto" w:fill="E6EDF5"/>
+          </w:tcPr>
+          <w:p>
+            <w:pPr>
+              <w:pStyle w:val="Compact"/>
+              <w:spacing w:after="40"/>
+              <w:jc w:val="left"/>
+            </w:pPr>
+            <w:r>
+              <w:rPr>
+                <w:sz w:val="19"/>
+              </w:rPr>
+              <w:t xml:space="preserve">Da confermare</w:t>
+            </w:r>
+          </w:p>
+        </w:tc>
+      </w:tr>
+      <w:tr>
+        <w:tc>
+          <w:tcPr>
+            <w:tcW w:type="dxa" w:w="907"/>
+          </w:tcPr>
+          <w:p>
+            <w:pPr>
+              <w:pStyle w:val="Compact"/>
+              <w:spacing w:after="40"/>
+              <w:jc w:val="left"/>
+            </w:pPr>
+            <w:r>
+              <w:rPr>
+                <w:sz w:val="19"/>
+              </w:rPr>
+              <w:t xml:space="preserve">F-17</w:t>
+            </w:r>
+          </w:p>
+        </w:tc>
+        <w:tc>
+          <w:tcPr>
+            <w:tcW w:type="dxa" w:w="6803"/>
+          </w:tcPr>
+          <w:p>
+            <w:pPr>
+              <w:pStyle w:val="Compact"/>
+              <w:spacing w:after="40"/>
+              <w:jc w:val="left"/>
+            </w:pPr>
+            <w:r>
+              <w:rPr>
+                <w:sz w:val="19"/>
+              </w:rPr>
+              <w:t xml:space="preserve">Prima discesa guidata: tre suggerimenti a schermo al momento giusto (curva, salto, posizione raccolta) solo alla prima visita, come la prima corsa di Subway Surfers e Alto’s. Dato: quanti nuovi finiscono la prima gara. Proposta del 27/10 sera</w:t>
+            </w:r>
+          </w:p>
+        </w:tc>
+        <w:tc>
+          <w:tcPr>
+            <w:tcW w:type="dxa" w:w="2154"/>
+            <w:shd w:val="clear" w:color="auto" w:fill="E6EDF5"/>
+          </w:tcPr>
+          <w:p>
+            <w:pPr>
+              <w:pStyle w:val="Compact"/>
+              <w:spacing w:after="40"/>
+              <w:jc w:val="left"/>
+            </w:pPr>
+            <w:r>
+              <w:rPr>
+                <w:sz w:val="19"/>
+              </w:rPr>
+              <w:t xml:space="preserve">Da confermare</w:t>
+            </w:r>
+          </w:p>
+        </w:tc>
+      </w:tr>
+      <w:tr>
+        <w:tc>
+          <w:tcPr>
+            <w:tcW w:type="dxa" w:w="907"/>
+          </w:tcPr>
+          <w:p>
+            <w:pPr>
+              <w:pStyle w:val="Compact"/>
+              <w:spacing w:after="40"/>
+              <w:jc w:val="left"/>
+            </w:pPr>
+            <w:r>
+              <w:rPr>
+                <w:sz w:val="19"/>
+              </w:rPr>
+              <w:t xml:space="preserve">F-18</w:t>
+            </w:r>
+          </w:p>
+        </w:tc>
+        <w:tc>
+          <w:tcPr>
+            <w:tcW w:type="dxa" w:w="6803"/>
+          </w:tcPr>
+          <w:p>
+            <w:pPr>
+              <w:pStyle w:val="Compact"/>
+              <w:spacing w:after="40"/>
+              <w:jc w:val="left"/>
+            </w:pPr>
+            <w:r>
+              <w:rPr>
+                <w:sz w:val="19"/>
+              </w:rPr>
+              <w:t xml:space="preserve">Tedesco come quinta lingua e lingua del browser nelle misure delle visite (pubblico mondiale sui portali). Proposta del 27/10 sera</w:t>
+            </w:r>
+          </w:p>
+        </w:tc>
+        <w:tc>
+          <w:tcPr>
+            <w:tcW w:type="dxa" w:w="2154"/>
+            <w:shd w:val="clear" w:color="auto" w:fill="E6EDF5"/>
+          </w:tcPr>
+          <w:p>
+            <w:pPr>
+              <w:pStyle w:val="Compact"/>
+              <w:spacing w:after="40"/>
+              <w:jc w:val="left"/>
+            </w:pPr>
+            <w:r>
+              <w:rPr>
+                <w:sz w:val="19"/>
+              </w:rPr>
+              <w:t xml:space="preserve">Da confermare</w:t>
+            </w:r>
+          </w:p>
+        </w:tc>
+      </w:tr>
+      <w:tr>
+        <w:tc>
+          <w:tcPr>
+            <w:tcW w:type="dxa" w:w="907"/>
+          </w:tcPr>
+          <w:p>
+            <w:pPr>
+              <w:pStyle w:val="Compact"/>
+              <w:spacing w:after="40"/>
+              <w:jc w:val="left"/>
+            </w:pPr>
+            <w:r>
+              <w:rPr>
+                <w:sz w:val="19"/>
+              </w:rPr>
+              <w:t xml:space="preserve">F-19</w:t>
+            </w:r>
+          </w:p>
+        </w:tc>
+        <w:tc>
+          <w:tcPr>
+            <w:tcW w:type="dxa" w:w="6803"/>
+          </w:tcPr>
+          <w:p>
+            <w:pPr>
+              <w:pStyle w:val="Compact"/>
+              <w:spacing w:after="40"/>
+              <w:jc w:val="left"/>
+            </w:pPr>
+            <w:r>
+              <w:rPr>
+                <w:sz w:val="19"/>
+              </w:rPr>
+              <w:t xml:space="preserve">Stagione da 4 settimane con livelli e obiettivi di stagione, premi solo estetici decisi dal server (Smash Karts: più di 30 livelli di stagione, partite private senza XP). Unisce missioni, stelle e maglia della settimana; da fare dopo i primi dati sui ritorni (estende F-14). Proposta del 27/10 sera</w:t>
+            </w:r>
+          </w:p>
+        </w:tc>
+        <w:tc>
+          <w:tcPr>
+            <w:tcW w:type="dxa" w:w="2154"/>
+            <w:shd w:val="clear" w:color="auto" w:fill="E6EDF5"/>
+          </w:tcPr>
+          <w:p>
+            <w:pPr>
+              <w:pStyle w:val="Compact"/>
+              <w:spacing w:after="40"/>
+              <w:jc w:val="left"/>
+            </w:pPr>
+            <w:r>
+              <w:rPr>
+                <w:sz w:val="19"/>
+              </w:rPr>
+              <w:t xml:space="preserve">Da confermare</w:t>
             </w:r>
           </w:p>
         </w:tc>
@@ -41486,6 +42202,384 @@
           </w:p>
         </w:tc>
       </w:tr>
+      <w:tr>
+        <w:tc>
+          <w:tcPr>
+            <w:tcW w:type="dxa" w:w="907"/>
+          </w:tcPr>
+          <w:p>
+            <w:pPr>
+              <w:pStyle w:val="Compact"/>
+              <w:spacing w:after="40"/>
+              <w:jc w:val="left"/>
+            </w:pPr>
+            <w:r>
+              <w:rPr>
+                <w:sz w:val="19"/>
+              </w:rPr>
+              <w:t xml:space="preserve">R-247</w:t>
+            </w:r>
+          </w:p>
+        </w:tc>
+        <w:tc>
+          <w:tcPr>
+            <w:tcW w:type="dxa" w:w="4195"/>
+          </w:tcPr>
+          <w:p>
+            <w:pPr>
+              <w:pStyle w:val="Compact"/>
+              <w:spacing w:after="40"/>
+              <w:jc w:val="left"/>
+            </w:pPr>
+            <w:r>
+              <w:rPr>
+                <w:sz w:val="19"/>
+              </w:rPr>
+              <w:t xml:space="preserve">Gara ad appuntamento fisso: ogni sera alle 21 (ora italiana) il</w:t>
+            </w:r>
+            <w:r>
+              <w:rPr>
+                <w:sz w:val="19"/>
+              </w:rPr>
+              <w:t xml:space="preserve"> </w:t>
+            </w:r>
+            <w:r>
+              <w:rPr>
+                <w:bCs/>
+                <w:b/>
+                <w:sz w:val="19"/>
+              </w:rPr>
+              <w:t xml:space="preserve">Gran Premio</w:t>
+            </w:r>
+            <w:r>
+              <w:rPr>
+                <w:sz w:val="19"/>
+              </w:rPr>
+              <w:t xml:space="preserve"> </w:t>
+            </w:r>
+            <w:r>
+              <w:rPr>
+                <w:sz w:val="19"/>
+              </w:rPr>
+              <w:t xml:space="preserve">nella città della settimana, tutti insieme nella stessa sala, come gli eventi a orario fisso di Trackmania (Cup of the Week il sabato alle 17, Weekly Grand Track la domenica alle 18). Risolve il problema della sala online vuota (sezione 13): i giocatori arrivano nello stesso momento</w:t>
+            </w:r>
+          </w:p>
+        </w:tc>
+        <w:tc>
+          <w:tcPr>
+            <w:tcW w:type="dxa" w:w="1134"/>
+          </w:tcPr>
+          <w:p>
+            <w:pPr>
+              <w:pStyle w:val="Compact"/>
+              <w:spacing w:after="40"/>
+              <w:jc w:val="left"/>
+            </w:pPr>
+            <w:r>
+              <w:rPr>
+                <w:sz w:val="19"/>
+              </w:rPr>
+              <w:t xml:space="preserve">27/10/2026</w:t>
+            </w:r>
+          </w:p>
+        </w:tc>
+        <w:tc>
+          <w:tcPr>
+            <w:tcW w:type="dxa" w:w="1134"/>
+            <w:shd w:val="clear" w:color="auto" w:fill="FFF1C7"/>
+          </w:tcPr>
+          <w:p>
+            <w:pPr>
+              <w:pStyle w:val="Compact"/>
+              <w:spacing w:after="40"/>
+              <w:jc w:val="left"/>
+            </w:pPr>
+            <w:r>
+              <w:rPr>
+                <w:sz w:val="19"/>
+              </w:rPr>
+              <w:t xml:space="preserve">In corso</w:t>
+            </w:r>
+          </w:p>
+        </w:tc>
+        <w:tc>
+          <w:tcPr>
+            <w:tcW w:type="dxa" w:w="2494"/>
+          </w:tcPr>
+          <w:p>
+            <w:pPr>
+              <w:pStyle w:val="Compact"/>
+              <w:spacing w:after="40"/>
+              <w:jc w:val="left"/>
+            </w:pPr>
+            <w:r>
+              <w:rPr>
+                <w:sz w:val="19"/>
+              </w:rPr>
+              <w:t xml:space="preserve">Scritto il 27/10 per la 0.25.0 (ramo</w:t>
+            </w:r>
+            <w:r>
+              <w:rPr>
+                <w:sz w:val="19"/>
+              </w:rPr>
+              <w:t xml:space="preserve"> </w:t>
+            </w:r>
+            <w:r>
+              <w:rPr>
+                <w:rStyle w:val="VerbatimChar"/>
+                <w:sz w:val="19"/>
+              </w:rPr>
+              <w:t xml:space="preserve">giorno/portale-settimana</w:t>
+            </w:r>
+            <w:r>
+              <w:rPr>
+                <w:sz w:val="19"/>
+              </w:rPr>
+              <w:t xml:space="preserve">). Nel menu il riquadro</w:t>
+            </w:r>
+            <w:r>
+              <w:rPr>
+                <w:sz w:val="19"/>
+              </w:rPr>
+              <w:t xml:space="preserve"> </w:t>
+            </w:r>
+            <w:r>
+              <w:rPr>
+                <w:bCs/>
+                <w:b/>
+                <w:sz w:val="19"/>
+              </w:rPr>
+              <w:t xml:space="preserve">🏆 Gran Premio delle 21 · Roma</w:t>
+            </w:r>
+            <w:r>
+              <w:rPr>
+                <w:sz w:val="19"/>
+              </w:rPr>
+              <w:t xml:space="preserve"> </w:t>
+            </w:r>
+            <w:r>
+              <w:rPr>
+                <w:sz w:val="19"/>
+              </w:rPr>
+              <w:t xml:space="preserve">con il conto alla rovescia (</w:t>
+            </w:r>
+            <w:r>
+              <w:rPr>
+                <w:sz w:val="19"/>
+              </w:rPr>
+              <w:t xml:space="preserve">“</w:t>
+            </w:r>
+            <w:r>
+              <w:rPr>
+                <w:sz w:val="19"/>
+              </w:rPr>
+              <w:t xml:space="preserve">tra 1 h 08 min</w:t>
+            </w:r>
+            <w:r>
+              <w:rPr>
+                <w:sz w:val="19"/>
+              </w:rPr>
+              <w:t xml:space="preserve">”</w:t>
+            </w:r>
+            <w:r>
+              <w:rPr>
+                <w:sz w:val="19"/>
+              </w:rPr>
+              <w:t xml:space="preserve">); da 10 minuti prima si può entrare (</w:t>
+            </w:r>
+            <w:r>
+              <w:rPr>
+                <w:bCs/>
+                <w:b/>
+                <w:sz w:val="19"/>
+              </w:rPr>
+              <w:t xml:space="preserve">Entra nel Gran Premio</w:t>
+            </w:r>
+            <w:r>
+              <w:rPr>
+                <w:sz w:val="19"/>
+              </w:rPr>
+              <w:t xml:space="preserve">): si aspetta nella sala con gli altri (</w:t>
+            </w:r>
+            <w:r>
+              <w:rPr>
+                <w:sz w:val="19"/>
+              </w:rPr>
+              <w:t xml:space="preserve">“</w:t>
+            </w:r>
+            <w:r>
+              <w:rPr>
+                <w:sz w:val="19"/>
+              </w:rPr>
+              <w:t xml:space="preserve">Il Gran Premio parte alle 21:00 · tra 3:12 · 5 in sala</w:t>
+            </w:r>
+            <w:r>
+              <w:rPr>
+                <w:sz w:val="19"/>
+              </w:rPr>
+              <w:t xml:space="preserve">”</w:t>
+            </w:r>
+            <w:r>
+              <w:rPr>
+                <w:sz w:val="19"/>
+              </w:rPr>
+              <w:t xml:space="preserve">) e alle 21:00 in punto parte per tutte le sale insieme, con la</w:t>
+            </w:r>
+            <w:r>
+              <w:rPr>
+                <w:sz w:val="19"/>
+              </w:rPr>
+              <w:t xml:space="preserve"> </w:t>
+            </w:r>
+            <w:r>
+              <w:rPr>
+                <w:bCs/>
+                <w:b/>
+                <w:sz w:val="19"/>
+              </w:rPr>
+              <w:t xml:space="preserve">stessa pista</w:t>
+            </w:r>
+            <w:r>
+              <w:rPr>
+                <w:sz w:val="19"/>
+              </w:rPr>
+              <w:t xml:space="preserve"> </w:t>
+            </w:r>
+            <w:r>
+              <w:rPr>
+                <w:sz w:val="19"/>
+              </w:rPr>
+              <w:t xml:space="preserve">(stesso seme) per tutti quella sera, 5 minuti, nella città della settimana (R-245: la gara vale anche per la maglia). Sale da 8: la prima si riempie, poi la seconda, fino a 8 sale. Chi entra tra le 21:00 e le 21:06 corre lo stesso, dal via, svantaggiato come oggi (R-119); da soli alle 21 si parte con 3 avversari del software (R-235). A fine gara la</w:t>
+            </w:r>
+            <w:r>
+              <w:rPr>
+                <w:sz w:val="19"/>
+              </w:rPr>
+              <w:t xml:space="preserve"> </w:t>
+            </w:r>
+            <w:r>
+              <w:rPr>
+                <w:bCs/>
+                <w:b/>
+                <w:sz w:val="19"/>
+              </w:rPr>
+              <w:t xml:space="preserve">classifica del Gran Premio di stasera</w:t>
+            </w:r>
+            <w:r>
+              <w:rPr>
+                <w:sz w:val="19"/>
+              </w:rPr>
+              <w:t xml:space="preserve"> </w:t>
+            </w:r>
+            <w:r>
+              <w:rPr>
+                <w:sz w:val="19"/>
+              </w:rPr>
+              <w:t xml:space="preserve">(tutte le sale insieme, il migliore di ognuno, tempo misurato dal server) e</w:t>
+            </w:r>
+            <w:r>
+              <w:rPr>
+                <w:sz w:val="19"/>
+              </w:rPr>
+              <w:t xml:space="preserve"> </w:t>
+            </w:r>
+            <w:r>
+              <w:rPr>
+                <w:sz w:val="19"/>
+              </w:rPr>
+              <w:t xml:space="preserve">“</w:t>
+            </w:r>
+            <w:r>
+              <w:rPr>
+                <w:sz w:val="19"/>
+              </w:rPr>
+              <w:t xml:space="preserve">Gran Premio: sei 4° su 11</w:t>
+            </w:r>
+            <w:r>
+              <w:rPr>
+                <w:sz w:val="19"/>
+              </w:rPr>
+              <w:t xml:space="preserve">”</w:t>
+            </w:r>
+            <w:r>
+              <w:rPr>
+                <w:sz w:val="19"/>
+              </w:rPr>
+              <w:t xml:space="preserve">; resta nel menu fino a mezzanotte. Dopo il Gran Premio le sale si comportano come la sala online (rivincite ogni 30 s). Banane, bombe e vocali come nella sala online.</w:t>
+            </w:r>
+            <w:r>
+              <w:rPr>
+                <w:sz w:val="19"/>
+              </w:rPr>
+              <w:t xml:space="preserve"> </w:t>
+            </w:r>
+            <w:r>
+              <w:rPr>
+                <w:bCs/>
+                <w:b/>
+                <w:sz w:val="19"/>
+              </w:rPr>
+              <w:t xml:space="preserve">Misure</w:t>
+            </w:r>
+            <w:r>
+              <w:rPr>
+                <w:sz w:val="19"/>
+              </w:rPr>
+              <w:t xml:space="preserve">:</w:t>
+            </w:r>
+            <w:r>
+              <w:rPr>
+                <w:sz w:val="19"/>
+              </w:rPr>
+              <w:t xml:space="preserve"> </w:t>
+            </w:r>
+            <w:r>
+              <w:rPr>
+                <w:rStyle w:val="VerbatimChar"/>
+                <w:sz w:val="19"/>
+              </w:rPr>
+              <w:t xml:space="preserve">gp_persone</w:t>
+            </w:r>
+            <w:r>
+              <w:rPr>
+                <w:sz w:val="19"/>
+              </w:rPr>
+              <w:t xml:space="preserve"> </w:t>
+            </w:r>
+            <w:r>
+              <w:rPr>
+                <w:sz w:val="19"/>
+              </w:rPr>
+              <w:t xml:space="preserve">(persone al via) e</w:t>
+            </w:r>
+            <w:r>
+              <w:rPr>
+                <w:sz w:val="19"/>
+              </w:rPr>
+              <w:t xml:space="preserve"> </w:t>
+            </w:r>
+            <w:r>
+              <w:rPr>
+                <w:rStyle w:val="VerbatimChar"/>
+                <w:sz w:val="19"/>
+              </w:rPr>
+              <w:t xml:space="preserve">gp_sale</w:t>
+            </w:r>
+            <w:r>
+              <w:rPr>
+                <w:sz w:val="19"/>
+              </w:rPr>
+              <w:t xml:space="preserve"> </w:t>
+            </w:r>
+            <w:r>
+              <w:rPr>
+                <w:sz w:val="19"/>
+              </w:rPr>
+              <w:t xml:space="preserve">su /api/stats; classifica su /api/gp. Niente notifiche sul telefono (il browser non le manda senza permesso): l’orario è fisso proprio per non averne bisogno. Scelte S-49</w:t>
+            </w:r>
+          </w:p>
+        </w:tc>
+      </w:tr>
     </w:tbl>
     <w:bookmarkEnd w:id="61"/>
     <w:bookmarkStart w:id="62" w:name="storico-delle-versioni"/>
@@ -44965,6 +46059,220 @@
                 <w:sz w:val="19"/>
               </w:rPr>
               <w:t xml:space="preserve">, su /api/ritorni i ritorni per fonte</w:t>
+            </w:r>
+          </w:p>
+        </w:tc>
+      </w:tr>
+      <w:tr>
+        <w:tc>
+          <w:tcPr>
+            <w:tcW w:type="dxa" w:w="1247"/>
+          </w:tcPr>
+          <w:p>
+            <w:pPr>
+              <w:pStyle w:val="Compact"/>
+              <w:spacing w:after="40"/>
+              <w:jc w:val="left"/>
+            </w:pPr>
+            <w:r>
+              <w:rPr>
+                <w:sz w:val="19"/>
+              </w:rPr>
+              <w:t xml:space="preserve">0.25.0</w:t>
+            </w:r>
+          </w:p>
+        </w:tc>
+        <w:tc>
+          <w:tcPr>
+            <w:tcW w:type="dxa" w:w="1361"/>
+          </w:tcPr>
+          <w:p>
+            <w:pPr>
+              <w:pStyle w:val="Compact"/>
+              <w:spacing w:after="40"/>
+              <w:jc w:val="left"/>
+            </w:pPr>
+            <w:r>
+              <w:rPr>
+                <w:sz w:val="19"/>
+              </w:rPr>
+              <w:t xml:space="preserve">27/10/2026</w:t>
+            </w:r>
+          </w:p>
+        </w:tc>
+        <w:tc>
+          <w:tcPr>
+            <w:tcW w:type="dxa" w:w="7257"/>
+          </w:tcPr>
+          <w:p>
+            <w:pPr>
+              <w:pStyle w:val="Compact"/>
+              <w:spacing w:after="40"/>
+              <w:jc w:val="left"/>
+            </w:pPr>
+            <w:r>
+              <w:rPr>
+                <w:sz w:val="19"/>
+              </w:rPr>
+              <w:t xml:space="preserve">(Stesso ramo.) Gran Premio delle 21 (R-247, S-49): gara ad appuntamento fisso nella città della settimana, sale</w:t>
+            </w:r>
+            <w:r>
+              <w:rPr>
+                <w:sz w:val="19"/>
+              </w:rPr>
+              <w:t xml:space="preserve"> </w:t>
+            </w:r>
+            <w:r>
+              <w:rPr>
+                <w:rStyle w:val="VerbatimChar"/>
+                <w:sz w:val="19"/>
+              </w:rPr>
+              <w:t xml:space="preserve">GP01</w:t>
+            </w:r>
+            <w:r>
+              <w:rPr>
+                <w:sz w:val="19"/>
+              </w:rPr>
+              <w:t xml:space="preserve">…</w:t>
+            </w:r>
+            <w:r>
+              <w:rPr>
+                <w:rStyle w:val="VerbatimChar"/>
+                <w:sz w:val="19"/>
+              </w:rPr>
+              <w:t xml:space="preserve">GP08</w:t>
+            </w:r>
+            <w:r>
+              <w:rPr>
+                <w:sz w:val="19"/>
+              </w:rPr>
+              <w:t xml:space="preserve"> </w:t>
+            </w:r>
+            <w:r>
+              <w:rPr>
+                <w:sz w:val="19"/>
+              </w:rPr>
+              <w:t xml:space="preserve">che partono insieme all’ora fissa con la stessa pista, riquadro nel menu con il conto alla rovescia, classifica della sera;</w:t>
+            </w:r>
+            <w:r>
+              <w:rPr>
+                <w:sz w:val="19"/>
+              </w:rPr>
+              <w:t xml:space="preserve"> </w:t>
+            </w:r>
+            <w:r>
+              <w:rPr>
+                <w:rStyle w:val="VerbatimChar"/>
+                <w:sz w:val="19"/>
+              </w:rPr>
+              <w:t xml:space="preserve">/api/gp</w:t>
+            </w:r>
+            <w:r>
+              <w:rPr>
+                <w:sz w:val="19"/>
+              </w:rPr>
+              <w:t xml:space="preserve">,</w:t>
+            </w:r>
+            <w:r>
+              <w:rPr>
+                <w:sz w:val="19"/>
+              </w:rPr>
+              <w:t xml:space="preserve"> </w:t>
+            </w:r>
+            <w:r>
+              <w:rPr>
+                <w:rStyle w:val="VerbatimChar"/>
+                <w:sz w:val="19"/>
+              </w:rPr>
+              <w:t xml:space="preserve">/api/quick?gp=1</w:t>
+            </w:r>
+            <w:r>
+              <w:rPr>
+                <w:sz w:val="19"/>
+              </w:rPr>
+              <w:t xml:space="preserve">; misure</w:t>
+            </w:r>
+            <w:r>
+              <w:rPr>
+                <w:sz w:val="19"/>
+              </w:rPr>
+              <w:t xml:space="preserve"> </w:t>
+            </w:r>
+            <w:r>
+              <w:rPr>
+                <w:rStyle w:val="VerbatimChar"/>
+                <w:sz w:val="19"/>
+              </w:rPr>
+              <w:t xml:space="preserve">gp_persone</w:t>
+            </w:r>
+            <w:r>
+              <w:rPr>
+                <w:sz w:val="19"/>
+              </w:rPr>
+              <w:t xml:space="preserve">,</w:t>
+            </w:r>
+            <w:r>
+              <w:rPr>
+                <w:sz w:val="19"/>
+              </w:rPr>
+              <w:t xml:space="preserve"> </w:t>
+            </w:r>
+            <w:r>
+              <w:rPr>
+                <w:rStyle w:val="VerbatimChar"/>
+                <w:sz w:val="19"/>
+              </w:rPr>
+              <w:t xml:space="preserve">gp_sale</w:t>
+            </w:r>
+            <w:r>
+              <w:rPr>
+                <w:sz w:val="19"/>
+              </w:rPr>
+              <w:t xml:space="preserve">. Nuovi</w:t>
+            </w:r>
+            <w:r>
+              <w:rPr>
+                <w:sz w:val="19"/>
+              </w:rPr>
+              <w:t xml:space="preserve"> </w:t>
+            </w:r>
+            <w:r>
+              <w:rPr>
+                <w:rStyle w:val="VerbatimChar"/>
+                <w:sz w:val="19"/>
+              </w:rPr>
+              <w:t xml:space="preserve">src/granpremio.mjs</w:t>
+            </w:r>
+            <w:r>
+              <w:rPr>
+                <w:sz w:val="19"/>
+              </w:rPr>
+              <w:t xml:space="preserve"> </w:t>
+            </w:r>
+            <w:r>
+              <w:rPr>
+                <w:sz w:val="19"/>
+              </w:rPr>
+              <w:t xml:space="preserve">e</w:t>
+            </w:r>
+            <w:r>
+              <w:rPr>
+                <w:sz w:val="19"/>
+              </w:rPr>
+              <w:t xml:space="preserve"> </w:t>
+            </w:r>
+            <w:r>
+              <w:rPr>
+                <w:rStyle w:val="VerbatimChar"/>
+                <w:sz w:val="19"/>
+              </w:rPr>
+              <w:t xml:space="preserve">moduli/granpremio.js</w:t>
+            </w:r>
+            <w:r>
+              <w:rPr>
+                <w:sz w:val="19"/>
+              </w:rPr>
+              <w:t xml:space="preserve">. Idee F-16…F-19 dal confronto della sera</w:t>
             </w:r>
           </w:p>
         </w:tc>

</xml_diff>

<commit_message>
0.25.1 (giorno): anche la pagina senza versione si ricarica (R-011): un Samsung Internet ha riaperto una pagina di prima della 0.20.0 con il programma 0.20.2 e il gioco si è fermato sugli sfondi; da provare stanotte (variante di R1c)
Co-Authored-By: Claude Opus 5.5 <noreply@anthropic.com>
Claude-Session: https://claude.ai/code/session_017ipzp9sqryzfFBJaHpW6iC
</commit_message>
<xml_diff>
--- a/docs/CYF-Gaming-requisiti.docx
+++ b/docs/CYF-Gaming-requisiti.docx
@@ -69,7 +69,7 @@
         <w:t xml:space="preserve"> </w:t>
       </w:r>
       <w:r>
-        <w:t xml:space="preserve">0.21.0-0.25.0</w:t>
+        <w:t xml:space="preserve">0.21.0-0.25.1</w:t>
       </w:r>
       <w:r>
         <w:t xml:space="preserve"> </w:t>
@@ -135,7 +135,7 @@
         <w:t xml:space="preserve"> </w:t>
       </w:r>
       <w:r>
-        <w:t xml:space="preserve">20:30</w:t>
+        <w:t xml:space="preserve">22:15</w:t>
       </w:r>
       <w:r>
         <w:t xml:space="preserve"> </w:t>
@@ -338,7 +338,7 @@
         <w:pStyle w:val="FirstParagraph"/>
       </w:pPr>
       <w:r>
-        <w:t xml:space="preserve">Aggiornati il 27/10/2026 alle 20:30 (versione online: 0.20.2; la 0.21.0 con</w:t>
+        <w:t xml:space="preserve">Aggiornati il 27/10/2026 alle 22:15 (versione online: 0.20.2; la 0.21.0 con</w:t>
       </w:r>
       <w:r>
         <w:t xml:space="preserve"> </w:t>
@@ -380,7 +380,31 @@
         <w:t xml:space="preserve">giorno/portale-settimana</w:t>
       </w:r>
       <w:r>
-        <w:t xml:space="preserve">, che contiene anche la 0.21.0: vanno online domattina, dopo le prove del turno di notte). Questo Word è anche su Google Drive, cartella</w:t>
+        <w:t xml:space="preserve">, che contiene anche la 0.21.0; la 0.25.1 (correzione di un errore dai telefoni, R-011) è sul ramo</w:t>
+      </w:r>
+      <w:r>
+        <w:t xml:space="preserve"> </w:t>
+      </w:r>
+      <w:r>
+        <w:rPr>
+          <w:rStyle w:val="VerbatimChar"/>
+        </w:rPr>
+        <w:t xml:space="preserve">giorno/pagina-vecchia</w:t>
+      </w:r>
+      <w:r>
+        <w:t xml:space="preserve">, che parte da</w:t>
+      </w:r>
+      <w:r>
+        <w:t xml:space="preserve"> </w:t>
+      </w:r>
+      <w:r>
+        <w:rPr>
+          <w:rStyle w:val="VerbatimChar"/>
+        </w:rPr>
+        <w:t xml:space="preserve">giorno/portale-settimana</w:t>
+      </w:r>
+      <w:r>
+        <w:t xml:space="preserve">: vanno online domattina, dopo le prove del turno di notte). Questo Word è anche su Google Drive, cartella</w:t>
       </w:r>
       <w:r>
         <w:t xml:space="preserve"> </w:t>
@@ -2914,6 +2938,173 @@
               <w:rPr>
                 <w:sz w:val="19"/>
               </w:rPr>
+              <w:t xml:space="preserve">1d</w:t>
+            </w:r>
+          </w:p>
+        </w:tc>
+        <w:tc>
+          <w:tcPr>
+            <w:tcW w:type="dxa" w:w="3175"/>
+          </w:tcPr>
+          <w:p>
+            <w:pPr>
+              <w:pStyle w:val="Compact"/>
+              <w:spacing w:after="40"/>
+              <w:jc w:val="left"/>
+            </w:pPr>
+            <w:r>
+              <w:rPr>
+                <w:sz w:val="19"/>
+              </w:rPr>
+              <w:t xml:space="preserve">Provare e pubblicare la 0.25.1 (ramo</w:t>
+            </w:r>
+            <w:r>
+              <w:rPr>
+                <w:sz w:val="19"/>
+              </w:rPr>
+              <w:t xml:space="preserve"> </w:t>
+            </w:r>
+            <w:r>
+              <w:rPr>
+                <w:rStyle w:val="VerbatimChar"/>
+                <w:sz w:val="19"/>
+              </w:rPr>
+              <w:t xml:space="preserve">giorno/pagina-vecchia</w:t>
+            </w:r>
+            <w:r>
+              <w:rPr>
+                <w:sz w:val="19"/>
+              </w:rPr>
+              <w:t xml:space="preserve">, parte da</w:t>
+            </w:r>
+            <w:r>
+              <w:rPr>
+                <w:sz w:val="19"/>
+              </w:rPr>
+              <w:t xml:space="preserve"> </w:t>
+            </w:r>
+            <w:r>
+              <w:rPr>
+                <w:rStyle w:val="VerbatimChar"/>
+                <w:sz w:val="19"/>
+              </w:rPr>
+              <w:t xml:space="preserve">giorno/portale-settimana</w:t>
+            </w:r>
+            <w:r>
+              <w:rPr>
+                <w:sz w:val="19"/>
+              </w:rPr>
+              <w:t xml:space="preserve">): anche la pagina senza versione si ricarica (unico errore nuovo dai telefoni del 27/10, Samsung Internet). Prova da aggiungere: variante di R1c con la pagina senza</w:t>
+            </w:r>
+            <w:r>
+              <w:rPr>
+                <w:sz w:val="19"/>
+              </w:rPr>
+              <w:t xml:space="preserve"> </w:t>
+            </w:r>
+            <w:r>
+              <w:rPr>
+                <w:rStyle w:val="VerbatimChar"/>
+                <w:sz w:val="19"/>
+              </w:rPr>
+              <w:t xml:space="preserve">&lt;meta name="cyf-versione"&gt;</w:t>
+            </w:r>
+            <w:r>
+              <w:rPr>
+                <w:sz w:val="19"/>
+              </w:rPr>
+              <w:t xml:space="preserve">, che deve ricaricarsi una volta e arrivare al menu</w:t>
+            </w:r>
+          </w:p>
+        </w:tc>
+        <w:tc>
+          <w:tcPr>
+            <w:tcW w:type="dxa" w:w="2494"/>
+          </w:tcPr>
+          <w:p>
+            <w:pPr>
+              <w:pStyle w:val="Compact"/>
+              <w:spacing w:after="40"/>
+              <w:jc w:val="left"/>
+            </w:pPr>
+            <w:r>
+              <w:rPr>
+                <w:sz w:val="19"/>
+              </w:rPr>
+              <w:t xml:space="preserve">Ogni errore visto dai telefoni va corretto (R-506)</w:t>
+            </w:r>
+          </w:p>
+        </w:tc>
+        <w:tc>
+          <w:tcPr>
+            <w:tcW w:type="dxa" w:w="1247"/>
+          </w:tcPr>
+          <w:p>
+            <w:pPr>
+              <w:pStyle w:val="Compact"/>
+              <w:spacing w:after="40"/>
+              <w:jc w:val="left"/>
+            </w:pPr>
+            <w:r>
+              <w:rPr>
+                <w:sz w:val="19"/>
+              </w:rPr>
+              <w:t xml:space="preserve">R-011</w:t>
+            </w:r>
+          </w:p>
+        </w:tc>
+        <w:tc>
+          <w:tcPr>
+            <w:tcW w:type="dxa" w:w="1134"/>
+          </w:tcPr>
+          <w:p>
+            <w:pPr>
+              <w:pStyle w:val="Compact"/>
+              <w:spacing w:after="40"/>
+              <w:jc w:val="left"/>
+            </w:pPr>
+            <w:r>
+              <w:rPr>
+                <w:sz w:val="19"/>
+              </w:rPr>
+              <w:t xml:space="preserve">0.25.1</w:t>
+            </w:r>
+          </w:p>
+        </w:tc>
+        <w:tc>
+          <w:tcPr>
+            <w:tcW w:type="dxa" w:w="1304"/>
+          </w:tcPr>
+          <w:p>
+            <w:pPr>
+              <w:pStyle w:val="Compact"/>
+              <w:spacing w:after="40"/>
+              <w:jc w:val="left"/>
+            </w:pPr>
+            <w:r>
+              <w:rPr>
+                <w:sz w:val="19"/>
+              </w:rPr>
+              <w:t xml:space="preserve">Sì (stanotte)</w:t>
+            </w:r>
+          </w:p>
+        </w:tc>
+      </w:tr>
+      <w:tr>
+        <w:tc>
+          <w:tcPr>
+            <w:tcW w:type="dxa" w:w="510"/>
+          </w:tcPr>
+          <w:p>
+            <w:pPr>
+              <w:pStyle w:val="Compact"/>
+              <w:spacing w:after="40"/>
+              <w:jc w:val="left"/>
+            </w:pPr>
+            <w:r>
+              <w:rPr>
+                <w:sz w:val="19"/>
+              </w:rPr>
               <w:t xml:space="preserve">2</w:t>
             </w:r>
           </w:p>
@@ -5602,7 +5793,45 @@
               <w:rPr>
                 <w:sz w:val="19"/>
               </w:rPr>
-              <w:t xml:space="preserve">abbiano la stessa versione; la prova R1c del giro rapido simula la pagina vecchia</w:t>
+              <w:t xml:space="preserve">abbiano la stessa versione; la prova R1c del giro rapido simula la pagina vecchia. Dalla 0.25.1 anche una pagina senza versione (scritta prima della 0.20.1) conta come vecchia e si ricarica: il 27/10 alle 20:53 lo stesso Samsung Internet (Android 10) ha riaperto una pagina di prima della 0.20.0 con il programma 0.20.2 e il gioco si è fermato sugli sfondi (</w:t>
+            </w:r>
+            <w:r>
+              <w:rPr>
+                <w:rStyle w:val="VerbatimChar"/>
+                <w:sz w:val="19"/>
+              </w:rPr>
+              <w:t xml:space="preserve">PN.panorami</w:t>
+            </w:r>
+            <w:r>
+              <w:rPr>
+                <w:sz w:val="19"/>
+              </w:rPr>
+              <w:t xml:space="preserve"> </w:t>
+            </w:r>
+            <w:r>
+              <w:rPr>
+                <w:sz w:val="19"/>
+              </w:rPr>
+              <w:t xml:space="preserve">mancante, la pagina non caricava</w:t>
+            </w:r>
+            <w:r>
+              <w:rPr>
+                <w:sz w:val="19"/>
+              </w:rPr>
+              <w:t xml:space="preserve"> </w:t>
+            </w:r>
+            <w:r>
+              <w:rPr>
+                <w:rStyle w:val="VerbatimChar"/>
+                <w:sz w:val="19"/>
+              </w:rPr>
+              <w:t xml:space="preserve">panorami.js</w:t>
+            </w:r>
+            <w:r>
+              <w:rPr>
+                <w:sz w:val="19"/>
+              </w:rPr>
+              <w:t xml:space="preserve">); la guardia della 0.20.1 non scattava perché la pagina non aveva la versione</w:t>
             </w:r>
           </w:p>
         </w:tc>
@@ -46273,6 +46502,188 @@
                 <w:sz w:val="19"/>
               </w:rPr>
               <w:t xml:space="preserve">. Idee F-16…F-19 dal confronto della sera</w:t>
+            </w:r>
+          </w:p>
+        </w:tc>
+      </w:tr>
+      <w:tr>
+        <w:tc>
+          <w:tcPr>
+            <w:tcW w:type="dxa" w:w="1247"/>
+          </w:tcPr>
+          <w:p>
+            <w:pPr>
+              <w:pStyle w:val="Compact"/>
+              <w:spacing w:after="40"/>
+              <w:jc w:val="left"/>
+            </w:pPr>
+            <w:r>
+              <w:rPr>
+                <w:sz w:val="19"/>
+              </w:rPr>
+              <w:t xml:space="preserve">0.25.1</w:t>
+            </w:r>
+          </w:p>
+        </w:tc>
+        <w:tc>
+          <w:tcPr>
+            <w:tcW w:type="dxa" w:w="1361"/>
+          </w:tcPr>
+          <w:p>
+            <w:pPr>
+              <w:pStyle w:val="Compact"/>
+              <w:spacing w:after="40"/>
+              <w:jc w:val="left"/>
+            </w:pPr>
+            <w:r>
+              <w:rPr>
+                <w:sz w:val="19"/>
+              </w:rPr>
+              <w:t xml:space="preserve">27/10/2026</w:t>
+            </w:r>
+          </w:p>
+        </w:tc>
+        <w:tc>
+          <w:tcPr>
+            <w:tcW w:type="dxa" w:w="7257"/>
+          </w:tcPr>
+          <w:p>
+            <w:pPr>
+              <w:pStyle w:val="Compact"/>
+              <w:spacing w:after="40"/>
+              <w:jc w:val="left"/>
+            </w:pPr>
+            <w:r>
+              <w:rPr>
+                <w:sz w:val="19"/>
+              </w:rPr>
+              <w:t xml:space="preserve">(Ramo</w:t>
+            </w:r>
+            <w:r>
+              <w:rPr>
+                <w:sz w:val="19"/>
+              </w:rPr>
+              <w:t xml:space="preserve"> </w:t>
+            </w:r>
+            <w:r>
+              <w:rPr>
+                <w:rStyle w:val="VerbatimChar"/>
+                <w:sz w:val="19"/>
+              </w:rPr>
+              <w:t xml:space="preserve">giorno/pagina-vecchia</w:t>
+            </w:r>
+            <w:r>
+              <w:rPr>
+                <w:sz w:val="19"/>
+              </w:rPr>
+              <w:t xml:space="preserve">, parte da</w:t>
+            </w:r>
+            <w:r>
+              <w:rPr>
+                <w:sz w:val="19"/>
+              </w:rPr>
+              <w:t xml:space="preserve"> </w:t>
+            </w:r>
+            <w:r>
+              <w:rPr>
+                <w:rStyle w:val="VerbatimChar"/>
+                <w:sz w:val="19"/>
+              </w:rPr>
+              <w:t xml:space="preserve">giorno/portale-settimana</w:t>
+            </w:r>
+            <w:r>
+              <w:rPr>
+                <w:sz w:val="19"/>
+              </w:rPr>
+              <w:t xml:space="preserve">; scritta di giorno senza prove, R-506.) Correzione dell’unico errore nuovo dai telefoni del 27/10 (R-011):</w:t>
+            </w:r>
+            <w:r>
+              <w:rPr>
+                <w:sz w:val="19"/>
+              </w:rPr>
+              <w:t xml:space="preserve"> </w:t>
+            </w:r>
+            <w:r>
+              <w:rPr>
+                <w:rStyle w:val="VerbatimChar"/>
+                <w:sz w:val="19"/>
+              </w:rPr>
+              <w:t xml:space="preserve">Cannot read properties of undefined (reading 'GEOMETRIA')</w:t>
+            </w:r>
+            <w:r>
+              <w:rPr>
+                <w:sz w:val="19"/>
+              </w:rPr>
+              <w:t xml:space="preserve"> </w:t>
+            </w:r>
+            <w:r>
+              <w:rPr>
+                <w:sz w:val="19"/>
+              </w:rPr>
+              <w:t xml:space="preserve">in</w:t>
+            </w:r>
+            <w:r>
+              <w:rPr>
+                <w:sz w:val="19"/>
+              </w:rPr>
+              <w:t xml:space="preserve"> </w:t>
+            </w:r>
+            <w:r>
+              <w:rPr>
+                <w:rStyle w:val="VerbatimChar"/>
+                <w:sz w:val="19"/>
+              </w:rPr>
+              <w:t xml:space="preserve">sfondi.js</w:t>
+            </w:r>
+            <w:r>
+              <w:rPr>
+                <w:sz w:val="19"/>
+              </w:rPr>
+              <w:t xml:space="preserve"> </w:t>
+            </w:r>
+            <w:r>
+              <w:rPr>
+                <w:sz w:val="19"/>
+              </w:rPr>
+              <w:t xml:space="preserve">su Samsung Internet 30, Android 10, versione 0.20.2. Causa: il telefono ha riaperto una pagina salvata di prima della 0.20.0 (senza</w:t>
+            </w:r>
+            <w:r>
+              <w:rPr>
+                <w:sz w:val="19"/>
+              </w:rPr>
+              <w:t xml:space="preserve"> </w:t>
+            </w:r>
+            <w:r>
+              <w:rPr>
+                <w:rStyle w:val="VerbatimChar"/>
+                <w:sz w:val="19"/>
+              </w:rPr>
+              <w:t xml:space="preserve">panorami.js</w:t>
+            </w:r>
+            <w:r>
+              <w:rPr>
+                <w:sz w:val="19"/>
+              </w:rPr>
+              <w:t xml:space="preserve"> </w:t>
+            </w:r>
+            <w:r>
+              <w:rPr>
+                <w:sz w:val="19"/>
+              </w:rPr>
+              <w:t xml:space="preserve">e senza la versione nella pagina) con il programma nuovo; la guardia della 0.20.1 controllava solo le pagine con la versione. Ora anche la pagina senza versione si ricarica una volta. Da provare stanotte: variante della prova R1c con la pagina senza</w:t>
+            </w:r>
+            <w:r>
+              <w:rPr>
+                <w:sz w:val="19"/>
+              </w:rPr>
+              <w:t xml:space="preserve"> </w:t>
+            </w:r>
+            <w:r>
+              <w:rPr>
+                <w:rStyle w:val="VerbatimChar"/>
+                <w:sz w:val="19"/>
+              </w:rPr>
+              <w:t xml:space="preserve">&lt;meta name="cyf-versione"&gt;</w:t>
             </w:r>
           </w:p>
         </w:tc>

</xml_diff>

<commit_message>
Requisiti 0.25.1: ora giusta dell'aggiornamento (22:05)
Co-Authored-By: Claude Opus 5.5 <noreply@anthropic.com>
Claude-Session: https://claude.ai/code/session_017ipzp9sqryzfFBJaHpW6iC
</commit_message>
<xml_diff>
--- a/docs/CYF-Gaming-requisiti.docx
+++ b/docs/CYF-Gaming-requisiti.docx
@@ -135,7 +135,7 @@
         <w:t xml:space="preserve"> </w:t>
       </w:r>
       <w:r>
-        <w:t xml:space="preserve">22:15</w:t>
+        <w:t xml:space="preserve">22:05</w:t>
       </w:r>
       <w:r>
         <w:t xml:space="preserve"> </w:t>
@@ -338,7 +338,7 @@
         <w:pStyle w:val="FirstParagraph"/>
       </w:pPr>
       <w:r>
-        <w:t xml:space="preserve">Aggiornati il 27/10/2026 alle 22:15 (versione online: 0.20.2; la 0.21.0 con</w:t>
+        <w:t xml:space="preserve">Aggiornati il 27/10/2026 alle 22:05 (versione online: 0.20.2; la 0.21.0 con</w:t>
       </w:r>
       <w:r>
         <w:t xml:space="preserve"> </w:t>

</xml_diff>

<commit_message>
Requisiti: il turno di notte parte all'1:30 (decisione di Luigi del 27/10; R-503, R-506, regole di lavoro)
Co-Authored-By: Claude Opus 5.5 <noreply@anthropic.com>
Claude-Session: https://claude.ai/code/session_017ipzp9sqryzfFBJaHpW6iC
</commit_message>
<xml_diff>
--- a/docs/CYF-Gaming-requisiti.docx
+++ b/docs/CYF-Gaming-requisiti.docx
@@ -135,7 +135,37 @@
         <w:t xml:space="preserve"> </w:t>
       </w:r>
       <w:r>
-        <w:t xml:space="preserve">22:05</w:t>
+        <w:t xml:space="preserve">22:10</w:t>
+      </w:r>
+      <w:r>
+        <w:t xml:space="preserve"> </w:t>
+      </w:r>
+      <w:r>
+        <w:t xml:space="preserve">·</w:t>
+      </w:r>
+      <w:r>
+        <w:t xml:space="preserve"> </w:t>
+      </w:r>
+      <w:r>
+        <w:t xml:space="preserve">turno</w:t>
+      </w:r>
+      <w:r>
+        <w:t xml:space="preserve"> </w:t>
+      </w:r>
+      <w:r>
+        <w:t xml:space="preserve">di</w:t>
+      </w:r>
+      <w:r>
+        <w:t xml:space="preserve"> </w:t>
+      </w:r>
+      <w:r>
+        <w:t xml:space="preserve">notte</w:t>
+      </w:r>
+      <w:r>
+        <w:t xml:space="preserve"> </w:t>
+      </w:r>
+      <w:r>
+        <w:t xml:space="preserve">all’1:30</w:t>
       </w:r>
       <w:r>
         <w:t xml:space="preserve"> </w:t>
@@ -338,7 +368,7 @@
         <w:pStyle w:val="FirstParagraph"/>
       </w:pPr>
       <w:r>
-        <w:t xml:space="preserve">Aggiornati il 27/10/2026 alle 22:05 (versione online: 0.20.2; la 0.21.0 con</w:t>
+        <w:t xml:space="preserve">Aggiornati il 27/10/2026 alle 22:10 (versione online: 0.20.2; la 0.21.0 con</w:t>
       </w:r>
       <w:r>
         <w:t xml:space="preserve"> </w:t>
@@ -1955,7 +1985,7 @@
         <w:t xml:space="preserve">Notte</w:t>
       </w:r>
       <w:r>
-        <w:t xml:space="preserve">: il turno di notte (dalle 23:07) prova tutto, corregge gli errori e pubblica; la novità è online la mattina dopo. Nella colonna</w:t>
+        <w:t xml:space="preserve">: il turno di notte (dalle 1:30) prova tutto, corregge gli errori e pubblica; la novità è online la mattina dopo. Nella colonna</w:t>
       </w:r>
       <w:r>
         <w:t xml:space="preserve"> </w:t>
@@ -4157,7 +4187,7 @@
         <w:t xml:space="preserve">”</w:t>
       </w:r>
       <w:r>
-        <w:t xml:space="preserve">). Il turno di notte parte alle 23:07, fa il giro completo, corregge tutti gli errori che le prove e i telefoni dei giocatori mostrano, e pubblica solo se tutto è verde. Il lavoro del giorno sta sui rami</w:t>
+        <w:t xml:space="preserve">). Il turno di notte parte all’1:30 (decisione di Luigi del 27/10; prima 23:07), fa il giro completo, corregge tutti gli errori che le prove e i telefoni dei giocatori mostrano, e pubblica solo se tutto è verde. Il lavoro del giorno sta sui rami</w:t>
       </w:r>
       <w:r>
         <w:t xml:space="preserve"> </w:t>
@@ -14070,7 +14100,7 @@
               <w:rPr>
                 <w:sz w:val="19"/>
               </w:rPr>
-              <w:t xml:space="preserve">ogni sera alle 23:07 ora italiana (prima 21:33, poi 22:59): giro completo delle prove (A-05), errori dai telefoni, correzione di ogni errore, pubblicazione con tutto verde, prossimi passi approvati con il tempo che resta (fino alle 6:30), rapporto con le misure</w:t>
+              <w:t xml:space="preserve">ogni notte all’1:30 ora italiana (decisione di Luigi del 27/10; prima 21:33, poi 22:59, poi 23:07): giro completo delle prove (A-05), errori dai telefoni, correzione di ogni errore, pubblicazione con tutto verde, prossimi passi approvati con il tempo che resta (fino alle 6:30), rapporto con le misure</w:t>
             </w:r>
           </w:p>
         </w:tc>
@@ -14455,7 +14485,7 @@
               <w:rPr>
                 <w:sz w:val="19"/>
               </w:rPr>
-              <w:t xml:space="preserve">, dalla 0.20.2). Il turno di notte (R-503) unisce i rami, prova, corregge e pubblica: le novità vanno online la mattina dopo. Se Luigi scrive</w:t>
+              <w:t xml:space="preserve">, dalla 0.20.2). Il turno di notte (R-503, dal 27/10 parte all’1:30, fino alle 6:30) unisce i rami, prova, corregge e pubblica: le novità vanno online la mattina dopo. Se Luigi scrive</w:t>
             </w:r>
             <w:r>
               <w:rPr>

</xml_diff>